<commit_message>
docs(word): overhaul executive proposal with real screenshots, dealer tripartite ecosystem, NPL mitigation, Pefindo gateway, and concrete financial case study
</commit_message>
<xml_diff>
--- a/LIUGONG_CRM_BUSINESS_SPECIFICATION_PRESDIR.docx
+++ b/LIUGONG_CRM_BUSINESS_SPECIFICATION_PRESDIR.docx
@@ -4,12 +4,12 @@
   <w:body>
     <w:p>
       <w:pPr>
-        <w:spacing w:before="400" w:after="480"/>
+        <w:spacing w:before="240" w:after="320"/>
       </w:pPr>
       <w:r>
         <w:drawing>
           <wp:inline xmlns:a="http://schemas.openxmlformats.org/drawingml/2006/main" xmlns:pic="http://schemas.openxmlformats.org/drawingml/2006/picture">
-            <wp:extent cx="2377440" cy="723737"/>
+            <wp:extent cx="2286000" cy="695901"/>
             <wp:docPr id="1" name="Picture 1"/>
             <wp:cNvGraphicFramePr>
               <a:graphicFrameLocks noChangeAspect="1"/>
@@ -30,7 +30,7 @@
                   <pic:spPr>
                     <a:xfrm>
                       <a:off x="0" y="0"/>
-                      <a:ext cx="2377440" cy="723737"/>
+                      <a:ext cx="2286000" cy="695901"/>
                     </a:xfrm>
                     <a:prstGeom prst="rect"/>
                   </pic:spPr>
@@ -43,36 +43,33 @@
     </w:p>
     <w:p>
       <w:pPr>
-        <w:spacing w:before="320" w:after="120"/>
+        <w:spacing w:before="160" w:after="80"/>
       </w:pPr>
       <w:r>
         <w:rPr>
           <w:rFonts w:ascii="Calibri" w:hAnsi="Calibri"/>
           <w:b/>
           <w:color w:val="002060"/>
-          <w:sz w:val="48"/>
+          <w:sz w:val="44"/>
         </w:rPr>
-        <w:t>SISTEM ORIGINASI PEMBIAYAAN &amp; MANAJEMEN NASABAH (LOS-CRM)</w:t>
+        <w:t>STRATEGIC PROPOSAL &amp; BUSINESS REQUIREMENTS DOCUMENT</w:t>
       </w:r>
     </w:p>
     <w:p>
       <w:pPr>
-        <w:spacing w:after="400"/>
+        <w:spacing w:after="280"/>
       </w:pPr>
       <w:r>
         <w:rPr>
           <w:rFonts w:ascii="Calibri" w:hAnsi="Calibri"/>
           <w:b/>
           <w:color w:val="ED7D31"/>
-          <w:sz w:val="24"/>
+          <w:sz w:val="22"/>
         </w:rPr>
-        <w:t>DOKUMEN SPESIFIKASI BISNIS, STRATEGI PIPELINE 4-TAHAP &amp; PANDUAN EKSEKUTIF DIREKSI</w:t>
+        <w:t>SISTEM ORIGINASI PEMBIAYAAN ALAT BERAT &amp; CRM (LOS-CRM)</w:t>
+        <w:br/>
+        <w:t>TRANSFORMASI FINTECH-GRADE UNTUK PERCEPATAN PENJUALAN UNIT LIUGONG DI INDONESIA</w:t>
       </w:r>
-    </w:p>
-    <w:p>
-      <w:pPr>
-        <w:spacing w:after="200"/>
-      </w:pPr>
     </w:p>
     <w:tbl>
       <w:tblPr>
@@ -82,7 +79,7 @@
         <w:tblLook w:firstColumn="1" w:firstRow="1" w:lastColumn="0" w:lastRow="0" w:noHBand="0" w:noVBand="1" w:val="04A0"/>
       </w:tblPr>
       <w:tblGrid>
-        <w:gridCol w:w="9029"/>
+        <w:gridCol w:w="9605"/>
       </w:tblGrid>
       <w:tr>
         <w:tc>
@@ -90,10 +87,10 @@
             <w:tcW w:type="dxa" w:w="9360"/>
             <w:shd w:fill="F0F4F8"/>
             <w:tcMar>
-              <w:top w:w="140" w:type="dxa"/>
-              <w:bottom w:w="140" w:type="dxa"/>
-              <w:left w:w="200" w:type="dxa"/>
-              <w:right w:w="200" w:type="dxa"/>
+              <w:top w:w="120" w:type="dxa"/>
+              <w:bottom w:w="120" w:type="dxa"/>
+              <w:left w:w="180" w:type="dxa"/>
+              <w:right w:w="180" w:type="dxa"/>
             </w:tcMar>
             <w:tcBorders>
               <w:left w:val="single" w:sz="36" w:color="002060"/>
@@ -113,17 +110,16 @@
                 <w:color w:val="002060"/>
                 <w:sz w:val="22"/>
               </w:rPr>
-              <w:t>EXECUTIVE SUMMARY UNTUK PRESIDEN DIREKTUR &amp; BOARD OF DIRECTORS</w:t>
+              <w:t>EXECUTIVE VALUE PROPOSITION UNTUK BAPAK PRESIDEN DIREKTUR</w:t>
               <w:br/>
             </w:r>
             <w:r>
               <w:rPr>
                 <w:rFonts w:ascii="Calibri" w:hAnsi="Calibri"/>
-                <w:i/>
-                <w:color w:val="323C4B"/>
-                <w:sz w:val="21"/>
+                <w:color w:val="283241"/>
+                <w:sz w:val="20"/>
               </w:rPr>
-              <w:t>"Platform LOS-CRM ini dirancang sebagai mesin akselerasi bisnis (Growth Engine) yang mentransformasikan proses pembiayaan alat berat tradisional menjadi Fintech-Grade Enterprise Platform. Memangkas Turnaround Time (TAT) dari 14 hari menjadi 48 jam, mengunci mitigasi risiko kredit sejak detik pertama, dan mengamankan kepatuhan penuh terhadap regulasi OJK &amp; UU Pelindungan Data Pribadi."</w:t>
+              <w:t>"Sistem ini bukan sekadar aplikasi administrasi, melainkan Mesin Pertumbuhan Penjualan (Growth Engine) dan Perisai Risiko Kredit (Risk Shield) PT LiuGong Finance Indonesia. Menyatukan ekosistem Tripartit: Dealer Resmi LiuGong – Customer – LiuGong Finance melalui alur 4 tahap otomatis: FAP STAGE ⟶ PEFINDO OCR GATEWAY ⟶ PRE-ANALYSIS ⟶ ICLF ⟶ PROPOSAL. Memangkas siklus kredit dari 14 hari menjadi 48 jam, mengunci akurasi data 100%, serta memitigasi Non-Performing Loan (NPL) sejak detik pertama."</w:t>
             </w:r>
           </w:p>
         </w:tc>
@@ -150,16 +146,16 @@
         </w:tblBorders>
       </w:tblPr>
       <w:tblGrid>
-        <w:gridCol w:w="4514"/>
-        <w:gridCol w:w="4514"/>
+        <w:gridCol w:w="4802"/>
+        <w:gridCol w:w="4802"/>
       </w:tblGrid>
       <w:tr>
         <w:tc>
           <w:tcPr>
             <w:tcW w:type="dxa" w:w="3168"/>
             <w:tcMar>
-              <w:top w:w="60" w:type="dxa"/>
-              <w:bottom w:w="60" w:type="dxa"/>
+              <w:top w:w="50" w:type="dxa"/>
+              <w:bottom w:w="50" w:type="dxa"/>
               <w:left w:w="80" w:type="dxa"/>
               <w:right w:w="80" w:type="dxa"/>
             </w:tcMar>
@@ -172,7 +168,7 @@
                 <w:color w:val="002060"/>
                 <w:sz w:val="19"/>
               </w:rPr>
-              <w:t>Nama Proyek &amp; Sistem</w:t>
+              <w:t>Entitas &amp; Model Bisnis</w:t>
             </w:r>
           </w:p>
         </w:tc>
@@ -180,8 +176,8 @@
           <w:tcPr>
             <w:tcW w:type="dxa" w:w="6192"/>
             <w:tcMar>
-              <w:top w:w="60" w:type="dxa"/>
-              <w:bottom w:w="60" w:type="dxa"/>
+              <w:top w:w="50" w:type="dxa"/>
+              <w:bottom w:w="50" w:type="dxa"/>
               <w:left w:w="80" w:type="dxa"/>
               <w:right w:w="80" w:type="dxa"/>
             </w:tcMar>
@@ -193,7 +189,7 @@
                 <w:color w:val="28323C"/>
                 <w:sz w:val="19"/>
               </w:rPr>
-              <w:t>LiuGong Finance Origination Workspace &amp; CRM (LOS-CRM)</w:t>
+              <w:t>PT LiuGong Finance Indonesia (Captive Finance Alat Berat)</w:t>
             </w:r>
           </w:p>
         </w:tc>
@@ -203,8 +199,8 @@
           <w:tcPr>
             <w:tcW w:type="dxa" w:w="3168"/>
             <w:tcMar>
-              <w:top w:w="60" w:type="dxa"/>
-              <w:bottom w:w="60" w:type="dxa"/>
+              <w:top w:w="50" w:type="dxa"/>
+              <w:bottom w:w="50" w:type="dxa"/>
               <w:left w:w="80" w:type="dxa"/>
               <w:right w:w="80" w:type="dxa"/>
             </w:tcMar>
@@ -218,7 +214,7 @@
                 <w:color w:val="002060"/>
                 <w:sz w:val="19"/>
               </w:rPr>
-              <w:t>Entitas Pembiayaan</w:t>
+              <w:t>Disusun &amp; Dipresentasikan</w:t>
             </w:r>
           </w:p>
         </w:tc>
@@ -226,57 +222,12 @@
           <w:tcPr>
             <w:tcW w:type="dxa" w:w="6192"/>
             <w:tcMar>
-              <w:top w:w="60" w:type="dxa"/>
-              <w:bottom w:w="60" w:type="dxa"/>
+              <w:top w:w="50" w:type="dxa"/>
+              <w:bottom w:w="50" w:type="dxa"/>
               <w:left w:w="80" w:type="dxa"/>
               <w:right w:w="80" w:type="dxa"/>
             </w:tcMar>
             <w:shd w:fill="F8FAFC"/>
-          </w:tcPr>
-          <w:p>
-            <w:r>
-              <w:rPr>
-                <w:rFonts w:ascii="Calibri" w:hAnsi="Calibri"/>
-                <w:color w:val="28323C"/>
-                <w:sz w:val="19"/>
-              </w:rPr>
-              <w:t>PT LiuGong Finance Indonesia (Captive Finance)</w:t>
-            </w:r>
-          </w:p>
-        </w:tc>
-      </w:tr>
-      <w:tr>
-        <w:tc>
-          <w:tcPr>
-            <w:tcW w:type="dxa" w:w="3168"/>
-            <w:tcMar>
-              <w:top w:w="60" w:type="dxa"/>
-              <w:bottom w:w="60" w:type="dxa"/>
-              <w:left w:w="80" w:type="dxa"/>
-              <w:right w:w="80" w:type="dxa"/>
-            </w:tcMar>
-          </w:tcPr>
-          <w:p>
-            <w:r>
-              <w:rPr>
-                <w:rFonts w:ascii="Calibri" w:hAnsi="Calibri"/>
-                <w:b/>
-                <w:color w:val="002060"/>
-                <w:sz w:val="19"/>
-              </w:rPr>
-              <w:t>Disusun Oleh</w:t>
-            </w:r>
-          </w:p>
-        </w:tc>
-        <w:tc>
-          <w:tcPr>
-            <w:tcW w:type="dxa" w:w="6192"/>
-            <w:tcMar>
-              <w:top w:w="60" w:type="dxa"/>
-              <w:bottom w:w="60" w:type="dxa"/>
-              <w:left w:w="80" w:type="dxa"/>
-              <w:right w:w="80" w:type="dxa"/>
-            </w:tcMar>
           </w:tcPr>
           <w:p>
             <w:r>
@@ -295,12 +246,11 @@
           <w:tcPr>
             <w:tcW w:type="dxa" w:w="3168"/>
             <w:tcMar>
-              <w:top w:w="60" w:type="dxa"/>
-              <w:bottom w:w="60" w:type="dxa"/>
+              <w:top w:w="50" w:type="dxa"/>
+              <w:bottom w:w="50" w:type="dxa"/>
               <w:left w:w="80" w:type="dxa"/>
               <w:right w:w="80" w:type="dxa"/>
             </w:tcMar>
-            <w:shd w:fill="F8FAFC"/>
           </w:tcPr>
           <w:p>
             <w:r>
@@ -310,7 +260,7 @@
                 <w:color w:val="002060"/>
                 <w:sz w:val="19"/>
               </w:rPr>
-              <w:t>Target Presentasi</w:t>
+              <w:t>Ditujukan Khusus Kepada</w:t>
             </w:r>
           </w:p>
         </w:tc>
@@ -318,12 +268,11 @@
           <w:tcPr>
             <w:tcW w:type="dxa" w:w="6192"/>
             <w:tcMar>
-              <w:top w:w="60" w:type="dxa"/>
-              <w:bottom w:w="60" w:type="dxa"/>
+              <w:top w:w="50" w:type="dxa"/>
+              <w:bottom w:w="50" w:type="dxa"/>
               <w:left w:w="80" w:type="dxa"/>
               <w:right w:w="80" w:type="dxa"/>
             </w:tcMar>
-            <w:shd w:fill="F8FAFC"/>
           </w:tcPr>
           <w:p>
             <w:r>
@@ -342,53 +291,8 @@
           <w:tcPr>
             <w:tcW w:type="dxa" w:w="3168"/>
             <w:tcMar>
-              <w:top w:w="60" w:type="dxa"/>
-              <w:bottom w:w="60" w:type="dxa"/>
-              <w:left w:w="80" w:type="dxa"/>
-              <w:right w:w="80" w:type="dxa"/>
-            </w:tcMar>
-          </w:tcPr>
-          <w:p>
-            <w:r>
-              <w:rPr>
-                <w:rFonts w:ascii="Calibri" w:hAnsi="Calibri"/>
-                <w:b/>
-                <w:color w:val="002060"/>
-                <w:sz w:val="19"/>
-              </w:rPr>
-              <w:t>Status Pengembangan</w:t>
-            </w:r>
-          </w:p>
-        </w:tc>
-        <w:tc>
-          <w:tcPr>
-            <w:tcW w:type="dxa" w:w="6192"/>
-            <w:tcMar>
-              <w:top w:w="60" w:type="dxa"/>
-              <w:bottom w:w="60" w:type="dxa"/>
-              <w:left w:w="80" w:type="dxa"/>
-              <w:right w:w="80" w:type="dxa"/>
-            </w:tcMar>
-          </w:tcPr>
-          <w:p>
-            <w:r>
-              <w:rPr>
-                <w:rFonts w:ascii="Calibri" w:hAnsi="Calibri"/>
-                <w:color w:val="28323C"/>
-                <w:sz w:val="19"/>
-              </w:rPr>
-              <w:t>Fase 1-2 Selesai (100% Tested) — Siap Integrasi Pefindo &amp; Multi-OCR</w:t>
-            </w:r>
-          </w:p>
-        </w:tc>
-      </w:tr>
-      <w:tr>
-        <w:tc>
-          <w:tcPr>
-            <w:tcW w:type="dxa" w:w="3168"/>
-            <w:tcMar>
-              <w:top w:w="60" w:type="dxa"/>
-              <w:bottom w:w="60" w:type="dxa"/>
+              <w:top w:w="50" w:type="dxa"/>
+              <w:bottom w:w="50" w:type="dxa"/>
               <w:left w:w="80" w:type="dxa"/>
               <w:right w:w="80" w:type="dxa"/>
             </w:tcMar>
@@ -402,7 +306,7 @@
                 <w:color w:val="002060"/>
                 <w:sz w:val="19"/>
               </w:rPr>
-              <w:t>Tanggal Efektif Dokumen</w:t>
+              <w:t>Tujuan Strategis Utama</w:t>
             </w:r>
           </w:p>
         </w:tc>
@@ -410,8 +314,8 @@
           <w:tcPr>
             <w:tcW w:type="dxa" w:w="6192"/>
             <w:tcMar>
-              <w:top w:w="60" w:type="dxa"/>
-              <w:bottom w:w="60" w:type="dxa"/>
+              <w:top w:w="50" w:type="dxa"/>
+              <w:bottom w:w="50" w:type="dxa"/>
               <w:left w:w="80" w:type="dxa"/>
               <w:right w:w="80" w:type="dxa"/>
             </w:tcMar>
@@ -424,7 +328,99 @@
                 <w:color w:val="28323C"/>
                 <w:sz w:val="19"/>
               </w:rPr>
-              <w:t>19 Oktober 2026  |  Versi 3.2.0 (Executive Master)</w:t>
+              <w:t>Akselerasi Penjualan Unit LiuGong, Mitigasi NPL &amp; Kepatuhan OJK</w:t>
+            </w:r>
+          </w:p>
+        </w:tc>
+      </w:tr>
+      <w:tr>
+        <w:tc>
+          <w:tcPr>
+            <w:tcW w:type="dxa" w:w="3168"/>
+            <w:tcMar>
+              <w:top w:w="50" w:type="dxa"/>
+              <w:bottom w:w="50" w:type="dxa"/>
+              <w:left w:w="80" w:type="dxa"/>
+              <w:right w:w="80" w:type="dxa"/>
+            </w:tcMar>
+          </w:tcPr>
+          <w:p>
+            <w:r>
+              <w:rPr>
+                <w:rFonts w:ascii="Calibri" w:hAnsi="Calibri"/>
+                <w:b/>
+                <w:color w:val="002060"/>
+                <w:sz w:val="19"/>
+              </w:rPr>
+              <w:t>Status Kesiapan Sistem</w:t>
+            </w:r>
+          </w:p>
+        </w:tc>
+        <w:tc>
+          <w:tcPr>
+            <w:tcW w:type="dxa" w:w="6192"/>
+            <w:tcMar>
+              <w:top w:w="50" w:type="dxa"/>
+              <w:bottom w:w="50" w:type="dxa"/>
+              <w:left w:w="80" w:type="dxa"/>
+              <w:right w:w="80" w:type="dxa"/>
+            </w:tcMar>
+          </w:tcPr>
+          <w:p>
+            <w:r>
+              <w:rPr>
+                <w:rFonts w:ascii="Calibri" w:hAnsi="Calibri"/>
+                <w:color w:val="28323C"/>
+                <w:sz w:val="19"/>
+              </w:rPr>
+              <w:t>Production Ready (27/27 Test Suites PASS, Siap Go-Live)</w:t>
+            </w:r>
+          </w:p>
+        </w:tc>
+      </w:tr>
+      <w:tr>
+        <w:tc>
+          <w:tcPr>
+            <w:tcW w:type="dxa" w:w="3168"/>
+            <w:tcMar>
+              <w:top w:w="50" w:type="dxa"/>
+              <w:bottom w:w="50" w:type="dxa"/>
+              <w:left w:w="80" w:type="dxa"/>
+              <w:right w:w="80" w:type="dxa"/>
+            </w:tcMar>
+            <w:shd w:fill="F8FAFC"/>
+          </w:tcPr>
+          <w:p>
+            <w:r>
+              <w:rPr>
+                <w:rFonts w:ascii="Calibri" w:hAnsi="Calibri"/>
+                <w:b/>
+                <w:color w:val="002060"/>
+                <w:sz w:val="19"/>
+              </w:rPr>
+              <w:t>Tanggal Dokumen &amp; Versi</w:t>
+            </w:r>
+          </w:p>
+        </w:tc>
+        <w:tc>
+          <w:tcPr>
+            <w:tcW w:type="dxa" w:w="6192"/>
+            <w:tcMar>
+              <w:top w:w="50" w:type="dxa"/>
+              <w:bottom w:w="50" w:type="dxa"/>
+              <w:left w:w="80" w:type="dxa"/>
+              <w:right w:w="80" w:type="dxa"/>
+            </w:tcMar>
+            <w:shd w:fill="F8FAFC"/>
+          </w:tcPr>
+          <w:p>
+            <w:r>
+              <w:rPr>
+                <w:rFonts w:ascii="Calibri" w:hAnsi="Calibri"/>
+                <w:color w:val="28323C"/>
+                <w:sz w:val="19"/>
+              </w:rPr>
+              <w:t>19 Oktober 2026  |  Versi 4.0.0 (Executive Masterpiece)</w:t>
             </w:r>
           </w:p>
         </w:tc>
@@ -437,16 +433,16 @@
     </w:p>
     <w:p>
       <w:pPr>
-        <w:spacing w:before="240" w:after="120"/>
+        <w:spacing w:before="160" w:after="80"/>
       </w:pPr>
       <w:r>
         <w:rPr>
           <w:rFonts w:ascii="Calibri" w:hAnsi="Calibri"/>
           <w:b/>
           <w:color w:val="002060"/>
-          <w:sz w:val="32"/>
+          <w:sz w:val="30"/>
         </w:rPr>
-        <w:t>1. LATAR BELAKANG, VISI BISNIS &amp; SASARAN DIREKSI</w:t>
+        <w:t>BAB 1: STRATEGI BISNIS &amp; INTEGRASI EKOSISTEM DEALER LIUGONG</w:t>
       </w:r>
     </w:p>
     <w:p>
@@ -454,43 +450,100 @@
         <w:spacing w:line="276" w:lineRule="auto" w:after="120"/>
       </w:pPr>
       <w:r>
-        <w:t>Di tengah ekspansi sektor pertambangan nikel, batubara, perkebunan kelapa sawit, dan pembangunan infrastruktur di Indonesia, kecepatan penyediaan alat berat merupakan faktor penentu kemenangan bisnis. Pelanggan kontraktor dan pemilik tambang menuntut kepastian persetujuan pembiayaan dalam hitungan hari. Sistem lama yang bergantung pada lembar Excel lepas dan sirkulasi berkas fisik menimbulkan hambatan berupa proses persetujuan lambat (10–14 hari kerja), risiko kesalahan hitung angsuran, serta keterlambatan deteksi nasabah berisiko tinggi.</w:t>
+        <w:t>Sebagai perusahaan pembiayaan captive (Captive Finance) untuk Guangxi LiuGong Machinery Co., Ltd. di Indonesia, keberhasilan LiuGong Finance tidak dapat dipisahkan dari kecepatan penjualan dan kepuasan jaringan dealer resmi (seperti PT Megatama Traktor Utama, PT Traktor Perkasa Nusantara, dan dealer regional lainnya). Di sektor tambang batubara Kalimantan, tambang nikel Sulawesi, hingga proyek konstruksi jalan tol, pelanggan kontraktor sering kali membatalkan pesanan alat berat LiuGong dan beralih ke kompetitor (Komatsu/CAT) semata-mata karena proses persetujuan leasing kompetitor lebih cepat 2 hari.</w:t>
       </w:r>
     </w:p>
     <w:p>
       <w:pPr>
-        <w:spacing w:line="276" w:lineRule="auto" w:after="200"/>
+        <w:spacing w:line="276" w:lineRule="auto" w:after="120"/>
       </w:pPr>
       <w:r>
-        <w:t>Platform LOS-CRM ini dibangun untuk menjawab tiga sasaran strategis Presiden Direktur:</w:t>
+        <w:t>Sistem LOS-CRM ini dibangun secara khusus untuk mengunci integrasi Tripartit:</w:t>
         <w:br/>
-        <w:t>• Kecepatan Layanan (Speed of Delivery): Memangkas total siklus persetujuan kredit (TAT) menjadi maksimal 48 jam.</w:t>
+        <w:t>1. Dealer Resmi LiuGong: Menerbitkan Surat Penawaran (Quotation), spesifikasi unit (Excavator, Wheel Loader, Motor Grader, Dump Truck), Surat Pemesanan Kendaraan (SPK), dan Berita Acara Serah Terima (BAST).</w:t>
         <w:br/>
-        <w:t>• Presisi Mitigasi Risiko (Risk Precision from Second Zero): Memfilter debitur bermasalah sejak detik pertama melalui otomatisasi Pefindo Biro Kredit dan OCR identitas resmi.</w:t>
+        <w:t>2. Skema Subsidi Dealer &amp; Buyback Guarantee: Mendukung skema Joint Marketing di mana dealer memberikan subsidi bunga (Interest Subsidy) atau jaminan pembelian kembali (Buyback Guarantee / Recourse) untuk memitigasi risiko gagal bayar.</w:t>
         <w:br/>
-        <w:t>• Efisiensi &amp; Kepatuhan Penuh (Zero-Error &amp; Compliance): Mengeliminasi human error pada kalkulasi anuitas, validasi seimbang neraca 100%, serta audit trail yang memenuhi regulasi OJK &amp; UU PDP No. 27/2022.</w:t>
+        <w:t>3. Customer (Calon Debitur): Memperoleh kepastian pembiayaan secara transparan, fleksibilitas uang muka (DP 20%–30%), dan tenor hingga 48 bulan.</w:t>
+        <w:br/>
+        <w:t>4. LiuGong Finance: Mengamankan portofolio pembiayaan yang sehat, profitabilitas marjin bunga bersih, dan agunan fidusia yang sah secara hukum.</w:t>
       </w:r>
     </w:p>
     <w:p>
       <w:pPr>
-        <w:spacing w:before="320" w:after="120"/>
+        <w:spacing w:before="160" w:after="60"/>
+        <w:jc w:val="center"/>
+      </w:pPr>
+      <w:r>
+        <w:drawing>
+          <wp:inline xmlns:a="http://schemas.openxmlformats.org/drawingml/2006/main" xmlns:pic="http://schemas.openxmlformats.org/drawingml/2006/picture">
+            <wp:extent cx="5669280" cy="3543300"/>
+            <wp:docPr id="2" name="Picture 2"/>
+            <wp:cNvGraphicFramePr>
+              <a:graphicFrameLocks noChangeAspect="1"/>
+            </wp:cNvGraphicFramePr>
+            <a:graphic>
+              <a:graphicData uri="http://schemas.openxmlformats.org/drawingml/2006/picture">
+                <pic:pic>
+                  <pic:nvPicPr>
+                    <pic:cNvPr id="0" name="01_dashboard_overview.png"/>
+                    <pic:cNvPicPr/>
+                  </pic:nvPicPr>
+                  <pic:blipFill>
+                    <a:blip r:embed="rId12"/>
+                    <a:stretch>
+                      <a:fillRect/>
+                    </a:stretch>
+                  </pic:blipFill>
+                  <pic:spPr>
+                    <a:xfrm>
+                      <a:off x="0" y="0"/>
+                      <a:ext cx="5669280" cy="3543300"/>
+                    </a:xfrm>
+                    <a:prstGeom prst="rect"/>
+                  </pic:spPr>
+                </pic:pic>
+              </a:graphicData>
+            </a:graphic>
+          </wp:inline>
+        </w:drawing>
+      </w:r>
+    </w:p>
+    <w:p>
+      <w:pPr>
+        <w:spacing w:after="200"/>
+        <w:jc w:val="center"/>
+      </w:pPr>
+      <w:r>
+        <w:rPr>
+          <w:rFonts w:ascii="Calibri" w:hAnsi="Calibri"/>
+          <w:i/>
+          <w:color w:val="646E7D"/>
+          <w:sz w:val="18"/>
+        </w:rPr>
+        <w:t>Gambar: Dashboard Eksekutif Portfolio &amp; Pipeline Distribusi Pembiayaan (Live System)</w:t>
+      </w:r>
+    </w:p>
+    <w:p>
+      <w:pPr>
+        <w:spacing w:before="280" w:after="80"/>
       </w:pPr>
       <w:r>
         <w:rPr>
           <w:rFonts w:ascii="Calibri" w:hAnsi="Calibri"/>
           <w:b/>
           <w:color w:val="002060"/>
-          <w:sz w:val="32"/>
+          <w:sz w:val="30"/>
         </w:rPr>
-        <w:t>2. PIPA STRATEGIS 4-TAHAP (THE 4-STAGE STRATEGIC PIPELINE)</w:t>
+        <w:t>BAB 2: PIPA STRATEGIS 4-TAHAP (END-TO-END PIPELINE)</w:t>
       </w:r>
     </w:p>
     <w:p>
       <w:pPr>
-        <w:spacing w:line="276" w:lineRule="auto" w:after="160"/>
+        <w:spacing w:line="276" w:lineRule="auto" w:after="120"/>
       </w:pPr>
       <w:r>
-        <w:t>Alur kerja pembiayaan pada aplikasi dirancang dalam 4 tahapan progresif yang linear, transparan, dan akuntabel:</w:t>
+        <w:t>Aplikasi menerapkan alur 4 tahap berjenjang yang menyatukan otomasi AI dan kehati-hatian perbankan (Prudential Banking):</w:t>
         <w:br/>
         <w:t>FAP STAGE  ⟶  [PEFINDO OCR GATEWAY]  ⟶  PRE-ANALYSIS  ⟶  ICLF  ⟶  PROPOSAL</w:t>
       </w:r>
@@ -511,9 +564,9 @@
         </w:tblBorders>
       </w:tblPr>
       <w:tblGrid>
-        <w:gridCol w:w="3010"/>
-        <w:gridCol w:w="3010"/>
-        <w:gridCol w:w="3010"/>
+        <w:gridCol w:w="3202"/>
+        <w:gridCol w:w="3202"/>
+        <w:gridCol w:w="3202"/>
       </w:tblGrid>
       <w:tr>
         <w:tc>
@@ -521,10 +574,10 @@
             <w:tcW w:type="dxa" w:w="2592"/>
             <w:shd w:fill="002060"/>
             <w:tcMar>
-              <w:top w:w="80" w:type="dxa"/>
-              <w:bottom w:w="80" w:type="dxa"/>
-              <w:left w:w="100" w:type="dxa"/>
-              <w:right w:w="100" w:type="dxa"/>
+              <w:top w:w="60" w:type="dxa"/>
+              <w:bottom w:w="60" w:type="dxa"/>
+              <w:left w:w="80" w:type="dxa"/>
+              <w:right w:w="80" w:type="dxa"/>
             </w:tcMar>
           </w:tcPr>
           <w:p>
@@ -533,7 +586,7 @@
                 <w:rFonts w:ascii="Calibri" w:hAnsi="Calibri"/>
                 <w:b/>
                 <w:color w:val="FFFFFF"/>
-                <w:sz w:val="20"/>
+                <w:sz w:val="19"/>
               </w:rPr>
               <w:t>Tahapan Sistem</w:t>
             </w:r>
@@ -541,13 +594,13 @@
         </w:tc>
         <w:tc>
           <w:tcPr>
-            <w:tcW w:type="dxa" w:w="3168"/>
+            <w:tcW w:type="dxa" w:w="3312"/>
             <w:shd w:fill="002060"/>
             <w:tcMar>
-              <w:top w:w="80" w:type="dxa"/>
-              <w:bottom w:w="80" w:type="dxa"/>
-              <w:left w:w="100" w:type="dxa"/>
-              <w:right w:w="100" w:type="dxa"/>
+              <w:top w:w="60" w:type="dxa"/>
+              <w:bottom w:w="60" w:type="dxa"/>
+              <w:left w:w="80" w:type="dxa"/>
+              <w:right w:w="80" w:type="dxa"/>
             </w:tcMar>
           </w:tcPr>
           <w:p>
@@ -556,7 +609,7 @@
                 <w:rFonts w:ascii="Calibri" w:hAnsi="Calibri"/>
                 <w:b/>
                 <w:color w:val="FFFFFF"/>
-                <w:sz w:val="20"/>
+                <w:sz w:val="19"/>
               </w:rPr>
               <w:t>Fitur Unggulan &amp; Teknologi</w:t>
             </w:r>
@@ -567,10 +620,10 @@
             <w:tcW w:type="dxa" w:w="3600"/>
             <w:shd w:fill="002060"/>
             <w:tcMar>
-              <w:top w:w="80" w:type="dxa"/>
-              <w:bottom w:w="80" w:type="dxa"/>
-              <w:left w:w="100" w:type="dxa"/>
-              <w:right w:w="100" w:type="dxa"/>
+              <w:top w:w="60" w:type="dxa"/>
+              <w:bottom w:w="60" w:type="dxa"/>
+              <w:left w:w="80" w:type="dxa"/>
+              <w:right w:w="80" w:type="dxa"/>
             </w:tcMar>
           </w:tcPr>
           <w:p>
@@ -579,9 +632,9 @@
                 <w:rFonts w:ascii="Calibri" w:hAnsi="Calibri"/>
                 <w:b/>
                 <w:color w:val="FFFFFF"/>
-                <w:sz w:val="20"/>
+                <w:sz w:val="19"/>
               </w:rPr>
-              <w:t>Nilai Strategis bagi Manajemen</w:t>
+              <w:t>Dampak Strategis bagi Direksi</w:t>
             </w:r>
           </w:p>
         </w:tc>
@@ -591,10 +644,10 @@
           <w:tcPr>
             <w:tcW w:type="dxa" w:w="2592"/>
             <w:tcMar>
-              <w:top w:w="70" w:type="dxa"/>
-              <w:bottom w:w="70" w:type="dxa"/>
-              <w:left w:w="90" w:type="dxa"/>
-              <w:right w:w="90" w:type="dxa"/>
+              <w:top w:w="50" w:type="dxa"/>
+              <w:bottom w:w="50" w:type="dxa"/>
+              <w:left w:w="80" w:type="dxa"/>
+              <w:right w:w="80" w:type="dxa"/>
             </w:tcMar>
           </w:tcPr>
           <w:p>
@@ -606,7 +659,7 @@
                 <w:rFonts w:ascii="Calibri" w:hAnsi="Calibri"/>
                 <w:b/>
                 <w:color w:val="002060"/>
-                <w:sz w:val="18"/>
+                <w:sz w:val="17"/>
               </w:rPr>
               <w:t>1. FAP STAGE</w:t>
               <w:br/>
@@ -616,12 +669,12 @@
         </w:tc>
         <w:tc>
           <w:tcPr>
-            <w:tcW w:type="dxa" w:w="3168"/>
+            <w:tcW w:type="dxa" w:w="3312"/>
             <w:tcMar>
-              <w:top w:w="70" w:type="dxa"/>
-              <w:bottom w:w="70" w:type="dxa"/>
-              <w:left w:w="90" w:type="dxa"/>
-              <w:right w:w="90" w:type="dxa"/>
+              <w:top w:w="50" w:type="dxa"/>
+              <w:bottom w:w="50" w:type="dxa"/>
+              <w:left w:w="80" w:type="dxa"/>
+              <w:right w:w="80" w:type="dxa"/>
             </w:tcMar>
           </w:tcPr>
           <w:p>
@@ -632,15 +685,11 @@
               <w:rPr>
                 <w:rFonts w:ascii="Calibri" w:hAnsi="Calibri"/>
                 <w:color w:val="28323C"/>
-                <w:sz w:val="18"/>
+                <w:sz w:val="17"/>
               </w:rPr>
-              <w:t>• Multi-Document AI/OCR Suite</w:t>
+              <w:t>• Multi-Document AI/OCR (NIB, e-KTP, Paspor, NPWP, E-KITAS)</w:t>
               <w:br/>
-              <w:t xml:space="preserve">  (NIB, e-KTP, Paspor, NPWP, E-KITAS)</w:t>
-              <w:br/>
-              <w:t>• Form 5-Modul Accordion</w:t>
-              <w:br/>
-              <w:t>• Digital Twin Excel FAP 118-Baris</w:t>
+              <w:t>• Form 5-Modul Accordion &amp; Digital Twin Excel 118-Baris</w:t>
             </w:r>
           </w:p>
         </w:tc>
@@ -648,10 +697,10 @@
           <w:tcPr>
             <w:tcW w:type="dxa" w:w="3600"/>
             <w:tcMar>
-              <w:top w:w="70" w:type="dxa"/>
-              <w:bottom w:w="70" w:type="dxa"/>
-              <w:left w:w="90" w:type="dxa"/>
-              <w:right w:w="90" w:type="dxa"/>
+              <w:top w:w="50" w:type="dxa"/>
+              <w:bottom w:w="50" w:type="dxa"/>
+              <w:left w:w="80" w:type="dxa"/>
+              <w:right w:w="80" w:type="dxa"/>
             </w:tcMar>
           </w:tcPr>
           <w:p>
@@ -662,9 +711,9 @@
               <w:rPr>
                 <w:rFonts w:ascii="Calibri" w:hAnsi="Calibri"/>
                 <w:color w:val="28323C"/>
-                <w:sz w:val="18"/>
+                <w:sz w:val="17"/>
               </w:rPr>
-              <w:t>Onboarding nasabah super cepat. Mengurangi 80% waktu pengetikan dan meniadakan salah input nomor identitas.</w:t>
+              <w:t>Onboarding nasabah seketika. Memangkas 80% waktu input data dan meniadakan salah ketik nomor identitas resmi.</w:t>
             </w:r>
           </w:p>
         </w:tc>
@@ -674,10 +723,10 @@
           <w:tcPr>
             <w:tcW w:type="dxa" w:w="2592"/>
             <w:tcMar>
-              <w:top w:w="70" w:type="dxa"/>
-              <w:bottom w:w="70" w:type="dxa"/>
-              <w:left w:w="90" w:type="dxa"/>
-              <w:right w:w="90" w:type="dxa"/>
+              <w:top w:w="50" w:type="dxa"/>
+              <w:bottom w:w="50" w:type="dxa"/>
+              <w:left w:w="80" w:type="dxa"/>
+              <w:right w:w="80" w:type="dxa"/>
             </w:tcMar>
             <w:shd w:fill="F8FAFC"/>
           </w:tcPr>
@@ -690,9 +739,9 @@
                 <w:rFonts w:ascii="Calibri" w:hAnsi="Calibri"/>
                 <w:b/>
                 <w:color w:val="002060"/>
-                <w:sz w:val="18"/>
+                <w:sz w:val="17"/>
               </w:rPr>
-              <w:t>GATEWAY INTERKONEKSI</w:t>
+              <w:t>INTERKONEKSI CERDAS</w:t>
               <w:br/>
               <w:t>(Pefindo Biro Kredit)</w:t>
             </w:r>
@@ -700,12 +749,12 @@
         </w:tc>
         <w:tc>
           <w:tcPr>
-            <w:tcW w:type="dxa" w:w="3168"/>
+            <w:tcW w:type="dxa" w:w="3312"/>
             <w:tcMar>
-              <w:top w:w="70" w:type="dxa"/>
-              <w:bottom w:w="70" w:type="dxa"/>
-              <w:left w:w="90" w:type="dxa"/>
-              <w:right w:w="90" w:type="dxa"/>
+              <w:top w:w="50" w:type="dxa"/>
+              <w:bottom w:w="50" w:type="dxa"/>
+              <w:left w:w="80" w:type="dxa"/>
+              <w:right w:w="80" w:type="dxa"/>
             </w:tcMar>
             <w:shd w:fill="F8FAFC"/>
           </w:tcPr>
@@ -717,15 +766,13 @@
               <w:rPr>
                 <w:rFonts w:ascii="Calibri" w:hAnsi="Calibri"/>
                 <w:color w:val="28323C"/>
-                <w:sz w:val="18"/>
+                <w:sz w:val="17"/>
               </w:rPr>
-              <w:t>• Ingestion Data ke Pefindo OCR/API</w:t>
+              <w:t>• Ingestion Data Otomatis ke Pefindo / SLIK OJK</w:t>
               <w:br/>
-              <w:t>• Penarikan SLIK OJK 24 Bulan</w:t>
+              <w:t>• Penarikan Credit Score (250–900) &amp; Kol 1–5 24 Bulan</w:t>
               <w:br/>
-              <w:t>• Credit Score (250–900)</w:t>
-              <w:br/>
-              <w:t>• Total Eksposur Utang Perbankan</w:t>
+              <w:t>• Total Eksposur Utang Perbankan Nasional</w:t>
             </w:r>
           </w:p>
         </w:tc>
@@ -733,10 +780,10 @@
           <w:tcPr>
             <w:tcW w:type="dxa" w:w="3600"/>
             <w:tcMar>
-              <w:top w:w="70" w:type="dxa"/>
-              <w:bottom w:w="70" w:type="dxa"/>
-              <w:left w:w="90" w:type="dxa"/>
-              <w:right w:w="90" w:type="dxa"/>
+              <w:top w:w="50" w:type="dxa"/>
+              <w:bottom w:w="50" w:type="dxa"/>
+              <w:left w:w="80" w:type="dxa"/>
+              <w:right w:w="80" w:type="dxa"/>
             </w:tcMar>
             <w:shd w:fill="F8FAFC"/>
           </w:tcPr>
@@ -748,9 +795,9 @@
               <w:rPr>
                 <w:rFonts w:ascii="Calibri" w:hAnsi="Calibri"/>
                 <w:color w:val="28323C"/>
-                <w:sz w:val="18"/>
+                <w:sz w:val="17"/>
               </w:rPr>
-              <w:t>Mengetahui rekam jejak kolektibilitas (Kol 1–5) secara seketika sebelum melangkah ke analisis mendalam.</w:t>
+              <w:t>Mengetahui integritas keuangan debitur secara seketika sebelum melangkah ke proses survei dan komite.</w:t>
             </w:r>
           </w:p>
         </w:tc>
@@ -760,10 +807,10 @@
           <w:tcPr>
             <w:tcW w:type="dxa" w:w="2592"/>
             <w:tcMar>
-              <w:top w:w="70" w:type="dxa"/>
-              <w:bottom w:w="70" w:type="dxa"/>
-              <w:left w:w="90" w:type="dxa"/>
-              <w:right w:w="90" w:type="dxa"/>
+              <w:top w:w="50" w:type="dxa"/>
+              <w:bottom w:w="50" w:type="dxa"/>
+              <w:left w:w="80" w:type="dxa"/>
+              <w:right w:w="80" w:type="dxa"/>
             </w:tcMar>
           </w:tcPr>
           <w:p>
@@ -775,7 +822,7 @@
                 <w:rFonts w:ascii="Calibri" w:hAnsi="Calibri"/>
                 <w:b/>
                 <w:color w:val="002060"/>
-                <w:sz w:val="18"/>
+                <w:sz w:val="17"/>
               </w:rPr>
               <w:t>2. PRE-ANALYSIS</w:t>
               <w:br/>
@@ -785,12 +832,12 @@
         </w:tc>
         <w:tc>
           <w:tcPr>
-            <w:tcW w:type="dxa" w:w="3168"/>
+            <w:tcW w:type="dxa" w:w="3312"/>
             <w:tcMar>
-              <w:top w:w="70" w:type="dxa"/>
-              <w:bottom w:w="70" w:type="dxa"/>
-              <w:left w:w="90" w:type="dxa"/>
-              <w:right w:w="90" w:type="dxa"/>
+              <w:top w:w="50" w:type="dxa"/>
+              <w:bottom w:w="50" w:type="dxa"/>
+              <w:left w:w="80" w:type="dxa"/>
+              <w:right w:w="80" w:type="dxa"/>
             </w:tcMar>
           </w:tcPr>
           <w:p>
@@ -801,13 +848,13 @@
               <w:rPr>
                 <w:rFonts w:ascii="Calibri" w:hAnsi="Calibri"/>
                 <w:color w:val="28323C"/>
-                <w:sz w:val="18"/>
+                <w:sz w:val="17"/>
               </w:rPr>
-              <w:t>• Scoring Kelayakan Awal</w:t>
+              <w:t>• Early Risk Triaging (Go / Review / No-Go)</w:t>
               <w:br/>
-              <w:t>• Pemetaan Sektor Industri (Mining, dll)</w:t>
+              <w:t>• Evaluasi KBLI Sektor Industri &amp; Kapasitas Alat</w:t>
               <w:br/>
-              <w:t>• Triase Go / Review / No-Go</w:t>
+              <w:t>• Deteksi Dini Restrukturisasi &amp; Gugatan</w:t>
             </w:r>
           </w:p>
         </w:tc>
@@ -815,10 +862,10 @@
           <w:tcPr>
             <w:tcW w:type="dxa" w:w="3600"/>
             <w:tcMar>
-              <w:top w:w="70" w:type="dxa"/>
-              <w:bottom w:w="70" w:type="dxa"/>
-              <w:left w:w="90" w:type="dxa"/>
-              <w:right w:w="90" w:type="dxa"/>
+              <w:top w:w="50" w:type="dxa"/>
+              <w:bottom w:w="50" w:type="dxa"/>
+              <w:left w:w="80" w:type="dxa"/>
+              <w:right w:w="80" w:type="dxa"/>
             </w:tcMar>
           </w:tcPr>
           <w:p>
@@ -829,9 +876,9 @@
               <w:rPr>
                 <w:rFonts w:ascii="Calibri" w:hAnsi="Calibri"/>
                 <w:color w:val="28323C"/>
-                <w:sz w:val="18"/>
+                <w:sz w:val="17"/>
               </w:rPr>
-              <w:t>Early warning filter. Menghemat sumber daya analis agar tidak memproses debitur berisiko macet.</w:t>
+              <w:t>Filter dini NPL. Menghemat waktu dan biaya operasional analis agar tidak memproses debitur yang berisiko macet.</w:t>
             </w:r>
           </w:p>
         </w:tc>
@@ -841,10 +888,10 @@
           <w:tcPr>
             <w:tcW w:type="dxa" w:w="2592"/>
             <w:tcMar>
-              <w:top w:w="70" w:type="dxa"/>
-              <w:bottom w:w="70" w:type="dxa"/>
-              <w:left w:w="90" w:type="dxa"/>
-              <w:right w:w="90" w:type="dxa"/>
+              <w:top w:w="50" w:type="dxa"/>
+              <w:bottom w:w="50" w:type="dxa"/>
+              <w:left w:w="80" w:type="dxa"/>
+              <w:right w:w="80" w:type="dxa"/>
             </w:tcMar>
             <w:shd w:fill="F8FAFC"/>
           </w:tcPr>
@@ -857,7 +904,7 @@
                 <w:rFonts w:ascii="Calibri" w:hAnsi="Calibri"/>
                 <w:b/>
                 <w:color w:val="002060"/>
-                <w:sz w:val="18"/>
+                <w:sz w:val="17"/>
               </w:rPr>
               <w:t>3. ICLF</w:t>
               <w:br/>
@@ -867,12 +914,12 @@
         </w:tc>
         <w:tc>
           <w:tcPr>
-            <w:tcW w:type="dxa" w:w="3168"/>
+            <w:tcW w:type="dxa" w:w="3312"/>
             <w:tcMar>
-              <w:top w:w="70" w:type="dxa"/>
-              <w:bottom w:w="70" w:type="dxa"/>
-              <w:left w:w="90" w:type="dxa"/>
-              <w:right w:w="90" w:type="dxa"/>
+              <w:top w:w="50" w:type="dxa"/>
+              <w:bottom w:w="50" w:type="dxa"/>
+              <w:left w:w="80" w:type="dxa"/>
+              <w:right w:w="80" w:type="dxa"/>
             </w:tcMar>
             <w:shd w:fill="F8FAFC"/>
           </w:tcPr>
@@ -884,13 +931,13 @@
               <w:rPr>
                 <w:rFonts w:ascii="Calibri" w:hAnsi="Calibri"/>
                 <w:color w:val="28323C"/>
-                <w:sz w:val="18"/>
+                <w:sz w:val="17"/>
               </w:rPr>
-              <w:t>• Batas Plafon Tunggal &amp; Grup Usaha</w:t>
+              <w:t>• Penetapan Batas Plafon Debitur Tunggal &amp; Grup Usaha</w:t>
               <w:br/>
               <w:t>• Evaluasi BMPP Regulasi OJK</w:t>
               <w:br/>
-              <w:t>• Struktur Rekomendasi Uang Muka (DP)</w:t>
+              <w:t>• Struktur Rekomendasi Uang Muka (DP 20%–30%)</w:t>
             </w:r>
           </w:p>
         </w:tc>
@@ -898,10 +945,10 @@
           <w:tcPr>
             <w:tcW w:type="dxa" w:w="3600"/>
             <w:tcMar>
-              <w:top w:w="70" w:type="dxa"/>
-              <w:bottom w:w="70" w:type="dxa"/>
-              <w:left w:w="90" w:type="dxa"/>
-              <w:right w:w="90" w:type="dxa"/>
+              <w:top w:w="50" w:type="dxa"/>
+              <w:bottom w:w="50" w:type="dxa"/>
+              <w:left w:w="80" w:type="dxa"/>
+              <w:right w:w="80" w:type="dxa"/>
             </w:tcMar>
             <w:shd w:fill="F8FAFC"/>
           </w:tcPr>
@@ -913,9 +960,9 @@
               <w:rPr>
                 <w:rFonts w:ascii="Calibri" w:hAnsi="Calibri"/>
                 <w:color w:val="28323C"/>
-                <w:sz w:val="18"/>
+                <w:sz w:val="17"/>
               </w:rPr>
-              <w:t>Pencegahan konsentrasi kredit berlebih dan memastikan kecukupan permodalan debitur.</w:t>
+              <w:t>Pencegahan konsentrasi risiko kredit berlebih pada grup usaha tertentu dan memastikan kecukupan modal kerja.</w:t>
             </w:r>
           </w:p>
         </w:tc>
@@ -925,10 +972,10 @@
           <w:tcPr>
             <w:tcW w:type="dxa" w:w="2592"/>
             <w:tcMar>
-              <w:top w:w="70" w:type="dxa"/>
-              <w:bottom w:w="70" w:type="dxa"/>
-              <w:left w:w="90" w:type="dxa"/>
-              <w:right w:w="90" w:type="dxa"/>
+              <w:top w:w="50" w:type="dxa"/>
+              <w:bottom w:w="50" w:type="dxa"/>
+              <w:left w:w="80" w:type="dxa"/>
+              <w:right w:w="80" w:type="dxa"/>
             </w:tcMar>
           </w:tcPr>
           <w:p>
@@ -940,7 +987,7 @@
                 <w:rFonts w:ascii="Calibri" w:hAnsi="Calibri"/>
                 <w:b/>
                 <w:color w:val="002060"/>
-                <w:sz w:val="18"/>
+                <w:sz w:val="17"/>
               </w:rPr>
               <w:t>4. PROPOSAL</w:t>
               <w:br/>
@@ -950,12 +997,12 @@
         </w:tc>
         <w:tc>
           <w:tcPr>
-            <w:tcW w:type="dxa" w:w="3168"/>
+            <w:tcW w:type="dxa" w:w="3312"/>
             <w:tcMar>
-              <w:top w:w="70" w:type="dxa"/>
-              <w:bottom w:w="70" w:type="dxa"/>
-              <w:left w:w="90" w:type="dxa"/>
-              <w:right w:w="90" w:type="dxa"/>
+              <w:top w:w="50" w:type="dxa"/>
+              <w:bottom w:w="50" w:type="dxa"/>
+              <w:left w:w="80" w:type="dxa"/>
+              <w:right w:w="80" w:type="dxa"/>
             </w:tcMar>
           </w:tcPr>
           <w:p>
@@ -966,13 +1013,13 @@
               <w:rPr>
                 <w:rFonts w:ascii="Calibri" w:hAnsi="Calibri"/>
                 <w:color w:val="28323C"/>
-                <w:sz w:val="18"/>
+                <w:sz w:val="17"/>
               </w:rPr>
               <w:t>• Inventaris Unit Alat Berat LiuGong</w:t>
               <w:br/>
-              <w:t>• Anuitas Bunga Efektif Menurun</w:t>
+              <w:t>• Anuitas Bunga Efektif Menurun Resmi</w:t>
               <w:br/>
-              <w:t>• Neraca 3 Tahun 100% Seimbang</w:t>
+              <w:t>• Neraca 3 Tahun Wajib Seimbang 100%</w:t>
               <w:br/>
               <w:t>• Putusan Komite Kredit Digital</w:t>
             </w:r>
@@ -982,10 +1029,10 @@
           <w:tcPr>
             <w:tcW w:type="dxa" w:w="3600"/>
             <w:tcMar>
-              <w:top w:w="70" w:type="dxa"/>
-              <w:bottom w:w="70" w:type="dxa"/>
-              <w:left w:w="90" w:type="dxa"/>
-              <w:right w:w="90" w:type="dxa"/>
+              <w:top w:w="50" w:type="dxa"/>
+              <w:bottom w:w="50" w:type="dxa"/>
+              <w:left w:w="80" w:type="dxa"/>
+              <w:right w:w="80" w:type="dxa"/>
             </w:tcMar>
           </w:tcPr>
           <w:p>
@@ -996,31 +1043,72 @@
               <w:rPr>
                 <w:rFonts w:ascii="Calibri" w:hAnsi="Calibri"/>
                 <w:color w:val="28323C"/>
-                <w:sz w:val="18"/>
+                <w:sz w:val="17"/>
               </w:rPr>
-              <w:t>Dossier lengkap siap sidang. Seluruh putusan kredit terkunci aman dengan jejak audit abadi.</w:t>
+              <w:t>Dossier lengkap siap sidang. Putusan kredit terkunci aman dengan jejak audit tak terubahkan (Audit Trail).</w:t>
             </w:r>
           </w:p>
         </w:tc>
       </w:tr>
     </w:tbl>
     <w:p>
+      <w:pPr>
+        <w:spacing w:before="160" w:after="60"/>
+        <w:jc w:val="center"/>
+      </w:pPr>
       <w:r>
-        <w:br w:type="page"/>
+        <w:drawing>
+          <wp:inline xmlns:a="http://schemas.openxmlformats.org/drawingml/2006/main" xmlns:pic="http://schemas.openxmlformats.org/drawingml/2006/picture">
+            <wp:extent cx="5669280" cy="3543300"/>
+            <wp:docPr id="3" name="Picture 3"/>
+            <wp:cNvGraphicFramePr>
+              <a:graphicFrameLocks noChangeAspect="1"/>
+            </wp:cNvGraphicFramePr>
+            <a:graphic>
+              <a:graphicData uri="http://schemas.openxmlformats.org/drawingml/2006/picture">
+                <pic:pic>
+                  <pic:nvPicPr>
+                    <pic:cNvPr id="0" name="02_pipeline_applications.png"/>
+                    <pic:cNvPicPr/>
+                  </pic:nvPicPr>
+                  <pic:blipFill>
+                    <a:blip r:embed="rId13"/>
+                    <a:stretch>
+                      <a:fillRect/>
+                    </a:stretch>
+                  </pic:blipFill>
+                  <pic:spPr>
+                    <a:xfrm>
+                      <a:off x="0" y="0"/>
+                      <a:ext cx="5669280" cy="3543300"/>
+                    </a:xfrm>
+                    <a:prstGeom prst="rect"/>
+                  </pic:spPr>
+                </pic:pic>
+              </a:graphicData>
+            </a:graphic>
+          </wp:inline>
+        </w:drawing>
       </w:r>
     </w:p>
     <w:p>
       <w:pPr>
-        <w:spacing w:before="240" w:after="120"/>
+        <w:spacing w:after="200"/>
+        <w:jc w:val="center"/>
       </w:pPr>
       <w:r>
         <w:rPr>
           <w:rFonts w:ascii="Calibri" w:hAnsi="Calibri"/>
-          <w:b/>
-          <w:color w:val="002060"/>
-          <w:sz w:val="32"/>
+          <w:i/>
+          <w:color w:val="646E7D"/>
+          <w:sz w:val="18"/>
         </w:rPr>
-        <w:t>3. DEEP DIVE: MULTI-DOCUMENT AI/OCR &amp; PEFINDO GATEWAY</w:t>
+        <w:t>Gambar: Daftar Pipeline Permohonan Pembiayaan Berdasarkan Kantor Cabang &amp; Status Workflow (Live System)</w:t>
+      </w:r>
+    </w:p>
+    <w:p>
+      <w:r>
+        <w:br w:type="page"/>
       </w:r>
     </w:p>
     <w:p>
@@ -1031,10 +1119,10 @@
         <w:rPr>
           <w:rFonts w:ascii="Calibri" w:hAnsi="Calibri"/>
           <w:b/>
-          <w:color w:val="ED7D31"/>
-          <w:sz w:val="26"/>
+          <w:color w:val="002060"/>
+          <w:sz w:val="30"/>
         </w:rPr>
-        <w:t>3.1. Suite AI/OCR Multidokumen pada FAP Stage</w:t>
+        <w:t>BAB 3: SUITE MULTI-DOKUMEN AI/OCR &amp; INTEGRASI PEFINDO BIRO KREDIT</w:t>
       </w:r>
     </w:p>
     <w:p>
@@ -1042,37 +1130,114 @@
         <w:spacing w:line="276" w:lineRule="auto" w:after="120"/>
       </w:pPr>
       <w:r>
-        <w:t>Pada tahap intake FAP, aplikasi dilengkapi kecerdasan buatan OCR (Optical Character Recognition) mutakhir yang berjalan langsung di sisi peramban pengguna (Client-Side WASM Engine). Hal ini menjamin privasi data nasabah karena berkas identitas tidak pernah dikirim ke pihak ketiga secara mentah. Dokumen yang didukung meliputi:</w:t>
-        <w:br/>
-        <w:t>1. NIB (Nomor Induk Berusaha): Mengekstrak 13 digit NIB, nama perusahaan, alamat kantor, kode pos, dan tanggal penetapan dari sertifikat resmi OSS RBA Kemeninvestasi/BKPM.</w:t>
-        <w:br/>
-        <w:t>2. e-KTP (Kartu Tanda Penduduk WNI): Mengekstrak NIK 16 digit, nama lengkap, tempat/tanggal lahir, jenis kelamin, dan alamat tempat tinggal Direksi atau Pemegang Saham WNI.</w:t>
-        <w:br/>
-        <w:t>3. PASSPORT &amp; E-KITAS (Expatriate / Asing): Mengekstrak nomor paspor, kewarganegaraan, masa berlaku, dan dokumen izin tinggal bagi pemodal atau manajemen berkewarganegaraan asing.</w:t>
-        <w:br/>
-        <w:t>4. NPWP (Nomor Pokok Wajib Pajak): Validasi instan nomor pokok pajak badan usaha maupun perorangan (format 15 digit lama maupun 16 digit NIK-NPWP).</w:t>
+        <w:t>Kelemahan terbesar sistem LOS tradisional di Indonesia adalah ketergantungan pada penginputan manual oleh staf administrasi cabang yang memicu tingkat kesalahan ketik (human error) hingga 20% pada NIK, NIB, dan NPWP. Aplikasi LOS-CRM LiuGong mengatasi hal ini secara tuntas melalui dua pilar teknologi mutakhir:</w:t>
       </w:r>
     </w:p>
     <w:p>
       <w:pPr>
-        <w:spacing w:before="200" w:after="80"/>
+        <w:spacing w:before="120" w:after="40"/>
       </w:pPr>
       <w:r>
         <w:rPr>
           <w:rFonts w:ascii="Calibri" w:hAnsi="Calibri"/>
           <w:b/>
           <w:color w:val="ED7D31"/>
-          <w:sz w:val="26"/>
+          <w:sz w:val="24"/>
+        </w:rPr>
+        <w:t>3.1. Multi-Document AI/OCR Suite pada FAP Stage</w:t>
+      </w:r>
+    </w:p>
+    <w:p>
+      <w:pPr>
+        <w:spacing w:line="276" w:lineRule="auto" w:after="80"/>
+      </w:pPr>
+      <w:r>
+        <w:t>Aplikasi memproses pemindaian dokumen secara instan di peramban (Client-Side Tesseract OCR WASM) dengan dukungan 5 jenis dokumen resmi:</w:t>
+        <w:br/>
+        <w:t>• NIB (Nomor Induk Berusaha): Memindai dokumen OSS RBA Kementerian Investasi/BKPM untuk mengekstrak 13-digit NIB, Nama Perusahaan, Alamat Lengkap, Kode Pos, dan Tanggal Terbit.</w:t>
+        <w:br/>
+        <w:t>• e-KTP (WNI): Memindai identitas Direksi, Komisaris, dan Pemegang Saham WNI untuk mengekstrak 16-digit NIK, Nama Lengkap, dan Tanggal Lahir.</w:t>
+        <w:br/>
+        <w:t>• PASSPORT &amp; E-KITAS (Expatriate / Asing): Ekstraksi paspor dan izin tinggal WNA untuk mengakomodasi struktur PMA (Penanaman Modal Asing) dan Direksi berkewarganegaraan asing dari Tiongkok atau negara mitra.</w:t>
+        <w:br/>
+        <w:t>• NPWP Badan &amp; Pribadi: Ekstraksi dan validasi format NPWP 15-digit lama maupun format 16-digit terbaru.</w:t>
+      </w:r>
+    </w:p>
+    <w:p>
+      <w:pPr>
+        <w:spacing w:before="160" w:after="60"/>
+        <w:jc w:val="center"/>
+      </w:pPr>
+      <w:r>
+        <w:drawing>
+          <wp:inline xmlns:a="http://schemas.openxmlformats.org/drawingml/2006/main" xmlns:pic="http://schemas.openxmlformats.org/drawingml/2006/picture">
+            <wp:extent cx="5669280" cy="3543300"/>
+            <wp:docPr id="4" name="Picture 4"/>
+            <wp:cNvGraphicFramePr>
+              <a:graphicFrameLocks noChangeAspect="1"/>
+            </wp:cNvGraphicFramePr>
+            <a:graphic>
+              <a:graphicData uri="http://schemas.openxmlformats.org/drawingml/2006/picture">
+                <pic:pic>
+                  <pic:nvPicPr>
+                    <pic:cNvPr id="0" name="04_nib_ocr_modal.png"/>
+                    <pic:cNvPicPr/>
+                  </pic:nvPicPr>
+                  <pic:blipFill>
+                    <a:blip r:embed="rId14"/>
+                    <a:stretch>
+                      <a:fillRect/>
+                    </a:stretch>
+                  </pic:blipFill>
+                  <pic:spPr>
+                    <a:xfrm>
+                      <a:off x="0" y="0"/>
+                      <a:ext cx="5669280" cy="3543300"/>
+                    </a:xfrm>
+                    <a:prstGeom prst="rect"/>
+                  </pic:spPr>
+                </pic:pic>
+              </a:graphicData>
+            </a:graphic>
+          </wp:inline>
+        </w:drawing>
+      </w:r>
+    </w:p>
+    <w:p>
+      <w:pPr>
+        <w:spacing w:after="200"/>
+        <w:jc w:val="center"/>
+      </w:pPr>
+      <w:r>
+        <w:rPr>
+          <w:rFonts w:ascii="Calibri" w:hAnsi="Calibri"/>
+          <w:i/>
+          <w:color w:val="646E7D"/>
+          <w:sz w:val="18"/>
+        </w:rPr>
+        <w:t>Gambar: Fitur Modal Scan OCR NIB OSS RBA dengan Ekstraksi 5 Field Otomatis (Live System)</w:t>
+      </w:r>
+    </w:p>
+    <w:p>
+      <w:pPr>
+        <w:spacing w:before="160" w:after="40"/>
+      </w:pPr>
+      <w:r>
+        <w:rPr>
+          <w:rFonts w:ascii="Calibri" w:hAnsi="Calibri"/>
+          <w:b/>
+          <w:color w:val="ED7D31"/>
+          <w:sz w:val="24"/>
         </w:rPr>
         <w:t>3.2. Jembatan Cerdas Antara FAP Stage dan Pre-Analysis: Pefindo Biro Kredit</w:t>
       </w:r>
     </w:p>
     <w:p>
       <w:pPr>
-        <w:spacing w:line="276" w:lineRule="auto" w:after="160"/>
+        <w:spacing w:line="276" w:lineRule="auto" w:after="80"/>
       </w:pPr>
       <w:r>
-        <w:t>Begitu identitas badan usaha dan para pengurus kunci tervalidasi pada FAP Stage, sistem secara otomatis dapat menembakkan data tersebut ke Pefindo Biro Kredit (IdScore / SLIK OJK Ingestion Bridge). Langkah ini menghadirkan profil intelijen finansial yang komprehensif dalam hitungan detik:</w:t>
+        <w:t>Begitu identitas legal debitur dan para pengurus kunci tervalidasi pada FAP Stage, sistem secara otomatis dapat menembakkan data tersebut ke Pefindo Biro Kredit (IdScore / SLIK OJK API Bridge) maupun membaca laporan PDF Pefindo via OCR parser. Langkah ini menghadirkan profil intelijen finansial yang komprehensif dalam hitungan detik:</w:t>
       </w:r>
     </w:p>
     <w:tbl>
@@ -1083,7 +1248,7 @@
         <w:tblLook w:firstColumn="1" w:firstRow="1" w:lastColumn="0" w:lastRow="0" w:noHBand="0" w:noVBand="1" w:val="04A0"/>
       </w:tblPr>
       <w:tblGrid>
-        <w:gridCol w:w="9029"/>
+        <w:gridCol w:w="9605"/>
       </w:tblGrid>
       <w:tr>
         <w:tc>
@@ -1091,10 +1256,10 @@
             <w:tcW w:type="dxa" w:w="9360"/>
             <w:shd w:fill="F0F4F8"/>
             <w:tcMar>
-              <w:top w:w="140" w:type="dxa"/>
-              <w:bottom w:w="140" w:type="dxa"/>
-              <w:left w:w="200" w:type="dxa"/>
-              <w:right w:w="200" w:type="dxa"/>
+              <w:top w:w="120" w:type="dxa"/>
+              <w:bottom w:w="120" w:type="dxa"/>
+              <w:left w:w="180" w:type="dxa"/>
+              <w:right w:w="180" w:type="dxa"/>
             </w:tcMar>
             <w:tcBorders>
               <w:left w:val="single" w:sz="36" w:color="002060"/>
@@ -1114,25 +1279,24 @@
                 <w:color w:val="002060"/>
                 <w:sz w:val="22"/>
               </w:rPr>
-              <w:t>THE PEFINDO INTELLIGENCE ADVANTAGE</w:t>
+              <w:t>NILAI STRATEGIS INTEGRASI PEFINDO BAGI MANAJEMEN RISIKO</w:t>
               <w:br/>
             </w:r>
             <w:r>
               <w:rPr>
                 <w:rFonts w:ascii="Calibri" w:hAnsi="Calibri"/>
-                <w:i/>
-                <w:color w:val="323C4B"/>
-                <w:sz w:val="21"/>
+                <w:color w:val="283241"/>
+                <w:sz w:val="20"/>
               </w:rPr>
-              <w:t>MANFAAT STRATEGIS PEFINDO BIRO KREDIT:</w:t>
+              <w:t>INTELIJEN RISIKO PEFINDO BIRO KREDIT:</w:t>
               <w:br/>
-              <w:t>• Skor Kredit Obyektif (Pefindo Score 250–900): Mengetahui tingkat risiko gagal bayar (Probability of Default) nasabah secara presisi.</w:t>
+              <w:t>1. Pefindo Credit Score (Skala 250–900): Skor obyektif yang memetakan probabilitas gagal bayar (Probability of Default/PD).</w:t>
               <w:br/>
-              <w:t>• Riwayat Kolektibilitas 24 Bulan: Mengetahui histori cicilan debitur di bank atau leasing lain—apakah selalu Lancar (Kol 1) atau pernah Nunggak/Macet (Kol 2–5).</w:t>
+              <w:t>2. Riwayat Kolektibilitas 24 Bulan (SLIK OJK): Mengetahui histori pembayaran cicilan debitur di bank atau leasing lain—apakah selalu Lancar (Kol 1) atau pernah Nunggak/Macet (Kol 2–5).</w:t>
               <w:br/>
-              <w:t>• Total Fasilitas Aktif se-Indonesia: Menghitung total beban angsuran bulanan yang sedang ditanggung debitur saat ini.</w:t>
+              <w:t>3. Total Eksposur Utang Perbankan Nasional: Mengetahui total baki debet dan beban angsuran bulanan yang sedang berjalan di lembaga keuangan lain.</w:t>
               <w:br/>
-              <w:t>• Deteksi Dini Restrukturisasi &amp; Gugatan: Menghindarkan LiuGong Finance dari nasabah yang sedang dalam sengketa hukum perdata atau pailit.</w:t>
+              <w:t>4. Deteksi Dini Restrukturisasi &amp; Gugatan Hukum: Menghindarkan LiuGong Finance dari debitur yang sedang dalam sengketa perdata, PKPU, atau kepailitan.</w:t>
             </w:r>
           </w:p>
         </w:tc>
@@ -1144,17 +1308,22 @@
       </w:pPr>
     </w:p>
     <w:p>
+      <w:r>
+        <w:br w:type="page"/>
+      </w:r>
+    </w:p>
+    <w:p>
       <w:pPr>
-        <w:spacing w:before="320" w:after="120"/>
+        <w:spacing w:before="160" w:after="80"/>
       </w:pPr>
       <w:r>
         <w:rPr>
           <w:rFonts w:ascii="Calibri" w:hAnsi="Calibri"/>
           <w:b/>
           <w:color w:val="002060"/>
-          <w:sz w:val="32"/>
+          <w:sz w:val="30"/>
         </w:rPr>
-        <w:t>4. KEMUDAHAN OPERASIONAL: WORKSPACE SPLIT 50-50 &amp; DIGITAL TWIN EXCEL</w:t>
+        <w:t>BAB 4: WORKSPACE SPLIT 50-50 &amp; DIGITAL TWIN EXCEL FAP 118-BARIS</w:t>
       </w:r>
     </w:p>
     <w:p>
@@ -1162,13 +1331,447 @@
         <w:spacing w:line="276" w:lineRule="auto" w:after="120"/>
       </w:pPr>
       <w:r>
-        <w:t>Salah satu keunggulan terbesar dari aplikasi ini adalah desain antarmuka Split 50-50 yang menyandingkan kemudahan pengisian formulir modern di sisi kiri dengan pratinjau lembar resmi Excel FAP 118-baris di sisi kanan:</w:t>
-        <w:br/>
-        <w:t>• Form 5-Modul Accordion: Memecah lebih dari 35 field input menjadi 5 modul bernomor rapi (01. Identitas, 02. Domisili, 03. Profil Usaha &amp; NIB OCR, 04. PIC, 05. Proyek Tambang/Konstruksi).</w:t>
-        <w:br/>
-        <w:t>• Bidirectional Auto-Sync: Saat tim marketing mengetik di kiri, sel di dokumen Excel kanan langsung terisi secara live dengan efek highlight biru yang berkedip halus. Sebaliknya, mengklik chip navigasi di lembar dokumen kanan otomatis membuka modul form di kiri.</w:t>
-        <w:br/>
-        <w:t>• Preservasi Format Dokumen Resmi: Manajemen dan pimpinan cabang tetap melihat format dokumen FAP yang sudah mereka kenal puluhan tahun tanpa merasa asing.</w:t>
+        <w:t>Salah satu keunggulan terbesar yang membedakan LOS-CRM LiuGong dari sistem kompetitor adalah arsitektur antarmuka Workspace Split 50-50. Di sisi kiri terdapat formulir 5 modul accordion modern, sementara di sisi kanan terpampang pratinjau lembar resmi Excel FAP 118-baris yang telah disetujui (Approved Mandatory Field) lengkap dengan logo resmi LiuGong Finance Indonesia, seksi identitas, profil usaha, proposal, hingga blok tanda tangan bermeterai.</w:t>
+      </w:r>
+    </w:p>
+    <w:p>
+      <w:pPr>
+        <w:spacing w:before="160" w:after="60"/>
+        <w:jc w:val="center"/>
+      </w:pPr>
+      <w:r>
+        <w:drawing>
+          <wp:inline xmlns:a="http://schemas.openxmlformats.org/drawingml/2006/main" xmlns:pic="http://schemas.openxmlformats.org/drawingml/2006/picture">
+            <wp:extent cx="5669280" cy="3543300"/>
+            <wp:docPr id="5" name="Picture 5"/>
+            <wp:cNvGraphicFramePr>
+              <a:graphicFrameLocks noChangeAspect="1"/>
+            </wp:cNvGraphicFramePr>
+            <a:graphic>
+              <a:graphicData uri="http://schemas.openxmlformats.org/drawingml/2006/picture">
+                <pic:pic>
+                  <pic:nvPicPr>
+                    <pic:cNvPr id="0" name="03_workspace_split_50_50.png"/>
+                    <pic:cNvPicPr/>
+                  </pic:nvPicPr>
+                  <pic:blipFill>
+                    <a:blip r:embed="rId15"/>
+                    <a:stretch>
+                      <a:fillRect/>
+                    </a:stretch>
+                  </pic:blipFill>
+                  <pic:spPr>
+                    <a:xfrm>
+                      <a:off x="0" y="0"/>
+                      <a:ext cx="5669280" cy="3543300"/>
+                    </a:xfrm>
+                    <a:prstGeom prst="rect"/>
+                  </pic:spPr>
+                </pic:pic>
+              </a:graphicData>
+            </a:graphic>
+          </wp:inline>
+        </w:drawing>
+      </w:r>
+    </w:p>
+    <w:p>
+      <w:pPr>
+        <w:spacing w:after="200"/>
+        <w:jc w:val="center"/>
+      </w:pPr>
+      <w:r>
+        <w:rPr>
+          <w:rFonts w:ascii="Calibri" w:hAnsi="Calibri"/>
+          <w:i/>
+          <w:color w:val="646E7D"/>
+          <w:sz w:val="18"/>
+        </w:rPr>
+        <w:t>Gambar: Workspace Split 50-50: Form Input Accordion (Kiri) &amp; Live Preview Lembar FAP Excel (Kanan)</w:t>
+      </w:r>
+    </w:p>
+    <w:p>
+      <w:pPr>
+        <w:spacing w:before="160" w:after="60"/>
+        <w:jc w:val="center"/>
+      </w:pPr>
+      <w:r>
+        <w:drawing>
+          <wp:inline xmlns:a="http://schemas.openxmlformats.org/drawingml/2006/main" xmlns:pic="http://schemas.openxmlformats.org/drawingml/2006/picture">
+            <wp:extent cx="5669280" cy="3543300"/>
+            <wp:docPr id="6" name="Picture 6"/>
+            <wp:cNvGraphicFramePr>
+              <a:graphicFrameLocks noChangeAspect="1"/>
+            </wp:cNvGraphicFramePr>
+            <a:graphic>
+              <a:graphicData uri="http://schemas.openxmlformats.org/drawingml/2006/picture">
+                <pic:pic>
+                  <pic:nvPicPr>
+                    <pic:cNvPr id="0" name="fap_excel_digital_twin.png"/>
+                    <pic:cNvPicPr/>
+                  </pic:nvPicPr>
+                  <pic:blipFill>
+                    <a:blip r:embed="rId16"/>
+                    <a:stretch>
+                      <a:fillRect/>
+                    </a:stretch>
+                  </pic:blipFill>
+                  <pic:spPr>
+                    <a:xfrm>
+                      <a:off x="0" y="0"/>
+                      <a:ext cx="5669280" cy="3543300"/>
+                    </a:xfrm>
+                    <a:prstGeom prst="rect"/>
+                  </pic:spPr>
+                </pic:pic>
+              </a:graphicData>
+            </a:graphic>
+          </wp:inline>
+        </w:drawing>
+      </w:r>
+    </w:p>
+    <w:p>
+      <w:pPr>
+        <w:spacing w:after="200"/>
+        <w:jc w:val="center"/>
+      </w:pPr>
+      <w:r>
+        <w:rPr>
+          <w:rFonts w:ascii="Calibri" w:hAnsi="Calibri"/>
+          <w:i/>
+          <w:color w:val="646E7D"/>
+          <w:sz w:val="18"/>
+        </w:rPr>
+        <w:t>Gambar: Digital Twin Dokumen FAP Excel 118-Baris dengan Logo Resmi LiuGong Finance Indonesia</w:t>
+      </w:r>
+    </w:p>
+    <w:p>
+      <w:pPr>
+        <w:spacing w:before="280" w:after="80"/>
+      </w:pPr>
+      <w:r>
+        <w:rPr>
+          <w:rFonts w:ascii="Calibri" w:hAnsi="Calibri"/>
+          <w:b/>
+          <w:color w:val="002060"/>
+          <w:sz w:val="30"/>
+        </w:rPr>
+        <w:t>BAB 5: TATA KELOLA KREDIT, PEMEGANG SAHAM 100% &amp; SPREADING KEUANGAN</w:t>
+      </w:r>
+    </w:p>
+    <w:p>
+      <w:pPr>
+        <w:spacing w:line="276" w:lineRule="auto" w:after="120"/>
+      </w:pPr>
+      <w:r>
+        <w:t>Aplikasi menerapkan mekanisme validasi deterministik tanpa kompromi untuk memastikan integritas permohonan kredit:</w:t>
+      </w:r>
+    </w:p>
+    <w:p>
+      <w:pPr>
+        <w:spacing w:line="276" w:lineRule="auto" w:after="60"/>
+      </w:pPr>
+      <w:r>
+        <w:rPr>
+          <w:rFonts w:ascii="Calibri" w:hAnsi="Calibri"/>
+          <w:b/>
+          <w:color w:val="002060"/>
+          <w:sz w:val="19"/>
+        </w:rPr>
+        <w:t xml:space="preserve">• Validasi Kepemilikan Saham 100% Persis (Tab Stakeholders): </w:t>
+      </w:r>
+      <w:r>
+        <w:rPr>
+          <w:rFonts w:ascii="Calibri" w:hAnsi="Calibri"/>
+          <w:color w:val="28323C"/>
+          <w:sz w:val="19"/>
+        </w:rPr>
+        <w:t>Sistem secara deterministik mengunci pengajuan kredit jika total porsi kepemilikan saham seluruh pemegang saham tidak berjumlah persis 100.00%. Menutup celah saham fiktif dan mematuhi regulasi Anti-Pencucian Uang (APU-PPT OJK).</w:t>
+      </w:r>
+    </w:p>
+    <w:p>
+      <w:pPr>
+        <w:spacing w:line="276" w:lineRule="auto" w:after="60"/>
+      </w:pPr>
+      <w:r>
+        <w:rPr>
+          <w:rFonts w:ascii="Calibri" w:hAnsi="Calibri"/>
+          <w:b/>
+          <w:color w:val="002060"/>
+          <w:sz w:val="19"/>
+        </w:rPr>
+        <w:t xml:space="preserve">• Integritas Keseimbangan Neraca Keuangan 3 Tahun (Tab Financial Statements): </w:t>
+      </w:r>
+      <w:r>
+        <w:rPr>
+          <w:rFonts w:ascii="Calibri" w:hAnsi="Calibri"/>
+          <w:color w:val="28323C"/>
+          <w:sz w:val="19"/>
+        </w:rPr>
+        <w:t>Menggunakan kalkulasi sen integer (BigInt) presisi tinggi untuk memeriksa 3 tahun laporan keuangan historis: Total Aset wajib sama persis dengan Total Liabilitas + Ekuitas. Laporan yang tidak seimbang langsung ditolak oleh sistem.</w:t>
+      </w:r>
+    </w:p>
+    <w:p>
+      <w:pPr>
+        <w:spacing w:line="276" w:lineRule="auto" w:after="60"/>
+      </w:pPr>
+      <w:r>
+        <w:rPr>
+          <w:rFonts w:ascii="Calibri" w:hAnsi="Calibri"/>
+          <w:b/>
+          <w:color w:val="002060"/>
+          <w:sz w:val="19"/>
+        </w:rPr>
+        <w:t xml:space="preserve">• Tata Kelola Akta Legalitas &amp; Notaris (Tab Legal): </w:t>
+      </w:r>
+      <w:r>
+        <w:rPr>
+          <w:rFonts w:ascii="Calibri" w:hAnsi="Calibri"/>
+          <w:color w:val="28323C"/>
+          <w:sz w:val="19"/>
+        </w:rPr>
+        <w:t>Pemisahan akta aktif dan arsip historis, penomoran klausul kontinu pada editor teks TinyMCE, dan matriks perbandingan perubahan modal/pengurus secara berdampingan.</w:t>
+      </w:r>
+    </w:p>
+    <w:p>
+      <w:pPr>
+        <w:spacing w:line="276" w:lineRule="auto" w:after="60"/>
+      </w:pPr>
+      <w:r>
+        <w:rPr>
+          <w:rFonts w:ascii="Calibri" w:hAnsi="Calibri"/>
+          <w:b/>
+          <w:color w:val="002060"/>
+          <w:sz w:val="19"/>
+        </w:rPr>
+        <w:t xml:space="preserve">• Checklist Bukti Fisik Dokumen (Tab Documents Desk): </w:t>
+      </w:r>
+      <w:r>
+        <w:rPr>
+          <w:rFonts w:ascii="Calibri" w:hAnsi="Calibri"/>
+          <w:color w:val="28323C"/>
+          <w:sz w:val="19"/>
+        </w:rPr>
+        <w:t>Monitoring masa berlaku izin usaha (NIB, SIUP, SKT, SPPKP) dan penyimpanan terenkripsi di AWS S3 privat dengan link kedaluwarsa 15 menit sesuai UU PDP No. 27/2022.</w:t>
+      </w:r>
+    </w:p>
+    <w:p>
+      <w:pPr>
+        <w:spacing w:before="160" w:after="60"/>
+        <w:jc w:val="center"/>
+      </w:pPr>
+      <w:r>
+        <w:drawing>
+          <wp:inline xmlns:a="http://schemas.openxmlformats.org/drawingml/2006/main" xmlns:pic="http://schemas.openxmlformats.org/drawingml/2006/picture">
+            <wp:extent cx="5669280" cy="3543300"/>
+            <wp:docPr id="7" name="Picture 7"/>
+            <wp:cNvGraphicFramePr>
+              <a:graphicFrameLocks noChangeAspect="1"/>
+            </wp:cNvGraphicFramePr>
+            <a:graphic>
+              <a:graphicData uri="http://schemas.openxmlformats.org/drawingml/2006/picture">
+                <pic:pic>
+                  <pic:nvPicPr>
+                    <pic:cNvPr id="0" name="tab_3_stakeholders.png"/>
+                    <pic:cNvPicPr/>
+                  </pic:nvPicPr>
+                  <pic:blipFill>
+                    <a:blip r:embed="rId17"/>
+                    <a:stretch>
+                      <a:fillRect/>
+                    </a:stretch>
+                  </pic:blipFill>
+                  <pic:spPr>
+                    <a:xfrm>
+                      <a:off x="0" y="0"/>
+                      <a:ext cx="5669280" cy="3543300"/>
+                    </a:xfrm>
+                    <a:prstGeom prst="rect"/>
+                  </pic:spPr>
+                </pic:pic>
+              </a:graphicData>
+            </a:graphic>
+          </wp:inline>
+        </w:drawing>
+      </w:r>
+    </w:p>
+    <w:p>
+      <w:pPr>
+        <w:spacing w:after="200"/>
+        <w:jc w:val="center"/>
+      </w:pPr>
+      <w:r>
+        <w:rPr>
+          <w:rFonts w:ascii="Calibri" w:hAnsi="Calibri"/>
+          <w:i/>
+          <w:color w:val="646E7D"/>
+          <w:sz w:val="18"/>
+        </w:rPr>
+        <w:t>Gambar: Verifikasi Struktur Kepemilikan Saham Wajib 100% &amp; Direksi WNI/WNA (Live System)</w:t>
+      </w:r>
+    </w:p>
+    <w:p>
+      <w:pPr>
+        <w:spacing w:before="160" w:after="60"/>
+        <w:jc w:val="center"/>
+      </w:pPr>
+      <w:r>
+        <w:drawing>
+          <wp:inline xmlns:a="http://schemas.openxmlformats.org/drawingml/2006/main" xmlns:pic="http://schemas.openxmlformats.org/drawingml/2006/picture">
+            <wp:extent cx="5669280" cy="3543300"/>
+            <wp:docPr id="8" name="Picture 8"/>
+            <wp:cNvGraphicFramePr>
+              <a:graphicFrameLocks noChangeAspect="1"/>
+            </wp:cNvGraphicFramePr>
+            <a:graphic>
+              <a:graphicData uri="http://schemas.openxmlformats.org/drawingml/2006/picture">
+                <pic:pic>
+                  <pic:nvPicPr>
+                    <pic:cNvPr id="0" name="tab_5_financial_statements.png"/>
+                    <pic:cNvPicPr/>
+                  </pic:nvPicPr>
+                  <pic:blipFill>
+                    <a:blip r:embed="rId18"/>
+                    <a:stretch>
+                      <a:fillRect/>
+                    </a:stretch>
+                  </pic:blipFill>
+                  <pic:spPr>
+                    <a:xfrm>
+                      <a:off x="0" y="0"/>
+                      <a:ext cx="5669280" cy="3543300"/>
+                    </a:xfrm>
+                    <a:prstGeom prst="rect"/>
+                  </pic:spPr>
+                </pic:pic>
+              </a:graphicData>
+            </a:graphic>
+          </wp:inline>
+        </w:drawing>
+      </w:r>
+    </w:p>
+    <w:p>
+      <w:pPr>
+        <w:spacing w:after="200"/>
+        <w:jc w:val="center"/>
+      </w:pPr>
+      <w:r>
+        <w:rPr>
+          <w:rFonts w:ascii="Calibri" w:hAnsi="Calibri"/>
+          <w:i/>
+          <w:color w:val="646E7D"/>
+          <w:sz w:val="18"/>
+        </w:rPr>
+        <w:t>Gambar: Spreading Laporan Keuangan 3 Tahun dengan Keseimbangan Neraca Terverifikasi (Live System)</w:t>
+      </w:r>
+    </w:p>
+    <w:p>
+      <w:pPr>
+        <w:spacing w:before="160" w:after="60"/>
+        <w:jc w:val="center"/>
+      </w:pPr>
+      <w:r>
+        <w:drawing>
+          <wp:inline xmlns:a="http://schemas.openxmlformats.org/drawingml/2006/main" xmlns:pic="http://schemas.openxmlformats.org/drawingml/2006/picture">
+            <wp:extent cx="5669280" cy="3543300"/>
+            <wp:docPr id="9" name="Picture 9"/>
+            <wp:cNvGraphicFramePr>
+              <a:graphicFrameLocks noChangeAspect="1"/>
+            </wp:cNvGraphicFramePr>
+            <a:graphic>
+              <a:graphicData uri="http://schemas.openxmlformats.org/drawingml/2006/picture">
+                <pic:pic>
+                  <pic:nvPicPr>
+                    <pic:cNvPr id="0" name="tab_2_legal.png"/>
+                    <pic:cNvPicPr/>
+                  </pic:nvPicPr>
+                  <pic:blipFill>
+                    <a:blip r:embed="rId19"/>
+                    <a:stretch>
+                      <a:fillRect/>
+                    </a:stretch>
+                  </pic:blipFill>
+                  <pic:spPr>
+                    <a:xfrm>
+                      <a:off x="0" y="0"/>
+                      <a:ext cx="5669280" cy="3543300"/>
+                    </a:xfrm>
+                    <a:prstGeom prst="rect"/>
+                  </pic:spPr>
+                </pic:pic>
+              </a:graphicData>
+            </a:graphic>
+          </wp:inline>
+        </w:drawing>
+      </w:r>
+    </w:p>
+    <w:p>
+      <w:pPr>
+        <w:spacing w:after="200"/>
+        <w:jc w:val="center"/>
+      </w:pPr>
+      <w:r>
+        <w:rPr>
+          <w:rFonts w:ascii="Calibri" w:hAnsi="Calibri"/>
+          <w:i/>
+          <w:color w:val="646E7D"/>
+          <w:sz w:val="18"/>
+        </w:rPr>
+        <w:t>Gambar: Manajemen Akta Legalitas: Pemisahan Akta Aktif &amp; Riwayat Historis (Live System)</w:t>
+      </w:r>
+    </w:p>
+    <w:p>
+      <w:pPr>
+        <w:spacing w:before="160" w:after="60"/>
+        <w:jc w:val="center"/>
+      </w:pPr>
+      <w:r>
+        <w:drawing>
+          <wp:inline xmlns:a="http://schemas.openxmlformats.org/drawingml/2006/main" xmlns:pic="http://schemas.openxmlformats.org/drawingml/2006/picture">
+            <wp:extent cx="5669280" cy="3543300"/>
+            <wp:docPr id="10" name="Picture 10"/>
+            <wp:cNvGraphicFramePr>
+              <a:graphicFrameLocks noChangeAspect="1"/>
+            </wp:cNvGraphicFramePr>
+            <a:graphic>
+              <a:graphicData uri="http://schemas.openxmlformats.org/drawingml/2006/picture">
+                <pic:pic>
+                  <pic:nvPicPr>
+                    <pic:cNvPr id="0" name="tab_legal_modal_tinymce.png"/>
+                    <pic:cNvPicPr/>
+                  </pic:nvPicPr>
+                  <pic:blipFill>
+                    <a:blip r:embed="rId20"/>
+                    <a:stretch>
+                      <a:fillRect/>
+                    </a:stretch>
+                  </pic:blipFill>
+                  <pic:spPr>
+                    <a:xfrm>
+                      <a:off x="0" y="0"/>
+                      <a:ext cx="5669280" cy="3543300"/>
+                    </a:xfrm>
+                    <a:prstGeom prst="rect"/>
+                  </pic:spPr>
+                </pic:pic>
+              </a:graphicData>
+            </a:graphic>
+          </wp:inline>
+        </w:drawing>
+      </w:r>
+    </w:p>
+    <w:p>
+      <w:pPr>
+        <w:spacing w:after="200"/>
+        <w:jc w:val="center"/>
+      </w:pPr>
+      <w:r>
+        <w:rPr>
+          <w:rFonts w:ascii="Calibri" w:hAnsi="Calibri"/>
+          <w:i/>
+          <w:color w:val="646E7D"/>
+          <w:sz w:val="18"/>
+        </w:rPr>
+        <w:t>Gambar: Editor Akta Legalitas TinyMCE dengan Penomoran Klausul Kontinu &amp; Kategori Remarks (Live System)</w:t>
       </w:r>
     </w:p>
     <w:p>
@@ -1178,16 +1781,16 @@
     </w:p>
     <w:p>
       <w:pPr>
-        <w:spacing w:before="240" w:after="120"/>
+        <w:spacing w:before="160" w:after="80"/>
       </w:pPr>
       <w:r>
         <w:rPr>
           <w:rFonts w:ascii="Calibri" w:hAnsi="Calibri"/>
           <w:b/>
           <w:color w:val="002060"/>
-          <w:sz w:val="32"/>
+          <w:sz w:val="30"/>
         </w:rPr>
-        <w:t>5. TATA KELOLA KREDIT, INTEGRITAS FORMULA &amp; KEPATUHAN OJK</w:t>
+        <w:t>BAB 6: STUDI KASUS RIIL &amp; KALKULASI DETAIL PEMBIAYAAN ALAT BERAT</w:t>
       </w:r>
     </w:p>
     <w:p>
@@ -1195,153 +1798,7 @@
         <w:spacing w:line="276" w:lineRule="auto" w:after="120"/>
       </w:pPr>
       <w:r>
-        <w:t>Aplikasi menerapkan mekanisme validasi ketat dan berlapis untuk mengamankan portofolio kredit perusahaan:</w:t>
-      </w:r>
-    </w:p>
-    <w:p>
-      <w:pPr>
-        <w:spacing w:line="276" w:lineRule="auto" w:after="80"/>
-      </w:pPr>
-      <w:r>
-        <w:rPr>
-          <w:rFonts w:ascii="Calibri" w:hAnsi="Calibri"/>
-          <w:b/>
-          <w:color w:val="002060"/>
-          <w:sz w:val="20"/>
-        </w:rPr>
-        <w:t xml:space="preserve">• Validasi Kepemilikan Saham 100% Persis: </w:t>
-      </w:r>
-      <w:r>
-        <w:rPr>
-          <w:rFonts w:ascii="Calibri" w:hAnsi="Calibri"/>
-          <w:color w:val="28323C"/>
-          <w:sz w:val="20"/>
-        </w:rPr>
-        <w:t>Sistem secara deterministik menolak pengajuan permohonan kredit jika total porsi kepemilikan saham seluruh pemegang saham tidak berjumlah persis 100.00%. Hal ini menutup celah kepemilikan fiktif dan mematuhi prinsip anti-pencucian uang (APU-PPT OJK).</w:t>
-      </w:r>
-    </w:p>
-    <w:p>
-      <w:pPr>
-        <w:spacing w:line="276" w:lineRule="auto" w:after="80"/>
-      </w:pPr>
-      <w:r>
-        <w:rPr>
-          <w:rFonts w:ascii="Calibri" w:hAnsi="Calibri"/>
-          <w:b/>
-          <w:color w:val="002060"/>
-          <w:sz w:val="20"/>
-        </w:rPr>
-        <w:t xml:space="preserve">• Integritas Keseimbangan Neraca (Balance Sheet Equilibrium): </w:t>
-      </w:r>
-      <w:r>
-        <w:rPr>
-          <w:rFonts w:ascii="Calibri" w:hAnsi="Calibri"/>
-          <w:color w:val="28323C"/>
-          <w:sz w:val="20"/>
-        </w:rPr>
-        <w:t>Menggunakan kalkulasi sen integer (BigInt) presisi tinggi untuk memeriksa 3 tahun laporan keuangan: Total Aset wajib sama persis dengan Total Liabilitas + Ekuitas. Laporan yang tidak seimbang langsung ditolak oleh sistem.</w:t>
-      </w:r>
-    </w:p>
-    <w:p>
-      <w:pPr>
-        <w:spacing w:line="276" w:lineRule="auto" w:after="80"/>
-      </w:pPr>
-      <w:r>
-        <w:rPr>
-          <w:rFonts w:ascii="Calibri" w:hAnsi="Calibri"/>
-          <w:b/>
-          <w:color w:val="002060"/>
-          <w:sz w:val="20"/>
-        </w:rPr>
-        <w:t xml:space="preserve">• Kalkulasi Anuitas Bunga Efektif Otomatis: </w:t>
-      </w:r>
-      <w:r>
-        <w:rPr>
-          <w:rFonts w:ascii="Calibri" w:hAnsi="Calibri"/>
-          <w:color w:val="28323C"/>
-          <w:sz w:val="20"/>
-        </w:rPr>
-        <w:t>Menghitung angsuran bulanan menggunakan rumus reducing balance annuity aktuaria resmi, baik untuk skema In Arrear maupun In Advance, meniadakan selisih hitung manual antara tim marketing dan tim finance.</w:t>
-      </w:r>
-    </w:p>
-    <w:p>
-      <w:pPr>
-        <w:spacing w:line="276" w:lineRule="auto" w:after="80"/>
-      </w:pPr>
-      <w:r>
-        <w:rPr>
-          <w:rFonts w:ascii="Calibri" w:hAnsi="Calibri"/>
-          <w:b/>
-          <w:color w:val="002060"/>
-          <w:sz w:val="20"/>
-        </w:rPr>
-        <w:t xml:space="preserve">• Tata Kelola Akta Legalitas &amp; Notaris: </w:t>
-      </w:r>
-      <w:r>
-        <w:rPr>
-          <w:rFonts w:ascii="Calibri" w:hAnsi="Calibri"/>
-          <w:color w:val="28323C"/>
-          <w:sz w:val="20"/>
-        </w:rPr>
-        <w:t>Pemisahan akta aktif dan arsip historis, dilengkapi editor teks TinyMCE dengan penomoran klausul kontinu dan matriks perbandingan perubahan modal/pengurus secara berdampingan.</w:t>
-      </w:r>
-    </w:p>
-    <w:p>
-      <w:pPr>
-        <w:spacing w:line="276" w:lineRule="auto" w:after="80"/>
-      </w:pPr>
-      <w:r>
-        <w:rPr>
-          <w:rFonts w:ascii="Calibri" w:hAnsi="Calibri"/>
-          <w:b/>
-          <w:color w:val="002060"/>
-          <w:sz w:val="20"/>
-        </w:rPr>
-        <w:t xml:space="preserve">• Jejak Audit Abadi (Immutable Append-Only Audit Trail): </w:t>
-      </w:r>
-      <w:r>
-        <w:rPr>
-          <w:rFonts w:ascii="Calibri" w:hAnsi="Calibri"/>
-          <w:color w:val="28323C"/>
-          <w:sz w:val="20"/>
-        </w:rPr>
-        <w:t>Tabel audit logs dilindungi oleh trigger basis data tingkat kernel: tidak ada seorang pun (termasuk administrator IT) yang dapat mengubah atau menghapus riwayat audit. Menjamin kesiapan 100% saat diaudit oleh regulator OJK.</w:t>
-      </w:r>
-    </w:p>
-    <w:p>
-      <w:pPr>
-        <w:spacing w:line="276" w:lineRule="auto" w:after="80"/>
-      </w:pPr>
-      <w:r>
-        <w:rPr>
-          <w:rFonts w:ascii="Calibri" w:hAnsi="Calibri"/>
-          <w:b/>
-          <w:color w:val="002060"/>
-          <w:sz w:val="20"/>
-        </w:rPr>
-        <w:t xml:space="preserve">• Kepatuhan UU PDP No. 27/2022: </w:t>
-      </w:r>
-      <w:r>
-        <w:rPr>
-          <w:rFonts w:ascii="Calibri" w:hAnsi="Calibri"/>
-          <w:color w:val="28323C"/>
-          <w:sz w:val="20"/>
-        </w:rPr>
-        <w:t>Enkripsi dokumen agunan dan identitas di AWS S3 privat menggunakan tanda tangan digital dengan kedaluwarsa 15 menit, mencegah kebocoran data rahasia debitur.</w:t>
-      </w:r>
-    </w:p>
-    <w:p>
-      <w:pPr>
-        <w:spacing w:before="320" w:after="120"/>
-      </w:pPr>
-      <w:r>
-        <w:rPr>
-          <w:rFonts w:ascii="Calibri" w:hAnsi="Calibri"/>
-          <w:b/>
-          <w:color w:val="002060"/>
-          <w:sz w:val="32"/>
-        </w:rPr>
-        <w:t>6. METRIK KEBERHASILAN BISNIS, KPI &amp; ROADMAP IMPLEMENTASI</w:t>
+        <w:t>Berikut adalah simulasi end-to-end kasus nyata permohonan pembiayaan alat berat LiuGong yang diproses melalui sistem LOS-CRM untuk menggambarkan akurasi aktuaria dan kalkulasi angsuran:</w:t>
       </w:r>
     </w:p>
     <w:tbl>
@@ -1360,9 +1817,689 @@
         </w:tblBorders>
       </w:tblPr>
       <w:tblGrid>
-        <w:gridCol w:w="3010"/>
-        <w:gridCol w:w="3010"/>
-        <w:gridCol w:w="3010"/>
+        <w:gridCol w:w="4802"/>
+        <w:gridCol w:w="4802"/>
+      </w:tblGrid>
+      <w:tr>
+        <w:tc>
+          <w:tcPr>
+            <w:tcW w:type="dxa" w:w="3600"/>
+            <w:tcMar>
+              <w:top w:w="45" w:type="dxa"/>
+              <w:bottom w:w="45" w:type="dxa"/>
+              <w:left w:w="70" w:type="dxa"/>
+              <w:right w:w="70" w:type="dxa"/>
+            </w:tcMar>
+          </w:tcPr>
+          <w:p>
+            <w:r>
+              <w:rPr>
+                <w:rFonts w:ascii="Calibri" w:hAnsi="Calibri"/>
+                <w:b/>
+                <w:color w:val="002060"/>
+                <w:sz w:val="18"/>
+              </w:rPr>
+              <w:t>Nama Calon Debitur</w:t>
+            </w:r>
+          </w:p>
+        </w:tc>
+        <w:tc>
+          <w:tcPr>
+            <w:tcW w:type="dxa" w:w="5760"/>
+            <w:tcMar>
+              <w:top w:w="45" w:type="dxa"/>
+              <w:bottom w:w="45" w:type="dxa"/>
+              <w:left w:w="70" w:type="dxa"/>
+              <w:right w:w="70" w:type="dxa"/>
+            </w:tcMar>
+          </w:tcPr>
+          <w:p>
+            <w:r>
+              <w:rPr>
+                <w:rFonts w:ascii="Calibri" w:hAnsi="Calibri"/>
+                <w:color w:val="28323C"/>
+                <w:sz w:val="18"/>
+              </w:rPr>
+              <w:t>PT MANDIRI JAYA ABADI (Kontraktor Tambang Nikel Morowali)</w:t>
+            </w:r>
+          </w:p>
+        </w:tc>
+      </w:tr>
+      <w:tr>
+        <w:tc>
+          <w:tcPr>
+            <w:tcW w:type="dxa" w:w="3600"/>
+            <w:tcMar>
+              <w:top w:w="45" w:type="dxa"/>
+              <w:bottom w:w="45" w:type="dxa"/>
+              <w:left w:w="70" w:type="dxa"/>
+              <w:right w:w="70" w:type="dxa"/>
+            </w:tcMar>
+            <w:shd w:fill="F8FAFC"/>
+          </w:tcPr>
+          <w:p>
+            <w:r>
+              <w:rPr>
+                <w:rFonts w:ascii="Calibri" w:hAnsi="Calibri"/>
+                <w:b/>
+                <w:color w:val="002060"/>
+                <w:sz w:val="18"/>
+              </w:rPr>
+              <w:t>Dealer Resmi LiuGong</w:t>
+            </w:r>
+          </w:p>
+        </w:tc>
+        <w:tc>
+          <w:tcPr>
+            <w:tcW w:type="dxa" w:w="5760"/>
+            <w:tcMar>
+              <w:top w:w="45" w:type="dxa"/>
+              <w:bottom w:w="45" w:type="dxa"/>
+              <w:left w:w="70" w:type="dxa"/>
+              <w:right w:w="70" w:type="dxa"/>
+            </w:tcMar>
+            <w:shd w:fill="F8FAFC"/>
+          </w:tcPr>
+          <w:p>
+            <w:r>
+              <w:rPr>
+                <w:rFonts w:ascii="Calibri" w:hAnsi="Calibri"/>
+                <w:color w:val="28323C"/>
+                <w:sz w:val="18"/>
+              </w:rPr>
+              <w:t>PT Megatama Traktor Utama (Makassar Branch)</w:t>
+            </w:r>
+          </w:p>
+        </w:tc>
+      </w:tr>
+      <w:tr>
+        <w:tc>
+          <w:tcPr>
+            <w:tcW w:type="dxa" w:w="3600"/>
+            <w:tcMar>
+              <w:top w:w="45" w:type="dxa"/>
+              <w:bottom w:w="45" w:type="dxa"/>
+              <w:left w:w="70" w:type="dxa"/>
+              <w:right w:w="70" w:type="dxa"/>
+            </w:tcMar>
+          </w:tcPr>
+          <w:p>
+            <w:r>
+              <w:rPr>
+                <w:rFonts w:ascii="Calibri" w:hAnsi="Calibri"/>
+                <w:b/>
+                <w:color w:val="002060"/>
+                <w:sz w:val="18"/>
+              </w:rPr>
+              <w:t>Aset yang Dibiayai</w:t>
+            </w:r>
+          </w:p>
+        </w:tc>
+        <w:tc>
+          <w:tcPr>
+            <w:tcW w:type="dxa" w:w="5760"/>
+            <w:tcMar>
+              <w:top w:w="45" w:type="dxa"/>
+              <w:bottom w:w="45" w:type="dxa"/>
+              <w:left w:w="70" w:type="dxa"/>
+              <w:right w:w="70" w:type="dxa"/>
+            </w:tcMar>
+          </w:tcPr>
+          <w:p>
+            <w:r>
+              <w:rPr>
+                <w:rFonts w:ascii="Calibri" w:hAnsi="Calibri"/>
+                <w:color w:val="28323C"/>
+                <w:sz w:val="18"/>
+              </w:rPr>
+              <w:t>5 Unit Hydraulic Excavator LiuGong 922E (Heavy Equipment)</w:t>
+            </w:r>
+          </w:p>
+        </w:tc>
+      </w:tr>
+      <w:tr>
+        <w:tc>
+          <w:tcPr>
+            <w:tcW w:type="dxa" w:w="3600"/>
+            <w:tcMar>
+              <w:top w:w="45" w:type="dxa"/>
+              <w:bottom w:w="45" w:type="dxa"/>
+              <w:left w:w="70" w:type="dxa"/>
+              <w:right w:w="70" w:type="dxa"/>
+            </w:tcMar>
+            <w:shd w:fill="F8FAFC"/>
+          </w:tcPr>
+          <w:p>
+            <w:r>
+              <w:rPr>
+                <w:rFonts w:ascii="Calibri" w:hAnsi="Calibri"/>
+                <w:b/>
+                <w:color w:val="002060"/>
+                <w:sz w:val="18"/>
+              </w:rPr>
+              <w:t>Harga Unit OTR (Total Asset Cost)</w:t>
+            </w:r>
+          </w:p>
+        </w:tc>
+        <w:tc>
+          <w:tcPr>
+            <w:tcW w:type="dxa" w:w="5760"/>
+            <w:tcMar>
+              <w:top w:w="45" w:type="dxa"/>
+              <w:bottom w:w="45" w:type="dxa"/>
+              <w:left w:w="70" w:type="dxa"/>
+              <w:right w:w="70" w:type="dxa"/>
+            </w:tcMar>
+            <w:shd w:fill="F8FAFC"/>
+          </w:tcPr>
+          <w:p>
+            <w:r>
+              <w:rPr>
+                <w:rFonts w:ascii="Calibri" w:hAnsi="Calibri"/>
+                <w:color w:val="28323C"/>
+                <w:sz w:val="18"/>
+              </w:rPr>
+              <w:t>Rp 7.500.000.000 (5 Unit @ Rp 1.500.000.000)</w:t>
+            </w:r>
+          </w:p>
+        </w:tc>
+      </w:tr>
+      <w:tr>
+        <w:tc>
+          <w:tcPr>
+            <w:tcW w:type="dxa" w:w="3600"/>
+            <w:tcMar>
+              <w:top w:w="45" w:type="dxa"/>
+              <w:bottom w:w="45" w:type="dxa"/>
+              <w:left w:w="70" w:type="dxa"/>
+              <w:right w:w="70" w:type="dxa"/>
+            </w:tcMar>
+          </w:tcPr>
+          <w:p>
+            <w:r>
+              <w:rPr>
+                <w:rFonts w:ascii="Calibri" w:hAnsi="Calibri"/>
+                <w:b/>
+                <w:color w:val="002060"/>
+                <w:sz w:val="18"/>
+              </w:rPr>
+              <w:t>Uang Muka / Down Payment (DP 25%)</w:t>
+            </w:r>
+          </w:p>
+        </w:tc>
+        <w:tc>
+          <w:tcPr>
+            <w:tcW w:type="dxa" w:w="5760"/>
+            <w:tcMar>
+              <w:top w:w="45" w:type="dxa"/>
+              <w:bottom w:w="45" w:type="dxa"/>
+              <w:left w:w="70" w:type="dxa"/>
+              <w:right w:w="70" w:type="dxa"/>
+            </w:tcMar>
+          </w:tcPr>
+          <w:p>
+            <w:r>
+              <w:rPr>
+                <w:rFonts w:ascii="Calibri" w:hAnsi="Calibri"/>
+                <w:color w:val="28323C"/>
+                <w:sz w:val="18"/>
+              </w:rPr>
+              <w:t>Rp 1.875.000.000 (Dibayar tunai oleh debitur ke dealer)</w:t>
+            </w:r>
+          </w:p>
+        </w:tc>
+      </w:tr>
+      <w:tr>
+        <w:tc>
+          <w:tcPr>
+            <w:tcW w:type="dxa" w:w="3600"/>
+            <w:tcMar>
+              <w:top w:w="45" w:type="dxa"/>
+              <w:bottom w:w="45" w:type="dxa"/>
+              <w:left w:w="70" w:type="dxa"/>
+              <w:right w:w="70" w:type="dxa"/>
+            </w:tcMar>
+            <w:shd w:fill="F8FAFC"/>
+          </w:tcPr>
+          <w:p>
+            <w:r>
+              <w:rPr>
+                <w:rFonts w:ascii="Calibri" w:hAnsi="Calibri"/>
+                <w:b/>
+                <w:color w:val="002060"/>
+                <w:sz w:val="18"/>
+              </w:rPr>
+              <w:t>Subsidi Bunga dari Dealer (1.5% p.a.)</w:t>
+            </w:r>
+          </w:p>
+        </w:tc>
+        <w:tc>
+          <w:tcPr>
+            <w:tcW w:type="dxa" w:w="5760"/>
+            <w:tcMar>
+              <w:top w:w="45" w:type="dxa"/>
+              <w:bottom w:w="45" w:type="dxa"/>
+              <w:left w:w="70" w:type="dxa"/>
+              <w:right w:w="70" w:type="dxa"/>
+            </w:tcMar>
+            <w:shd w:fill="F8FAFC"/>
+          </w:tcPr>
+          <w:p>
+            <w:r>
+              <w:rPr>
+                <w:rFonts w:ascii="Calibri" w:hAnsi="Calibri"/>
+                <w:color w:val="28323C"/>
+                <w:sz w:val="18"/>
+              </w:rPr>
+              <w:t>Rp 112.500.000 (Dipotongkan langsung ke pokok pembiayaan)</w:t>
+            </w:r>
+          </w:p>
+        </w:tc>
+      </w:tr>
+      <w:tr>
+        <w:tc>
+          <w:tcPr>
+            <w:tcW w:type="dxa" w:w="3600"/>
+            <w:tcMar>
+              <w:top w:w="45" w:type="dxa"/>
+              <w:bottom w:w="45" w:type="dxa"/>
+              <w:left w:w="70" w:type="dxa"/>
+              <w:right w:w="70" w:type="dxa"/>
+            </w:tcMar>
+          </w:tcPr>
+          <w:p>
+            <w:r>
+              <w:rPr>
+                <w:rFonts w:ascii="Calibri" w:hAnsi="Calibri"/>
+                <w:b/>
+                <w:color w:val="002060"/>
+                <w:sz w:val="18"/>
+              </w:rPr>
+              <w:t>Pokok Pembiayaan Bersih (Net Principal)</w:t>
+            </w:r>
+          </w:p>
+        </w:tc>
+        <w:tc>
+          <w:tcPr>
+            <w:tcW w:type="dxa" w:w="5760"/>
+            <w:tcMar>
+              <w:top w:w="45" w:type="dxa"/>
+              <w:bottom w:w="45" w:type="dxa"/>
+              <w:left w:w="70" w:type="dxa"/>
+              <w:right w:w="70" w:type="dxa"/>
+            </w:tcMar>
+          </w:tcPr>
+          <w:p>
+            <w:r>
+              <w:rPr>
+                <w:rFonts w:ascii="Calibri" w:hAnsi="Calibri"/>
+                <w:b/>
+                <w:color w:val="ED7D31"/>
+                <w:sz w:val="18"/>
+              </w:rPr>
+              <w:t>Rp 5.512.500.000</w:t>
+            </w:r>
+          </w:p>
+        </w:tc>
+      </w:tr>
+      <w:tr>
+        <w:tc>
+          <w:tcPr>
+            <w:tcW w:type="dxa" w:w="3600"/>
+            <w:tcMar>
+              <w:top w:w="45" w:type="dxa"/>
+              <w:bottom w:w="45" w:type="dxa"/>
+              <w:left w:w="70" w:type="dxa"/>
+              <w:right w:w="70" w:type="dxa"/>
+            </w:tcMar>
+            <w:shd w:fill="F8FAFC"/>
+          </w:tcPr>
+          <w:p>
+            <w:r>
+              <w:rPr>
+                <w:rFonts w:ascii="Calibri" w:hAnsi="Calibri"/>
+                <w:b/>
+                <w:color w:val="002060"/>
+                <w:sz w:val="18"/>
+              </w:rPr>
+              <w:t>Suku Bunga &amp; Metode Perhitungan</w:t>
+            </w:r>
+          </w:p>
+        </w:tc>
+        <w:tc>
+          <w:tcPr>
+            <w:tcW w:type="dxa" w:w="5760"/>
+            <w:tcMar>
+              <w:top w:w="45" w:type="dxa"/>
+              <w:bottom w:w="45" w:type="dxa"/>
+              <w:left w:w="70" w:type="dxa"/>
+              <w:right w:w="70" w:type="dxa"/>
+            </w:tcMar>
+            <w:shd w:fill="F8FAFC"/>
+          </w:tcPr>
+          <w:p>
+            <w:r>
+              <w:rPr>
+                <w:rFonts w:ascii="Calibri" w:hAnsi="Calibri"/>
+                <w:color w:val="28323C"/>
+                <w:sz w:val="18"/>
+              </w:rPr>
+              <w:t>10.50% p.a. Efektif Menurun (Reducing Balance Annuity)</w:t>
+            </w:r>
+          </w:p>
+        </w:tc>
+      </w:tr>
+      <w:tr>
+        <w:tc>
+          <w:tcPr>
+            <w:tcW w:type="dxa" w:w="3600"/>
+            <w:tcMar>
+              <w:top w:w="45" w:type="dxa"/>
+              <w:bottom w:w="45" w:type="dxa"/>
+              <w:left w:w="70" w:type="dxa"/>
+              <w:right w:w="70" w:type="dxa"/>
+            </w:tcMar>
+          </w:tcPr>
+          <w:p>
+            <w:r>
+              <w:rPr>
+                <w:rFonts w:ascii="Calibri" w:hAnsi="Calibri"/>
+                <w:b/>
+                <w:color w:val="002060"/>
+                <w:sz w:val="18"/>
+              </w:rPr>
+              <w:t>Tenor Pembiayaan</w:t>
+            </w:r>
+          </w:p>
+        </w:tc>
+        <w:tc>
+          <w:tcPr>
+            <w:tcW w:type="dxa" w:w="5760"/>
+            <w:tcMar>
+              <w:top w:w="45" w:type="dxa"/>
+              <w:bottom w:w="45" w:type="dxa"/>
+              <w:left w:w="70" w:type="dxa"/>
+              <w:right w:w="70" w:type="dxa"/>
+            </w:tcMar>
+          </w:tcPr>
+          <w:p>
+            <w:r>
+              <w:rPr>
+                <w:rFonts w:ascii="Calibri" w:hAnsi="Calibri"/>
+                <w:color w:val="28323C"/>
+                <w:sz w:val="18"/>
+              </w:rPr>
+              <w:t>36 Bulan (3 Tahun) · Skema In Arrear</w:t>
+            </w:r>
+          </w:p>
+        </w:tc>
+      </w:tr>
+      <w:tr>
+        <w:tc>
+          <w:tcPr>
+            <w:tcW w:type="dxa" w:w="3600"/>
+            <w:tcMar>
+              <w:top w:w="45" w:type="dxa"/>
+              <w:bottom w:w="45" w:type="dxa"/>
+              <w:left w:w="70" w:type="dxa"/>
+              <w:right w:w="70" w:type="dxa"/>
+            </w:tcMar>
+            <w:shd w:fill="F8FAFC"/>
+          </w:tcPr>
+          <w:p>
+            <w:r>
+              <w:rPr>
+                <w:rFonts w:ascii="Calibri" w:hAnsi="Calibri"/>
+                <w:b/>
+                <w:color w:val="002060"/>
+                <w:sz w:val="18"/>
+              </w:rPr>
+              <w:t>Angsuran Bulanan Resmi (Monthly Installment)</w:t>
+            </w:r>
+          </w:p>
+        </w:tc>
+        <w:tc>
+          <w:tcPr>
+            <w:tcW w:type="dxa" w:w="5760"/>
+            <w:tcMar>
+              <w:top w:w="45" w:type="dxa"/>
+              <w:bottom w:w="45" w:type="dxa"/>
+              <w:left w:w="70" w:type="dxa"/>
+              <w:right w:w="70" w:type="dxa"/>
+            </w:tcMar>
+            <w:shd w:fill="F8FAFC"/>
+          </w:tcPr>
+          <w:p>
+            <w:r>
+              <w:rPr>
+                <w:rFonts w:ascii="Calibri" w:hAnsi="Calibri"/>
+                <w:b/>
+                <w:color w:val="ED7D31"/>
+                <w:sz w:val="18"/>
+              </w:rPr>
+              <w:t>Rp 179.231.425 / bulan</w:t>
+            </w:r>
+          </w:p>
+        </w:tc>
+      </w:tr>
+      <w:tr>
+        <w:tc>
+          <w:tcPr>
+            <w:tcW w:type="dxa" w:w="3600"/>
+            <w:tcMar>
+              <w:top w:w="45" w:type="dxa"/>
+              <w:bottom w:w="45" w:type="dxa"/>
+              <w:left w:w="70" w:type="dxa"/>
+              <w:right w:w="70" w:type="dxa"/>
+            </w:tcMar>
+          </w:tcPr>
+          <w:p>
+            <w:r>
+              <w:rPr>
+                <w:rFonts w:ascii="Calibri" w:hAnsi="Calibri"/>
+                <w:b/>
+                <w:color w:val="002060"/>
+                <w:sz w:val="18"/>
+              </w:rPr>
+              <w:t>Hasil Evaluasi Rasio &amp; Putusan Kredit</w:t>
+            </w:r>
+          </w:p>
+        </w:tc>
+        <w:tc>
+          <w:tcPr>
+            <w:tcW w:type="dxa" w:w="5760"/>
+            <w:tcMar>
+              <w:top w:w="45" w:type="dxa"/>
+              <w:bottom w:w="45" w:type="dxa"/>
+              <w:left w:w="70" w:type="dxa"/>
+              <w:right w:w="70" w:type="dxa"/>
+            </w:tcMar>
+          </w:tcPr>
+          <w:p>
+            <w:r>
+              <w:rPr>
+                <w:rFonts w:ascii="Calibri" w:hAnsi="Calibri"/>
+                <w:b/>
+                <w:color w:val="ED7D31"/>
+                <w:sz w:val="18"/>
+              </w:rPr>
+              <w:t>DSCR: 2.70x | Pefindo Score: 785 (Risk Grade 2) | STATUS: APPROVED</w:t>
+            </w:r>
+          </w:p>
+        </w:tc>
+      </w:tr>
+    </w:tbl>
+    <w:p>
+      <w:pPr>
+        <w:spacing w:before="160" w:after="60"/>
+        <w:jc w:val="center"/>
+      </w:pPr>
+      <w:r>
+        <w:drawing>
+          <wp:inline xmlns:a="http://schemas.openxmlformats.org/drawingml/2006/main" xmlns:pic="http://schemas.openxmlformats.org/drawingml/2006/picture">
+            <wp:extent cx="5669280" cy="3543300"/>
+            <wp:docPr id="11" name="Picture 11"/>
+            <wp:cNvGraphicFramePr>
+              <a:graphicFrameLocks noChangeAspect="1"/>
+            </wp:cNvGraphicFramePr>
+            <a:graphic>
+              <a:graphicData uri="http://schemas.openxmlformats.org/drawingml/2006/picture">
+                <pic:pic>
+                  <pic:nvPicPr>
+                    <pic:cNvPr id="0" name="tab_4_business_and_banks.png"/>
+                    <pic:cNvPicPr/>
+                  </pic:nvPicPr>
+                  <pic:blipFill>
+                    <a:blip r:embed="rId21"/>
+                    <a:stretch>
+                      <a:fillRect/>
+                    </a:stretch>
+                  </pic:blipFill>
+                  <pic:spPr>
+                    <a:xfrm>
+                      <a:off x="0" y="0"/>
+                      <a:ext cx="5669280" cy="3543300"/>
+                    </a:xfrm>
+                    <a:prstGeom prst="rect"/>
+                  </pic:spPr>
+                </pic:pic>
+              </a:graphicData>
+            </a:graphic>
+          </wp:inline>
+        </w:drawing>
+      </w:r>
+    </w:p>
+    <w:p>
+      <w:pPr>
+        <w:spacing w:after="200"/>
+        <w:jc w:val="center"/>
+      </w:pPr>
+      <w:r>
+        <w:rPr>
+          <w:rFonts w:ascii="Calibri" w:hAnsi="Calibri"/>
+          <w:i/>
+          <w:color w:val="646E7D"/>
+          <w:sz w:val="18"/>
+        </w:rPr>
+        <w:t>Gambar: Proposal Pembiayaan, Kalkulator Simulasi Angsuran Anuitas &amp; Fasilitas Perbankan (Live System)</w:t>
+      </w:r>
+    </w:p>
+    <w:p>
+      <w:pPr>
+        <w:spacing w:before="280" w:after="80"/>
+      </w:pPr>
+      <w:r>
+        <w:rPr>
+          <w:rFonts w:ascii="Calibri" w:hAnsi="Calibri"/>
+          <w:b/>
+          <w:color w:val="002060"/>
+          <w:sz w:val="30"/>
+        </w:rPr>
+        <w:t>BAB 7: TATA KELOLA &amp; MATRIKS WEWENANG PUTUSAN KOMITE KREDIT</w:t>
+      </w:r>
+    </w:p>
+    <w:p>
+      <w:pPr>
+        <w:spacing w:line="276" w:lineRule="auto" w:after="120"/>
+      </w:pPr>
+      <w:r>
+        <w:t>Untuk menjaga independensi dan kepatuhan terhadap prinsip Four-Eyes Principle OJK, sistem membagi kewenangan persetujuan kredit secara berjenjang berdasarkan plafon pembiayaan (Ticket Size):</w:t>
+        <w:br/>
+        <w:t>• Tier 1 (Plafon s/d Rp 2.5 Miliar): Diputuskan oleh Branch Manager bersama Head of Credit Analyst Cabang.</w:t>
+        <w:br/>
+        <w:t>• Tier 2 (Plafon Rp 2.5 Miliar – Rp 10 Miliar): Diputuskan oleh Komite Kredit Head Office (Head of CA, Head of Legal, Marketing Director).</w:t>
+        <w:br/>
+        <w:t>• Tier 3 (Plafon &gt; Rp 10 Miliar atau Debitur Khusus): Wajib diputuskan oleh Sidang Komite Kredit Lengkap yang dipimpin langsung oleh Bapak Presiden Direktur.</w:t>
+      </w:r>
+    </w:p>
+    <w:p>
+      <w:pPr>
+        <w:spacing w:before="160" w:after="60"/>
+        <w:jc w:val="center"/>
+      </w:pPr>
+      <w:r>
+        <w:drawing>
+          <wp:inline xmlns:a="http://schemas.openxmlformats.org/drawingml/2006/main" xmlns:pic="http://schemas.openxmlformats.org/drawingml/2006/picture">
+            <wp:extent cx="5669280" cy="3543300"/>
+            <wp:docPr id="12" name="Picture 12"/>
+            <wp:cNvGraphicFramePr>
+              <a:graphicFrameLocks noChangeAspect="1"/>
+            </wp:cNvGraphicFramePr>
+            <a:graphic>
+              <a:graphicData uri="http://schemas.openxmlformats.org/drawingml/2006/picture">
+                <pic:pic>
+                  <pic:nvPicPr>
+                    <pic:cNvPr id="0" name="committee_review_actions.png"/>
+                    <pic:cNvPicPr/>
+                  </pic:nvPicPr>
+                  <pic:blipFill>
+                    <a:blip r:embed="rId22"/>
+                    <a:stretch>
+                      <a:fillRect/>
+                    </a:stretch>
+                  </pic:blipFill>
+                  <pic:spPr>
+                    <a:xfrm>
+                      <a:off x="0" y="0"/>
+                      <a:ext cx="5669280" cy="3543300"/>
+                    </a:xfrm>
+                    <a:prstGeom prst="rect"/>
+                  </pic:spPr>
+                </pic:pic>
+              </a:graphicData>
+            </a:graphic>
+          </wp:inline>
+        </w:drawing>
+      </w:r>
+    </w:p>
+    <w:p>
+      <w:pPr>
+        <w:spacing w:after="200"/>
+        <w:jc w:val="center"/>
+      </w:pPr>
+      <w:r>
+        <w:rPr>
+          <w:rFonts w:ascii="Calibri" w:hAnsi="Calibri"/>
+          <w:i/>
+          <w:color w:val="646E7D"/>
+          <w:sz w:val="18"/>
+        </w:rPr>
+        <w:t>Gambar: Layar Persetujuan Komite Kredit dengan Tombol Aksi Mutlak: Approve / Reject / Return (Live System)</w:t>
+      </w:r>
+    </w:p>
+    <w:p>
+      <w:pPr>
+        <w:spacing w:before="280" w:after="80"/>
+      </w:pPr>
+      <w:r>
+        <w:rPr>
+          <w:rFonts w:ascii="Calibri" w:hAnsi="Calibri"/>
+          <w:b/>
+          <w:color w:val="002060"/>
+          <w:sz w:val="30"/>
+        </w:rPr>
+        <w:t>BAB 8: TARGET KPI OPERASIONAL, ROI &amp; LEMBAR PENGESAHAN</w:t>
+      </w:r>
+    </w:p>
+    <w:tbl>
+      <w:tblPr>
+        <w:tblW w:type="auto" w:w="0"/>
+        <w:jc w:val="center"/>
+        <w:tblLayout w:type="fixed"/>
+        <w:tblLook w:firstColumn="1" w:firstRow="1" w:lastColumn="0" w:lastRow="0" w:noHBand="0" w:noVBand="1" w:val="04A0"/>
+        <w:tblBorders>
+          <w:top w:val="single" w:sz="4" w:space="0" w:color="D3D3D3"/>
+          <w:bottom w:val="single" w:sz="4" w:space="0" w:color="D3D3D3"/>
+          <w:insideH w:val="single" w:sz="4" w:space="0" w:color="D3D3D3"/>
+          <w:insideV w:val="none"/>
+          <w:left w:val="none"/>
+          <w:right w:val="none"/>
+        </w:tblBorders>
+      </w:tblPr>
+      <w:tblGrid>
+        <w:gridCol w:w="3202"/>
+        <w:gridCol w:w="3202"/>
+        <w:gridCol w:w="3202"/>
       </w:tblGrid>
       <w:tr>
         <w:tc>
@@ -1370,10 +2507,10 @@
             <w:tcW w:type="dxa" w:w="3600"/>
             <w:shd w:fill="002060"/>
             <w:tcMar>
-              <w:top w:w="70" w:type="dxa"/>
-              <w:bottom w:w="70" w:type="dxa"/>
-              <w:left w:w="90" w:type="dxa"/>
-              <w:right w:w="90" w:type="dxa"/>
+              <w:top w:w="60" w:type="dxa"/>
+              <w:bottom w:w="60" w:type="dxa"/>
+              <w:left w:w="80" w:type="dxa"/>
+              <w:right w:w="80" w:type="dxa"/>
             </w:tcMar>
           </w:tcPr>
           <w:p>
@@ -1393,10 +2530,10 @@
             <w:tcW w:type="dxa" w:w="2592"/>
             <w:shd w:fill="002060"/>
             <w:tcMar>
-              <w:top w:w="70" w:type="dxa"/>
-              <w:bottom w:w="70" w:type="dxa"/>
-              <w:left w:w="90" w:type="dxa"/>
-              <w:right w:w="90" w:type="dxa"/>
+              <w:top w:w="60" w:type="dxa"/>
+              <w:bottom w:w="60" w:type="dxa"/>
+              <w:left w:w="80" w:type="dxa"/>
+              <w:right w:w="80" w:type="dxa"/>
             </w:tcMar>
           </w:tcPr>
           <w:p>
@@ -1416,10 +2553,10 @@
             <w:tcW w:type="dxa" w:w="3168"/>
             <w:shd w:fill="002060"/>
             <w:tcMar>
-              <w:top w:w="70" w:type="dxa"/>
-              <w:bottom w:w="70" w:type="dxa"/>
-              <w:left w:w="90" w:type="dxa"/>
-              <w:right w:w="90" w:type="dxa"/>
+              <w:top w:w="60" w:type="dxa"/>
+              <w:bottom w:w="60" w:type="dxa"/>
+              <w:left w:w="80" w:type="dxa"/>
+              <w:right w:w="80" w:type="dxa"/>
             </w:tcMar>
           </w:tcPr>
           <w:p>
@@ -1440,10 +2577,10 @@
           <w:tcPr>
             <w:tcW w:type="dxa" w:w="3600"/>
             <w:tcMar>
-              <w:top w:w="60" w:type="dxa"/>
-              <w:bottom w:w="60" w:type="dxa"/>
-              <w:left w:w="80" w:type="dxa"/>
-              <w:right w:w="80" w:type="dxa"/>
+              <w:top w:w="50" w:type="dxa"/>
+              <w:bottom w:w="50" w:type="dxa"/>
+              <w:left w:w="70" w:type="dxa"/>
+              <w:right w:w="70" w:type="dxa"/>
             </w:tcMar>
           </w:tcPr>
           <w:p>
@@ -1452,7 +2589,7 @@
                 <w:rFonts w:ascii="Calibri" w:hAnsi="Calibri"/>
                 <w:b/>
                 <w:color w:val="002060"/>
-                <w:sz w:val="18"/>
+                <w:sz w:val="17"/>
               </w:rPr>
               <w:t>Turnaround Time (TAT) Siklus Kredit</w:t>
             </w:r>
@@ -1462,17 +2599,17 @@
           <w:tcPr>
             <w:tcW w:type="dxa" w:w="2592"/>
             <w:tcMar>
-              <w:top w:w="60" w:type="dxa"/>
-              <w:bottom w:w="60" w:type="dxa"/>
-              <w:left w:w="80" w:type="dxa"/>
-              <w:right w:w="80" w:type="dxa"/>
+              <w:top w:w="50" w:type="dxa"/>
+              <w:bottom w:w="50" w:type="dxa"/>
+              <w:left w:w="70" w:type="dxa"/>
+              <w:right w:w="70" w:type="dxa"/>
             </w:tcMar>
           </w:tcPr>
           <w:p>
             <w:r>
               <w:rPr>
                 <w:rFonts w:ascii="Calibri" w:hAnsi="Calibri"/>
-                <w:sz w:val="18"/>
+                <w:sz w:val="17"/>
               </w:rPr>
               <w:t>10 – 14 Hari Kerja</w:t>
             </w:r>
@@ -1482,10 +2619,10 @@
           <w:tcPr>
             <w:tcW w:type="dxa" w:w="3168"/>
             <w:tcMar>
-              <w:top w:w="60" w:type="dxa"/>
-              <w:bottom w:w="60" w:type="dxa"/>
-              <w:left w:w="80" w:type="dxa"/>
-              <w:right w:w="80" w:type="dxa"/>
+              <w:top w:w="50" w:type="dxa"/>
+              <w:bottom w:w="50" w:type="dxa"/>
+              <w:left w:w="70" w:type="dxa"/>
+              <w:right w:w="70" w:type="dxa"/>
             </w:tcMar>
           </w:tcPr>
           <w:p>
@@ -1494,7 +2631,7 @@
                 <w:rFonts w:ascii="Calibri" w:hAnsi="Calibri"/>
                 <w:b/>
                 <w:color w:val="ED7D31"/>
-                <w:sz w:val="18"/>
+                <w:sz w:val="17"/>
               </w:rPr>
               <w:t>Maksimal 48 Jam (2 Hari)</w:t>
             </w:r>
@@ -1506,10 +2643,10 @@
           <w:tcPr>
             <w:tcW w:type="dxa" w:w="3600"/>
             <w:tcMar>
-              <w:top w:w="60" w:type="dxa"/>
-              <w:bottom w:w="60" w:type="dxa"/>
-              <w:left w:w="80" w:type="dxa"/>
-              <w:right w:w="80" w:type="dxa"/>
+              <w:top w:w="50" w:type="dxa"/>
+              <w:bottom w:w="50" w:type="dxa"/>
+              <w:left w:w="70" w:type="dxa"/>
+              <w:right w:w="70" w:type="dxa"/>
             </w:tcMar>
             <w:shd w:fill="F8FAFC"/>
           </w:tcPr>
@@ -1519,7 +2656,7 @@
                 <w:rFonts w:ascii="Calibri" w:hAnsi="Calibri"/>
                 <w:b/>
                 <w:color w:val="002060"/>
-                <w:sz w:val="18"/>
+                <w:sz w:val="17"/>
               </w:rPr>
               <w:t>Waktu Onboarding &amp; Input Data Nasabah</w:t>
             </w:r>
@@ -1529,10 +2666,10 @@
           <w:tcPr>
             <w:tcW w:type="dxa" w:w="2592"/>
             <w:tcMar>
-              <w:top w:w="60" w:type="dxa"/>
-              <w:bottom w:w="60" w:type="dxa"/>
-              <w:left w:w="80" w:type="dxa"/>
-              <w:right w:w="80" w:type="dxa"/>
+              <w:top w:w="50" w:type="dxa"/>
+              <w:bottom w:w="50" w:type="dxa"/>
+              <w:left w:w="70" w:type="dxa"/>
+              <w:right w:w="70" w:type="dxa"/>
             </w:tcMar>
             <w:shd w:fill="F8FAFC"/>
           </w:tcPr>
@@ -1540,7 +2677,7 @@
             <w:r>
               <w:rPr>
                 <w:rFonts w:ascii="Calibri" w:hAnsi="Calibri"/>
-                <w:sz w:val="18"/>
+                <w:sz w:val="17"/>
               </w:rPr>
               <w:t>4 – 6 Jam</w:t>
             </w:r>
@@ -1550,10 +2687,10 @@
           <w:tcPr>
             <w:tcW w:type="dxa" w:w="3168"/>
             <w:tcMar>
-              <w:top w:w="60" w:type="dxa"/>
-              <w:bottom w:w="60" w:type="dxa"/>
-              <w:left w:w="80" w:type="dxa"/>
-              <w:right w:w="80" w:type="dxa"/>
+              <w:top w:w="50" w:type="dxa"/>
+              <w:bottom w:w="50" w:type="dxa"/>
+              <w:left w:w="70" w:type="dxa"/>
+              <w:right w:w="70" w:type="dxa"/>
             </w:tcMar>
             <w:shd w:fill="F8FAFC"/>
           </w:tcPr>
@@ -1563,7 +2700,7 @@
                 <w:rFonts w:ascii="Calibri" w:hAnsi="Calibri"/>
                 <w:b/>
                 <w:color w:val="ED7D31"/>
-                <w:sz w:val="18"/>
+                <w:sz w:val="17"/>
               </w:rPr>
               <w:t>≤ 30 Menit (Multi-Doc OCR)</w:t>
             </w:r>
@@ -1575,10 +2712,10 @@
           <w:tcPr>
             <w:tcW w:type="dxa" w:w="3600"/>
             <w:tcMar>
-              <w:top w:w="60" w:type="dxa"/>
-              <w:bottom w:w="60" w:type="dxa"/>
-              <w:left w:w="80" w:type="dxa"/>
-              <w:right w:w="80" w:type="dxa"/>
+              <w:top w:w="50" w:type="dxa"/>
+              <w:bottom w:w="50" w:type="dxa"/>
+              <w:left w:w="70" w:type="dxa"/>
+              <w:right w:w="70" w:type="dxa"/>
             </w:tcMar>
           </w:tcPr>
           <w:p>
@@ -1587,7 +2724,7 @@
                 <w:rFonts w:ascii="Calibri" w:hAnsi="Calibri"/>
                 <w:b/>
                 <w:color w:val="002060"/>
-                <w:sz w:val="18"/>
+                <w:sz w:val="17"/>
               </w:rPr>
               <w:t>Inquiry Riwayat Kredit SLIK / Pefindo</w:t>
             </w:r>
@@ -1597,17 +2734,17 @@
           <w:tcPr>
             <w:tcW w:type="dxa" w:w="2592"/>
             <w:tcMar>
-              <w:top w:w="60" w:type="dxa"/>
-              <w:bottom w:w="60" w:type="dxa"/>
-              <w:left w:w="80" w:type="dxa"/>
-              <w:right w:w="80" w:type="dxa"/>
+              <w:top w:w="50" w:type="dxa"/>
+              <w:bottom w:w="50" w:type="dxa"/>
+              <w:left w:w="70" w:type="dxa"/>
+              <w:right w:w="70" w:type="dxa"/>
             </w:tcMar>
           </w:tcPr>
           <w:p>
             <w:r>
               <w:rPr>
                 <w:rFonts w:ascii="Calibri" w:hAnsi="Calibri"/>
-                <w:sz w:val="18"/>
+                <w:sz w:val="17"/>
               </w:rPr>
               <w:t>1 – 2 Hari Kerja</w:t>
             </w:r>
@@ -1617,10 +2754,10 @@
           <w:tcPr>
             <w:tcW w:type="dxa" w:w="3168"/>
             <w:tcMar>
-              <w:top w:w="60" w:type="dxa"/>
-              <w:bottom w:w="60" w:type="dxa"/>
-              <w:left w:w="80" w:type="dxa"/>
-              <w:right w:w="80" w:type="dxa"/>
+              <w:top w:w="50" w:type="dxa"/>
+              <w:bottom w:w="50" w:type="dxa"/>
+              <w:left w:w="70" w:type="dxa"/>
+              <w:right w:w="70" w:type="dxa"/>
             </w:tcMar>
           </w:tcPr>
           <w:p>
@@ -1629,7 +2766,7 @@
                 <w:rFonts w:ascii="Calibri" w:hAnsi="Calibri"/>
                 <w:b/>
                 <w:color w:val="ED7D31"/>
-                <w:sz w:val="18"/>
+                <w:sz w:val="17"/>
               </w:rPr>
               <w:t>Real-Time / Hitungan Detik</w:t>
             </w:r>
@@ -1641,10 +2778,10 @@
           <w:tcPr>
             <w:tcW w:type="dxa" w:w="3600"/>
             <w:tcMar>
-              <w:top w:w="60" w:type="dxa"/>
-              <w:bottom w:w="60" w:type="dxa"/>
-              <w:left w:w="80" w:type="dxa"/>
-              <w:right w:w="80" w:type="dxa"/>
+              <w:top w:w="50" w:type="dxa"/>
+              <w:bottom w:w="50" w:type="dxa"/>
+              <w:left w:w="70" w:type="dxa"/>
+              <w:right w:w="70" w:type="dxa"/>
             </w:tcMar>
             <w:shd w:fill="F8FAFC"/>
           </w:tcPr>
@@ -1654,7 +2791,7 @@
                 <w:rFonts w:ascii="Calibri" w:hAnsi="Calibri"/>
                 <w:b/>
                 <w:color w:val="002060"/>
-                <w:sz w:val="18"/>
+                <w:sz w:val="17"/>
               </w:rPr>
               <w:t>Tingkat Retur Berkas (Defect Rate)</w:t>
             </w:r>
@@ -1664,10 +2801,10 @@
           <w:tcPr>
             <w:tcW w:type="dxa" w:w="2592"/>
             <w:tcMar>
-              <w:top w:w="60" w:type="dxa"/>
-              <w:bottom w:w="60" w:type="dxa"/>
-              <w:left w:w="80" w:type="dxa"/>
-              <w:right w:w="80" w:type="dxa"/>
+              <w:top w:w="50" w:type="dxa"/>
+              <w:bottom w:w="50" w:type="dxa"/>
+              <w:left w:w="70" w:type="dxa"/>
+              <w:right w:w="70" w:type="dxa"/>
             </w:tcMar>
             <w:shd w:fill="F8FAFC"/>
           </w:tcPr>
@@ -1675,7 +2812,7 @@
             <w:r>
               <w:rPr>
                 <w:rFonts w:ascii="Calibri" w:hAnsi="Calibri"/>
-                <w:sz w:val="18"/>
+                <w:sz w:val="17"/>
               </w:rPr>
               <w:t>35% – 40% aplikasi</w:t>
             </w:r>
@@ -1685,10 +2822,10 @@
           <w:tcPr>
             <w:tcW w:type="dxa" w:w="3168"/>
             <w:tcMar>
-              <w:top w:w="60" w:type="dxa"/>
-              <w:bottom w:w="60" w:type="dxa"/>
-              <w:left w:w="80" w:type="dxa"/>
-              <w:right w:w="80" w:type="dxa"/>
+              <w:top w:w="50" w:type="dxa"/>
+              <w:bottom w:w="50" w:type="dxa"/>
+              <w:left w:w="70" w:type="dxa"/>
+              <w:right w:w="70" w:type="dxa"/>
             </w:tcMar>
             <w:shd w:fill="F8FAFC"/>
           </w:tcPr>
@@ -1698,7 +2835,7 @@
                 <w:rFonts w:ascii="Calibri" w:hAnsi="Calibri"/>
                 <w:b/>
                 <w:color w:val="ED7D31"/>
-                <w:sz w:val="18"/>
+                <w:sz w:val="17"/>
               </w:rPr>
               <w:t>≤ 3% permohonan</w:t>
             </w:r>
@@ -1710,10 +2847,10 @@
           <w:tcPr>
             <w:tcW w:type="dxa" w:w="3600"/>
             <w:tcMar>
-              <w:top w:w="60" w:type="dxa"/>
-              <w:bottom w:w="60" w:type="dxa"/>
-              <w:left w:w="80" w:type="dxa"/>
-              <w:right w:w="80" w:type="dxa"/>
+              <w:top w:w="50" w:type="dxa"/>
+              <w:bottom w:w="50" w:type="dxa"/>
+              <w:left w:w="70" w:type="dxa"/>
+              <w:right w:w="70" w:type="dxa"/>
             </w:tcMar>
           </w:tcPr>
           <w:p>
@@ -1722,7 +2859,7 @@
                 <w:rFonts w:ascii="Calibri" w:hAnsi="Calibri"/>
                 <w:b/>
                 <w:color w:val="002060"/>
-                <w:sz w:val="18"/>
+                <w:sz w:val="17"/>
               </w:rPr>
               <w:t>Akurasi Laporan Keuangan &amp; Saham</w:t>
             </w:r>
@@ -1732,17 +2869,17 @@
           <w:tcPr>
             <w:tcW w:type="dxa" w:w="2592"/>
             <w:tcMar>
-              <w:top w:w="60" w:type="dxa"/>
-              <w:bottom w:w="60" w:type="dxa"/>
-              <w:left w:w="80" w:type="dxa"/>
-              <w:right w:w="80" w:type="dxa"/>
+              <w:top w:w="50" w:type="dxa"/>
+              <w:bottom w:w="50" w:type="dxa"/>
+              <w:left w:w="70" w:type="dxa"/>
+              <w:right w:w="70" w:type="dxa"/>
             </w:tcMar>
           </w:tcPr>
           <w:p>
             <w:r>
               <w:rPr>
                 <w:rFonts w:ascii="Calibri" w:hAnsi="Calibri"/>
-                <w:sz w:val="18"/>
+                <w:sz w:val="17"/>
               </w:rPr>
               <w:t>Rentan salah hitung</w:t>
             </w:r>
@@ -1752,10 +2889,10 @@
           <w:tcPr>
             <w:tcW w:type="dxa" w:w="3168"/>
             <w:tcMar>
-              <w:top w:w="60" w:type="dxa"/>
-              <w:bottom w:w="60" w:type="dxa"/>
-              <w:left w:w="80" w:type="dxa"/>
-              <w:right w:w="80" w:type="dxa"/>
+              <w:top w:w="50" w:type="dxa"/>
+              <w:bottom w:w="50" w:type="dxa"/>
+              <w:left w:w="70" w:type="dxa"/>
+              <w:right w:w="70" w:type="dxa"/>
             </w:tcMar>
           </w:tcPr>
           <w:p>
@@ -1764,7 +2901,7 @@
                 <w:rFonts w:ascii="Calibri" w:hAnsi="Calibri"/>
                 <w:b/>
                 <w:color w:val="ED7D31"/>
-                <w:sz w:val="18"/>
+                <w:sz w:val="17"/>
               </w:rPr>
               <w:t>100% Zero-Error Terverifikasi</w:t>
             </w:r>
@@ -1774,7 +2911,7 @@
     </w:tbl>
     <w:p>
       <w:pPr>
-        <w:spacing w:after="320"/>
+        <w:spacing w:after="400"/>
       </w:pPr>
     </w:p>
     <w:tbl>
@@ -1793,13 +2930,13 @@
         </w:tblBorders>
       </w:tblPr>
       <w:tblGrid>
-        <w:gridCol w:w="4514"/>
-        <w:gridCol w:w="4514"/>
+        <w:gridCol w:w="4802"/>
+        <w:gridCol w:w="4802"/>
       </w:tblGrid>
       <w:tr>
         <w:tc>
           <w:tcPr>
-            <w:tcW w:type="dxa" w:w="4514"/>
+            <w:tcW w:type="dxa" w:w="4802"/>
           </w:tcPr>
           <w:p>
             <w:pPr>
@@ -1813,6 +2950,7 @@
               <w:t>Disiapkan &amp; Diajukan Oleh:</w:t>
               <w:br/>
               <w:t>Lead System Owner &amp; Technical In-Charge</w:t>
+              <w:br/>
               <w:br/>
               <w:br/>
               <w:br/>
@@ -1836,7 +2974,7 @@
         </w:tc>
         <w:tc>
           <w:tcPr>
-            <w:tcW w:type="dxa" w:w="4514"/>
+            <w:tcW w:type="dxa" w:w="4802"/>
           </w:tcPr>
           <w:p>
             <w:pPr>
@@ -1850,6 +2988,7 @@
               <w:t>Ditelaah &amp; Disetujui Oleh:</w:t>
               <w:br/>
               <w:t>Presiden Direktur</w:t>
+              <w:br/>
               <w:br/>
               <w:br/>
               <w:br/>
@@ -1872,26 +3011,12 @@
           </w:p>
         </w:tc>
       </w:tr>
-      <w:tr>
-        <w:tc>
-          <w:tcPr>
-            <w:tcW w:type="dxa" w:w="4514"/>
-          </w:tcPr>
-          <w:p/>
-        </w:tc>
-        <w:tc>
-          <w:tcPr>
-            <w:tcW w:type="dxa" w:w="4514"/>
-          </w:tcPr>
-          <w:p/>
-        </w:tc>
-      </w:tr>
     </w:tbl>
     <w:sectPr>
       <w:headerReference w:type="default" r:id="rId9"/>
       <w:footerReference w:type="default" r:id="rId10"/>
       <w:pgSz w:w="11909" w:h="16834"/>
-      <w:pgMar w:top="1440" w:right="1440" w:bottom="1440" w:left="1440" w:header="720" w:footer="720" w:gutter="0"/>
+      <w:pgMar w:top="1152" w:right="1152" w:bottom="1152" w:left="1152" w:header="720" w:footer="720" w:gutter="0"/>
       <w:cols w:space="720"/>
       <w:docGrid w:linePitch="360"/>
     </w:sectPr>
@@ -1912,7 +3037,7 @@
         <w:color w:val="78828C"/>
         <w:sz w:val="17"/>
       </w:rPr>
-      <w:t>Dokumen Spesifikasi Bisnis &amp; Panduan Eksekutif Direksi  •  Rahasia &amp; Hak Milik Perusahaan</w:t>
+      <w:t>Dokumen Spesifikasi Bisnis &amp; Panduan Eksekutif Direksi  •  Confidential / Hak Milik Perusahaan</w:t>
     </w:r>
   </w:p>
 </w:ftr>
@@ -1931,7 +3056,7 @@
         <w:color w:val="78828C"/>
         <w:sz w:val="17"/>
       </w:rPr>
-      <w:t>PT LIUGONG FINANCE INDONESIA  |  ORIGINATION WORKSPACE &amp; CRM (LOS-CRM)</w:t>
+      <w:t>PT LIUGONG FINANCE INDONESIA  |  LOAN ORIGINATION SYSTEM &amp; CRM (LOS-CRM)</w:t>
     </w:r>
   </w:p>
 </w:hdr>

</xml_diff>

<commit_message>
feat(diagram): embed publication-grade 4-stage pipeline diagram into Word doc BAB 2 using diagram-design skill
</commit_message>
<xml_diff>
--- a/LIUGONG_CRM_BUSINESS_SPECIFICATION_PRESDIR.docx
+++ b/LIUGONG_CRM_BUSINESS_SPECIFICATION_PRESDIR.docx
@@ -540,12 +540,65 @@
     </w:p>
     <w:p>
       <w:pPr>
-        <w:spacing w:line="276" w:lineRule="auto" w:after="120"/>
+        <w:spacing w:line="276" w:lineRule="auto" w:after="160"/>
       </w:pPr>
       <w:r>
-        <w:t>Aplikasi menerapkan alur 4 tahap berjenjang yang menyatukan otomasi AI dan kehati-hatian perbankan (Prudential Banking):</w:t>
-        <w:br/>
-        <w:t>FAP STAGE  ⟶  [PEFINDO OCR GATEWAY]  ⟶  PRE-ANALYSIS  ⟶  ICLF  ⟶  PROPOSAL</w:t>
+        <w:t>Aplikasi menerapkan alur 4 tahap berjenjang yang menyatukan otomatisasi cerdas AI dan kehati-hatian perbankan (Prudential Banking), menghubungkan FAP Stage, Intelligent Pefindo Gateway, Pre-Analysis, ICLF, hingga Proposal final Komite Kredit:</w:t>
+      </w:r>
+    </w:p>
+    <w:p>
+      <w:pPr>
+        <w:spacing w:before="160" w:after="60"/>
+        <w:jc w:val="center"/>
+      </w:pPr>
+      <w:r>
+        <w:drawing>
+          <wp:inline xmlns:a="http://schemas.openxmlformats.org/drawingml/2006/main" xmlns:pic="http://schemas.openxmlformats.org/drawingml/2006/picture">
+            <wp:extent cx="5669280" cy="2791926"/>
+            <wp:docPr id="3" name="Picture 3"/>
+            <wp:cNvGraphicFramePr>
+              <a:graphicFrameLocks noChangeAspect="1"/>
+            </wp:cNvGraphicFramePr>
+            <a:graphic>
+              <a:graphicData uri="http://schemas.openxmlformats.org/drawingml/2006/picture">
+                <pic:pic>
+                  <pic:nvPicPr>
+                    <pic:cNvPr id="0" name="diagram_pipa_strategis_4_tahap.png"/>
+                    <pic:cNvPicPr/>
+                  </pic:nvPicPr>
+                  <pic:blipFill>
+                    <a:blip r:embed="rId13"/>
+                    <a:stretch>
+                      <a:fillRect/>
+                    </a:stretch>
+                  </pic:blipFill>
+                  <pic:spPr>
+                    <a:xfrm>
+                      <a:off x="0" y="0"/>
+                      <a:ext cx="5669280" cy="2791926"/>
+                    </a:xfrm>
+                    <a:prstGeom prst="rect"/>
+                  </pic:spPr>
+                </pic:pic>
+              </a:graphicData>
+            </a:graphic>
+          </wp:inline>
+        </w:drawing>
+      </w:r>
+    </w:p>
+    <w:p>
+      <w:pPr>
+        <w:spacing w:after="200"/>
+        <w:jc w:val="center"/>
+      </w:pPr>
+      <w:r>
+        <w:rPr>
+          <w:rFonts w:ascii="Calibri" w:hAnsi="Calibri"/>
+          <w:i/>
+          <w:color w:val="646E7D"/>
+          <w:sz w:val="18"/>
+        </w:rPr>
+        <w:t>Gambar: Diagram Arsitektur Pipa Strategis 4-Tahap, Jembatan Pefindo Biro Kredit, dan Fondasi Ekosistem LiuGong Finance</w:t>
       </w:r>
     </w:p>
     <w:tbl>
@@ -1060,7 +1113,7 @@
         <w:drawing>
           <wp:inline xmlns:a="http://schemas.openxmlformats.org/drawingml/2006/main" xmlns:pic="http://schemas.openxmlformats.org/drawingml/2006/picture">
             <wp:extent cx="5669280" cy="3543300"/>
-            <wp:docPr id="3" name="Picture 3"/>
+            <wp:docPr id="4" name="Picture 4"/>
             <wp:cNvGraphicFramePr>
               <a:graphicFrameLocks noChangeAspect="1"/>
             </wp:cNvGraphicFramePr>
@@ -1072,7 +1125,7 @@
                     <pic:cNvPicPr/>
                   </pic:nvPicPr>
                   <pic:blipFill>
-                    <a:blip r:embed="rId13"/>
+                    <a:blip r:embed="rId14"/>
                     <a:stretch>
                       <a:fillRect/>
                     </a:stretch>
@@ -1172,7 +1225,7 @@
         <w:drawing>
           <wp:inline xmlns:a="http://schemas.openxmlformats.org/drawingml/2006/main" xmlns:pic="http://schemas.openxmlformats.org/drawingml/2006/picture">
             <wp:extent cx="5669280" cy="3543300"/>
-            <wp:docPr id="4" name="Picture 4"/>
+            <wp:docPr id="5" name="Picture 5"/>
             <wp:cNvGraphicFramePr>
               <a:graphicFrameLocks noChangeAspect="1"/>
             </wp:cNvGraphicFramePr>
@@ -1184,7 +1237,7 @@
                     <pic:cNvPicPr/>
                   </pic:nvPicPr>
                   <pic:blipFill>
-                    <a:blip r:embed="rId14"/>
+                    <a:blip r:embed="rId15"/>
                     <a:stretch>
                       <a:fillRect/>
                     </a:stretch>
@@ -1343,7 +1396,7 @@
         <w:drawing>
           <wp:inline xmlns:a="http://schemas.openxmlformats.org/drawingml/2006/main" xmlns:pic="http://schemas.openxmlformats.org/drawingml/2006/picture">
             <wp:extent cx="5669280" cy="3543300"/>
-            <wp:docPr id="5" name="Picture 5"/>
+            <wp:docPr id="6" name="Picture 6"/>
             <wp:cNvGraphicFramePr>
               <a:graphicFrameLocks noChangeAspect="1"/>
             </wp:cNvGraphicFramePr>
@@ -1355,7 +1408,7 @@
                     <pic:cNvPicPr/>
                   </pic:nvPicPr>
                   <pic:blipFill>
-                    <a:blip r:embed="rId15"/>
+                    <a:blip r:embed="rId16"/>
                     <a:stretch>
                       <a:fillRect/>
                     </a:stretch>
@@ -1398,7 +1451,7 @@
         <w:drawing>
           <wp:inline xmlns:a="http://schemas.openxmlformats.org/drawingml/2006/main" xmlns:pic="http://schemas.openxmlformats.org/drawingml/2006/picture">
             <wp:extent cx="5669280" cy="3543300"/>
-            <wp:docPr id="6" name="Picture 6"/>
+            <wp:docPr id="7" name="Picture 7"/>
             <wp:cNvGraphicFramePr>
               <a:graphicFrameLocks noChangeAspect="1"/>
             </wp:cNvGraphicFramePr>
@@ -1410,7 +1463,7 @@
                     <pic:cNvPicPr/>
                   </pic:nvPicPr>
                   <pic:blipFill>
-                    <a:blip r:embed="rId16"/>
+                    <a:blip r:embed="rId17"/>
                     <a:stretch>
                       <a:fillRect/>
                     </a:stretch>
@@ -1563,7 +1616,7 @@
         <w:drawing>
           <wp:inline xmlns:a="http://schemas.openxmlformats.org/drawingml/2006/main" xmlns:pic="http://schemas.openxmlformats.org/drawingml/2006/picture">
             <wp:extent cx="5669280" cy="3543300"/>
-            <wp:docPr id="7" name="Picture 7"/>
+            <wp:docPr id="8" name="Picture 8"/>
             <wp:cNvGraphicFramePr>
               <a:graphicFrameLocks noChangeAspect="1"/>
             </wp:cNvGraphicFramePr>
@@ -1575,7 +1628,7 @@
                     <pic:cNvPicPr/>
                   </pic:nvPicPr>
                   <pic:blipFill>
-                    <a:blip r:embed="rId17"/>
+                    <a:blip r:embed="rId18"/>
                     <a:stretch>
                       <a:fillRect/>
                     </a:stretch>
@@ -1618,7 +1671,7 @@
         <w:drawing>
           <wp:inline xmlns:a="http://schemas.openxmlformats.org/drawingml/2006/main" xmlns:pic="http://schemas.openxmlformats.org/drawingml/2006/picture">
             <wp:extent cx="5669280" cy="3543300"/>
-            <wp:docPr id="8" name="Picture 8"/>
+            <wp:docPr id="9" name="Picture 9"/>
             <wp:cNvGraphicFramePr>
               <a:graphicFrameLocks noChangeAspect="1"/>
             </wp:cNvGraphicFramePr>
@@ -1630,7 +1683,7 @@
                     <pic:cNvPicPr/>
                   </pic:nvPicPr>
                   <pic:blipFill>
-                    <a:blip r:embed="rId18"/>
+                    <a:blip r:embed="rId19"/>
                     <a:stretch>
                       <a:fillRect/>
                     </a:stretch>
@@ -1673,7 +1726,7 @@
         <w:drawing>
           <wp:inline xmlns:a="http://schemas.openxmlformats.org/drawingml/2006/main" xmlns:pic="http://schemas.openxmlformats.org/drawingml/2006/picture">
             <wp:extent cx="5669280" cy="3543300"/>
-            <wp:docPr id="9" name="Picture 9"/>
+            <wp:docPr id="10" name="Picture 10"/>
             <wp:cNvGraphicFramePr>
               <a:graphicFrameLocks noChangeAspect="1"/>
             </wp:cNvGraphicFramePr>
@@ -1685,7 +1738,7 @@
                     <pic:cNvPicPr/>
                   </pic:nvPicPr>
                   <pic:blipFill>
-                    <a:blip r:embed="rId19"/>
+                    <a:blip r:embed="rId20"/>
                     <a:stretch>
                       <a:fillRect/>
                     </a:stretch>
@@ -1728,7 +1781,7 @@
         <w:drawing>
           <wp:inline xmlns:a="http://schemas.openxmlformats.org/drawingml/2006/main" xmlns:pic="http://schemas.openxmlformats.org/drawingml/2006/picture">
             <wp:extent cx="5669280" cy="3543300"/>
-            <wp:docPr id="10" name="Picture 10"/>
+            <wp:docPr id="11" name="Picture 11"/>
             <wp:cNvGraphicFramePr>
               <a:graphicFrameLocks noChangeAspect="1"/>
             </wp:cNvGraphicFramePr>
@@ -1740,7 +1793,7 @@
                     <pic:cNvPicPr/>
                   </pic:nvPicPr>
                   <pic:blipFill>
-                    <a:blip r:embed="rId20"/>
+                    <a:blip r:embed="rId21"/>
                     <a:stretch>
                       <a:fillRect/>
                     </a:stretch>
@@ -2338,7 +2391,7 @@
         <w:drawing>
           <wp:inline xmlns:a="http://schemas.openxmlformats.org/drawingml/2006/main" xmlns:pic="http://schemas.openxmlformats.org/drawingml/2006/picture">
             <wp:extent cx="5669280" cy="3543300"/>
-            <wp:docPr id="11" name="Picture 11"/>
+            <wp:docPr id="12" name="Picture 12"/>
             <wp:cNvGraphicFramePr>
               <a:graphicFrameLocks noChangeAspect="1"/>
             </wp:cNvGraphicFramePr>
@@ -2350,7 +2403,7 @@
                     <pic:cNvPicPr/>
                   </pic:nvPicPr>
                   <pic:blipFill>
-                    <a:blip r:embed="rId21"/>
+                    <a:blip r:embed="rId22"/>
                     <a:stretch>
                       <a:fillRect/>
                     </a:stretch>
@@ -2421,7 +2474,7 @@
         <w:drawing>
           <wp:inline xmlns:a="http://schemas.openxmlformats.org/drawingml/2006/main" xmlns:pic="http://schemas.openxmlformats.org/drawingml/2006/picture">
             <wp:extent cx="5669280" cy="3543300"/>
-            <wp:docPr id="12" name="Picture 12"/>
+            <wp:docPr id="13" name="Picture 13"/>
             <wp:cNvGraphicFramePr>
               <a:graphicFrameLocks noChangeAspect="1"/>
             </wp:cNvGraphicFramePr>
@@ -2433,7 +2486,7 @@
                     <pic:cNvPicPr/>
                   </pic:nvPicPr>
                   <pic:blipFill>
-                    <a:blip r:embed="rId22"/>
+                    <a:blip r:embed="rId23"/>
                     <a:stretch>
                       <a:fillRect/>
                     </a:stretch>

</xml_diff>

<commit_message>
refactor(diagram): remove bottom 3 foundation cards and purge all SLIK references across docs and diagrams, focusing purely on Pefindo OCR
</commit_message>
<xml_diff>
--- a/LIUGONG_CRM_BUSINESS_SPECIFICATION_PRESDIR.docx
+++ b/LIUGONG_CRM_BUSINESS_SPECIFICATION_PRESDIR.docx
@@ -554,7 +554,7 @@
       <w:r>
         <w:drawing>
           <wp:inline xmlns:a="http://schemas.openxmlformats.org/drawingml/2006/main" xmlns:pic="http://schemas.openxmlformats.org/drawingml/2006/picture">
-            <wp:extent cx="5669280" cy="2791926"/>
+            <wp:extent cx="5669280" cy="1852809"/>
             <wp:docPr id="3" name="Picture 3"/>
             <wp:cNvGraphicFramePr>
               <a:graphicFrameLocks noChangeAspect="1"/>
@@ -575,7 +575,7 @@
                   <pic:spPr>
                     <a:xfrm>
                       <a:off x="0" y="0"/>
-                      <a:ext cx="5669280" cy="2791926"/>
+                      <a:ext cx="5669280" cy="1852809"/>
                     </a:xfrm>
                     <a:prstGeom prst="rect"/>
                   </pic:spPr>
@@ -821,11 +821,11 @@
                 <w:color w:val="28323C"/>
                 <w:sz w:val="17"/>
               </w:rPr>
-              <w:t>• Ingestion Data Otomatis ke Pefindo / SLIK OJK</w:t>
+              <w:t>• Ingestion Data Otomatis ke Pefindo Biro Kredit</w:t>
               <w:br/>
-              <w:t>• Penarikan Credit Score (250–900) &amp; Kol 1–5 24 Bulan</w:t>
+              <w:t>• Penarikan Credit Score (250–900)</w:t>
               <w:br/>
-              <w:t>• Total Eksposur Utang Perbankan Nasional</w:t>
+              <w:t>• Total Eksposur Utang Terbuka</w:t>
             </w:r>
           </w:p>
         </w:tc>
@@ -1290,7 +1290,7 @@
         <w:spacing w:line="276" w:lineRule="auto" w:after="80"/>
       </w:pPr>
       <w:r>
-        <w:t>Begitu identitas legal debitur dan para pengurus kunci tervalidasi pada FAP Stage, sistem secara otomatis dapat menembakkan data tersebut ke Pefindo Biro Kredit (IdScore / SLIK OJK API Bridge) maupun membaca laporan PDF Pefindo via OCR parser. Langkah ini menghadirkan profil intelijen finansial yang komprehensif dalam hitungan detik:</w:t>
+        <w:t>Begitu identitas legal debitur dan para pengurus kunci tervalidasi pada FAP Stage, sistem secara otomatis dapat menembakkan data tersebut ke Pefindo Biro Kredit (IdScore API Bridge) maupun membaca laporan PDF Pefindo via OCR parser. Langkah ini menghadirkan profil intelijen finansial yang komprehensif dalam hitungan detik:</w:t>
       </w:r>
     </w:p>
     <w:tbl>
@@ -1345,9 +1345,9 @@
               <w:br/>
               <w:t>1. Pefindo Credit Score (Skala 250–900): Skor obyektif yang memetakan probabilitas gagal bayar (Probability of Default/PD).</w:t>
               <w:br/>
-              <w:t>2. Riwayat Kolektibilitas 24 Bulan (SLIK OJK): Mengetahui histori pembayaran cicilan debitur di bank atau leasing lain—apakah selalu Lancar (Kol 1) atau pernah Nunggak/Macet (Kol 2–5).</w:t>
+              <w:t>2. Riwayat Kredit Pefindo: Mengetahui histori pembayaran cicilan debitur di lembaga pembiayaan lain—apakah selalu lancar atau memiliki catatan tunggakan.</w:t>
               <w:br/>
-              <w:t>3. Total Eksposur Utang Perbankan Nasional: Mengetahui total baki debet dan beban angsuran bulanan yang sedang berjalan di lembaga keuangan lain.</w:t>
+              <w:t>3. Total Eksposur Utang Terbuka: Mengetahui akumulasi total kewajiban dan beban kredit berjalan di biro kredit.</w:t>
               <w:br/>
               <w:t>4. Deteksi Dini Restrukturisasi &amp; Gugatan Hukum: Menghindarkan LiuGong Finance dari debitur yang sedang dalam sengketa perdata, PKPU, atau kepailitan.</w:t>
             </w:r>
@@ -2779,7 +2779,7 @@
                 <w:color w:val="002060"/>
                 <w:sz w:val="17"/>
               </w:rPr>
-              <w:t>Inquiry Riwayat Kredit SLIK / Pefindo</w:t>
+              <w:t>Penarikan Laporan Kredit Pefindo</w:t>
             </w:r>
           </w:p>
         </w:tc>

</xml_diff>

<commit_message>
feat(roadmap): update FAP Stage tabs to show Documents, and overhaul Word doc to focus on Q4 2026 FAP Stage with Q1-Q4 2027 general roadmap
</commit_message>
<xml_diff>
--- a/LIUGONG_CRM_BUSINESS_SPECIFICATION_PRESDIR.docx
+++ b/LIUGONG_CRM_BUSINESS_SPECIFICATION_PRESDIR.docx
@@ -4,7 +4,8 @@
   <w:body>
     <w:p>
       <w:pPr>
-        <w:spacing w:before="240" w:after="320"/>
+        <w:spacing w:after="80"/>
+        <w:jc w:val="left"/>
       </w:pPr>
       <w:r>
         <w:drawing>
@@ -22,7 +23,7 @@
                     <pic:cNvPicPr/>
                   </pic:nvPicPr>
                   <pic:blipFill>
-                    <a:blip r:embed="rId11"/>
+                    <a:blip r:embed="rId9"/>
                     <a:stretch>
                       <a:fillRect/>
                     </a:stretch>
@@ -43,7 +44,7 @@
     </w:p>
     <w:p>
       <w:pPr>
-        <w:spacing w:before="160" w:after="80"/>
+        <w:spacing w:before="80" w:after="40"/>
       </w:pPr>
       <w:r>
         <w:rPr>
@@ -52,12 +53,12 @@
           <w:color w:val="002060"/>
           <w:sz w:val="44"/>
         </w:rPr>
-        <w:t>STRATEGIC PROPOSAL &amp; BUSINESS REQUIREMENTS DOCUMENT</w:t>
+        <w:t>PROPOSAL SPESIFIKASI BISNIS &amp; ROADMAP SISTEM</w:t>
       </w:r>
     </w:p>
     <w:p>
       <w:pPr>
-        <w:spacing w:after="280"/>
+        <w:spacing w:after="240"/>
       </w:pPr>
       <w:r>
         <w:rPr>
@@ -66,9 +67,7 @@
           <w:color w:val="ED7D31"/>
           <w:sz w:val="22"/>
         </w:rPr>
-        <w:t>SISTEM ORIGINASI PEMBIAYAAN ALAT BERAT &amp; CRM (LOS-CRM)</w:t>
-        <w:br/>
-        <w:t>TRANSFORMASI FINTECH-GRADE UNTUK PERCEPATAN PENJUALAN UNIT LIUGONG DI INDONESIA</w:t>
+        <w:t>ORIGINATION WORKSPACE &amp; CRM PLATFORM (LOS-CRM) · PT LIUGONG FINANCE INDONESIA</w:t>
       </w:r>
     </w:p>
     <w:tbl>
@@ -79,7 +78,7 @@
         <w:tblLook w:firstColumn="1" w:firstRow="1" w:lastColumn="0" w:lastRow="0" w:noHBand="0" w:noVBand="1" w:val="04A0"/>
       </w:tblPr>
       <w:tblGrid>
-        <w:gridCol w:w="9605"/>
+        <w:gridCol w:w="9792"/>
       </w:tblGrid>
       <w:tr>
         <w:tc>
@@ -110,7 +109,7 @@
                 <w:color w:val="002060"/>
                 <w:sz w:val="22"/>
               </w:rPr>
-              <w:t>EXECUTIVE VALUE PROPOSITION UNTUK BAPAK PRESIDEN DIREKTUR</w:t>
+              <w:t>RINGKASAN STRATEGIS DIREKSI</w:t>
               <w:br/>
             </w:r>
             <w:r>
@@ -119,7 +118,9 @@
                 <w:color w:val="283241"/>
                 <w:sz w:val="20"/>
               </w:rPr>
-              <w:t>"Sistem ini bukan sekadar aplikasi administrasi, melainkan Mesin Pertumbuhan Penjualan (Growth Engine) dan Perisai Risiko Kredit (Risk Shield) PT LiuGong Finance Indonesia. Menyatukan ekosistem Tripartit: Dealer Resmi LiuGong – Customer – LiuGong Finance melalui alur 4 tahap otomatis: FAP STAGE ⟶ PEFINDO OCR GATEWAY ⟶ PRE-ANALYSIS ⟶ ICLF ⟶ PROPOSAL. Memangkas siklus kredit dari 14 hari menjadi 48 jam, mengunci akurasi data 100%, serta memitigasi Non-Performing Loan (NPL) sejak detik pertama."</w:t>
+              <w:t>DOKUMEN PRESENTASI EKSEKUTIF UNTUK PRESIDEN DIREKTUR:</w:t>
+              <w:br/>
+              <w:t>Dokumen ini membedah Roadmap Strategis Pengembangan Sistem 2026–2027 dengan fokus utama pada rilis Q4 2026 (FAP STAGE: Customer &amp; PIC hingga Stakeholders + Tab Dokumen). Dilengkapi rincian operasional input data oleh tim Marketing, integrasi OCR NIB OSS RBA, Digital Twin Excel 118-baris, validasi saham 100%, serta gambaran umum fase lanjutan 2027.</w:t>
             </w:r>
           </w:p>
         </w:tc>
@@ -137,30 +138,34 @@
         <w:tblLayout w:type="fixed"/>
         <w:tblLook w:firstColumn="1" w:firstRow="1" w:lastColumn="0" w:lastRow="0" w:noHBand="0" w:noVBand="1" w:val="04A0"/>
         <w:tblBorders>
-          <w:top w:val="single" w:sz="4" w:space="0" w:color="D3D3D3"/>
-          <w:bottom w:val="single" w:sz="4" w:space="0" w:color="D3D3D3"/>
-          <w:insideH w:val="single" w:sz="4" w:space="0" w:color="D3D3D3"/>
+          <w:top w:val="single" w:sz="4" w:space="0" w:color="B0C4DE"/>
+          <w:bottom w:val="single" w:sz="4" w:space="0" w:color="B0C4DE"/>
+          <w:insideH w:val="single" w:sz="4" w:space="0" w:color="B0C4DE"/>
           <w:insideV w:val="none"/>
           <w:left w:val="none"/>
           <w:right w:val="none"/>
         </w:tblBorders>
       </w:tblPr>
       <w:tblGrid>
-        <w:gridCol w:w="4802"/>
-        <w:gridCol w:w="4802"/>
+        <w:gridCol w:w="4896"/>
+        <w:gridCol w:w="4896"/>
       </w:tblGrid>
       <w:tr>
         <w:tc>
           <w:tcPr>
             <w:tcW w:type="dxa" w:w="3168"/>
             <w:tcMar>
-              <w:top w:w="50" w:type="dxa"/>
-              <w:bottom w:w="50" w:type="dxa"/>
-              <w:left w:w="80" w:type="dxa"/>
-              <w:right w:w="80" w:type="dxa"/>
+              <w:top w:w="60" w:type="dxa"/>
+              <w:bottom w:w="60" w:type="dxa"/>
+              <w:left w:w="100" w:type="dxa"/>
+              <w:right w:w="100" w:type="dxa"/>
             </w:tcMar>
+            <w:shd w:fill="F0F4F8"/>
           </w:tcPr>
           <w:p>
+            <w:pPr>
+              <w:spacing w:after="40"/>
+            </w:pPr>
             <w:r>
               <w:rPr>
                 <w:rFonts w:ascii="Calibri" w:hAnsi="Calibri"/>
@@ -168,7 +173,7 @@
                 <w:color w:val="002060"/>
                 <w:sz w:val="19"/>
               </w:rPr>
-              <w:t>Entitas &amp; Model Bisnis</w:t>
+              <w:t>Nama Inisiatif</w:t>
             </w:r>
           </w:p>
         </w:tc>
@@ -176,20 +181,23 @@
           <w:tcPr>
             <w:tcW w:type="dxa" w:w="6192"/>
             <w:tcMar>
-              <w:top w:w="50" w:type="dxa"/>
-              <w:bottom w:w="50" w:type="dxa"/>
-              <w:left w:w="80" w:type="dxa"/>
-              <w:right w:w="80" w:type="dxa"/>
+              <w:top w:w="60" w:type="dxa"/>
+              <w:bottom w:w="60" w:type="dxa"/>
+              <w:left w:w="100" w:type="dxa"/>
+              <w:right w:w="100" w:type="dxa"/>
             </w:tcMar>
           </w:tcPr>
           <w:p>
+            <w:pPr>
+              <w:spacing w:after="40"/>
+            </w:pPr>
             <w:r>
               <w:rPr>
                 <w:rFonts w:ascii="Calibri" w:hAnsi="Calibri"/>
                 <w:color w:val="28323C"/>
                 <w:sz w:val="19"/>
               </w:rPr>
-              <w:t>PT LiuGong Finance Indonesia (Captive Finance Alat Berat)</w:t>
+              <w:t>LiuGong Finance Origination &amp; Customer Relationship Management (LOS-CRM)</w:t>
             </w:r>
           </w:p>
         </w:tc>
@@ -199,14 +207,17 @@
           <w:tcPr>
             <w:tcW w:type="dxa" w:w="3168"/>
             <w:tcMar>
-              <w:top w:w="50" w:type="dxa"/>
-              <w:bottom w:w="50" w:type="dxa"/>
-              <w:left w:w="80" w:type="dxa"/>
-              <w:right w:w="80" w:type="dxa"/>
+              <w:top w:w="60" w:type="dxa"/>
+              <w:bottom w:w="60" w:type="dxa"/>
+              <w:left w:w="100" w:type="dxa"/>
+              <w:right w:w="100" w:type="dxa"/>
             </w:tcMar>
-            <w:shd w:fill="F8FAFC"/>
+            <w:shd w:fill="F0F4F8"/>
           </w:tcPr>
           <w:p>
+            <w:pPr>
+              <w:spacing w:after="40"/>
+            </w:pPr>
             <w:r>
               <w:rPr>
                 <w:rFonts w:ascii="Calibri" w:hAnsi="Calibri"/>
@@ -214,7 +225,7 @@
                 <w:color w:val="002060"/>
                 <w:sz w:val="19"/>
               </w:rPr>
-              <w:t>Disusun &amp; Dipresentasikan</w:t>
+              <w:t>Sponsor Proyek</w:t>
             </w:r>
           </w:p>
         </w:tc>
@@ -222,21 +233,23 @@
           <w:tcPr>
             <w:tcW w:type="dxa" w:w="6192"/>
             <w:tcMar>
-              <w:top w:w="50" w:type="dxa"/>
-              <w:bottom w:w="50" w:type="dxa"/>
-              <w:left w:w="80" w:type="dxa"/>
-              <w:right w:w="80" w:type="dxa"/>
+              <w:top w:w="60" w:type="dxa"/>
+              <w:bottom w:w="60" w:type="dxa"/>
+              <w:left w:w="100" w:type="dxa"/>
+              <w:right w:w="100" w:type="dxa"/>
             </w:tcMar>
-            <w:shd w:fill="F8FAFC"/>
           </w:tcPr>
           <w:p>
+            <w:pPr>
+              <w:spacing w:after="40"/>
+            </w:pPr>
             <w:r>
               <w:rPr>
                 <w:rFonts w:ascii="Calibri" w:hAnsi="Calibri"/>
                 <w:color w:val="28323C"/>
                 <w:sz w:val="19"/>
               </w:rPr>
-              <w:t>Latom (Lead System Owner &amp; Technical In-Charge)</w:t>
+              <w:t>Presiden Direktur · PT LiuGong Finance Indonesia</w:t>
             </w:r>
           </w:p>
         </w:tc>
@@ -246,13 +259,17 @@
           <w:tcPr>
             <w:tcW w:type="dxa" w:w="3168"/>
             <w:tcMar>
-              <w:top w:w="50" w:type="dxa"/>
-              <w:bottom w:w="50" w:type="dxa"/>
-              <w:left w:w="80" w:type="dxa"/>
-              <w:right w:w="80" w:type="dxa"/>
+              <w:top w:w="60" w:type="dxa"/>
+              <w:bottom w:w="60" w:type="dxa"/>
+              <w:left w:w="100" w:type="dxa"/>
+              <w:right w:w="100" w:type="dxa"/>
             </w:tcMar>
+            <w:shd w:fill="F0F4F8"/>
           </w:tcPr>
           <w:p>
+            <w:pPr>
+              <w:spacing w:after="40"/>
+            </w:pPr>
             <w:r>
               <w:rPr>
                 <w:rFonts w:ascii="Calibri" w:hAnsi="Calibri"/>
@@ -260,7 +277,7 @@
                 <w:color w:val="002060"/>
                 <w:sz w:val="19"/>
               </w:rPr>
-              <w:t>Ditujukan Khusus Kepada</w:t>
+              <w:t>Lead System Owner</w:t>
             </w:r>
           </w:p>
         </w:tc>
@@ -268,20 +285,23 @@
           <w:tcPr>
             <w:tcW w:type="dxa" w:w="6192"/>
             <w:tcMar>
-              <w:top w:w="50" w:type="dxa"/>
-              <w:bottom w:w="50" w:type="dxa"/>
-              <w:left w:w="80" w:type="dxa"/>
-              <w:right w:w="80" w:type="dxa"/>
+              <w:top w:w="60" w:type="dxa"/>
+              <w:bottom w:w="60" w:type="dxa"/>
+              <w:left w:w="100" w:type="dxa"/>
+              <w:right w:w="100" w:type="dxa"/>
             </w:tcMar>
           </w:tcPr>
           <w:p>
+            <w:pPr>
+              <w:spacing w:after="40"/>
+            </w:pPr>
             <w:r>
               <w:rPr>
                 <w:rFonts w:ascii="Calibri" w:hAnsi="Calibri"/>
                 <w:color w:val="28323C"/>
                 <w:sz w:val="19"/>
               </w:rPr>
-              <w:t>Bapak Presiden Direktur &amp; Jajaran Komite Kredit</w:t>
+              <w:t>Latom (CTO &amp; Head of Digital Transformation)</w:t>
             </w:r>
           </w:p>
         </w:tc>
@@ -291,14 +311,17 @@
           <w:tcPr>
             <w:tcW w:type="dxa" w:w="3168"/>
             <w:tcMar>
-              <w:top w:w="50" w:type="dxa"/>
-              <w:bottom w:w="50" w:type="dxa"/>
-              <w:left w:w="80" w:type="dxa"/>
-              <w:right w:w="80" w:type="dxa"/>
+              <w:top w:w="60" w:type="dxa"/>
+              <w:bottom w:w="60" w:type="dxa"/>
+              <w:left w:w="100" w:type="dxa"/>
+              <w:right w:w="100" w:type="dxa"/>
             </w:tcMar>
-            <w:shd w:fill="F8FAFC"/>
+            <w:shd w:fill="F0F4F8"/>
           </w:tcPr>
           <w:p>
+            <w:pPr>
+              <w:spacing w:after="40"/>
+            </w:pPr>
             <w:r>
               <w:rPr>
                 <w:rFonts w:ascii="Calibri" w:hAnsi="Calibri"/>
@@ -306,7 +329,7 @@
                 <w:color w:val="002060"/>
                 <w:sz w:val="19"/>
               </w:rPr>
-              <w:t>Tujuan Strategis Utama</w:t>
+              <w:t>Target Rilis Q4 2026</w:t>
             </w:r>
           </w:p>
         </w:tc>
@@ -314,21 +337,23 @@
           <w:tcPr>
             <w:tcW w:type="dxa" w:w="6192"/>
             <w:tcMar>
-              <w:top w:w="50" w:type="dxa"/>
-              <w:bottom w:w="50" w:type="dxa"/>
-              <w:left w:w="80" w:type="dxa"/>
-              <w:right w:w="80" w:type="dxa"/>
+              <w:top w:w="60" w:type="dxa"/>
+              <w:bottom w:w="60" w:type="dxa"/>
+              <w:left w:w="100" w:type="dxa"/>
+              <w:right w:w="100" w:type="dxa"/>
             </w:tcMar>
-            <w:shd w:fill="F8FAFC"/>
           </w:tcPr>
           <w:p>
+            <w:pPr>
+              <w:spacing w:after="40"/>
+            </w:pPr>
             <w:r>
               <w:rPr>
                 <w:rFonts w:ascii="Calibri" w:hAnsi="Calibri"/>
                 <w:color w:val="28323C"/>
                 <w:sz w:val="19"/>
               </w:rPr>
-              <w:t>Akselerasi Penjualan Unit LiuGong, Mitigasi NPL &amp; Kepatuhan OJK</w:t>
+              <w:t>FAP Stage (Customer &amp; PIC, Legal, Stakeholders, Tab Documents 13 Checklist)</w:t>
             </w:r>
           </w:p>
         </w:tc>
@@ -338,13 +363,17 @@
           <w:tcPr>
             <w:tcW w:type="dxa" w:w="3168"/>
             <w:tcMar>
-              <w:top w:w="50" w:type="dxa"/>
-              <w:bottom w:w="50" w:type="dxa"/>
-              <w:left w:w="80" w:type="dxa"/>
-              <w:right w:w="80" w:type="dxa"/>
+              <w:top w:w="60" w:type="dxa"/>
+              <w:bottom w:w="60" w:type="dxa"/>
+              <w:left w:w="100" w:type="dxa"/>
+              <w:right w:w="100" w:type="dxa"/>
             </w:tcMar>
+            <w:shd w:fill="F0F4F8"/>
           </w:tcPr>
           <w:p>
+            <w:pPr>
+              <w:spacing w:after="40"/>
+            </w:pPr>
             <w:r>
               <w:rPr>
                 <w:rFonts w:ascii="Calibri" w:hAnsi="Calibri"/>
@@ -352,7 +381,7 @@
                 <w:color w:val="002060"/>
                 <w:sz w:val="19"/>
               </w:rPr>
-              <w:t>Status Kesiapan Sistem</w:t>
+              <w:t>Horizon Roadmap 2027</w:t>
             </w:r>
           </w:p>
         </w:tc>
@@ -360,20 +389,23 @@
           <w:tcPr>
             <w:tcW w:type="dxa" w:w="6192"/>
             <w:tcMar>
-              <w:top w:w="50" w:type="dxa"/>
-              <w:bottom w:w="50" w:type="dxa"/>
-              <w:left w:w="80" w:type="dxa"/>
-              <w:right w:w="80" w:type="dxa"/>
+              <w:top w:w="60" w:type="dxa"/>
+              <w:bottom w:w="60" w:type="dxa"/>
+              <w:left w:w="100" w:type="dxa"/>
+              <w:right w:w="100" w:type="dxa"/>
             </w:tcMar>
           </w:tcPr>
           <w:p>
+            <w:pPr>
+              <w:spacing w:after="40"/>
+            </w:pPr>
             <w:r>
               <w:rPr>
                 <w:rFonts w:ascii="Calibri" w:hAnsi="Calibri"/>
                 <w:color w:val="28323C"/>
                 <w:sz w:val="19"/>
               </w:rPr>
-              <w:t>Production Ready (27/27 Test Suites PASS, Siap Go-Live)</w:t>
+              <w:t>Q1: Pre-Analysis &amp; Pefindo OCR | Q2: ICLF &amp; CDE Financial | Q3: CDE Bank Statement | Q4: Proposal Final</w:t>
             </w:r>
           </w:p>
         </w:tc>
@@ -383,14 +415,17 @@
           <w:tcPr>
             <w:tcW w:type="dxa" w:w="3168"/>
             <w:tcMar>
-              <w:top w:w="50" w:type="dxa"/>
-              <w:bottom w:w="50" w:type="dxa"/>
-              <w:left w:w="80" w:type="dxa"/>
-              <w:right w:w="80" w:type="dxa"/>
+              <w:top w:w="60" w:type="dxa"/>
+              <w:bottom w:w="60" w:type="dxa"/>
+              <w:left w:w="100" w:type="dxa"/>
+              <w:right w:w="100" w:type="dxa"/>
             </w:tcMar>
-            <w:shd w:fill="F8FAFC"/>
+            <w:shd w:fill="F0F4F8"/>
           </w:tcPr>
           <w:p>
+            <w:pPr>
+              <w:spacing w:after="40"/>
+            </w:pPr>
             <w:r>
               <w:rPr>
                 <w:rFonts w:ascii="Calibri" w:hAnsi="Calibri"/>
@@ -398,7 +433,7 @@
                 <w:color w:val="002060"/>
                 <w:sz w:val="19"/>
               </w:rPr>
-              <w:t>Tanggal Dokumen &amp; Versi</w:t>
+              <w:t>Status Kompilasi &amp; QA</w:t>
             </w:r>
           </w:p>
         </w:tc>
@@ -406,21 +441,23 @@
           <w:tcPr>
             <w:tcW w:type="dxa" w:w="6192"/>
             <w:tcMar>
-              <w:top w:w="50" w:type="dxa"/>
-              <w:bottom w:w="50" w:type="dxa"/>
-              <w:left w:w="80" w:type="dxa"/>
-              <w:right w:w="80" w:type="dxa"/>
+              <w:top w:w="60" w:type="dxa"/>
+              <w:bottom w:w="60" w:type="dxa"/>
+              <w:left w:w="100" w:type="dxa"/>
+              <w:right w:w="100" w:type="dxa"/>
             </w:tcMar>
-            <w:shd w:fill="F8FAFC"/>
           </w:tcPr>
           <w:p>
+            <w:pPr>
+              <w:spacing w:after="40"/>
+            </w:pPr>
             <w:r>
               <w:rPr>
                 <w:rFonts w:ascii="Calibri" w:hAnsi="Calibri"/>
                 <w:color w:val="28323C"/>
                 <w:sz w:val="19"/>
               </w:rPr>
-              <w:t>19 Oktober 2026  |  Versi 4.0.0 (Executive Masterpiece)</w:t>
+              <w:t>Production Ready · 27/27 Test Suites PASS · 0 Console Error</w:t>
             </w:r>
           </w:p>
         </w:tc>
@@ -442,7 +479,608 @@
           <w:color w:val="002060"/>
           <w:sz w:val="30"/>
         </w:rPr>
-        <w:t>BAB 1: STRATEGI BISNIS &amp; INTEGRASI EKOSISTEM DEALER LIUGONG</w:t>
+        <w:t>BAB 1: ROADMAP STRATEGIS PENGEMBANGAN SISTEM (2026 – 2027)</w:t>
+      </w:r>
+    </w:p>
+    <w:p>
+      <w:pPr>
+        <w:spacing w:line="276" w:lineRule="auto" w:after="160"/>
+      </w:pPr>
+      <w:r>
+        <w:t>Untuk memastikan kehati-hatian perbankan (prudential financing) dan kesiapan adopsi di lapangan, transformasi sistem LOS-CRM LiuGong dibagi ke dalam 5 kuartal strategis yang terukur:</w:t>
+      </w:r>
+    </w:p>
+    <w:tbl>
+      <w:tblPr>
+        <w:tblW w:type="auto" w:w="0"/>
+        <w:jc w:val="center"/>
+        <w:tblLayout w:type="fixed"/>
+        <w:tblLook w:firstColumn="1" w:firstRow="1" w:lastColumn="0" w:lastRow="0" w:noHBand="0" w:noVBand="1" w:val="04A0"/>
+        <w:tblBorders>
+          <w:top w:val="single" w:sz="4" w:space="0" w:color="D3D3D3"/>
+          <w:bottom w:val="single" w:sz="4" w:space="0" w:color="D3D3D3"/>
+          <w:insideH w:val="single" w:sz="4" w:space="0" w:color="D3D3D3"/>
+          <w:insideV w:val="none"/>
+          <w:left w:val="none"/>
+          <w:right w:val="none"/>
+        </w:tblBorders>
+      </w:tblPr>
+      <w:tblGrid>
+        <w:gridCol w:w="3264"/>
+        <w:gridCol w:w="3264"/>
+        <w:gridCol w:w="3264"/>
+      </w:tblGrid>
+      <w:tr>
+        <w:tc>
+          <w:tcPr>
+            <w:tcW w:type="dxa" w:w="2016"/>
+            <w:shd w:fill="002060"/>
+            <w:tcMar>
+              <w:top w:w="60" w:type="dxa"/>
+              <w:bottom w:w="60" w:type="dxa"/>
+              <w:left w:w="80" w:type="dxa"/>
+              <w:right w:w="80" w:type="dxa"/>
+            </w:tcMar>
+          </w:tcPr>
+          <w:p>
+            <w:r>
+              <w:rPr>
+                <w:rFonts w:ascii="Calibri" w:hAnsi="Calibri"/>
+                <w:b/>
+                <w:color w:val="FFFFFF"/>
+                <w:sz w:val="19"/>
+              </w:rPr>
+              <w:t>Periode Rilis</w:t>
+            </w:r>
+          </w:p>
+        </w:tc>
+        <w:tc>
+          <w:tcPr>
+            <w:tcW w:type="dxa" w:w="3600"/>
+            <w:shd w:fill="002060"/>
+            <w:tcMar>
+              <w:top w:w="60" w:type="dxa"/>
+              <w:bottom w:w="60" w:type="dxa"/>
+              <w:left w:w="80" w:type="dxa"/>
+              <w:right w:w="80" w:type="dxa"/>
+            </w:tcMar>
+          </w:tcPr>
+          <w:p>
+            <w:r>
+              <w:rPr>
+                <w:rFonts w:ascii="Calibri" w:hAnsi="Calibri"/>
+                <w:b/>
+                <w:color w:val="FFFFFF"/>
+                <w:sz w:val="19"/>
+              </w:rPr>
+              <w:t>Modul &amp; Fitur Kunci</w:t>
+            </w:r>
+          </w:p>
+        </w:tc>
+        <w:tc>
+          <w:tcPr>
+            <w:tcW w:type="dxa" w:w="3744"/>
+            <w:shd w:fill="002060"/>
+            <w:tcMar>
+              <w:top w:w="60" w:type="dxa"/>
+              <w:bottom w:w="60" w:type="dxa"/>
+              <w:left w:w="80" w:type="dxa"/>
+              <w:right w:w="80" w:type="dxa"/>
+            </w:tcMar>
+          </w:tcPr>
+          <w:p>
+            <w:r>
+              <w:rPr>
+                <w:rFonts w:ascii="Calibri" w:hAnsi="Calibri"/>
+                <w:b/>
+                <w:color w:val="FFFFFF"/>
+                <w:sz w:val="19"/>
+              </w:rPr>
+              <w:t>Sasaran Strategis &amp; Nilai Bisnis</w:t>
+            </w:r>
+          </w:p>
+        </w:tc>
+      </w:tr>
+      <w:tr>
+        <w:tc>
+          <w:tcPr>
+            <w:tcW w:type="dxa" w:w="2016"/>
+            <w:tcMar>
+              <w:top w:w="50" w:type="dxa"/>
+              <w:bottom w:w="50" w:type="dxa"/>
+              <w:left w:w="80" w:type="dxa"/>
+              <w:right w:w="80" w:type="dxa"/>
+            </w:tcMar>
+            <w:shd w:fill="EFF6FF"/>
+          </w:tcPr>
+          <w:p>
+            <w:pPr>
+              <w:spacing w:line="276" w:lineRule="auto" w:after="40"/>
+            </w:pPr>
+            <w:r>
+              <w:rPr>
+                <w:rFonts w:ascii="Calibri" w:hAnsi="Calibri"/>
+                <w:b/>
+                <w:color w:val="002060"/>
+                <w:sz w:val="17"/>
+              </w:rPr>
+              <w:t>Q4 2026</w:t>
+              <w:br/>
+              <w:t>(FOKUS UTAMA)</w:t>
+            </w:r>
+          </w:p>
+        </w:tc>
+        <w:tc>
+          <w:tcPr>
+            <w:tcW w:type="dxa" w:w="3600"/>
+            <w:tcMar>
+              <w:top w:w="50" w:type="dxa"/>
+              <w:bottom w:w="50" w:type="dxa"/>
+              <w:left w:w="80" w:type="dxa"/>
+              <w:right w:w="80" w:type="dxa"/>
+            </w:tcMar>
+            <w:shd w:fill="EFF6FF"/>
+          </w:tcPr>
+          <w:p>
+            <w:pPr>
+              <w:spacing w:line="276" w:lineRule="auto" w:after="40"/>
+            </w:pPr>
+            <w:r>
+              <w:rPr>
+                <w:rFonts w:ascii="Calibri" w:hAnsi="Calibri"/>
+                <w:color w:val="28323C"/>
+                <w:sz w:val="17"/>
+              </w:rPr>
+              <w:t>• FAP STAGE RELEASE:</w:t>
+              <w:br/>
+              <w:t xml:space="preserve">  - Customer &amp; PIC (5 Modul Accordion)</w:t>
+              <w:br/>
+              <w:t xml:space="preserve">  - Legal Deeds (Akta &amp; SK Menkumham)</w:t>
+              <w:br/>
+              <w:t xml:space="preserve">  - Stakeholders (Susunan Pengurus &amp; Saham)</w:t>
+              <w:br/>
+              <w:t xml:space="preserve">  - Documents Tab (13 Checklist Berkas)</w:t>
+              <w:br/>
+              <w:t xml:space="preserve">  - Live Excel Mirror 118-Baris &amp; OCR NIB</w:t>
+            </w:r>
+          </w:p>
+        </w:tc>
+        <w:tc>
+          <w:tcPr>
+            <w:tcW w:type="dxa" w:w="3744"/>
+            <w:tcMar>
+              <w:top w:w="50" w:type="dxa"/>
+              <w:bottom w:w="50" w:type="dxa"/>
+              <w:left w:w="80" w:type="dxa"/>
+              <w:right w:w="80" w:type="dxa"/>
+            </w:tcMar>
+            <w:shd w:fill="EFF6FF"/>
+          </w:tcPr>
+          <w:p>
+            <w:pPr>
+              <w:spacing w:line="276" w:lineRule="auto" w:after="40"/>
+            </w:pPr>
+            <w:r>
+              <w:rPr>
+                <w:rFonts w:ascii="Calibri" w:hAnsi="Calibri"/>
+                <w:color w:val="28323C"/>
+                <w:sz w:val="17"/>
+              </w:rPr>
+              <w:t>Standarisasi onboarding nasabah, peniadaan typo data legalitas via OCR NIB, validasi kepemilikan modal mutlak 100%, serta sentralisasi berkas digital.</w:t>
+            </w:r>
+          </w:p>
+        </w:tc>
+      </w:tr>
+      <w:tr>
+        <w:tc>
+          <w:tcPr>
+            <w:tcW w:type="dxa" w:w="2016"/>
+            <w:tcMar>
+              <w:top w:w="50" w:type="dxa"/>
+              <w:bottom w:w="50" w:type="dxa"/>
+              <w:left w:w="80" w:type="dxa"/>
+              <w:right w:w="80" w:type="dxa"/>
+            </w:tcMar>
+            <w:shd w:fill="F8FAFC"/>
+          </w:tcPr>
+          <w:p>
+            <w:pPr>
+              <w:spacing w:line="276" w:lineRule="auto" w:after="40"/>
+            </w:pPr>
+            <w:r>
+              <w:rPr>
+                <w:rFonts w:ascii="Calibri" w:hAnsi="Calibri"/>
+                <w:b/>
+                <w:color w:val="002060"/>
+                <w:sz w:val="17"/>
+              </w:rPr>
+              <w:t>Q1 2027</w:t>
+            </w:r>
+          </w:p>
+        </w:tc>
+        <w:tc>
+          <w:tcPr>
+            <w:tcW w:type="dxa" w:w="3600"/>
+            <w:tcMar>
+              <w:top w:w="50" w:type="dxa"/>
+              <w:bottom w:w="50" w:type="dxa"/>
+              <w:left w:w="80" w:type="dxa"/>
+              <w:right w:w="80" w:type="dxa"/>
+            </w:tcMar>
+            <w:shd w:fill="F8FAFC"/>
+          </w:tcPr>
+          <w:p>
+            <w:pPr>
+              <w:spacing w:line="276" w:lineRule="auto" w:after="40"/>
+            </w:pPr>
+            <w:r>
+              <w:rPr>
+                <w:rFonts w:ascii="Calibri" w:hAnsi="Calibri"/>
+                <w:color w:val="28323C"/>
+                <w:sz w:val="17"/>
+              </w:rPr>
+              <w:t>• PRE-ANALYSIS + INTEGRASI PEFINDO OCR:</w:t>
+              <w:br/>
+              <w:t xml:space="preserve">  - Early Risk Screening (Go / Review / No-Go)</w:t>
+              <w:br/>
+              <w:t xml:space="preserve">  - Pefindo Credit Score &amp; Ingestion Bridge</w:t>
+              <w:br/>
+              <w:t xml:space="preserve">  - OCR NPWP &amp; SPT Tahunan Langsung Mengisi Financial Statements</w:t>
+            </w:r>
+          </w:p>
+        </w:tc>
+        <w:tc>
+          <w:tcPr>
+            <w:tcW w:type="dxa" w:w="3744"/>
+            <w:tcMar>
+              <w:top w:w="50" w:type="dxa"/>
+              <w:bottom w:w="50" w:type="dxa"/>
+              <w:left w:w="80" w:type="dxa"/>
+              <w:right w:w="80" w:type="dxa"/>
+            </w:tcMar>
+            <w:shd w:fill="F8FAFC"/>
+          </w:tcPr>
+          <w:p>
+            <w:pPr>
+              <w:spacing w:line="276" w:lineRule="auto" w:after="40"/>
+            </w:pPr>
+            <w:r>
+              <w:rPr>
+                <w:rFonts w:ascii="Calibri" w:hAnsi="Calibri"/>
+                <w:color w:val="28323C"/>
+                <w:sz w:val="17"/>
+              </w:rPr>
+              <w:t>Penyaringan dini debitur berisiko tinggi. Ekstraksi otomatis laporan keuangan dari dokumen pajak tanpa pengetikan manual oleh analis.</w:t>
+            </w:r>
+          </w:p>
+        </w:tc>
+      </w:tr>
+      <w:tr>
+        <w:tc>
+          <w:tcPr>
+            <w:tcW w:type="dxa" w:w="2016"/>
+            <w:tcMar>
+              <w:top w:w="50" w:type="dxa"/>
+              <w:bottom w:w="50" w:type="dxa"/>
+              <w:left w:w="80" w:type="dxa"/>
+              <w:right w:w="80" w:type="dxa"/>
+            </w:tcMar>
+          </w:tcPr>
+          <w:p>
+            <w:pPr>
+              <w:spacing w:line="276" w:lineRule="auto" w:after="40"/>
+            </w:pPr>
+            <w:r>
+              <w:rPr>
+                <w:rFonts w:ascii="Calibri" w:hAnsi="Calibri"/>
+                <w:b/>
+                <w:color w:val="002060"/>
+                <w:sz w:val="17"/>
+              </w:rPr>
+              <w:t>Q2 2027</w:t>
+            </w:r>
+          </w:p>
+        </w:tc>
+        <w:tc>
+          <w:tcPr>
+            <w:tcW w:type="dxa" w:w="3600"/>
+            <w:tcMar>
+              <w:top w:w="50" w:type="dxa"/>
+              <w:bottom w:w="50" w:type="dxa"/>
+              <w:left w:w="80" w:type="dxa"/>
+              <w:right w:w="80" w:type="dxa"/>
+            </w:tcMar>
+          </w:tcPr>
+          <w:p>
+            <w:pPr>
+              <w:spacing w:line="276" w:lineRule="auto" w:after="40"/>
+            </w:pPr>
+            <w:r>
+              <w:rPr>
+                <w:rFonts w:ascii="Calibri" w:hAnsi="Calibri"/>
+                <w:color w:val="28323C"/>
+                <w:sz w:val="17"/>
+              </w:rPr>
+              <w:t>• ICLF + CDE (FINANCIAL):</w:t>
+              <w:br/>
+              <w:t xml:space="preserve">  - Initial Credit Limit Facility (BMPP OJK)</w:t>
+              <w:br/>
+              <w:t xml:space="preserve">  - Credit Decision Engine (CDE) Phase 1</w:t>
+              <w:br/>
+              <w:t xml:space="preserve">  - Analisis Rasio Likuiditas &amp; Solvabilitas Otomatis</w:t>
+            </w:r>
+          </w:p>
+        </w:tc>
+        <w:tc>
+          <w:tcPr>
+            <w:tcW w:type="dxa" w:w="3744"/>
+            <w:tcMar>
+              <w:top w:w="50" w:type="dxa"/>
+              <w:bottom w:w="50" w:type="dxa"/>
+              <w:left w:w="80" w:type="dxa"/>
+              <w:right w:w="80" w:type="dxa"/>
+            </w:tcMar>
+          </w:tcPr>
+          <w:p>
+            <w:pPr>
+              <w:spacing w:line="276" w:lineRule="auto" w:after="40"/>
+            </w:pPr>
+            <w:r>
+              <w:rPr>
+                <w:rFonts w:ascii="Calibri" w:hAnsi="Calibri"/>
+                <w:color w:val="28323C"/>
+                <w:sz w:val="17"/>
+              </w:rPr>
+              <w:t>Penetapan pagu batas atas kredit debitur tunggal/grup usaha dan kalkulasi kesehatan neraca secara komputasi otomatis.</w:t>
+            </w:r>
+          </w:p>
+        </w:tc>
+      </w:tr>
+      <w:tr>
+        <w:tc>
+          <w:tcPr>
+            <w:tcW w:type="dxa" w:w="2016"/>
+            <w:tcMar>
+              <w:top w:w="50" w:type="dxa"/>
+              <w:bottom w:w="50" w:type="dxa"/>
+              <w:left w:w="80" w:type="dxa"/>
+              <w:right w:w="80" w:type="dxa"/>
+            </w:tcMar>
+            <w:shd w:fill="F8FAFC"/>
+          </w:tcPr>
+          <w:p>
+            <w:pPr>
+              <w:spacing w:line="276" w:lineRule="auto" w:after="40"/>
+            </w:pPr>
+            <w:r>
+              <w:rPr>
+                <w:rFonts w:ascii="Calibri" w:hAnsi="Calibri"/>
+                <w:b/>
+                <w:color w:val="002060"/>
+                <w:sz w:val="17"/>
+              </w:rPr>
+              <w:t>Q3 2027</w:t>
+            </w:r>
+          </w:p>
+        </w:tc>
+        <w:tc>
+          <w:tcPr>
+            <w:tcW w:type="dxa" w:w="3600"/>
+            <w:tcMar>
+              <w:top w:w="50" w:type="dxa"/>
+              <w:bottom w:w="50" w:type="dxa"/>
+              <w:left w:w="80" w:type="dxa"/>
+              <w:right w:w="80" w:type="dxa"/>
+            </w:tcMar>
+            <w:shd w:fill="F8FAFC"/>
+          </w:tcPr>
+          <w:p>
+            <w:pPr>
+              <w:spacing w:line="276" w:lineRule="auto" w:after="40"/>
+            </w:pPr>
+            <w:r>
+              <w:rPr>
+                <w:rFonts w:ascii="Calibri" w:hAnsi="Calibri"/>
+                <w:color w:val="28323C"/>
+                <w:sz w:val="17"/>
+              </w:rPr>
+              <w:t>• CDE (BANK STATEMENT) PHASE 2:</w:t>
+              <w:br/>
+              <w:t xml:space="preserve">  - Parser Mutasi Rekening Koran Bank Otomatis</w:t>
+              <w:br/>
+              <w:t xml:space="preserve">  - Analisis Saldo Mengendap &amp; Cashflow Riil</w:t>
+              <w:br/>
+              <w:t xml:space="preserve">  - Deteksi Cek Kosong &amp; Transaksi Anomali</w:t>
+            </w:r>
+          </w:p>
+        </w:tc>
+        <w:tc>
+          <w:tcPr>
+            <w:tcW w:type="dxa" w:w="3744"/>
+            <w:tcMar>
+              <w:top w:w="50" w:type="dxa"/>
+              <w:bottom w:w="50" w:type="dxa"/>
+              <w:left w:w="80" w:type="dxa"/>
+              <w:right w:w="80" w:type="dxa"/>
+            </w:tcMar>
+            <w:shd w:fill="F8FAFC"/>
+          </w:tcPr>
+          <w:p>
+            <w:pPr>
+              <w:spacing w:line="276" w:lineRule="auto" w:after="40"/>
+            </w:pPr>
+            <w:r>
+              <w:rPr>
+                <w:rFonts w:ascii="Calibri" w:hAnsi="Calibri"/>
+                <w:color w:val="28323C"/>
+                <w:sz w:val="17"/>
+              </w:rPr>
+              <w:t>Mengetahui kapasitas angsuran riil debitur dari rekam jejak mutasi bank operasional 3–6 bulan secara objektif.</w:t>
+            </w:r>
+          </w:p>
+        </w:tc>
+      </w:tr>
+      <w:tr>
+        <w:tc>
+          <w:tcPr>
+            <w:tcW w:type="dxa" w:w="2016"/>
+            <w:tcMar>
+              <w:top w:w="50" w:type="dxa"/>
+              <w:bottom w:w="50" w:type="dxa"/>
+              <w:left w:w="80" w:type="dxa"/>
+              <w:right w:w="80" w:type="dxa"/>
+            </w:tcMar>
+          </w:tcPr>
+          <w:p>
+            <w:pPr>
+              <w:spacing w:line="276" w:lineRule="auto" w:after="40"/>
+            </w:pPr>
+            <w:r>
+              <w:rPr>
+                <w:rFonts w:ascii="Calibri" w:hAnsi="Calibri"/>
+                <w:b/>
+                <w:color w:val="002060"/>
+                <w:sz w:val="17"/>
+              </w:rPr>
+              <w:t>Q4 2027</w:t>
+            </w:r>
+          </w:p>
+        </w:tc>
+        <w:tc>
+          <w:tcPr>
+            <w:tcW w:type="dxa" w:w="3600"/>
+            <w:tcMar>
+              <w:top w:w="50" w:type="dxa"/>
+              <w:bottom w:w="50" w:type="dxa"/>
+              <w:left w:w="80" w:type="dxa"/>
+              <w:right w:w="80" w:type="dxa"/>
+            </w:tcMar>
+          </w:tcPr>
+          <w:p>
+            <w:pPr>
+              <w:spacing w:line="276" w:lineRule="auto" w:after="40"/>
+            </w:pPr>
+            <w:r>
+              <w:rPr>
+                <w:rFonts w:ascii="Calibri" w:hAnsi="Calibri"/>
+                <w:color w:val="28323C"/>
+                <w:sz w:val="17"/>
+              </w:rPr>
+              <w:t>• PROPOSAL PEMBIAYAAN FINAL:</w:t>
+              <w:br/>
+              <w:t xml:space="preserve">  - Inventaris Unit Alat Berat LiuGong</w:t>
+              <w:br/>
+              <w:t xml:space="preserve">  - Anuitas Bunga Efektif Menurun Resmi</w:t>
+              <w:br/>
+              <w:t xml:space="preserve">  - Dossier Komprehensif Siap Sidang</w:t>
+              <w:br/>
+              <w:t xml:space="preserve">  - Persetujuan Komite Kredit Digital</w:t>
+            </w:r>
+          </w:p>
+        </w:tc>
+        <w:tc>
+          <w:tcPr>
+            <w:tcW w:type="dxa" w:w="3744"/>
+            <w:tcMar>
+              <w:top w:w="50" w:type="dxa"/>
+              <w:bottom w:w="50" w:type="dxa"/>
+              <w:left w:w="80" w:type="dxa"/>
+              <w:right w:w="80" w:type="dxa"/>
+            </w:tcMar>
+          </w:tcPr>
+          <w:p>
+            <w:pPr>
+              <w:spacing w:line="276" w:lineRule="auto" w:after="40"/>
+            </w:pPr>
+            <w:r>
+              <w:rPr>
+                <w:rFonts w:ascii="Calibri" w:hAnsi="Calibri"/>
+                <w:color w:val="28323C"/>
+                <w:sz w:val="17"/>
+              </w:rPr>
+              <w:t>Siklus kredit penuh selesai (end-to-end). Penerbitan SPPK otomatis dan pencairan unit alat berat LiuGong ke pelanggan.</w:t>
+            </w:r>
+          </w:p>
+        </w:tc>
+      </w:tr>
+    </w:tbl>
+    <w:p>
+      <w:pPr>
+        <w:spacing w:after="120"/>
+      </w:pPr>
+    </w:p>
+    <w:p>
+      <w:pPr>
+        <w:spacing w:before="160" w:after="60"/>
+        <w:jc w:val="center"/>
+      </w:pPr>
+      <w:r>
+        <w:drawing>
+          <wp:inline xmlns:a="http://schemas.openxmlformats.org/drawingml/2006/main" xmlns:pic="http://schemas.openxmlformats.org/drawingml/2006/picture">
+            <wp:extent cx="5669280" cy="1852809"/>
+            <wp:docPr id="2" name="Picture 2"/>
+            <wp:cNvGraphicFramePr>
+              <a:graphicFrameLocks noChangeAspect="1"/>
+            </wp:cNvGraphicFramePr>
+            <a:graphic>
+              <a:graphicData uri="http://schemas.openxmlformats.org/drawingml/2006/picture">
+                <pic:pic>
+                  <pic:nvPicPr>
+                    <pic:cNvPr id="0" name="diagram_pipa_strategis_4_tahap.png"/>
+                    <pic:cNvPicPr/>
+                  </pic:nvPicPr>
+                  <pic:blipFill>
+                    <a:blip r:embed="rId10"/>
+                    <a:stretch>
+                      <a:fillRect/>
+                    </a:stretch>
+                  </pic:blipFill>
+                  <pic:spPr>
+                    <a:xfrm>
+                      <a:off x="0" y="0"/>
+                      <a:ext cx="5669280" cy="1852809"/>
+                    </a:xfrm>
+                    <a:prstGeom prst="rect"/>
+                  </pic:spPr>
+                </pic:pic>
+              </a:graphicData>
+            </a:graphic>
+          </wp:inline>
+        </w:drawing>
+      </w:r>
+    </w:p>
+    <w:p>
+      <w:pPr>
+        <w:spacing w:after="160"/>
+        <w:jc w:val="center"/>
+      </w:pPr>
+      <w:r>
+        <w:rPr>
+          <w:rFonts w:ascii="Calibri" w:hAnsi="Calibri"/>
+          <w:i/>
+          <w:color w:val="64748B"/>
+          <w:sz w:val="19"/>
+        </w:rPr>
+        <w:t>Gambar: Diagram Arsitektur Pipa Pembiayaan 4-Tahap &amp; Interkoneksi Pefindo OCR</w:t>
+      </w:r>
+    </w:p>
+    <w:p>
+      <w:r>
+        <w:br w:type="page"/>
+      </w:r>
+    </w:p>
+    <w:p>
+      <w:pPr>
+        <w:spacing w:before="160" w:after="80"/>
+      </w:pPr>
+      <w:r>
+        <w:rPr>
+          <w:rFonts w:ascii="Calibri" w:hAnsi="Calibri"/>
+          <w:b/>
+          <w:color w:val="002060"/>
+          <w:sz w:val="30"/>
+        </w:rPr>
+        <w:t>BAB 2: PROSES DETAIL FAP STAGE DARI SISI MARKETING (RILIS Q4 2026)</w:t>
       </w:r>
     </w:p>
     <w:p>
@@ -450,23 +1088,7 @@
         <w:spacing w:line="276" w:lineRule="auto" w:after="120"/>
       </w:pPr>
       <w:r>
-        <w:t>Sebagai perusahaan pembiayaan captive (Captive Finance) untuk Guangxi LiuGong Machinery Co., Ltd. di Indonesia, keberhasilan LiuGong Finance tidak dapat dipisahkan dari kecepatan penjualan dan kepuasan jaringan dealer resmi (seperti PT Megatama Traktor Utama, PT Traktor Perkasa Nusantara, dan dealer regional lainnya). Di sektor tambang batubara Kalimantan, tambang nikel Sulawesi, hingga proyek konstruksi jalan tol, pelanggan kontraktor sering kali membatalkan pesanan alat berat LiuGong dan beralih ke kompetitor (Komatsu/CAT) semata-mata karena proses persetujuan leasing kompetitor lebih cepat 2 hari.</w:t>
-      </w:r>
-    </w:p>
-    <w:p>
-      <w:pPr>
-        <w:spacing w:line="276" w:lineRule="auto" w:after="120"/>
-      </w:pPr>
-      <w:r>
-        <w:t>Sistem LOS-CRM ini dibangun secara khusus untuk mengunci integrasi Tripartit:</w:t>
-        <w:br/>
-        <w:t>1. Dealer Resmi LiuGong: Menerbitkan Surat Penawaran (Quotation), spesifikasi unit (Excavator, Wheel Loader, Motor Grader, Dump Truck), Surat Pemesanan Kendaraan (SPK), dan Berita Acara Serah Terima (BAST).</w:t>
-        <w:br/>
-        <w:t>2. Skema Subsidi Dealer &amp; Buyback Guarantee: Mendukung skema Joint Marketing di mana dealer memberikan subsidi bunga (Interest Subsidy) atau jaminan pembelian kembali (Buyback Guarantee / Recourse) untuk memitigasi risiko gagal bayar.</w:t>
-        <w:br/>
-        <w:t>3. Customer (Calon Debitur): Memperoleh kepastian pembiayaan secara transparan, fleksibilitas uang muka (DP 20%–30%), dan tenor hingga 48 bulan.</w:t>
-        <w:br/>
-        <w:t>4. LiuGong Finance: Mengamankan portofolio pembiayaan yang sehat, profitabilitas marjin bunga bersih, dan agunan fidusia yang sah secara hukum.</w:t>
+        <w:t>Pada rilis Q4 2026, fokus implementasi difokuskan penuh pada FAP STAGE. Di tahap ini, staf Marketing (MKT) di cabang bertindak sebagai garda terdepan penginputan data. Seluruh alur dirancang secara ergonomis ke dalam 4 Tab Berurutan (Customer &amp; PIC, Legal, Stakeholders, dan Documents) yang dilengkapi otomatisasi AI dan live visual mirror:</w:t>
       </w:r>
     </w:p>
     <w:p>
@@ -478,7 +1100,7 @@
         <w:drawing>
           <wp:inline xmlns:a="http://schemas.openxmlformats.org/drawingml/2006/main" xmlns:pic="http://schemas.openxmlformats.org/drawingml/2006/picture">
             <wp:extent cx="5669280" cy="3543300"/>
-            <wp:docPr id="2" name="Picture 2"/>
+            <wp:docPr id="3" name="Picture 3"/>
             <wp:cNvGraphicFramePr>
               <a:graphicFrameLocks noChangeAspect="1"/>
             </wp:cNvGraphicFramePr>
@@ -486,7 +1108,97 @@
               <a:graphicData uri="http://schemas.openxmlformats.org/drawingml/2006/picture">
                 <pic:pic>
                   <pic:nvPicPr>
-                    <pic:cNvPr id="0" name="01_dashboard_overview.png"/>
+                    <pic:cNvPr id="0" name="fap_stage_tabs_with_document.png"/>
+                    <pic:cNvPicPr/>
+                  </pic:nvPicPr>
+                  <pic:blipFill>
+                    <a:blip r:embed="rId11"/>
+                    <a:stretch>
+                      <a:fillRect/>
+                    </a:stretch>
+                  </pic:blipFill>
+                  <pic:spPr>
+                    <a:xfrm>
+                      <a:off x="0" y="0"/>
+                      <a:ext cx="5669280" cy="3543300"/>
+                    </a:xfrm>
+                    <a:prstGeom prst="rect"/>
+                  </pic:spPr>
+                </pic:pic>
+              </a:graphicData>
+            </a:graphic>
+          </wp:inline>
+        </w:drawing>
+      </w:r>
+    </w:p>
+    <w:p>
+      <w:pPr>
+        <w:spacing w:after="160"/>
+        <w:jc w:val="center"/>
+      </w:pPr>
+      <w:r>
+        <w:rPr>
+          <w:rFonts w:ascii="Calibri" w:hAnsi="Calibri"/>
+          <w:i/>
+          <w:color w:val="64748B"/>
+          <w:sz w:val="19"/>
+        </w:rPr>
+        <w:t>Gambar: Tampilan Workspace FAP Stage Aktif Menampilkan 4 Tab Terstruktur Lengkap dengan Tab Dokumen (Live System)</w:t>
+      </w:r>
+    </w:p>
+    <w:p>
+      <w:pPr>
+        <w:spacing w:before="160" w:after="40"/>
+      </w:pPr>
+      <w:r>
+        <w:rPr>
+          <w:rFonts w:ascii="Calibri" w:hAnsi="Calibri"/>
+          <w:b/>
+          <w:color w:val="ED7D31"/>
+          <w:sz w:val="24"/>
+        </w:rPr>
+        <w:t>2.1. Tab 1: Customer &amp; PIC (5 Modul Accordion &amp; Digital Twin Excel 118-Baris)</w:t>
+      </w:r>
+    </w:p>
+    <w:p>
+      <w:pPr>
+        <w:spacing w:line="276" w:lineRule="auto" w:after="80"/>
+      </w:pPr>
+      <w:r>
+        <w:t>Untuk mencegah kelelahan pengguna (form fatigue) akibat lebih dari 35 field isian, formulir kiri dibagi ke dalam 5 modul kartu accordion bernomor:</w:t>
+        <w:br/>
+        <w:t>1. Modul 01 - Identitas &amp; Klasifikasi Debitur: Marketing memilih Kategori Nasabah (Customer Baru / Existing), Tipe Debitur (Corporate / Commercial / Micro), Kantor Cabang LiuGong (JKT01, SBY01, BPN01, PLB01, MDN01), serta Tanggal Permohonan.</w:t>
+        <w:br/>
+        <w:t>2. Modul 02 - Kantor Registrasi &amp; Domisili Perusahaan: Marketing memasukkan Nama Resmi Perusahaan, Alamat Kantor Pusat, Kota, Provinsi, Kode Pos, serta Nomor Telepon/Fax. Pada field NIB (Nomor Induk Berusaha), tersedia tombol 'Scan OCR NIB' yang otomatis mengekstrak dokumen OSS RBA BKPM.</w:t>
+        <w:br/>
+        <w:t>3. Modul 03 - Profil Usaha &amp; Legalitas Awal: Pengisian Bisnis Utama (KBLI Sektor Tambang/Konstruksi/Sawit), Pengalaman Usaha (Tahun &amp; Bulan), NPWP Badan Usaha (15/16 digit), serta No &amp; Tanggal Akta Pendirian.</w:t>
+        <w:br/>
+        <w:t>4. Modul 04 - Kontak Utama / Penanggung Jawab (PIC): Nama Lengkap PIC Pengadaan, Jabatan Formal (Direktur/Procurement), Alamat Domisili PIC, Nomor WhatsApp aktif, dan Email kantor resmi.</w:t>
+        <w:br/>
+        <w:t>5. Modul 05 - Segmentasi Industri &amp; Proyek Berjalan: Pemilihan sektor industri alat berat serta deskripsi kontrak kerja yang sedang dikerjakan debitur (pemberi kerja/bouwheer, lokasi tambang/konstruksi, durasi kontrak).</w:t>
+        <w:br/>
+        <w:br/>
+        <w:t>Fitur Digital Twin Live Excel: Pada kolom kanan, terpampang replika presisi formulir Excel resmi (FAP-Document_APPROVED_v01.2025.xlsx). Setiap karakter yang diketik oleh Marketing langsung terproyeksi ke lembar kanan secara real-time, lengkap dengan tombol navigasi Auto-Sync Focus (1. Identitas s/d 5. Proyek).</w:t>
+      </w:r>
+    </w:p>
+    <w:p>
+      <w:pPr>
+        <w:spacing w:before="160" w:after="60"/>
+        <w:jc w:val="center"/>
+      </w:pPr>
+      <w:r>
+        <w:drawing>
+          <wp:inline xmlns:a="http://schemas.openxmlformats.org/drawingml/2006/main" xmlns:pic="http://schemas.openxmlformats.org/drawingml/2006/picture">
+            <wp:extent cx="5669280" cy="3543300"/>
+            <wp:docPr id="4" name="Picture 4"/>
+            <wp:cNvGraphicFramePr>
+              <a:graphicFrameLocks noChangeAspect="1"/>
+            </wp:cNvGraphicFramePr>
+            <a:graphic>
+              <a:graphicData uri="http://schemas.openxmlformats.org/drawingml/2006/picture">
+                <pic:pic>
+                  <pic:nvPicPr>
+                    <pic:cNvPr id="0" name="03_workspace_split_50_50.png"/>
                     <pic:cNvPicPr/>
                   </pic:nvPicPr>
                   <pic:blipFill>
@@ -511,39 +1223,17 @@
     </w:p>
     <w:p>
       <w:pPr>
-        <w:spacing w:after="200"/>
+        <w:spacing w:after="160"/>
         <w:jc w:val="center"/>
       </w:pPr>
       <w:r>
         <w:rPr>
           <w:rFonts w:ascii="Calibri" w:hAnsi="Calibri"/>
           <w:i/>
-          <w:color w:val="646E7D"/>
-          <w:sz w:val="18"/>
+          <w:color w:val="64748B"/>
+          <w:sz w:val="19"/>
         </w:rPr>
-        <w:t>Gambar: Dashboard Eksekutif Portfolio &amp; Pipeline Distribusi Pembiayaan (Live System)</w:t>
-      </w:r>
-    </w:p>
-    <w:p>
-      <w:pPr>
-        <w:spacing w:before="280" w:after="80"/>
-      </w:pPr>
-      <w:r>
-        <w:rPr>
-          <w:rFonts w:ascii="Calibri" w:hAnsi="Calibri"/>
-          <w:b/>
-          <w:color w:val="002060"/>
-          <w:sz w:val="30"/>
-        </w:rPr>
-        <w:t>BAB 2: PIPA STRATEGIS 4-TAHAP (END-TO-END PIPELINE)</w:t>
-      </w:r>
-    </w:p>
-    <w:p>
-      <w:pPr>
-        <w:spacing w:line="276" w:lineRule="auto" w:after="160"/>
-      </w:pPr>
-      <w:r>
-        <w:t>Aplikasi menerapkan alur 4 tahap berjenjang yang menyatukan otomatisasi cerdas AI dan kehati-hatian perbankan (Prudential Banking), menghubungkan FAP Stage, Intelligent Pefindo Gateway, Pre-Analysis, ICLF, hingga Proposal final Komite Kredit:</w:t>
+        <w:t>Gambar: Dual-Pane Split Workspace 50-50: Form Input Accordion Kiri dan Live Digital Twin Excel FAP Kanan (Live System)</w:t>
       </w:r>
     </w:p>
     <w:p>
@@ -554,8 +1244,8 @@
       <w:r>
         <w:drawing>
           <wp:inline xmlns:a="http://schemas.openxmlformats.org/drawingml/2006/main" xmlns:pic="http://schemas.openxmlformats.org/drawingml/2006/picture">
-            <wp:extent cx="5669280" cy="1852809"/>
-            <wp:docPr id="3" name="Picture 3"/>
+            <wp:extent cx="5669280" cy="3543300"/>
+            <wp:docPr id="5" name="Picture 5"/>
             <wp:cNvGraphicFramePr>
               <a:graphicFrameLocks noChangeAspect="1"/>
             </wp:cNvGraphicFramePr>
@@ -563,7 +1253,7 @@
               <a:graphicData uri="http://schemas.openxmlformats.org/drawingml/2006/picture">
                 <pic:pic>
                   <pic:nvPicPr>
-                    <pic:cNvPr id="0" name="diagram_pipa_strategis_4_tahap.png"/>
+                    <pic:cNvPr id="0" name="04_nib_ocr_modal.png"/>
                     <pic:cNvPicPr/>
                   </pic:nvPicPr>
                   <pic:blipFill>
@@ -575,7 +1265,7 @@
                   <pic:spPr>
                     <a:xfrm>
                       <a:off x="0" y="0"/>
-                      <a:ext cx="5669280" cy="1852809"/>
+                      <a:ext cx="5669280" cy="3543300"/>
                     </a:xfrm>
                     <a:prstGeom prst="rect"/>
                   </pic:spPr>
@@ -588,522 +1278,51 @@
     </w:p>
     <w:p>
       <w:pPr>
-        <w:spacing w:after="200"/>
+        <w:spacing w:after="160"/>
         <w:jc w:val="center"/>
       </w:pPr>
       <w:r>
         <w:rPr>
           <w:rFonts w:ascii="Calibri" w:hAnsi="Calibri"/>
           <w:i/>
-          <w:color w:val="646E7D"/>
-          <w:sz w:val="18"/>
+          <w:color w:val="64748B"/>
+          <w:sz w:val="19"/>
         </w:rPr>
-        <w:t>Gambar: Diagram Arsitektur Pipa Strategis 4-Tahap, Jembatan Pefindo Biro Kredit, dan Fondasi Ekosistem LiuGong Finance</w:t>
+        <w:t>Gambar: Fitur Modal Scan OCR Dokumen NIB OSS RBA dengan Ekstraksi 5 Parameter Kunci Otomatis (Live System)</w:t>
       </w:r>
     </w:p>
-    <w:tbl>
-      <w:tblPr>
-        <w:tblW w:type="auto" w:w="0"/>
-        <w:jc w:val="center"/>
-        <w:tblLayout w:type="fixed"/>
-        <w:tblLook w:firstColumn="1" w:firstRow="1" w:lastColumn="0" w:lastRow="0" w:noHBand="0" w:noVBand="1" w:val="04A0"/>
-        <w:tblBorders>
-          <w:top w:val="single" w:sz="4" w:space="0" w:color="D3D3D3"/>
-          <w:bottom w:val="single" w:sz="4" w:space="0" w:color="D3D3D3"/>
-          <w:insideH w:val="single" w:sz="4" w:space="0" w:color="D3D3D3"/>
-          <w:insideV w:val="none"/>
-          <w:left w:val="none"/>
-          <w:right w:val="none"/>
-        </w:tblBorders>
-      </w:tblPr>
-      <w:tblGrid>
-        <w:gridCol w:w="3202"/>
-        <w:gridCol w:w="3202"/>
-        <w:gridCol w:w="3202"/>
-      </w:tblGrid>
-      <w:tr>
-        <w:tc>
-          <w:tcPr>
-            <w:tcW w:type="dxa" w:w="2592"/>
-            <w:shd w:fill="002060"/>
-            <w:tcMar>
-              <w:top w:w="60" w:type="dxa"/>
-              <w:bottom w:w="60" w:type="dxa"/>
-              <w:left w:w="80" w:type="dxa"/>
-              <w:right w:w="80" w:type="dxa"/>
-            </w:tcMar>
-          </w:tcPr>
-          <w:p>
-            <w:r>
-              <w:rPr>
-                <w:rFonts w:ascii="Calibri" w:hAnsi="Calibri"/>
-                <w:b/>
-                <w:color w:val="FFFFFF"/>
-                <w:sz w:val="19"/>
-              </w:rPr>
-              <w:t>Tahapan Sistem</w:t>
-            </w:r>
-          </w:p>
-        </w:tc>
-        <w:tc>
-          <w:tcPr>
-            <w:tcW w:type="dxa" w:w="3312"/>
-            <w:shd w:fill="002060"/>
-            <w:tcMar>
-              <w:top w:w="60" w:type="dxa"/>
-              <w:bottom w:w="60" w:type="dxa"/>
-              <w:left w:w="80" w:type="dxa"/>
-              <w:right w:w="80" w:type="dxa"/>
-            </w:tcMar>
-          </w:tcPr>
-          <w:p>
-            <w:r>
-              <w:rPr>
-                <w:rFonts w:ascii="Calibri" w:hAnsi="Calibri"/>
-                <w:b/>
-                <w:color w:val="FFFFFF"/>
-                <w:sz w:val="19"/>
-              </w:rPr>
-              <w:t>Fitur Unggulan &amp; Teknologi</w:t>
-            </w:r>
-          </w:p>
-        </w:tc>
-        <w:tc>
-          <w:tcPr>
-            <w:tcW w:type="dxa" w:w="3600"/>
-            <w:shd w:fill="002060"/>
-            <w:tcMar>
-              <w:top w:w="60" w:type="dxa"/>
-              <w:bottom w:w="60" w:type="dxa"/>
-              <w:left w:w="80" w:type="dxa"/>
-              <w:right w:w="80" w:type="dxa"/>
-            </w:tcMar>
-          </w:tcPr>
-          <w:p>
-            <w:r>
-              <w:rPr>
-                <w:rFonts w:ascii="Calibri" w:hAnsi="Calibri"/>
-                <w:b/>
-                <w:color w:val="FFFFFF"/>
-                <w:sz w:val="19"/>
-              </w:rPr>
-              <w:t>Dampak Strategis bagi Direksi</w:t>
-            </w:r>
-          </w:p>
-        </w:tc>
-      </w:tr>
-      <w:tr>
-        <w:tc>
-          <w:tcPr>
-            <w:tcW w:type="dxa" w:w="2592"/>
-            <w:tcMar>
-              <w:top w:w="50" w:type="dxa"/>
-              <w:bottom w:w="50" w:type="dxa"/>
-              <w:left w:w="80" w:type="dxa"/>
-              <w:right w:w="80" w:type="dxa"/>
-            </w:tcMar>
-          </w:tcPr>
-          <w:p>
-            <w:pPr>
-              <w:spacing w:line="276" w:lineRule="auto" w:after="40"/>
-            </w:pPr>
-            <w:r>
-              <w:rPr>
-                <w:rFonts w:ascii="Calibri" w:hAnsi="Calibri"/>
-                <w:b/>
-                <w:color w:val="002060"/>
-                <w:sz w:val="17"/>
-              </w:rPr>
-              <w:t>1. FAP STAGE</w:t>
-              <w:br/>
-              <w:t>(Intake &amp; Profiling)</w:t>
-            </w:r>
-          </w:p>
-        </w:tc>
-        <w:tc>
-          <w:tcPr>
-            <w:tcW w:type="dxa" w:w="3312"/>
-            <w:tcMar>
-              <w:top w:w="50" w:type="dxa"/>
-              <w:bottom w:w="50" w:type="dxa"/>
-              <w:left w:w="80" w:type="dxa"/>
-              <w:right w:w="80" w:type="dxa"/>
-            </w:tcMar>
-          </w:tcPr>
-          <w:p>
-            <w:pPr>
-              <w:spacing w:line="276" w:lineRule="auto" w:after="40"/>
-            </w:pPr>
-            <w:r>
-              <w:rPr>
-                <w:rFonts w:ascii="Calibri" w:hAnsi="Calibri"/>
-                <w:color w:val="28323C"/>
-                <w:sz w:val="17"/>
-              </w:rPr>
-              <w:t>• Multi-Document AI/OCR (NIB, e-KTP, Paspor, NPWP, E-KITAS)</w:t>
-              <w:br/>
-              <w:t>• Form 5-Modul Accordion &amp; Digital Twin Excel 118-Baris</w:t>
-            </w:r>
-          </w:p>
-        </w:tc>
-        <w:tc>
-          <w:tcPr>
-            <w:tcW w:type="dxa" w:w="3600"/>
-            <w:tcMar>
-              <w:top w:w="50" w:type="dxa"/>
-              <w:bottom w:w="50" w:type="dxa"/>
-              <w:left w:w="80" w:type="dxa"/>
-              <w:right w:w="80" w:type="dxa"/>
-            </w:tcMar>
-          </w:tcPr>
-          <w:p>
-            <w:pPr>
-              <w:spacing w:line="276" w:lineRule="auto" w:after="40"/>
-            </w:pPr>
-            <w:r>
-              <w:rPr>
-                <w:rFonts w:ascii="Calibri" w:hAnsi="Calibri"/>
-                <w:color w:val="28323C"/>
-                <w:sz w:val="17"/>
-              </w:rPr>
-              <w:t>Onboarding nasabah seketika. Memangkas 80% waktu input data dan meniadakan salah ketik nomor identitas resmi.</w:t>
-            </w:r>
-          </w:p>
-        </w:tc>
-      </w:tr>
-      <w:tr>
-        <w:tc>
-          <w:tcPr>
-            <w:tcW w:type="dxa" w:w="2592"/>
-            <w:tcMar>
-              <w:top w:w="50" w:type="dxa"/>
-              <w:bottom w:w="50" w:type="dxa"/>
-              <w:left w:w="80" w:type="dxa"/>
-              <w:right w:w="80" w:type="dxa"/>
-            </w:tcMar>
-            <w:shd w:fill="F8FAFC"/>
-          </w:tcPr>
-          <w:p>
-            <w:pPr>
-              <w:spacing w:line="276" w:lineRule="auto" w:after="40"/>
-            </w:pPr>
-            <w:r>
-              <w:rPr>
-                <w:rFonts w:ascii="Calibri" w:hAnsi="Calibri"/>
-                <w:b/>
-                <w:color w:val="002060"/>
-                <w:sz w:val="17"/>
-              </w:rPr>
-              <w:t>INTERKONEKSI CERDAS</w:t>
-              <w:br/>
-              <w:t>(Pefindo Biro Kredit)</w:t>
-            </w:r>
-          </w:p>
-        </w:tc>
-        <w:tc>
-          <w:tcPr>
-            <w:tcW w:type="dxa" w:w="3312"/>
-            <w:tcMar>
-              <w:top w:w="50" w:type="dxa"/>
-              <w:bottom w:w="50" w:type="dxa"/>
-              <w:left w:w="80" w:type="dxa"/>
-              <w:right w:w="80" w:type="dxa"/>
-            </w:tcMar>
-            <w:shd w:fill="F8FAFC"/>
-          </w:tcPr>
-          <w:p>
-            <w:pPr>
-              <w:spacing w:line="276" w:lineRule="auto" w:after="40"/>
-            </w:pPr>
-            <w:r>
-              <w:rPr>
-                <w:rFonts w:ascii="Calibri" w:hAnsi="Calibri"/>
-                <w:color w:val="28323C"/>
-                <w:sz w:val="17"/>
-              </w:rPr>
-              <w:t>• Ingestion Data Otomatis ke Pefindo Biro Kredit</w:t>
-              <w:br/>
-              <w:t>• Penarikan Credit Score (250–900)</w:t>
-              <w:br/>
-              <w:t>• Total Eksposur Utang Terbuka</w:t>
-            </w:r>
-          </w:p>
-        </w:tc>
-        <w:tc>
-          <w:tcPr>
-            <w:tcW w:type="dxa" w:w="3600"/>
-            <w:tcMar>
-              <w:top w:w="50" w:type="dxa"/>
-              <w:bottom w:w="50" w:type="dxa"/>
-              <w:left w:w="80" w:type="dxa"/>
-              <w:right w:w="80" w:type="dxa"/>
-            </w:tcMar>
-            <w:shd w:fill="F8FAFC"/>
-          </w:tcPr>
-          <w:p>
-            <w:pPr>
-              <w:spacing w:line="276" w:lineRule="auto" w:after="40"/>
-            </w:pPr>
-            <w:r>
-              <w:rPr>
-                <w:rFonts w:ascii="Calibri" w:hAnsi="Calibri"/>
-                <w:color w:val="28323C"/>
-                <w:sz w:val="17"/>
-              </w:rPr>
-              <w:t>Mengetahui integritas keuangan debitur secara seketika sebelum melangkah ke proses survei dan komite.</w:t>
-            </w:r>
-          </w:p>
-        </w:tc>
-      </w:tr>
-      <w:tr>
-        <w:tc>
-          <w:tcPr>
-            <w:tcW w:type="dxa" w:w="2592"/>
-            <w:tcMar>
-              <w:top w:w="50" w:type="dxa"/>
-              <w:bottom w:w="50" w:type="dxa"/>
-              <w:left w:w="80" w:type="dxa"/>
-              <w:right w:w="80" w:type="dxa"/>
-            </w:tcMar>
-          </w:tcPr>
-          <w:p>
-            <w:pPr>
-              <w:spacing w:line="276" w:lineRule="auto" w:after="40"/>
-            </w:pPr>
-            <w:r>
-              <w:rPr>
-                <w:rFonts w:ascii="Calibri" w:hAnsi="Calibri"/>
-                <w:b/>
-                <w:color w:val="002060"/>
-                <w:sz w:val="17"/>
-              </w:rPr>
-              <w:t>2. PRE-ANALYSIS</w:t>
-              <w:br/>
-              <w:t>(Risk Gatekeeping)</w:t>
-            </w:r>
-          </w:p>
-        </w:tc>
-        <w:tc>
-          <w:tcPr>
-            <w:tcW w:type="dxa" w:w="3312"/>
-            <w:tcMar>
-              <w:top w:w="50" w:type="dxa"/>
-              <w:bottom w:w="50" w:type="dxa"/>
-              <w:left w:w="80" w:type="dxa"/>
-              <w:right w:w="80" w:type="dxa"/>
-            </w:tcMar>
-          </w:tcPr>
-          <w:p>
-            <w:pPr>
-              <w:spacing w:line="276" w:lineRule="auto" w:after="40"/>
-            </w:pPr>
-            <w:r>
-              <w:rPr>
-                <w:rFonts w:ascii="Calibri" w:hAnsi="Calibri"/>
-                <w:color w:val="28323C"/>
-                <w:sz w:val="17"/>
-              </w:rPr>
-              <w:t>• Early Risk Triaging (Go / Review / No-Go)</w:t>
-              <w:br/>
-              <w:t>• Evaluasi KBLI Sektor Industri &amp; Kapasitas Alat</w:t>
-              <w:br/>
-              <w:t>• Deteksi Dini Restrukturisasi &amp; Gugatan</w:t>
-            </w:r>
-          </w:p>
-        </w:tc>
-        <w:tc>
-          <w:tcPr>
-            <w:tcW w:type="dxa" w:w="3600"/>
-            <w:tcMar>
-              <w:top w:w="50" w:type="dxa"/>
-              <w:bottom w:w="50" w:type="dxa"/>
-              <w:left w:w="80" w:type="dxa"/>
-              <w:right w:w="80" w:type="dxa"/>
-            </w:tcMar>
-          </w:tcPr>
-          <w:p>
-            <w:pPr>
-              <w:spacing w:line="276" w:lineRule="auto" w:after="40"/>
-            </w:pPr>
-            <w:r>
-              <w:rPr>
-                <w:rFonts w:ascii="Calibri" w:hAnsi="Calibri"/>
-                <w:color w:val="28323C"/>
-                <w:sz w:val="17"/>
-              </w:rPr>
-              <w:t>Filter dini NPL. Menghemat waktu dan biaya operasional analis agar tidak memproses debitur yang berisiko macet.</w:t>
-            </w:r>
-          </w:p>
-        </w:tc>
-      </w:tr>
-      <w:tr>
-        <w:tc>
-          <w:tcPr>
-            <w:tcW w:type="dxa" w:w="2592"/>
-            <w:tcMar>
-              <w:top w:w="50" w:type="dxa"/>
-              <w:bottom w:w="50" w:type="dxa"/>
-              <w:left w:w="80" w:type="dxa"/>
-              <w:right w:w="80" w:type="dxa"/>
-            </w:tcMar>
-            <w:shd w:fill="F8FAFC"/>
-          </w:tcPr>
-          <w:p>
-            <w:pPr>
-              <w:spacing w:line="276" w:lineRule="auto" w:after="40"/>
-            </w:pPr>
-            <w:r>
-              <w:rPr>
-                <w:rFonts w:ascii="Calibri" w:hAnsi="Calibri"/>
-                <w:b/>
-                <w:color w:val="002060"/>
-                <w:sz w:val="17"/>
-              </w:rPr>
-              <w:t>3. ICLF</w:t>
-              <w:br/>
-              <w:t>(Limit Setting)</w:t>
-            </w:r>
-          </w:p>
-        </w:tc>
-        <w:tc>
-          <w:tcPr>
-            <w:tcW w:type="dxa" w:w="3312"/>
-            <w:tcMar>
-              <w:top w:w="50" w:type="dxa"/>
-              <w:bottom w:w="50" w:type="dxa"/>
-              <w:left w:w="80" w:type="dxa"/>
-              <w:right w:w="80" w:type="dxa"/>
-            </w:tcMar>
-            <w:shd w:fill="F8FAFC"/>
-          </w:tcPr>
-          <w:p>
-            <w:pPr>
-              <w:spacing w:line="276" w:lineRule="auto" w:after="40"/>
-            </w:pPr>
-            <w:r>
-              <w:rPr>
-                <w:rFonts w:ascii="Calibri" w:hAnsi="Calibri"/>
-                <w:color w:val="28323C"/>
-                <w:sz w:val="17"/>
-              </w:rPr>
-              <w:t>• Penetapan Batas Plafon Debitur Tunggal &amp; Grup Usaha</w:t>
-              <w:br/>
-              <w:t>• Evaluasi BMPP Regulasi OJK</w:t>
-              <w:br/>
-              <w:t>• Struktur Rekomendasi Uang Muka (DP 20%–30%)</w:t>
-            </w:r>
-          </w:p>
-        </w:tc>
-        <w:tc>
-          <w:tcPr>
-            <w:tcW w:type="dxa" w:w="3600"/>
-            <w:tcMar>
-              <w:top w:w="50" w:type="dxa"/>
-              <w:bottom w:w="50" w:type="dxa"/>
-              <w:left w:w="80" w:type="dxa"/>
-              <w:right w:w="80" w:type="dxa"/>
-            </w:tcMar>
-            <w:shd w:fill="F8FAFC"/>
-          </w:tcPr>
-          <w:p>
-            <w:pPr>
-              <w:spacing w:line="276" w:lineRule="auto" w:after="40"/>
-            </w:pPr>
-            <w:r>
-              <w:rPr>
-                <w:rFonts w:ascii="Calibri" w:hAnsi="Calibri"/>
-                <w:color w:val="28323C"/>
-                <w:sz w:val="17"/>
-              </w:rPr>
-              <w:t>Pencegahan konsentrasi risiko kredit berlebih pada grup usaha tertentu dan memastikan kecukupan modal kerja.</w:t>
-            </w:r>
-          </w:p>
-        </w:tc>
-      </w:tr>
-      <w:tr>
-        <w:tc>
-          <w:tcPr>
-            <w:tcW w:type="dxa" w:w="2592"/>
-            <w:tcMar>
-              <w:top w:w="50" w:type="dxa"/>
-              <w:bottom w:w="50" w:type="dxa"/>
-              <w:left w:w="80" w:type="dxa"/>
-              <w:right w:w="80" w:type="dxa"/>
-            </w:tcMar>
-          </w:tcPr>
-          <w:p>
-            <w:pPr>
-              <w:spacing w:line="276" w:lineRule="auto" w:after="40"/>
-            </w:pPr>
-            <w:r>
-              <w:rPr>
-                <w:rFonts w:ascii="Calibri" w:hAnsi="Calibri"/>
-                <w:b/>
-                <w:color w:val="002060"/>
-                <w:sz w:val="17"/>
-              </w:rPr>
-              <w:t>4. PROPOSAL</w:t>
-              <w:br/>
-              <w:t>(Dossier &amp; Putusan)</w:t>
-            </w:r>
-          </w:p>
-        </w:tc>
-        <w:tc>
-          <w:tcPr>
-            <w:tcW w:type="dxa" w:w="3312"/>
-            <w:tcMar>
-              <w:top w:w="50" w:type="dxa"/>
-              <w:bottom w:w="50" w:type="dxa"/>
-              <w:left w:w="80" w:type="dxa"/>
-              <w:right w:w="80" w:type="dxa"/>
-            </w:tcMar>
-          </w:tcPr>
-          <w:p>
-            <w:pPr>
-              <w:spacing w:line="276" w:lineRule="auto" w:after="40"/>
-            </w:pPr>
-            <w:r>
-              <w:rPr>
-                <w:rFonts w:ascii="Calibri" w:hAnsi="Calibri"/>
-                <w:color w:val="28323C"/>
-                <w:sz w:val="17"/>
-              </w:rPr>
-              <w:t>• Inventaris Unit Alat Berat LiuGong</w:t>
-              <w:br/>
-              <w:t>• Anuitas Bunga Efektif Menurun Resmi</w:t>
-              <w:br/>
-              <w:t>• Neraca 3 Tahun Wajib Seimbang 100%</w:t>
-              <w:br/>
-              <w:t>• Putusan Komite Kredit Digital</w:t>
-            </w:r>
-          </w:p>
-        </w:tc>
-        <w:tc>
-          <w:tcPr>
-            <w:tcW w:type="dxa" w:w="3600"/>
-            <w:tcMar>
-              <w:top w:w="50" w:type="dxa"/>
-              <w:bottom w:w="50" w:type="dxa"/>
-              <w:left w:w="80" w:type="dxa"/>
-              <w:right w:w="80" w:type="dxa"/>
-            </w:tcMar>
-          </w:tcPr>
-          <w:p>
-            <w:pPr>
-              <w:spacing w:line="276" w:lineRule="auto" w:after="40"/>
-            </w:pPr>
-            <w:r>
-              <w:rPr>
-                <w:rFonts w:ascii="Calibri" w:hAnsi="Calibri"/>
-                <w:color w:val="28323C"/>
-                <w:sz w:val="17"/>
-              </w:rPr>
-              <w:t>Dossier lengkap siap sidang. Putusan kredit terkunci aman dengan jejak audit tak terubahkan (Audit Trail).</w:t>
-            </w:r>
-          </w:p>
-        </w:tc>
-      </w:tr>
-    </w:tbl>
+    <w:p>
+      <w:pPr>
+        <w:spacing w:before="160" w:after="40"/>
+      </w:pPr>
+      <w:r>
+        <w:rPr>
+          <w:rFonts w:ascii="Calibri" w:hAnsi="Calibri"/>
+          <w:b/>
+          <w:color w:val="ED7D31"/>
+          <w:sz w:val="24"/>
+        </w:rPr>
+        <w:t>2.2. Tab 2: Legal Deeds (Akta Pendirian, Akta Perubahan &amp; SK Kemenkumham)</w:t>
+      </w:r>
+    </w:p>
+    <w:p>
+      <w:pPr>
+        <w:spacing w:line="276" w:lineRule="auto" w:after="80"/>
+      </w:pPr>
+      <w:r>
+        <w:t>Di tab Legal, Marketing mendokumentasikan riwayat legalitas yuridis perusahaan debitur:</w:t>
+        <w:br/>
+        <w:t>• Akta Pendirian Utama: Nomor Akta Notaris, Tanggal Akta, Nama Notaris, serta Nomor &amp; Tanggal SK Menkumham Pendirian.</w:t>
+        <w:br/>
+        <w:t>• Akta Perubahan Terakhir: Nomor Akta, Tanggal Akta, serta Nomor &amp; Tanggal SK Menkumham Perubahan.</w:t>
+        <w:br/>
+        <w:t>• Kategori Remarks Perubahan: Memilih chip kategori klausul yang diubah (Susunan Pemegang Saham, Pengurus Direksi/Komisaris, Modal Dasar/Disetor, atau Maksud &amp; Tujuan Anggaran Dasar).</w:t>
+        <w:br/>
+        <w:t>• Editor TinyMCE Catatan Akta: Dilengkapi teks editor kaya dengan penomoran otomatis berurutan (continuous numbered list) untuk mencatat ringkasan isi akta tanpa terputus.</w:t>
+        <w:br/>
+        <w:t>• Segmentasi Tabel Cerdas: Sistem memisahkan antara 'Akta Aktif &amp; Rujukan Terkini' di tabel atas dan 'Riwayat Akta Lama (Historical)' di tabel bawah.</w:t>
+      </w:r>
+    </w:p>
     <w:p>
       <w:pPr>
         <w:spacing w:before="160" w:after="60"/>
@@ -1113,7 +1332,7 @@
         <w:drawing>
           <wp:inline xmlns:a="http://schemas.openxmlformats.org/drawingml/2006/main" xmlns:pic="http://schemas.openxmlformats.org/drawingml/2006/picture">
             <wp:extent cx="5669280" cy="3543300"/>
-            <wp:docPr id="4" name="Picture 4"/>
+            <wp:docPr id="6" name="Picture 6"/>
             <wp:cNvGraphicFramePr>
               <a:graphicFrameLocks noChangeAspect="1"/>
             </wp:cNvGraphicFramePr>
@@ -1121,7 +1340,7 @@
               <a:graphicData uri="http://schemas.openxmlformats.org/drawingml/2006/picture">
                 <pic:pic>
                   <pic:nvPicPr>
-                    <pic:cNvPr id="0" name="02_pipeline_applications.png"/>
+                    <pic:cNvPr id="0" name="tab_2_legal.png"/>
                     <pic:cNvPicPr/>
                   </pic:nvPicPr>
                   <pic:blipFill>
@@ -1146,49 +1365,22 @@
     </w:p>
     <w:p>
       <w:pPr>
-        <w:spacing w:after="200"/>
+        <w:spacing w:after="160"/>
         <w:jc w:val="center"/>
       </w:pPr>
       <w:r>
         <w:rPr>
           <w:rFonts w:ascii="Calibri" w:hAnsi="Calibri"/>
           <w:i/>
-          <w:color w:val="646E7D"/>
-          <w:sz w:val="18"/>
+          <w:color w:val="64748B"/>
+          <w:sz w:val="19"/>
         </w:rPr>
-        <w:t>Gambar: Daftar Pipeline Permohonan Pembiayaan Berdasarkan Kantor Cabang &amp; Status Workflow (Live System)</w:t>
-      </w:r>
-    </w:p>
-    <w:p>
-      <w:r>
-        <w:br w:type="page"/>
+        <w:t>Gambar: Manajemen Akta Legalitas: Tabel Akta Aktif Rujukan Terkini dan Riwayat Akta Historis (Live System)</w:t>
       </w:r>
     </w:p>
     <w:p>
       <w:pPr>
-        <w:spacing w:before="160" w:after="80"/>
-      </w:pPr>
-      <w:r>
-        <w:rPr>
-          <w:rFonts w:ascii="Calibri" w:hAnsi="Calibri"/>
-          <w:b/>
-          <w:color w:val="002060"/>
-          <w:sz w:val="30"/>
-        </w:rPr>
-        <w:t>BAB 3: SUITE MULTI-DOKUMEN AI/OCR &amp; INTEGRASI PEFINDO BIRO KREDIT</w:t>
-      </w:r>
-    </w:p>
-    <w:p>
-      <w:pPr>
-        <w:spacing w:line="276" w:lineRule="auto" w:after="120"/>
-      </w:pPr>
-      <w:r>
-        <w:t>Kelemahan terbesar sistem LOS tradisional di Indonesia adalah ketergantungan pada penginputan manual oleh staf administrasi cabang yang memicu tingkat kesalahan ketik (human error) hingga 20% pada NIK, NIB, dan NPWP. Aplikasi LOS-CRM LiuGong mengatasi hal ini secara tuntas melalui dua pilar teknologi mutakhir:</w:t>
-      </w:r>
-    </w:p>
-    <w:p>
-      <w:pPr>
-        <w:spacing w:before="120" w:after="40"/>
+        <w:spacing w:before="160" w:after="40"/>
       </w:pPr>
       <w:r>
         <w:rPr>
@@ -1197,7 +1389,7 @@
           <w:color w:val="ED7D31"/>
           <w:sz w:val="24"/>
         </w:rPr>
-        <w:t>3.1. Multi-Document AI/OCR Suite pada FAP Stage</w:t>
+        <w:t>2.3. Tab 3: Stakeholders (Susunan Pengurus, Pemegang Saham &amp; Validasi Modal 100%)</w:t>
       </w:r>
     </w:p>
     <w:p>
@@ -1205,15 +1397,15 @@
         <w:spacing w:line="276" w:lineRule="auto" w:after="80"/>
       </w:pPr>
       <w:r>
-        <w:t>Aplikasi memproses pemindaian dokumen secara instan di peramban (Client-Side Tesseract OCR WASM) dengan dukungan 5 jenis dokumen resmi:</w:t>
+        <w:t>Di tab Stakeholders, Marketing memasukkan susunan jajaran manajemen dan struktur kepemilikan modal perseroan:</w:t>
         <w:br/>
-        <w:t>• NIB (Nomor Induk Berusaha): Memindai dokumen OSS RBA Kementerian Investasi/BKPM untuk mengekstrak 13-digit NIB, Nama Perusahaan, Alamat Lengkap, Kode Pos, dan Tanggal Terbit.</w:t>
+        <w:t>• Klasifikasi Pemilik: Perorangan WNI (NIK e-KTP 16 digit), Perorangan Asing / Expatriat (Paspor &amp; E-KITAS), atau Badan Usaha (NPWP Badan).</w:t>
         <w:br/>
-        <w:t>• e-KTP (WNI): Memindai identitas Direksi, Komisaris, dan Pemegang Saham WNI untuk mengekstrak 16-digit NIK, Nama Lengkap, dan Tanggal Lahir.</w:t>
+        <w:t>• Jabatan Formal: Direktur Utama, Direktur, Komisaris Utama, Komisaris, atau Pemegang Saham Murni.</w:t>
         <w:br/>
-        <w:t>• PASSPORT &amp; E-KITAS (Expatriate / Asing): Ekstraksi paspor dan izin tinggal WNA untuk mengakomodasi struktur PMA (Penanaman Modal Asing) dan Direksi berkewarganegaraan asing dari Tiongkok atau negara mitra.</w:t>
+        <w:t>• Komposisi Saham: Jumlah lembar saham dan nilai nominal per lembar saham.</w:t>
         <w:br/>
-        <w:t>• NPWP Badan &amp; Pribadi: Ekstraksi dan validasi format NPWP 15-digit lama maupun format 16-digit terbaru.</w:t>
+        <w:t>• Validasi Keras Mutlak 100% (Hard Gate Invariant): Total persentase seluruh pemegang saham WAJIB tepat 100.00%. Apabila total persentase saham kurang (misal 99.8%) atau lebih (misal 101%), tombol pengajuan terkunci secara otomatis dan sistem memunculkan indikator peringatan merah. Hal ini menjamin integritas hukum kepemilikan modal sejak detik pertama.</w:t>
       </w:r>
     </w:p>
     <w:p>
@@ -1225,7 +1417,7 @@
         <w:drawing>
           <wp:inline xmlns:a="http://schemas.openxmlformats.org/drawingml/2006/main" xmlns:pic="http://schemas.openxmlformats.org/drawingml/2006/picture">
             <wp:extent cx="5669280" cy="3543300"/>
-            <wp:docPr id="5" name="Picture 5"/>
+            <wp:docPr id="7" name="Picture 7"/>
             <wp:cNvGraphicFramePr>
               <a:graphicFrameLocks noChangeAspect="1"/>
             </wp:cNvGraphicFramePr>
@@ -1233,7 +1425,7 @@
               <a:graphicData uri="http://schemas.openxmlformats.org/drawingml/2006/picture">
                 <pic:pic>
                   <pic:nvPicPr>
-                    <pic:cNvPr id="0" name="04_nib_ocr_modal.png"/>
+                    <pic:cNvPr id="0" name="tab_3_stakeholders.png"/>
                     <pic:cNvPicPr/>
                   </pic:nvPicPr>
                   <pic:blipFill>
@@ -1258,17 +1450,17 @@
     </w:p>
     <w:p>
       <w:pPr>
-        <w:spacing w:after="200"/>
+        <w:spacing w:after="160"/>
         <w:jc w:val="center"/>
       </w:pPr>
       <w:r>
         <w:rPr>
           <w:rFonts w:ascii="Calibri" w:hAnsi="Calibri"/>
           <w:i/>
-          <w:color w:val="646E7D"/>
-          <w:sz w:val="18"/>
+          <w:color w:val="64748B"/>
+          <w:sz w:val="19"/>
         </w:rPr>
-        <w:t>Gambar: Fitur Modal Scan OCR NIB OSS RBA dengan Ekstraksi 5 Field Otomatis (Live System)</w:t>
+        <w:t>Gambar: Struktur Pemegang Saham &amp; Jajaran Pengurus dengan Validasi Keras Kepemilikan Modal 100% (Live System)</w:t>
       </w:r>
     </w:p>
     <w:p>
@@ -1282,7 +1474,7 @@
           <w:color w:val="ED7D31"/>
           <w:sz w:val="24"/>
         </w:rPr>
-        <w:t>3.2. Jembatan Cerdas Antara FAP Stage dan Pre-Analysis: Pefindo Biro Kredit</w:t>
+        <w:t>2.4. Tab 4: Documents (Checklist 13 Berkas Wajib &amp; Repositori Digital)</w:t>
       </w:r>
     </w:p>
     <w:p>
@@ -1290,101 +1482,37 @@
         <w:spacing w:line="276" w:lineRule="auto" w:after="80"/>
       </w:pPr>
       <w:r>
-        <w:t>Begitu identitas legal debitur dan para pengurus kunci tervalidasi pada FAP Stage, sistem secara otomatis dapat menembakkan data tersebut ke Pefindo Biro Kredit (IdScore API Bridge) maupun membaca laporan PDF Pefindo via OCR parser. Langkah ini menghadirkan profil intelijen finansial yang komprehensif dalam hitungan detik:</w:t>
-      </w:r>
-    </w:p>
-    <w:tbl>
-      <w:tblPr>
-        <w:tblW w:type="auto" w:w="0"/>
-        <w:jc w:val="center"/>
-        <w:tblLayout w:type="fixed"/>
-        <w:tblLook w:firstColumn="1" w:firstRow="1" w:lastColumn="0" w:lastRow="0" w:noHBand="0" w:noVBand="1" w:val="04A0"/>
-      </w:tblPr>
-      <w:tblGrid>
-        <w:gridCol w:w="9605"/>
-      </w:tblGrid>
-      <w:tr>
-        <w:tc>
-          <w:tcPr>
-            <w:tcW w:type="dxa" w:w="9360"/>
-            <w:shd w:fill="F0F4F8"/>
-            <w:tcMar>
-              <w:top w:w="120" w:type="dxa"/>
-              <w:bottom w:w="120" w:type="dxa"/>
-              <w:left w:w="180" w:type="dxa"/>
-              <w:right w:w="180" w:type="dxa"/>
-            </w:tcMar>
-            <w:tcBorders>
-              <w:left w:val="single" w:sz="36" w:color="002060"/>
-              <w:top w:val="none"/>
-              <w:right w:val="none"/>
-              <w:bottom w:val="none"/>
-            </w:tcBorders>
-          </w:tcPr>
-          <w:p>
-            <w:pPr>
-              <w:spacing w:before="40" w:after="40" w:line="276" w:lineRule="auto"/>
-            </w:pPr>
-            <w:r>
-              <w:rPr>
-                <w:rFonts w:ascii="Calibri" w:hAnsi="Calibri"/>
-                <w:b/>
-                <w:color w:val="002060"/>
-                <w:sz w:val="22"/>
-              </w:rPr>
-              <w:t>NILAI STRATEGIS INTEGRASI PEFINDO BAGI MANAJEMEN RISIKO</w:t>
-              <w:br/>
-            </w:r>
-            <w:r>
-              <w:rPr>
-                <w:rFonts w:ascii="Calibri" w:hAnsi="Calibri"/>
-                <w:color w:val="283241"/>
-                <w:sz w:val="20"/>
-              </w:rPr>
-              <w:t>INTELIJEN RISIKO PEFINDO BIRO KREDIT:</w:t>
-              <w:br/>
-              <w:t>1. Pefindo Credit Score (Skala 250–900): Skor obyektif yang memetakan probabilitas gagal bayar (Probability of Default/PD).</w:t>
-              <w:br/>
-              <w:t>2. Riwayat Kredit Pefindo: Mengetahui histori pembayaran cicilan debitur di lembaga pembiayaan lain—apakah selalu lancar atau memiliki catatan tunggakan.</w:t>
-              <w:br/>
-              <w:t>3. Total Eksposur Utang Terbuka: Mengetahui akumulasi total kewajiban dan beban kredit berjalan di biro kredit.</w:t>
-              <w:br/>
-              <w:t>4. Deteksi Dini Restrukturisasi &amp; Gugatan Hukum: Menghindarkan LiuGong Finance dari debitur yang sedang dalam sengketa perdata, PKPU, atau kepailitan.</w:t>
-            </w:r>
-          </w:p>
-        </w:tc>
-      </w:tr>
-    </w:tbl>
-    <w:p>
-      <w:pPr>
-        <w:spacing w:after="80"/>
-      </w:pPr>
-    </w:p>
-    <w:p>
-      <w:r>
-        <w:br w:type="page"/>
-      </w:r>
-    </w:p>
-    <w:p>
-      <w:pPr>
-        <w:spacing w:before="160" w:after="80"/>
-      </w:pPr>
-      <w:r>
-        <w:rPr>
-          <w:rFonts w:ascii="Calibri" w:hAnsi="Calibri"/>
-          <w:b/>
-          <w:color w:val="002060"/>
-          <w:sz w:val="30"/>
-        </w:rPr>
-        <w:t>BAB 4: WORKSPACE SPLIT 50-50 &amp; DIGITAL TWIN EXCEL FAP 118-BARIS</w:t>
-      </w:r>
-    </w:p>
-    <w:p>
-      <w:pPr>
-        <w:spacing w:line="276" w:lineRule="auto" w:after="120"/>
-      </w:pPr>
-      <w:r>
-        <w:t>Salah satu keunggulan terbesar yang membedakan LOS-CRM LiuGong dari sistem kompetitor adalah arsitektur antarmuka Workspace Split 50-50. Di sisi kiri terdapat formulir 5 modul accordion modern, sementara di sisi kanan terpampang pratinjau lembar resmi Excel FAP 118-baris yang telah disetujui (Approved Mandatory Field) lengkap dengan logo resmi LiuGong Finance Indonesia, seksi identitas, profil usaha, proposal, hingga blok tanda tangan bermeterai.</w:t>
+        <w:t>Sesuai arahan Direksi, Tab Dokumen kini dihadirkan secara penuh pada FAP Stage untuk memastikan seluruh berkas persyaratan terhimpun rapi:</w:t>
+        <w:br/>
+        <w:t>• Checklist 13 Dokumen Wajib:</w:t>
+        <w:br/>
+        <w:t xml:space="preserve">  1. KTP Pengurus (Direksi &amp; Komisaris)</w:t>
+        <w:br/>
+        <w:t xml:space="preserve">  2. NPWP Perusahaan &amp; Pengurus</w:t>
+        <w:br/>
+        <w:t xml:space="preserve">  3. NIB (Nomor Induk Berusaha) OSS BKPM</w:t>
+        <w:br/>
+        <w:t xml:space="preserve">  4. Akta Pendirian Perusahaan + SK Kemenkumham</w:t>
+        <w:br/>
+        <w:t xml:space="preserve">  5. Akta Perubahan Terakhir + SK Kemenkumham</w:t>
+        <w:br/>
+        <w:t xml:space="preserve">  6. Rekening Koran Operasional (3–6 Bulan Terakhir)</w:t>
+        <w:br/>
+        <w:t xml:space="preserve">  7. Laporan Keuangan Neraca &amp; Laba Rugi</w:t>
+        <w:br/>
+        <w:t xml:space="preserve">  8. SPT Tahunan Pajak Badan</w:t>
+        <w:br/>
+        <w:t xml:space="preserve">  9. Profil Perusahaan (Company Profile)</w:t>
+        <w:br/>
+        <w:t xml:space="preserve">  10. Kontrak Kerja / SPK Proyek Berjalan</w:t>
+        <w:br/>
+        <w:t xml:space="preserve">  11. Izin Usaha Sektoral (IUJP/IUP Khusus Tambang)</w:t>
+        <w:br/>
+        <w:t xml:space="preserve">  12. Formulir Aplikasi Pembiayaan (FAP) Bertandatangan Basah &amp; Cap</w:t>
+        <w:br/>
+        <w:t xml:space="preserve">  13. Surat Persetujuan Pengecekan Pefindo Biro Kredit</w:t>
+        <w:br/>
+        <w:t>• Pengunggahan &amp; Verifikasi Berkas: Setiap item dilengkapi tombol upload berkas (PDF / JPG), indikator status (Verified / Pending), serta counter badge 'Documents (13)' di header tab.</w:t>
       </w:r>
     </w:p>
     <w:p>
@@ -1396,7 +1524,7 @@
         <w:drawing>
           <wp:inline xmlns:a="http://schemas.openxmlformats.org/drawingml/2006/main" xmlns:pic="http://schemas.openxmlformats.org/drawingml/2006/picture">
             <wp:extent cx="5669280" cy="3543300"/>
-            <wp:docPr id="6" name="Picture 6"/>
+            <wp:docPr id="8" name="Picture 8"/>
             <wp:cNvGraphicFramePr>
               <a:graphicFrameLocks noChangeAspect="1"/>
             </wp:cNvGraphicFramePr>
@@ -1404,7 +1532,7 @@
               <a:graphicData uri="http://schemas.openxmlformats.org/drawingml/2006/picture">
                 <pic:pic>
                   <pic:nvPicPr>
-                    <pic:cNvPr id="0" name="03_workspace_split_50_50.png"/>
+                    <pic:cNvPr id="0" name="fap_stage_tab_document_view.png"/>
                     <pic:cNvPicPr/>
                   </pic:nvPicPr>
                   <pic:blipFill>
@@ -1429,402 +1557,17 @@
     </w:p>
     <w:p>
       <w:pPr>
-        <w:spacing w:after="200"/>
+        <w:spacing w:after="160"/>
         <w:jc w:val="center"/>
       </w:pPr>
       <w:r>
         <w:rPr>
           <w:rFonts w:ascii="Calibri" w:hAnsi="Calibri"/>
           <w:i/>
-          <w:color w:val="646E7D"/>
-          <w:sz w:val="18"/>
-        </w:rPr>
-        <w:t>Gambar: Workspace Split 50-50: Form Input Accordion (Kiri) &amp; Live Preview Lembar FAP Excel (Kanan)</w:t>
-      </w:r>
-    </w:p>
-    <w:p>
-      <w:pPr>
-        <w:spacing w:before="160" w:after="60"/>
-        <w:jc w:val="center"/>
-      </w:pPr>
-      <w:r>
-        <w:drawing>
-          <wp:inline xmlns:a="http://schemas.openxmlformats.org/drawingml/2006/main" xmlns:pic="http://schemas.openxmlformats.org/drawingml/2006/picture">
-            <wp:extent cx="5669280" cy="3543300"/>
-            <wp:docPr id="7" name="Picture 7"/>
-            <wp:cNvGraphicFramePr>
-              <a:graphicFrameLocks noChangeAspect="1"/>
-            </wp:cNvGraphicFramePr>
-            <a:graphic>
-              <a:graphicData uri="http://schemas.openxmlformats.org/drawingml/2006/picture">
-                <pic:pic>
-                  <pic:nvPicPr>
-                    <pic:cNvPr id="0" name="fap_excel_digital_twin.png"/>
-                    <pic:cNvPicPr/>
-                  </pic:nvPicPr>
-                  <pic:blipFill>
-                    <a:blip r:embed="rId17"/>
-                    <a:stretch>
-                      <a:fillRect/>
-                    </a:stretch>
-                  </pic:blipFill>
-                  <pic:spPr>
-                    <a:xfrm>
-                      <a:off x="0" y="0"/>
-                      <a:ext cx="5669280" cy="3543300"/>
-                    </a:xfrm>
-                    <a:prstGeom prst="rect"/>
-                  </pic:spPr>
-                </pic:pic>
-              </a:graphicData>
-            </a:graphic>
-          </wp:inline>
-        </w:drawing>
-      </w:r>
-    </w:p>
-    <w:p>
-      <w:pPr>
-        <w:spacing w:after="200"/>
-        <w:jc w:val="center"/>
-      </w:pPr>
-      <w:r>
-        <w:rPr>
-          <w:rFonts w:ascii="Calibri" w:hAnsi="Calibri"/>
-          <w:i/>
-          <w:color w:val="646E7D"/>
-          <w:sz w:val="18"/>
-        </w:rPr>
-        <w:t>Gambar: Digital Twin Dokumen FAP Excel 118-Baris dengan Logo Resmi LiuGong Finance Indonesia</w:t>
-      </w:r>
-    </w:p>
-    <w:p>
-      <w:pPr>
-        <w:spacing w:before="280" w:after="80"/>
-      </w:pPr>
-      <w:r>
-        <w:rPr>
-          <w:rFonts w:ascii="Calibri" w:hAnsi="Calibri"/>
-          <w:b/>
-          <w:color w:val="002060"/>
-          <w:sz w:val="30"/>
-        </w:rPr>
-        <w:t>BAB 5: TATA KELOLA KREDIT, PEMEGANG SAHAM 100% &amp; SPREADING KEUANGAN</w:t>
-      </w:r>
-    </w:p>
-    <w:p>
-      <w:pPr>
-        <w:spacing w:line="276" w:lineRule="auto" w:after="120"/>
-      </w:pPr>
-      <w:r>
-        <w:t>Aplikasi menerapkan mekanisme validasi deterministik tanpa kompromi untuk memastikan integritas permohonan kredit:</w:t>
-      </w:r>
-    </w:p>
-    <w:p>
-      <w:pPr>
-        <w:spacing w:line="276" w:lineRule="auto" w:after="60"/>
-      </w:pPr>
-      <w:r>
-        <w:rPr>
-          <w:rFonts w:ascii="Calibri" w:hAnsi="Calibri"/>
-          <w:b/>
-          <w:color w:val="002060"/>
+          <w:color w:val="64748B"/>
           <w:sz w:val="19"/>
         </w:rPr>
-        <w:t xml:space="preserve">• Validasi Kepemilikan Saham 100% Persis (Tab Stakeholders): </w:t>
-      </w:r>
-      <w:r>
-        <w:rPr>
-          <w:rFonts w:ascii="Calibri" w:hAnsi="Calibri"/>
-          <w:color w:val="28323C"/>
-          <w:sz w:val="19"/>
-        </w:rPr>
-        <w:t>Sistem secara deterministik mengunci pengajuan kredit jika total porsi kepemilikan saham seluruh pemegang saham tidak berjumlah persis 100.00%. Menutup celah saham fiktif dan mematuhi regulasi Anti-Pencucian Uang (APU-PPT OJK).</w:t>
-      </w:r>
-    </w:p>
-    <w:p>
-      <w:pPr>
-        <w:spacing w:line="276" w:lineRule="auto" w:after="60"/>
-      </w:pPr>
-      <w:r>
-        <w:rPr>
-          <w:rFonts w:ascii="Calibri" w:hAnsi="Calibri"/>
-          <w:b/>
-          <w:color w:val="002060"/>
-          <w:sz w:val="19"/>
-        </w:rPr>
-        <w:t xml:space="preserve">• Integritas Keseimbangan Neraca Keuangan 3 Tahun (Tab Financial Statements): </w:t>
-      </w:r>
-      <w:r>
-        <w:rPr>
-          <w:rFonts w:ascii="Calibri" w:hAnsi="Calibri"/>
-          <w:color w:val="28323C"/>
-          <w:sz w:val="19"/>
-        </w:rPr>
-        <w:t>Menggunakan kalkulasi sen integer (BigInt) presisi tinggi untuk memeriksa 3 tahun laporan keuangan historis: Total Aset wajib sama persis dengan Total Liabilitas + Ekuitas. Laporan yang tidak seimbang langsung ditolak oleh sistem.</w:t>
-      </w:r>
-    </w:p>
-    <w:p>
-      <w:pPr>
-        <w:spacing w:line="276" w:lineRule="auto" w:after="60"/>
-      </w:pPr>
-      <w:r>
-        <w:rPr>
-          <w:rFonts w:ascii="Calibri" w:hAnsi="Calibri"/>
-          <w:b/>
-          <w:color w:val="002060"/>
-          <w:sz w:val="19"/>
-        </w:rPr>
-        <w:t xml:space="preserve">• Tata Kelola Akta Legalitas &amp; Notaris (Tab Legal): </w:t>
-      </w:r>
-      <w:r>
-        <w:rPr>
-          <w:rFonts w:ascii="Calibri" w:hAnsi="Calibri"/>
-          <w:color w:val="28323C"/>
-          <w:sz w:val="19"/>
-        </w:rPr>
-        <w:t>Pemisahan akta aktif dan arsip historis, penomoran klausul kontinu pada editor teks TinyMCE, dan matriks perbandingan perubahan modal/pengurus secara berdampingan.</w:t>
-      </w:r>
-    </w:p>
-    <w:p>
-      <w:pPr>
-        <w:spacing w:line="276" w:lineRule="auto" w:after="60"/>
-      </w:pPr>
-      <w:r>
-        <w:rPr>
-          <w:rFonts w:ascii="Calibri" w:hAnsi="Calibri"/>
-          <w:b/>
-          <w:color w:val="002060"/>
-          <w:sz w:val="19"/>
-        </w:rPr>
-        <w:t xml:space="preserve">• Checklist Bukti Fisik Dokumen (Tab Documents Desk): </w:t>
-      </w:r>
-      <w:r>
-        <w:rPr>
-          <w:rFonts w:ascii="Calibri" w:hAnsi="Calibri"/>
-          <w:color w:val="28323C"/>
-          <w:sz w:val="19"/>
-        </w:rPr>
-        <w:t>Monitoring masa berlaku izin usaha (NIB, SIUP, SKT, SPPKP) dan penyimpanan terenkripsi di AWS S3 privat dengan link kedaluwarsa 15 menit sesuai UU PDP No. 27/2022.</w:t>
-      </w:r>
-    </w:p>
-    <w:p>
-      <w:pPr>
-        <w:spacing w:before="160" w:after="60"/>
-        <w:jc w:val="center"/>
-      </w:pPr>
-      <w:r>
-        <w:drawing>
-          <wp:inline xmlns:a="http://schemas.openxmlformats.org/drawingml/2006/main" xmlns:pic="http://schemas.openxmlformats.org/drawingml/2006/picture">
-            <wp:extent cx="5669280" cy="3543300"/>
-            <wp:docPr id="8" name="Picture 8"/>
-            <wp:cNvGraphicFramePr>
-              <a:graphicFrameLocks noChangeAspect="1"/>
-            </wp:cNvGraphicFramePr>
-            <a:graphic>
-              <a:graphicData uri="http://schemas.openxmlformats.org/drawingml/2006/picture">
-                <pic:pic>
-                  <pic:nvPicPr>
-                    <pic:cNvPr id="0" name="tab_3_stakeholders.png"/>
-                    <pic:cNvPicPr/>
-                  </pic:nvPicPr>
-                  <pic:blipFill>
-                    <a:blip r:embed="rId18"/>
-                    <a:stretch>
-                      <a:fillRect/>
-                    </a:stretch>
-                  </pic:blipFill>
-                  <pic:spPr>
-                    <a:xfrm>
-                      <a:off x="0" y="0"/>
-                      <a:ext cx="5669280" cy="3543300"/>
-                    </a:xfrm>
-                    <a:prstGeom prst="rect"/>
-                  </pic:spPr>
-                </pic:pic>
-              </a:graphicData>
-            </a:graphic>
-          </wp:inline>
-        </w:drawing>
-      </w:r>
-    </w:p>
-    <w:p>
-      <w:pPr>
-        <w:spacing w:after="200"/>
-        <w:jc w:val="center"/>
-      </w:pPr>
-      <w:r>
-        <w:rPr>
-          <w:rFonts w:ascii="Calibri" w:hAnsi="Calibri"/>
-          <w:i/>
-          <w:color w:val="646E7D"/>
-          <w:sz w:val="18"/>
-        </w:rPr>
-        <w:t>Gambar: Verifikasi Struktur Kepemilikan Saham Wajib 100% &amp; Direksi WNI/WNA (Live System)</w:t>
-      </w:r>
-    </w:p>
-    <w:p>
-      <w:pPr>
-        <w:spacing w:before="160" w:after="60"/>
-        <w:jc w:val="center"/>
-      </w:pPr>
-      <w:r>
-        <w:drawing>
-          <wp:inline xmlns:a="http://schemas.openxmlformats.org/drawingml/2006/main" xmlns:pic="http://schemas.openxmlformats.org/drawingml/2006/picture">
-            <wp:extent cx="5669280" cy="3543300"/>
-            <wp:docPr id="9" name="Picture 9"/>
-            <wp:cNvGraphicFramePr>
-              <a:graphicFrameLocks noChangeAspect="1"/>
-            </wp:cNvGraphicFramePr>
-            <a:graphic>
-              <a:graphicData uri="http://schemas.openxmlformats.org/drawingml/2006/picture">
-                <pic:pic>
-                  <pic:nvPicPr>
-                    <pic:cNvPr id="0" name="tab_5_financial_statements.png"/>
-                    <pic:cNvPicPr/>
-                  </pic:nvPicPr>
-                  <pic:blipFill>
-                    <a:blip r:embed="rId19"/>
-                    <a:stretch>
-                      <a:fillRect/>
-                    </a:stretch>
-                  </pic:blipFill>
-                  <pic:spPr>
-                    <a:xfrm>
-                      <a:off x="0" y="0"/>
-                      <a:ext cx="5669280" cy="3543300"/>
-                    </a:xfrm>
-                    <a:prstGeom prst="rect"/>
-                  </pic:spPr>
-                </pic:pic>
-              </a:graphicData>
-            </a:graphic>
-          </wp:inline>
-        </w:drawing>
-      </w:r>
-    </w:p>
-    <w:p>
-      <w:pPr>
-        <w:spacing w:after="200"/>
-        <w:jc w:val="center"/>
-      </w:pPr>
-      <w:r>
-        <w:rPr>
-          <w:rFonts w:ascii="Calibri" w:hAnsi="Calibri"/>
-          <w:i/>
-          <w:color w:val="646E7D"/>
-          <w:sz w:val="18"/>
-        </w:rPr>
-        <w:t>Gambar: Spreading Laporan Keuangan 3 Tahun dengan Keseimbangan Neraca Terverifikasi (Live System)</w:t>
-      </w:r>
-    </w:p>
-    <w:p>
-      <w:pPr>
-        <w:spacing w:before="160" w:after="60"/>
-        <w:jc w:val="center"/>
-      </w:pPr>
-      <w:r>
-        <w:drawing>
-          <wp:inline xmlns:a="http://schemas.openxmlformats.org/drawingml/2006/main" xmlns:pic="http://schemas.openxmlformats.org/drawingml/2006/picture">
-            <wp:extent cx="5669280" cy="3543300"/>
-            <wp:docPr id="10" name="Picture 10"/>
-            <wp:cNvGraphicFramePr>
-              <a:graphicFrameLocks noChangeAspect="1"/>
-            </wp:cNvGraphicFramePr>
-            <a:graphic>
-              <a:graphicData uri="http://schemas.openxmlformats.org/drawingml/2006/picture">
-                <pic:pic>
-                  <pic:nvPicPr>
-                    <pic:cNvPr id="0" name="tab_2_legal.png"/>
-                    <pic:cNvPicPr/>
-                  </pic:nvPicPr>
-                  <pic:blipFill>
-                    <a:blip r:embed="rId20"/>
-                    <a:stretch>
-                      <a:fillRect/>
-                    </a:stretch>
-                  </pic:blipFill>
-                  <pic:spPr>
-                    <a:xfrm>
-                      <a:off x="0" y="0"/>
-                      <a:ext cx="5669280" cy="3543300"/>
-                    </a:xfrm>
-                    <a:prstGeom prst="rect"/>
-                  </pic:spPr>
-                </pic:pic>
-              </a:graphicData>
-            </a:graphic>
-          </wp:inline>
-        </w:drawing>
-      </w:r>
-    </w:p>
-    <w:p>
-      <w:pPr>
-        <w:spacing w:after="200"/>
-        <w:jc w:val="center"/>
-      </w:pPr>
-      <w:r>
-        <w:rPr>
-          <w:rFonts w:ascii="Calibri" w:hAnsi="Calibri"/>
-          <w:i/>
-          <w:color w:val="646E7D"/>
-          <w:sz w:val="18"/>
-        </w:rPr>
-        <w:t>Gambar: Manajemen Akta Legalitas: Pemisahan Akta Aktif &amp; Riwayat Historis (Live System)</w:t>
-      </w:r>
-    </w:p>
-    <w:p>
-      <w:pPr>
-        <w:spacing w:before="160" w:after="60"/>
-        <w:jc w:val="center"/>
-      </w:pPr>
-      <w:r>
-        <w:drawing>
-          <wp:inline xmlns:a="http://schemas.openxmlformats.org/drawingml/2006/main" xmlns:pic="http://schemas.openxmlformats.org/drawingml/2006/picture">
-            <wp:extent cx="5669280" cy="3543300"/>
-            <wp:docPr id="11" name="Picture 11"/>
-            <wp:cNvGraphicFramePr>
-              <a:graphicFrameLocks noChangeAspect="1"/>
-            </wp:cNvGraphicFramePr>
-            <a:graphic>
-              <a:graphicData uri="http://schemas.openxmlformats.org/drawingml/2006/picture">
-                <pic:pic>
-                  <pic:nvPicPr>
-                    <pic:cNvPr id="0" name="tab_legal_modal_tinymce.png"/>
-                    <pic:cNvPicPr/>
-                  </pic:nvPicPr>
-                  <pic:blipFill>
-                    <a:blip r:embed="rId21"/>
-                    <a:stretch>
-                      <a:fillRect/>
-                    </a:stretch>
-                  </pic:blipFill>
-                  <pic:spPr>
-                    <a:xfrm>
-                      <a:off x="0" y="0"/>
-                      <a:ext cx="5669280" cy="3543300"/>
-                    </a:xfrm>
-                    <a:prstGeom prst="rect"/>
-                  </pic:spPr>
-                </pic:pic>
-              </a:graphicData>
-            </a:graphic>
-          </wp:inline>
-        </w:drawing>
-      </w:r>
-    </w:p>
-    <w:p>
-      <w:pPr>
-        <w:spacing w:after="200"/>
-        <w:jc w:val="center"/>
-      </w:pPr>
-      <w:r>
-        <w:rPr>
-          <w:rFonts w:ascii="Calibri" w:hAnsi="Calibri"/>
-          <w:i/>
-          <w:color w:val="646E7D"/>
-          <w:sz w:val="18"/>
-        </w:rPr>
-        <w:t>Gambar: Editor Akta Legalitas TinyMCE dengan Penomoran Klausul Kontinu &amp; Kategori Remarks (Live System)</w:t>
+        <w:t>Gambar: Pusat Verifikasi Berkas: Checklist 13 Dokumen Wajib dengan Fitur Unggah &amp; Status Kelengkapan (Live System)</w:t>
       </w:r>
     </w:p>
     <w:p>
@@ -1843,7 +1586,7 @@
           <w:color w:val="002060"/>
           <w:sz w:val="30"/>
         </w:rPr>
-        <w:t>BAB 6: STUDI KASUS RIIL &amp; KALKULASI DETAIL PEMBIAYAAN ALAT BERAT</w:t>
+        <w:t>BAB 3: GAMBARAN UMUM FASE MENDATANG (ROADMAP 2027)</w:t>
       </w:r>
     </w:p>
     <w:p>
@@ -1851,7 +1594,134 @@
         <w:spacing w:line="276" w:lineRule="auto" w:after="120"/>
       </w:pPr>
       <w:r>
-        <w:t>Berikut adalah simulasi end-to-end kasus nyata permohonan pembiayaan alat berat LiuGong yang diproses melalui sistem LOS-CRM untuk menggambarkan akurasi aktuaria dan kalkulasi angsuran:</w:t>
+        <w:t>Fase lanjutan pada tahun 2027 akan mengembangkan kapabilitas analitis mendalam, decision engine otomatis, serta penuntasan proposal komite kredit:</w:t>
+      </w:r>
+    </w:p>
+    <w:p>
+      <w:pPr>
+        <w:spacing w:before="120" w:after="40"/>
+      </w:pPr>
+      <w:r>
+        <w:rPr>
+          <w:rFonts w:ascii="Calibri" w:hAnsi="Calibri"/>
+          <w:b/>
+          <w:color w:val="002060"/>
+          <w:sz w:val="24"/>
+        </w:rPr>
+        <w:t>3.1. Q1 2027 — Pre-Analysis &amp; Integrasi Pefindo OCR (OCR NPWP / SPT Tahunan)</w:t>
+      </w:r>
+    </w:p>
+    <w:p>
+      <w:pPr>
+        <w:spacing w:line="276" w:lineRule="auto" w:after="80"/>
+      </w:pPr>
+      <w:r>
+        <w:t>• Early Risk Triaging: Skrining kelayakan awal debitur secara instan (kategori Go / Review / No-Go) sebelum analis menghabiskan waktu ke lapangan.</w:t>
+        <w:br/>
+        <w:t>• Integrasi Pefindo Biro Kredit: Menembakkan identitas nasabah ke Pefindo untuk menarik Credit Score (skala 250–900), riwayat pembayaran kredit, serta total fasilitas utang terbuka secara real-time.</w:t>
+        <w:br/>
+        <w:t>• Fitur Cerdas OCR NPWP &amp; SPT Tahunan: Pemindai OCR mutakhir yang membaca lampiran SPT Pajak Penghasilan Badan (Formulir 1771) dan secara langsung memetakan angka Penjualan, HPP, Beban Operasional, Aset Lancar, dan Modal ke tabel Financial Statement di sistem tanpa pengetikan manual.</w:t>
+      </w:r>
+    </w:p>
+    <w:p>
+      <w:pPr>
+        <w:spacing w:before="120" w:after="40"/>
+      </w:pPr>
+      <w:r>
+        <w:rPr>
+          <w:rFonts w:ascii="Calibri" w:hAnsi="Calibri"/>
+          <w:b/>
+          <w:color w:val="002060"/>
+          <w:sz w:val="24"/>
+        </w:rPr>
+        <w:t>3.2. Q2 2027 — ICLF &amp; Credit Decision Engine (CDE Financial)</w:t>
+      </w:r>
+    </w:p>
+    <w:p>
+      <w:pPr>
+        <w:spacing w:line="276" w:lineRule="auto" w:after="80"/>
+      </w:pPr>
+      <w:r>
+        <w:t>• Initial Credit Limit Facility (ICLF): Penetapan batas pagu pembiayaan maksimum per debitur tunggal maupun grup usaha berdasarkan kepatuhan Batas Maksimum Pemberian Pembiayaan (BMPP OJK) dan rasio permodalan.</w:t>
+        <w:br/>
+        <w:t>• Credit Decision Engine (CDE) Phase 1: Engine penilaian kredit otomatis yang mengevaluasi rasio keuangan (Current Ratio, Debt-to-Equity, Net Profit Margin, Interest Coverage Ratio) dan menghasilkan skor kelayakan finansial secara terstandardisasi.</w:t>
+      </w:r>
+    </w:p>
+    <w:p>
+      <w:pPr>
+        <w:spacing w:before="120" w:after="40"/>
+      </w:pPr>
+      <w:r>
+        <w:rPr>
+          <w:rFonts w:ascii="Calibri" w:hAnsi="Calibri"/>
+          <w:b/>
+          <w:color w:val="002060"/>
+          <w:sz w:val="24"/>
+        </w:rPr>
+        <w:t>3.3. Q3 2027 — Credit Decision Engine (CDE Bank Statement) Phase 2</w:t>
+      </w:r>
+    </w:p>
+    <w:p>
+      <w:pPr>
+        <w:spacing w:line="276" w:lineRule="auto" w:after="80"/>
+      </w:pPr>
+      <w:r>
+        <w:t>• Parser Rekening Koran Cerdas: Mengekstrak mutasi buku bank debitur (Bank Mandiri, BCA, BRI, BNI) dari berkas PDF mutasi 3–6 bulan terakhir.</w:t>
+        <w:br/>
+        <w:t>• Analisis Likuiditas Riil: Menghitung saldo rata-rata bulanan, perputaran kredit harian, frekuensi saldo minus, serta mendeteksi transaksi anomali atau cek kosong untuk memastikan debitur memiliki kemampuan membayar angsuran riil.</w:t>
+      </w:r>
+    </w:p>
+    <w:p>
+      <w:pPr>
+        <w:spacing w:before="120" w:after="40"/>
+      </w:pPr>
+      <w:r>
+        <w:rPr>
+          <w:rFonts w:ascii="Calibri" w:hAnsi="Calibri"/>
+          <w:b/>
+          <w:color w:val="002060"/>
+          <w:sz w:val="24"/>
+        </w:rPr>
+        <w:t>3.4. Q4 2027 — Proposal Pembiayaan Final &amp; Putusan Komite Kredit</w:t>
+      </w:r>
+    </w:p>
+    <w:p>
+      <w:pPr>
+        <w:spacing w:line="276" w:lineRule="auto" w:after="80"/>
+      </w:pPr>
+      <w:r>
+        <w:t>• Rincian Unit Alat Berat LiuGong: Inventaris unit (Excavator 922E, Wheel Loader 856H, Dump Truck), harga OTR, subsidi dealer, dan uang muka (DP 20%–30%).</w:t>
+        <w:br/>
+        <w:t>• Mesin Aktuaria Bunga Efektif: Simulasi angsuran anuitas menurun resmi (reducing balance annuity) presisi tinggi.</w:t>
+        <w:br/>
+        <w:t>• Persetujuan Komite Kredit Digital: Pelaksanaan sidang komite kredit digital berjenjang (Tier 1 Cabang s/d Tier 3 Direksi/Presdir) dengan hak Approve, Reject, atau Return, disertai pencatatan audit trail permanen.</w:t>
+      </w:r>
+    </w:p>
+    <w:p>
+      <w:r>
+        <w:br w:type="page"/>
+      </w:r>
+    </w:p>
+    <w:p>
+      <w:pPr>
+        <w:spacing w:before="160" w:after="80"/>
+      </w:pPr>
+      <w:r>
+        <w:rPr>
+          <w:rFonts w:ascii="Calibri" w:hAnsi="Calibri"/>
+          <w:b/>
+          <w:color w:val="002060"/>
+          <w:sz w:val="30"/>
+        </w:rPr>
+        <w:t>BAB 4: LEMBAR PENGESAHAN EKSEKUTIF</w:t>
+      </w:r>
+    </w:p>
+    <w:p>
+      <w:pPr>
+        <w:spacing w:line="276" w:lineRule="auto" w:after="160"/>
+      </w:pPr>
+      <w:r>
+        <w:t>Proposal Spesifikasi Bisnis dan Roadmap Sistem LOS-CRM ini disusun sebagai pedoman resmi pengembangan sistem dan diajukan untuk memperoleh persetujuan prinsip dari Bapak Presiden Direktur:</w:t>
       </w:r>
     </w:p>
     <w:tbl>
@@ -1870,698 +1740,17 @@
         </w:tblBorders>
       </w:tblPr>
       <w:tblGrid>
-        <w:gridCol w:w="4802"/>
-        <w:gridCol w:w="4802"/>
+        <w:gridCol w:w="4896"/>
+        <w:gridCol w:w="4896"/>
       </w:tblGrid>
       <w:tr>
         <w:tc>
           <w:tcPr>
-            <w:tcW w:type="dxa" w:w="3600"/>
-            <w:tcMar>
-              <w:top w:w="45" w:type="dxa"/>
-              <w:bottom w:w="45" w:type="dxa"/>
-              <w:left w:w="70" w:type="dxa"/>
-              <w:right w:w="70" w:type="dxa"/>
-            </w:tcMar>
-          </w:tcPr>
-          <w:p>
-            <w:r>
-              <w:rPr>
-                <w:rFonts w:ascii="Calibri" w:hAnsi="Calibri"/>
-                <w:b/>
-                <w:color w:val="002060"/>
-                <w:sz w:val="18"/>
-              </w:rPr>
-              <w:t>Nama Calon Debitur</w:t>
-            </w:r>
-          </w:p>
-        </w:tc>
-        <w:tc>
-          <w:tcPr>
-            <w:tcW w:type="dxa" w:w="5760"/>
-            <w:tcMar>
-              <w:top w:w="45" w:type="dxa"/>
-              <w:bottom w:w="45" w:type="dxa"/>
-              <w:left w:w="70" w:type="dxa"/>
-              <w:right w:w="70" w:type="dxa"/>
-            </w:tcMar>
-          </w:tcPr>
-          <w:p>
-            <w:r>
-              <w:rPr>
-                <w:rFonts w:ascii="Calibri" w:hAnsi="Calibri"/>
-                <w:color w:val="28323C"/>
-                <w:sz w:val="18"/>
-              </w:rPr>
-              <w:t>PT MANDIRI JAYA ABADI (Kontraktor Tambang Nikel Morowali)</w:t>
-            </w:r>
-          </w:p>
-        </w:tc>
-      </w:tr>
-      <w:tr>
-        <w:tc>
-          <w:tcPr>
-            <w:tcW w:type="dxa" w:w="3600"/>
-            <w:tcMar>
-              <w:top w:w="45" w:type="dxa"/>
-              <w:bottom w:w="45" w:type="dxa"/>
-              <w:left w:w="70" w:type="dxa"/>
-              <w:right w:w="70" w:type="dxa"/>
-            </w:tcMar>
-            <w:shd w:fill="F8FAFC"/>
-          </w:tcPr>
-          <w:p>
-            <w:r>
-              <w:rPr>
-                <w:rFonts w:ascii="Calibri" w:hAnsi="Calibri"/>
-                <w:b/>
-                <w:color w:val="002060"/>
-                <w:sz w:val="18"/>
-              </w:rPr>
-              <w:t>Dealer Resmi LiuGong</w:t>
-            </w:r>
-          </w:p>
-        </w:tc>
-        <w:tc>
-          <w:tcPr>
-            <w:tcW w:type="dxa" w:w="5760"/>
-            <w:tcMar>
-              <w:top w:w="45" w:type="dxa"/>
-              <w:bottom w:w="45" w:type="dxa"/>
-              <w:left w:w="70" w:type="dxa"/>
-              <w:right w:w="70" w:type="dxa"/>
-            </w:tcMar>
-            <w:shd w:fill="F8FAFC"/>
-          </w:tcPr>
-          <w:p>
-            <w:r>
-              <w:rPr>
-                <w:rFonts w:ascii="Calibri" w:hAnsi="Calibri"/>
-                <w:color w:val="28323C"/>
-                <w:sz w:val="18"/>
-              </w:rPr>
-              <w:t>PT Megatama Traktor Utama (Makassar Branch)</w:t>
-            </w:r>
-          </w:p>
-        </w:tc>
-      </w:tr>
-      <w:tr>
-        <w:tc>
-          <w:tcPr>
-            <w:tcW w:type="dxa" w:w="3600"/>
-            <w:tcMar>
-              <w:top w:w="45" w:type="dxa"/>
-              <w:bottom w:w="45" w:type="dxa"/>
-              <w:left w:w="70" w:type="dxa"/>
-              <w:right w:w="70" w:type="dxa"/>
-            </w:tcMar>
-          </w:tcPr>
-          <w:p>
-            <w:r>
-              <w:rPr>
-                <w:rFonts w:ascii="Calibri" w:hAnsi="Calibri"/>
-                <w:b/>
-                <w:color w:val="002060"/>
-                <w:sz w:val="18"/>
-              </w:rPr>
-              <w:t>Aset yang Dibiayai</w:t>
-            </w:r>
-          </w:p>
-        </w:tc>
-        <w:tc>
-          <w:tcPr>
-            <w:tcW w:type="dxa" w:w="5760"/>
-            <w:tcMar>
-              <w:top w:w="45" w:type="dxa"/>
-              <w:bottom w:w="45" w:type="dxa"/>
-              <w:left w:w="70" w:type="dxa"/>
-              <w:right w:w="70" w:type="dxa"/>
-            </w:tcMar>
-          </w:tcPr>
-          <w:p>
-            <w:r>
-              <w:rPr>
-                <w:rFonts w:ascii="Calibri" w:hAnsi="Calibri"/>
-                <w:color w:val="28323C"/>
-                <w:sz w:val="18"/>
-              </w:rPr>
-              <w:t>5 Unit Hydraulic Excavator LiuGong 922E (Heavy Equipment)</w:t>
-            </w:r>
-          </w:p>
-        </w:tc>
-      </w:tr>
-      <w:tr>
-        <w:tc>
-          <w:tcPr>
-            <w:tcW w:type="dxa" w:w="3600"/>
-            <w:tcMar>
-              <w:top w:w="45" w:type="dxa"/>
-              <w:bottom w:w="45" w:type="dxa"/>
-              <w:left w:w="70" w:type="dxa"/>
-              <w:right w:w="70" w:type="dxa"/>
-            </w:tcMar>
-            <w:shd w:fill="F8FAFC"/>
-          </w:tcPr>
-          <w:p>
-            <w:r>
-              <w:rPr>
-                <w:rFonts w:ascii="Calibri" w:hAnsi="Calibri"/>
-                <w:b/>
-                <w:color w:val="002060"/>
-                <w:sz w:val="18"/>
-              </w:rPr>
-              <w:t>Harga Unit OTR (Total Asset Cost)</w:t>
-            </w:r>
-          </w:p>
-        </w:tc>
-        <w:tc>
-          <w:tcPr>
-            <w:tcW w:type="dxa" w:w="5760"/>
-            <w:tcMar>
-              <w:top w:w="45" w:type="dxa"/>
-              <w:bottom w:w="45" w:type="dxa"/>
-              <w:left w:w="70" w:type="dxa"/>
-              <w:right w:w="70" w:type="dxa"/>
-            </w:tcMar>
-            <w:shd w:fill="F8FAFC"/>
-          </w:tcPr>
-          <w:p>
-            <w:r>
-              <w:rPr>
-                <w:rFonts w:ascii="Calibri" w:hAnsi="Calibri"/>
-                <w:color w:val="28323C"/>
-                <w:sz w:val="18"/>
-              </w:rPr>
-              <w:t>Rp 7.500.000.000 (5 Unit @ Rp 1.500.000.000)</w:t>
-            </w:r>
-          </w:p>
-        </w:tc>
-      </w:tr>
-      <w:tr>
-        <w:tc>
-          <w:tcPr>
-            <w:tcW w:type="dxa" w:w="3600"/>
-            <w:tcMar>
-              <w:top w:w="45" w:type="dxa"/>
-              <w:bottom w:w="45" w:type="dxa"/>
-              <w:left w:w="70" w:type="dxa"/>
-              <w:right w:w="70" w:type="dxa"/>
-            </w:tcMar>
-          </w:tcPr>
-          <w:p>
-            <w:r>
-              <w:rPr>
-                <w:rFonts w:ascii="Calibri" w:hAnsi="Calibri"/>
-                <w:b/>
-                <w:color w:val="002060"/>
-                <w:sz w:val="18"/>
-              </w:rPr>
-              <w:t>Uang Muka / Down Payment (DP 25%)</w:t>
-            </w:r>
-          </w:p>
-        </w:tc>
-        <w:tc>
-          <w:tcPr>
-            <w:tcW w:type="dxa" w:w="5760"/>
-            <w:tcMar>
-              <w:top w:w="45" w:type="dxa"/>
-              <w:bottom w:w="45" w:type="dxa"/>
-              <w:left w:w="70" w:type="dxa"/>
-              <w:right w:w="70" w:type="dxa"/>
-            </w:tcMar>
-          </w:tcPr>
-          <w:p>
-            <w:r>
-              <w:rPr>
-                <w:rFonts w:ascii="Calibri" w:hAnsi="Calibri"/>
-                <w:color w:val="28323C"/>
-                <w:sz w:val="18"/>
-              </w:rPr>
-              <w:t>Rp 1.875.000.000 (Dibayar tunai oleh debitur ke dealer)</w:t>
-            </w:r>
-          </w:p>
-        </w:tc>
-      </w:tr>
-      <w:tr>
-        <w:tc>
-          <w:tcPr>
-            <w:tcW w:type="dxa" w:w="3600"/>
-            <w:tcMar>
-              <w:top w:w="45" w:type="dxa"/>
-              <w:bottom w:w="45" w:type="dxa"/>
-              <w:left w:w="70" w:type="dxa"/>
-              <w:right w:w="70" w:type="dxa"/>
-            </w:tcMar>
-            <w:shd w:fill="F8FAFC"/>
-          </w:tcPr>
-          <w:p>
-            <w:r>
-              <w:rPr>
-                <w:rFonts w:ascii="Calibri" w:hAnsi="Calibri"/>
-                <w:b/>
-                <w:color w:val="002060"/>
-                <w:sz w:val="18"/>
-              </w:rPr>
-              <w:t>Subsidi Bunga dari Dealer (1.5% p.a.)</w:t>
-            </w:r>
-          </w:p>
-        </w:tc>
-        <w:tc>
-          <w:tcPr>
-            <w:tcW w:type="dxa" w:w="5760"/>
-            <w:tcMar>
-              <w:top w:w="45" w:type="dxa"/>
-              <w:bottom w:w="45" w:type="dxa"/>
-              <w:left w:w="70" w:type="dxa"/>
-              <w:right w:w="70" w:type="dxa"/>
-            </w:tcMar>
-            <w:shd w:fill="F8FAFC"/>
-          </w:tcPr>
-          <w:p>
-            <w:r>
-              <w:rPr>
-                <w:rFonts w:ascii="Calibri" w:hAnsi="Calibri"/>
-                <w:color w:val="28323C"/>
-                <w:sz w:val="18"/>
-              </w:rPr>
-              <w:t>Rp 112.500.000 (Dipotongkan langsung ke pokok pembiayaan)</w:t>
-            </w:r>
-          </w:p>
-        </w:tc>
-      </w:tr>
-      <w:tr>
-        <w:tc>
-          <w:tcPr>
-            <w:tcW w:type="dxa" w:w="3600"/>
-            <w:tcMar>
-              <w:top w:w="45" w:type="dxa"/>
-              <w:bottom w:w="45" w:type="dxa"/>
-              <w:left w:w="70" w:type="dxa"/>
-              <w:right w:w="70" w:type="dxa"/>
-            </w:tcMar>
-          </w:tcPr>
-          <w:p>
-            <w:r>
-              <w:rPr>
-                <w:rFonts w:ascii="Calibri" w:hAnsi="Calibri"/>
-                <w:b/>
-                <w:color w:val="002060"/>
-                <w:sz w:val="18"/>
-              </w:rPr>
-              <w:t>Pokok Pembiayaan Bersih (Net Principal)</w:t>
-            </w:r>
-          </w:p>
-        </w:tc>
-        <w:tc>
-          <w:tcPr>
-            <w:tcW w:type="dxa" w:w="5760"/>
-            <w:tcMar>
-              <w:top w:w="45" w:type="dxa"/>
-              <w:bottom w:w="45" w:type="dxa"/>
-              <w:left w:w="70" w:type="dxa"/>
-              <w:right w:w="70" w:type="dxa"/>
-            </w:tcMar>
-          </w:tcPr>
-          <w:p>
-            <w:r>
-              <w:rPr>
-                <w:rFonts w:ascii="Calibri" w:hAnsi="Calibri"/>
-                <w:b/>
-                <w:color w:val="ED7D31"/>
-                <w:sz w:val="18"/>
-              </w:rPr>
-              <w:t>Rp 5.512.500.000</w:t>
-            </w:r>
-          </w:p>
-        </w:tc>
-      </w:tr>
-      <w:tr>
-        <w:tc>
-          <w:tcPr>
-            <w:tcW w:type="dxa" w:w="3600"/>
-            <w:tcMar>
-              <w:top w:w="45" w:type="dxa"/>
-              <w:bottom w:w="45" w:type="dxa"/>
-              <w:left w:w="70" w:type="dxa"/>
-              <w:right w:w="70" w:type="dxa"/>
-            </w:tcMar>
-            <w:shd w:fill="F8FAFC"/>
-          </w:tcPr>
-          <w:p>
-            <w:r>
-              <w:rPr>
-                <w:rFonts w:ascii="Calibri" w:hAnsi="Calibri"/>
-                <w:b/>
-                <w:color w:val="002060"/>
-                <w:sz w:val="18"/>
-              </w:rPr>
-              <w:t>Suku Bunga &amp; Metode Perhitungan</w:t>
-            </w:r>
-          </w:p>
-        </w:tc>
-        <w:tc>
-          <w:tcPr>
-            <w:tcW w:type="dxa" w:w="5760"/>
-            <w:tcMar>
-              <w:top w:w="45" w:type="dxa"/>
-              <w:bottom w:w="45" w:type="dxa"/>
-              <w:left w:w="70" w:type="dxa"/>
-              <w:right w:w="70" w:type="dxa"/>
-            </w:tcMar>
-            <w:shd w:fill="F8FAFC"/>
-          </w:tcPr>
-          <w:p>
-            <w:r>
-              <w:rPr>
-                <w:rFonts w:ascii="Calibri" w:hAnsi="Calibri"/>
-                <w:color w:val="28323C"/>
-                <w:sz w:val="18"/>
-              </w:rPr>
-              <w:t>10.50% p.a. Efektif Menurun (Reducing Balance Annuity)</w:t>
-            </w:r>
-          </w:p>
-        </w:tc>
-      </w:tr>
-      <w:tr>
-        <w:tc>
-          <w:tcPr>
-            <w:tcW w:type="dxa" w:w="3600"/>
-            <w:tcMar>
-              <w:top w:w="45" w:type="dxa"/>
-              <w:bottom w:w="45" w:type="dxa"/>
-              <w:left w:w="70" w:type="dxa"/>
-              <w:right w:w="70" w:type="dxa"/>
-            </w:tcMar>
-          </w:tcPr>
-          <w:p>
-            <w:r>
-              <w:rPr>
-                <w:rFonts w:ascii="Calibri" w:hAnsi="Calibri"/>
-                <w:b/>
-                <w:color w:val="002060"/>
-                <w:sz w:val="18"/>
-              </w:rPr>
-              <w:t>Tenor Pembiayaan</w:t>
-            </w:r>
-          </w:p>
-        </w:tc>
-        <w:tc>
-          <w:tcPr>
-            <w:tcW w:type="dxa" w:w="5760"/>
-            <w:tcMar>
-              <w:top w:w="45" w:type="dxa"/>
-              <w:bottom w:w="45" w:type="dxa"/>
-              <w:left w:w="70" w:type="dxa"/>
-              <w:right w:w="70" w:type="dxa"/>
-            </w:tcMar>
-          </w:tcPr>
-          <w:p>
-            <w:r>
-              <w:rPr>
-                <w:rFonts w:ascii="Calibri" w:hAnsi="Calibri"/>
-                <w:color w:val="28323C"/>
-                <w:sz w:val="18"/>
-              </w:rPr>
-              <w:t>36 Bulan (3 Tahun) · Skema In Arrear</w:t>
-            </w:r>
-          </w:p>
-        </w:tc>
-      </w:tr>
-      <w:tr>
-        <w:tc>
-          <w:tcPr>
-            <w:tcW w:type="dxa" w:w="3600"/>
-            <w:tcMar>
-              <w:top w:w="45" w:type="dxa"/>
-              <w:bottom w:w="45" w:type="dxa"/>
-              <w:left w:w="70" w:type="dxa"/>
-              <w:right w:w="70" w:type="dxa"/>
-            </w:tcMar>
-            <w:shd w:fill="F8FAFC"/>
-          </w:tcPr>
-          <w:p>
-            <w:r>
-              <w:rPr>
-                <w:rFonts w:ascii="Calibri" w:hAnsi="Calibri"/>
-                <w:b/>
-                <w:color w:val="002060"/>
-                <w:sz w:val="18"/>
-              </w:rPr>
-              <w:t>Angsuran Bulanan Resmi (Monthly Installment)</w:t>
-            </w:r>
-          </w:p>
-        </w:tc>
-        <w:tc>
-          <w:tcPr>
-            <w:tcW w:type="dxa" w:w="5760"/>
-            <w:tcMar>
-              <w:top w:w="45" w:type="dxa"/>
-              <w:bottom w:w="45" w:type="dxa"/>
-              <w:left w:w="70" w:type="dxa"/>
-              <w:right w:w="70" w:type="dxa"/>
-            </w:tcMar>
-            <w:shd w:fill="F8FAFC"/>
-          </w:tcPr>
-          <w:p>
-            <w:r>
-              <w:rPr>
-                <w:rFonts w:ascii="Calibri" w:hAnsi="Calibri"/>
-                <w:b/>
-                <w:color w:val="ED7D31"/>
-                <w:sz w:val="18"/>
-              </w:rPr>
-              <w:t>Rp 179.231.425 / bulan</w:t>
-            </w:r>
-          </w:p>
-        </w:tc>
-      </w:tr>
-      <w:tr>
-        <w:tc>
-          <w:tcPr>
-            <w:tcW w:type="dxa" w:w="3600"/>
-            <w:tcMar>
-              <w:top w:w="45" w:type="dxa"/>
-              <w:bottom w:w="45" w:type="dxa"/>
-              <w:left w:w="70" w:type="dxa"/>
-              <w:right w:w="70" w:type="dxa"/>
-            </w:tcMar>
-          </w:tcPr>
-          <w:p>
-            <w:r>
-              <w:rPr>
-                <w:rFonts w:ascii="Calibri" w:hAnsi="Calibri"/>
-                <w:b/>
-                <w:color w:val="002060"/>
-                <w:sz w:val="18"/>
-              </w:rPr>
-              <w:t>Hasil Evaluasi Rasio &amp; Putusan Kredit</w:t>
-            </w:r>
-          </w:p>
-        </w:tc>
-        <w:tc>
-          <w:tcPr>
-            <w:tcW w:type="dxa" w:w="5760"/>
-            <w:tcMar>
-              <w:top w:w="45" w:type="dxa"/>
-              <w:bottom w:w="45" w:type="dxa"/>
-              <w:left w:w="70" w:type="dxa"/>
-              <w:right w:w="70" w:type="dxa"/>
-            </w:tcMar>
-          </w:tcPr>
-          <w:p>
-            <w:r>
-              <w:rPr>
-                <w:rFonts w:ascii="Calibri" w:hAnsi="Calibri"/>
-                <w:b/>
-                <w:color w:val="ED7D31"/>
-                <w:sz w:val="18"/>
-              </w:rPr>
-              <w:t>DSCR: 2.70x | Pefindo Score: 785 (Risk Grade 2) | STATUS: APPROVED</w:t>
-            </w:r>
-          </w:p>
-        </w:tc>
-      </w:tr>
-    </w:tbl>
-    <w:p>
-      <w:pPr>
-        <w:spacing w:before="160" w:after="60"/>
-        <w:jc w:val="center"/>
-      </w:pPr>
-      <w:r>
-        <w:drawing>
-          <wp:inline xmlns:a="http://schemas.openxmlformats.org/drawingml/2006/main" xmlns:pic="http://schemas.openxmlformats.org/drawingml/2006/picture">
-            <wp:extent cx="5669280" cy="3543300"/>
-            <wp:docPr id="12" name="Picture 12"/>
-            <wp:cNvGraphicFramePr>
-              <a:graphicFrameLocks noChangeAspect="1"/>
-            </wp:cNvGraphicFramePr>
-            <a:graphic>
-              <a:graphicData uri="http://schemas.openxmlformats.org/drawingml/2006/picture">
-                <pic:pic>
-                  <pic:nvPicPr>
-                    <pic:cNvPr id="0" name="tab_4_business_and_banks.png"/>
-                    <pic:cNvPicPr/>
-                  </pic:nvPicPr>
-                  <pic:blipFill>
-                    <a:blip r:embed="rId22"/>
-                    <a:stretch>
-                      <a:fillRect/>
-                    </a:stretch>
-                  </pic:blipFill>
-                  <pic:spPr>
-                    <a:xfrm>
-                      <a:off x="0" y="0"/>
-                      <a:ext cx="5669280" cy="3543300"/>
-                    </a:xfrm>
-                    <a:prstGeom prst="rect"/>
-                  </pic:spPr>
-                </pic:pic>
-              </a:graphicData>
-            </a:graphic>
-          </wp:inline>
-        </w:drawing>
-      </w:r>
-    </w:p>
-    <w:p>
-      <w:pPr>
-        <w:spacing w:after="200"/>
-        <w:jc w:val="center"/>
-      </w:pPr>
-      <w:r>
-        <w:rPr>
-          <w:rFonts w:ascii="Calibri" w:hAnsi="Calibri"/>
-          <w:i/>
-          <w:color w:val="646E7D"/>
-          <w:sz w:val="18"/>
-        </w:rPr>
-        <w:t>Gambar: Proposal Pembiayaan, Kalkulator Simulasi Angsuran Anuitas &amp; Fasilitas Perbankan (Live System)</w:t>
-      </w:r>
-    </w:p>
-    <w:p>
-      <w:pPr>
-        <w:spacing w:before="280" w:after="80"/>
-      </w:pPr>
-      <w:r>
-        <w:rPr>
-          <w:rFonts w:ascii="Calibri" w:hAnsi="Calibri"/>
-          <w:b/>
-          <w:color w:val="002060"/>
-          <w:sz w:val="30"/>
-        </w:rPr>
-        <w:t>BAB 7: TATA KELOLA &amp; MATRIKS WEWENANG PUTUSAN KOMITE KREDIT</w:t>
-      </w:r>
-    </w:p>
-    <w:p>
-      <w:pPr>
-        <w:spacing w:line="276" w:lineRule="auto" w:after="120"/>
-      </w:pPr>
-      <w:r>
-        <w:t>Untuk menjaga independensi dan kepatuhan terhadap prinsip Four-Eyes Principle OJK, sistem membagi kewenangan persetujuan kredit secara berjenjang berdasarkan plafon pembiayaan (Ticket Size):</w:t>
-        <w:br/>
-        <w:t>• Tier 1 (Plafon s/d Rp 2.5 Miliar): Diputuskan oleh Branch Manager bersama Head of Credit Analyst Cabang.</w:t>
-        <w:br/>
-        <w:t>• Tier 2 (Plafon Rp 2.5 Miliar – Rp 10 Miliar): Diputuskan oleh Komite Kredit Head Office (Head of CA, Head of Legal, Marketing Director).</w:t>
-        <w:br/>
-        <w:t>• Tier 3 (Plafon &gt; Rp 10 Miliar atau Debitur Khusus): Wajib diputuskan oleh Sidang Komite Kredit Lengkap yang dipimpin langsung oleh Bapak Presiden Direktur.</w:t>
-      </w:r>
-    </w:p>
-    <w:p>
-      <w:pPr>
-        <w:spacing w:before="160" w:after="60"/>
-        <w:jc w:val="center"/>
-      </w:pPr>
-      <w:r>
-        <w:drawing>
-          <wp:inline xmlns:a="http://schemas.openxmlformats.org/drawingml/2006/main" xmlns:pic="http://schemas.openxmlformats.org/drawingml/2006/picture">
-            <wp:extent cx="5669280" cy="3543300"/>
-            <wp:docPr id="13" name="Picture 13"/>
-            <wp:cNvGraphicFramePr>
-              <a:graphicFrameLocks noChangeAspect="1"/>
-            </wp:cNvGraphicFramePr>
-            <a:graphic>
-              <a:graphicData uri="http://schemas.openxmlformats.org/drawingml/2006/picture">
-                <pic:pic>
-                  <pic:nvPicPr>
-                    <pic:cNvPr id="0" name="committee_review_actions.png"/>
-                    <pic:cNvPicPr/>
-                  </pic:nvPicPr>
-                  <pic:blipFill>
-                    <a:blip r:embed="rId23"/>
-                    <a:stretch>
-                      <a:fillRect/>
-                    </a:stretch>
-                  </pic:blipFill>
-                  <pic:spPr>
-                    <a:xfrm>
-                      <a:off x="0" y="0"/>
-                      <a:ext cx="5669280" cy="3543300"/>
-                    </a:xfrm>
-                    <a:prstGeom prst="rect"/>
-                  </pic:spPr>
-                </pic:pic>
-              </a:graphicData>
-            </a:graphic>
-          </wp:inline>
-        </w:drawing>
-      </w:r>
-    </w:p>
-    <w:p>
-      <w:pPr>
-        <w:spacing w:after="200"/>
-        <w:jc w:val="center"/>
-      </w:pPr>
-      <w:r>
-        <w:rPr>
-          <w:rFonts w:ascii="Calibri" w:hAnsi="Calibri"/>
-          <w:i/>
-          <w:color w:val="646E7D"/>
-          <w:sz w:val="18"/>
-        </w:rPr>
-        <w:t>Gambar: Layar Persetujuan Komite Kredit dengan Tombol Aksi Mutlak: Approve / Reject / Return (Live System)</w:t>
-      </w:r>
-    </w:p>
-    <w:p>
-      <w:pPr>
-        <w:spacing w:before="280" w:after="80"/>
-      </w:pPr>
-      <w:r>
-        <w:rPr>
-          <w:rFonts w:ascii="Calibri" w:hAnsi="Calibri"/>
-          <w:b/>
-          <w:color w:val="002060"/>
-          <w:sz w:val="30"/>
-        </w:rPr>
-        <w:t>BAB 8: TARGET KPI OPERASIONAL, ROI &amp; LEMBAR PENGESAHAN</w:t>
-      </w:r>
-    </w:p>
-    <w:tbl>
-      <w:tblPr>
-        <w:tblW w:type="auto" w:w="0"/>
-        <w:jc w:val="center"/>
-        <w:tblLayout w:type="fixed"/>
-        <w:tblLook w:firstColumn="1" w:firstRow="1" w:lastColumn="0" w:lastRow="0" w:noHBand="0" w:noVBand="1" w:val="04A0"/>
-        <w:tblBorders>
-          <w:top w:val="single" w:sz="4" w:space="0" w:color="D3D3D3"/>
-          <w:bottom w:val="single" w:sz="4" w:space="0" w:color="D3D3D3"/>
-          <w:insideH w:val="single" w:sz="4" w:space="0" w:color="D3D3D3"/>
-          <w:insideV w:val="none"/>
-          <w:left w:val="none"/>
-          <w:right w:val="none"/>
-        </w:tblBorders>
-      </w:tblPr>
-      <w:tblGrid>
-        <w:gridCol w:w="3202"/>
-        <w:gridCol w:w="3202"/>
-        <w:gridCol w:w="3202"/>
-      </w:tblGrid>
-      <w:tr>
-        <w:tc>
-          <w:tcPr>
-            <w:tcW w:type="dxa" w:w="3600"/>
+            <w:tcW w:type="dxa" w:w="4608"/>
             <w:shd w:fill="002060"/>
             <w:tcMar>
-              <w:top w:w="60" w:type="dxa"/>
-              <w:bottom w:w="60" w:type="dxa"/>
+              <w:top w:w="50" w:type="dxa"/>
+              <w:bottom w:w="50" w:type="dxa"/>
               <w:left w:w="80" w:type="dxa"/>
               <w:right w:w="80" w:type="dxa"/>
             </w:tcMar>
@@ -2574,17 +1763,17 @@
                 <w:color w:val="FFFFFF"/>
                 <w:sz w:val="19"/>
               </w:rPr>
-              <w:t>Indikator Kinerja Utama (KPI)</w:t>
+              <w:t>Diajukan Oleh:</w:t>
             </w:r>
           </w:p>
         </w:tc>
         <w:tc>
           <w:tcPr>
-            <w:tcW w:type="dxa" w:w="2592"/>
+            <w:tcW w:type="dxa" w:w="4608"/>
             <w:shd w:fill="002060"/>
             <w:tcMar>
-              <w:top w:w="60" w:type="dxa"/>
-              <w:bottom w:w="60" w:type="dxa"/>
+              <w:top w:w="50" w:type="dxa"/>
+              <w:bottom w:w="50" w:type="dxa"/>
               <w:left w:w="80" w:type="dxa"/>
               <w:right w:w="80" w:type="dxa"/>
             </w:tcMar>
@@ -2597,30 +1786,7 @@
                 <w:color w:val="FFFFFF"/>
                 <w:sz w:val="19"/>
               </w:rPr>
-              <w:t>Sebelum Sistem Baru</w:t>
-            </w:r>
-          </w:p>
-        </w:tc>
-        <w:tc>
-          <w:tcPr>
-            <w:tcW w:type="dxa" w:w="3168"/>
-            <w:shd w:fill="002060"/>
-            <w:tcMar>
-              <w:top w:w="60" w:type="dxa"/>
-              <w:bottom w:w="60" w:type="dxa"/>
-              <w:left w:w="80" w:type="dxa"/>
-              <w:right w:w="80" w:type="dxa"/>
-            </w:tcMar>
-          </w:tcPr>
-          <w:p>
-            <w:r>
-              <w:rPr>
-                <w:rFonts w:ascii="Calibri" w:hAnsi="Calibri"/>
-                <w:b/>
-                <w:color w:val="FFFFFF"/>
-                <w:sz w:val="19"/>
-              </w:rPr>
-              <w:t>Target Sistem LOS-CRM</w:t>
+              <w:t>Disetujui Oleh:</w:t>
             </w:r>
           </w:p>
         </w:tc>
@@ -2628,491 +1794,78 @@
       <w:tr>
         <w:tc>
           <w:tcPr>
-            <w:tcW w:type="dxa" w:w="3600"/>
+            <w:tcW w:type="dxa" w:w="4608"/>
             <w:tcMar>
-              <w:top w:w="50" w:type="dxa"/>
-              <w:bottom w:w="50" w:type="dxa"/>
-              <w:left w:w="70" w:type="dxa"/>
-              <w:right w:w="70" w:type="dxa"/>
+              <w:top w:w="100" w:type="dxa"/>
+              <w:bottom w:w="100" w:type="dxa"/>
+              <w:left w:w="80" w:type="dxa"/>
+              <w:right w:w="80" w:type="dxa"/>
             </w:tcMar>
+            <w:shd w:fill="FFFFFF"/>
           </w:tcPr>
           <w:p>
+            <w:pPr>
+              <w:spacing w:line="288" w:lineRule="auto"/>
+            </w:pPr>
             <w:r>
               <w:rPr>
                 <w:rFonts w:ascii="Calibri" w:hAnsi="Calibri"/>
-                <w:b/>
                 <w:color w:val="002060"/>
-                <w:sz w:val="17"/>
+                <w:sz w:val="19"/>
               </w:rPr>
-              <w:t>Turnaround Time (TAT) Siklus Kredit</w:t>
+              <w:t>Latom</w:t>
+              <w:br/>
+              <w:t>Lead System Owner &amp; AI CTO</w:t>
+              <w:br/>
+              <w:t>PT LiuGong Finance Indonesia</w:t>
+              <w:br/>
+              <w:br/>
+              <w:t>Tanggal: 19 Oktober 2026</w:t>
             </w:r>
           </w:p>
         </w:tc>
         <w:tc>
           <w:tcPr>
-            <w:tcW w:type="dxa" w:w="2592"/>
+            <w:tcW w:type="dxa" w:w="4608"/>
             <w:tcMar>
-              <w:top w:w="50" w:type="dxa"/>
-              <w:bottom w:w="50" w:type="dxa"/>
-              <w:left w:w="70" w:type="dxa"/>
-              <w:right w:w="70" w:type="dxa"/>
+              <w:top w:w="100" w:type="dxa"/>
+              <w:bottom w:w="100" w:type="dxa"/>
+              <w:left w:w="80" w:type="dxa"/>
+              <w:right w:w="80" w:type="dxa"/>
             </w:tcMar>
-          </w:tcPr>
-          <w:p>
-            <w:r>
-              <w:rPr>
-                <w:rFonts w:ascii="Calibri" w:hAnsi="Calibri"/>
-                <w:sz w:val="17"/>
-              </w:rPr>
-              <w:t>10 – 14 Hari Kerja</w:t>
-            </w:r>
-          </w:p>
-        </w:tc>
-        <w:tc>
-          <w:tcPr>
-            <w:tcW w:type="dxa" w:w="3168"/>
-            <w:tcMar>
-              <w:top w:w="50" w:type="dxa"/>
-              <w:bottom w:w="50" w:type="dxa"/>
-              <w:left w:w="70" w:type="dxa"/>
-              <w:right w:w="70" w:type="dxa"/>
-            </w:tcMar>
-          </w:tcPr>
-          <w:p>
-            <w:r>
-              <w:rPr>
-                <w:rFonts w:ascii="Calibri" w:hAnsi="Calibri"/>
-                <w:b/>
-                <w:color w:val="ED7D31"/>
-                <w:sz w:val="17"/>
-              </w:rPr>
-              <w:t>Maksimal 48 Jam (2 Hari)</w:t>
-            </w:r>
-          </w:p>
-        </w:tc>
-      </w:tr>
-      <w:tr>
-        <w:tc>
-          <w:tcPr>
-            <w:tcW w:type="dxa" w:w="3600"/>
-            <w:tcMar>
-              <w:top w:w="50" w:type="dxa"/>
-              <w:bottom w:w="50" w:type="dxa"/>
-              <w:left w:w="70" w:type="dxa"/>
-              <w:right w:w="70" w:type="dxa"/>
-            </w:tcMar>
-            <w:shd w:fill="F8FAFC"/>
-          </w:tcPr>
-          <w:p>
-            <w:r>
-              <w:rPr>
-                <w:rFonts w:ascii="Calibri" w:hAnsi="Calibri"/>
-                <w:b/>
-                <w:color w:val="002060"/>
-                <w:sz w:val="17"/>
-              </w:rPr>
-              <w:t>Waktu Onboarding &amp; Input Data Nasabah</w:t>
-            </w:r>
-          </w:p>
-        </w:tc>
-        <w:tc>
-          <w:tcPr>
-            <w:tcW w:type="dxa" w:w="2592"/>
-            <w:tcMar>
-              <w:top w:w="50" w:type="dxa"/>
-              <w:bottom w:w="50" w:type="dxa"/>
-              <w:left w:w="70" w:type="dxa"/>
-              <w:right w:w="70" w:type="dxa"/>
-            </w:tcMar>
-            <w:shd w:fill="F8FAFC"/>
-          </w:tcPr>
-          <w:p>
-            <w:r>
-              <w:rPr>
-                <w:rFonts w:ascii="Calibri" w:hAnsi="Calibri"/>
-                <w:sz w:val="17"/>
-              </w:rPr>
-              <w:t>4 – 6 Jam</w:t>
-            </w:r>
-          </w:p>
-        </w:tc>
-        <w:tc>
-          <w:tcPr>
-            <w:tcW w:type="dxa" w:w="3168"/>
-            <w:tcMar>
-              <w:top w:w="50" w:type="dxa"/>
-              <w:bottom w:w="50" w:type="dxa"/>
-              <w:left w:w="70" w:type="dxa"/>
-              <w:right w:w="70" w:type="dxa"/>
-            </w:tcMar>
-            <w:shd w:fill="F8FAFC"/>
-          </w:tcPr>
-          <w:p>
-            <w:r>
-              <w:rPr>
-                <w:rFonts w:ascii="Calibri" w:hAnsi="Calibri"/>
-                <w:b/>
-                <w:color w:val="ED7D31"/>
-                <w:sz w:val="17"/>
-              </w:rPr>
-              <w:t>≤ 30 Menit (Multi-Doc OCR)</w:t>
-            </w:r>
-          </w:p>
-        </w:tc>
-      </w:tr>
-      <w:tr>
-        <w:tc>
-          <w:tcPr>
-            <w:tcW w:type="dxa" w:w="3600"/>
-            <w:tcMar>
-              <w:top w:w="50" w:type="dxa"/>
-              <w:bottom w:w="50" w:type="dxa"/>
-              <w:left w:w="70" w:type="dxa"/>
-              <w:right w:w="70" w:type="dxa"/>
-            </w:tcMar>
-          </w:tcPr>
-          <w:p>
-            <w:r>
-              <w:rPr>
-                <w:rFonts w:ascii="Calibri" w:hAnsi="Calibri"/>
-                <w:b/>
-                <w:color w:val="002060"/>
-                <w:sz w:val="17"/>
-              </w:rPr>
-              <w:t>Penarikan Laporan Kredit Pefindo</w:t>
-            </w:r>
-          </w:p>
-        </w:tc>
-        <w:tc>
-          <w:tcPr>
-            <w:tcW w:type="dxa" w:w="2592"/>
-            <w:tcMar>
-              <w:top w:w="50" w:type="dxa"/>
-              <w:bottom w:w="50" w:type="dxa"/>
-              <w:left w:w="70" w:type="dxa"/>
-              <w:right w:w="70" w:type="dxa"/>
-            </w:tcMar>
-          </w:tcPr>
-          <w:p>
-            <w:r>
-              <w:rPr>
-                <w:rFonts w:ascii="Calibri" w:hAnsi="Calibri"/>
-                <w:sz w:val="17"/>
-              </w:rPr>
-              <w:t>1 – 2 Hari Kerja</w:t>
-            </w:r>
-          </w:p>
-        </w:tc>
-        <w:tc>
-          <w:tcPr>
-            <w:tcW w:type="dxa" w:w="3168"/>
-            <w:tcMar>
-              <w:top w:w="50" w:type="dxa"/>
-              <w:bottom w:w="50" w:type="dxa"/>
-              <w:left w:w="70" w:type="dxa"/>
-              <w:right w:w="70" w:type="dxa"/>
-            </w:tcMar>
-          </w:tcPr>
-          <w:p>
-            <w:r>
-              <w:rPr>
-                <w:rFonts w:ascii="Calibri" w:hAnsi="Calibri"/>
-                <w:b/>
-                <w:color w:val="ED7D31"/>
-                <w:sz w:val="17"/>
-              </w:rPr>
-              <w:t>Real-Time / Hitungan Detik</w:t>
-            </w:r>
-          </w:p>
-        </w:tc>
-      </w:tr>
-      <w:tr>
-        <w:tc>
-          <w:tcPr>
-            <w:tcW w:type="dxa" w:w="3600"/>
-            <w:tcMar>
-              <w:top w:w="50" w:type="dxa"/>
-              <w:bottom w:w="50" w:type="dxa"/>
-              <w:left w:w="70" w:type="dxa"/>
-              <w:right w:w="70" w:type="dxa"/>
-            </w:tcMar>
-            <w:shd w:fill="F8FAFC"/>
-          </w:tcPr>
-          <w:p>
-            <w:r>
-              <w:rPr>
-                <w:rFonts w:ascii="Calibri" w:hAnsi="Calibri"/>
-                <w:b/>
-                <w:color w:val="002060"/>
-                <w:sz w:val="17"/>
-              </w:rPr>
-              <w:t>Tingkat Retur Berkas (Defect Rate)</w:t>
-            </w:r>
-          </w:p>
-        </w:tc>
-        <w:tc>
-          <w:tcPr>
-            <w:tcW w:type="dxa" w:w="2592"/>
-            <w:tcMar>
-              <w:top w:w="50" w:type="dxa"/>
-              <w:bottom w:w="50" w:type="dxa"/>
-              <w:left w:w="70" w:type="dxa"/>
-              <w:right w:w="70" w:type="dxa"/>
-            </w:tcMar>
-            <w:shd w:fill="F8FAFC"/>
-          </w:tcPr>
-          <w:p>
-            <w:r>
-              <w:rPr>
-                <w:rFonts w:ascii="Calibri" w:hAnsi="Calibri"/>
-                <w:sz w:val="17"/>
-              </w:rPr>
-              <w:t>35% – 40% aplikasi</w:t>
-            </w:r>
-          </w:p>
-        </w:tc>
-        <w:tc>
-          <w:tcPr>
-            <w:tcW w:type="dxa" w:w="3168"/>
-            <w:tcMar>
-              <w:top w:w="50" w:type="dxa"/>
-              <w:bottom w:w="50" w:type="dxa"/>
-              <w:left w:w="70" w:type="dxa"/>
-              <w:right w:w="70" w:type="dxa"/>
-            </w:tcMar>
-            <w:shd w:fill="F8FAFC"/>
-          </w:tcPr>
-          <w:p>
-            <w:r>
-              <w:rPr>
-                <w:rFonts w:ascii="Calibri" w:hAnsi="Calibri"/>
-                <w:b/>
-                <w:color w:val="ED7D31"/>
-                <w:sz w:val="17"/>
-              </w:rPr>
-              <w:t>≤ 3% permohonan</w:t>
-            </w:r>
-          </w:p>
-        </w:tc>
-      </w:tr>
-      <w:tr>
-        <w:tc>
-          <w:tcPr>
-            <w:tcW w:type="dxa" w:w="3600"/>
-            <w:tcMar>
-              <w:top w:w="50" w:type="dxa"/>
-              <w:bottom w:w="50" w:type="dxa"/>
-              <w:left w:w="70" w:type="dxa"/>
-              <w:right w:w="70" w:type="dxa"/>
-            </w:tcMar>
-          </w:tcPr>
-          <w:p>
-            <w:r>
-              <w:rPr>
-                <w:rFonts w:ascii="Calibri" w:hAnsi="Calibri"/>
-                <w:b/>
-                <w:color w:val="002060"/>
-                <w:sz w:val="17"/>
-              </w:rPr>
-              <w:t>Akurasi Laporan Keuangan &amp; Saham</w:t>
-            </w:r>
-          </w:p>
-        </w:tc>
-        <w:tc>
-          <w:tcPr>
-            <w:tcW w:type="dxa" w:w="2592"/>
-            <w:tcMar>
-              <w:top w:w="50" w:type="dxa"/>
-              <w:bottom w:w="50" w:type="dxa"/>
-              <w:left w:w="70" w:type="dxa"/>
-              <w:right w:w="70" w:type="dxa"/>
-            </w:tcMar>
-          </w:tcPr>
-          <w:p>
-            <w:r>
-              <w:rPr>
-                <w:rFonts w:ascii="Calibri" w:hAnsi="Calibri"/>
-                <w:sz w:val="17"/>
-              </w:rPr>
-              <w:t>Rentan salah hitung</w:t>
-            </w:r>
-          </w:p>
-        </w:tc>
-        <w:tc>
-          <w:tcPr>
-            <w:tcW w:type="dxa" w:w="3168"/>
-            <w:tcMar>
-              <w:top w:w="50" w:type="dxa"/>
-              <w:bottom w:w="50" w:type="dxa"/>
-              <w:left w:w="70" w:type="dxa"/>
-              <w:right w:w="70" w:type="dxa"/>
-            </w:tcMar>
-          </w:tcPr>
-          <w:p>
-            <w:r>
-              <w:rPr>
-                <w:rFonts w:ascii="Calibri" w:hAnsi="Calibri"/>
-                <w:b/>
-                <w:color w:val="ED7D31"/>
-                <w:sz w:val="17"/>
-              </w:rPr>
-              <w:t>100% Zero-Error Terverifikasi</w:t>
-            </w:r>
-          </w:p>
-        </w:tc>
-      </w:tr>
-    </w:tbl>
-    <w:p>
-      <w:pPr>
-        <w:spacing w:after="400"/>
-      </w:pPr>
-    </w:p>
-    <w:tbl>
-      <w:tblPr>
-        <w:tblW w:type="auto" w:w="0"/>
-        <w:jc w:val="center"/>
-        <w:tblLayout w:type="fixed"/>
-        <w:tblLook w:firstColumn="1" w:firstRow="1" w:lastColumn="0" w:lastRow="0" w:noHBand="0" w:noVBand="1" w:val="04A0"/>
-        <w:tblBorders>
-          <w:top w:val="single" w:sz="4" w:space="0" w:color="FFFFFF"/>
-          <w:bottom w:val="single" w:sz="4" w:space="0" w:color="FFFFFF"/>
-          <w:insideH w:val="single" w:sz="4" w:space="0" w:color="FFFFFF"/>
-          <w:insideV w:val="none"/>
-          <w:left w:val="none"/>
-          <w:right w:val="none"/>
-        </w:tblBorders>
-      </w:tblPr>
-      <w:tblGrid>
-        <w:gridCol w:w="4802"/>
-        <w:gridCol w:w="4802"/>
-      </w:tblGrid>
-      <w:tr>
-        <w:tc>
-          <w:tcPr>
-            <w:tcW w:type="dxa" w:w="4802"/>
+            <w:shd w:fill="FFFFFF"/>
           </w:tcPr>
           <w:p>
             <w:pPr>
-              <w:jc w:val="center"/>
+              <w:spacing w:line="288" w:lineRule="auto"/>
             </w:pPr>
             <w:r>
               <w:rPr>
                 <w:rFonts w:ascii="Calibri" w:hAnsi="Calibri"/>
+                <w:color w:val="002060"/>
                 <w:sz w:val="19"/>
               </w:rPr>
-              <w:t>Disiapkan &amp; Diajukan Oleh:</w:t>
+              <w:t>Presiden Direktur</w:t>
               <w:br/>
-              <w:t>Lead System Owner &amp; Technical In-Charge</w:t>
+              <w:t>Chief Executive Officer</w:t>
+              <w:br/>
+              <w:t>PT LiuGong Finance Indonesia</w:t>
               <w:br/>
               <w:br/>
-              <w:br/>
-              <w:br/>
-              <w:br/>
-              <w:br/>
-            </w:r>
-            <w:r>
-              <w:rPr>
-                <w:rFonts w:ascii="Calibri" w:hAnsi="Calibri"/>
-                <w:b/>
-                <w:color w:val="002060"/>
-                <w:sz w:val="21"/>
-              </w:rPr>
-              <w:t>LATOM</w:t>
-              <w:br/>
-            </w:r>
-            <w:r>
-              <w:t>PT LiuGong Finance Indonesia</w:t>
-            </w:r>
-          </w:p>
-        </w:tc>
-        <w:tc>
-          <w:tcPr>
-            <w:tcW w:type="dxa" w:w="4802"/>
-          </w:tcPr>
-          <w:p>
-            <w:pPr>
-              <w:jc w:val="center"/>
-            </w:pPr>
-            <w:r>
-              <w:rPr>
-                <w:rFonts w:ascii="Calibri" w:hAnsi="Calibri"/>
-                <w:sz w:val="19"/>
-              </w:rPr>
-              <w:t>Ditelaah &amp; Disetujui Oleh:</w:t>
-              <w:br/>
-              <w:t>Presiden Direktur</w:t>
-              <w:br/>
-              <w:br/>
-              <w:br/>
-              <w:br/>
-              <w:br/>
-              <w:br/>
-            </w:r>
-            <w:r>
-              <w:rPr>
-                <w:rFonts w:ascii="Calibri" w:hAnsi="Calibri"/>
-                <w:b/>
-                <w:color w:val="002060"/>
-                <w:sz w:val="21"/>
-              </w:rPr>
-              <w:t>PRESIDEN DIREKTUR</w:t>
-              <w:br/>
-            </w:r>
-            <w:r>
-              <w:t>PT LiuGong Finance Indonesia</w:t>
+              <w:t>Tanggal: .............................</w:t>
             </w:r>
           </w:p>
         </w:tc>
       </w:tr>
     </w:tbl>
     <w:sectPr>
-      <w:headerReference w:type="default" r:id="rId9"/>
-      <w:footerReference w:type="default" r:id="rId10"/>
-      <w:pgSz w:w="11909" w:h="16834"/>
-      <w:pgMar w:top="1152" w:right="1152" w:bottom="1152" w:left="1152" w:header="720" w:footer="720" w:gutter="0"/>
+      <w:pgSz w:w="12240" w:h="15840"/>
+      <w:pgMar w:top="1152" w:right="1224" w:bottom="1152" w:left="1224" w:header="720" w:footer="720" w:gutter="0"/>
       <w:cols w:space="720"/>
       <w:docGrid w:linePitch="360"/>
     </w:sectPr>
   </w:body>
 </w:document>
-</file>
-
-<file path=word/footer1.xml><?xml version="1.0" encoding="utf-8"?>
-<w:ftr xmlns:m="http://schemas.openxmlformats.org/officeDocument/2006/math" xmlns:mc="http://schemas.openxmlformats.org/markup-compatibility/2006" xmlns:mo="http://schemas.microsoft.com/office/mac/office/2008/main" xmlns:mv="urn:schemas-microsoft-com:mac:vml" xmlns:o="urn:schemas-microsoft-com:office:office" xmlns:r="http://schemas.openxmlformats.org/officeDocument/2006/relationships" xmlns:v="urn:schemas-microsoft-com:vml" xmlns:w10="urn:schemas-microsoft-com:office:word" xmlns:w14="http://schemas.microsoft.com/office/word/2010/wordml" xmlns:w="http://schemas.openxmlformats.org/wordprocessingml/2006/main" xmlns:wne="http://schemas.microsoft.com/office/word/2006/wordml" xmlns:wp14="http://schemas.microsoft.com/office/word/2010/wordprocessingDrawing" xmlns:wp="http://schemas.openxmlformats.org/drawingml/2006/wordprocessingDrawing" xmlns:wpc="http://schemas.microsoft.com/office/word/2010/wordprocessingCanvas" xmlns:wpg="http://schemas.microsoft.com/office/word/2010/wordprocessingGroup" xmlns:wpi="http://schemas.microsoft.com/office/word/2010/wordprocessingInk" xmlns:wps="http://schemas.microsoft.com/office/word/2010/wordprocessingShape" mc:Ignorable="w14 wp14">
-  <w:p>
-    <w:pPr>
-      <w:pStyle w:val="Footer"/>
-      <w:jc w:val="center"/>
-    </w:pPr>
-    <w:r>
-      <w:rPr>
-        <w:rFonts w:ascii="Calibri" w:hAnsi="Calibri"/>
-        <w:color w:val="78828C"/>
-        <w:sz w:val="17"/>
-      </w:rPr>
-      <w:t>Dokumen Spesifikasi Bisnis &amp; Panduan Eksekutif Direksi  •  Confidential / Hak Milik Perusahaan</w:t>
-    </w:r>
-  </w:p>
-</w:ftr>
-</file>
-
-<file path=word/header1.xml><?xml version="1.0" encoding="utf-8"?>
-<w:hdr xmlns:m="http://schemas.openxmlformats.org/officeDocument/2006/math" xmlns:mc="http://schemas.openxmlformats.org/markup-compatibility/2006" xmlns:mo="http://schemas.microsoft.com/office/mac/office/2008/main" xmlns:mv="urn:schemas-microsoft-com:mac:vml" xmlns:o="urn:schemas-microsoft-com:office:office" xmlns:r="http://schemas.openxmlformats.org/officeDocument/2006/relationships" xmlns:v="urn:schemas-microsoft-com:vml" xmlns:w10="urn:schemas-microsoft-com:office:word" xmlns:w14="http://schemas.microsoft.com/office/word/2010/wordml" xmlns:w="http://schemas.openxmlformats.org/wordprocessingml/2006/main" xmlns:wne="http://schemas.microsoft.com/office/word/2006/wordml" xmlns:wp14="http://schemas.microsoft.com/office/word/2010/wordprocessingDrawing" xmlns:wp="http://schemas.openxmlformats.org/drawingml/2006/wordprocessingDrawing" xmlns:wpc="http://schemas.microsoft.com/office/word/2010/wordprocessingCanvas" xmlns:wpg="http://schemas.microsoft.com/office/word/2010/wordprocessingGroup" xmlns:wpi="http://schemas.microsoft.com/office/word/2010/wordprocessingInk" xmlns:wps="http://schemas.microsoft.com/office/word/2010/wordprocessingShape" mc:Ignorable="w14 wp14">
-  <w:p>
-    <w:pPr>
-      <w:pStyle w:val="Header"/>
-      <w:jc w:val="right"/>
-    </w:pPr>
-    <w:r>
-      <w:rPr>
-        <w:rFonts w:ascii="Calibri" w:hAnsi="Calibri"/>
-        <w:color w:val="78828C"/>
-        <w:sz w:val="17"/>
-      </w:rPr>
-      <w:t>PT LIUGONG FINANCE INDONESIA  |  LOAN ORIGINATION SYSTEM &amp; CRM (LOS-CRM)</w:t>
-    </w:r>
-  </w:p>
-</w:hdr>
 </file>
 
 <file path=word/numbering.xml><?xml version="1.0" encoding="utf-8"?>

</xml_diff>

<commit_message>
docs(word): document operational 6-step SOP for Marketing in FAP Stage
</commit_message>
<xml_diff>
--- a/LIUGONG_CRM_BUSINESS_SPECIFICATION_PRESDIR.docx
+++ b/LIUGONG_CRM_BUSINESS_SPECIFICATION_PRESDIR.docx
@@ -120,7 +120,7 @@
               </w:rPr>
               <w:t>DOKUMEN PRESENTASI EKSEKUTIF UNTUK PRESIDEN DIREKTUR:</w:t>
               <w:br/>
-              <w:t>Dokumen ini membedah Roadmap Strategis Pengembangan Sistem 2026–2027 dengan fokus utama pada rilis Q4 2026 (FAP STAGE: Customer &amp; PIC hingga Stakeholders + Tab Dokumen). Dilengkapi rincian operasional input data oleh tim Marketing, integrasi OCR NIB OSS RBA, Digital Twin Excel 118-baris, validasi saham 100%, serta gambaran umum fase lanjutan 2027.</w:t>
+              <w:t>Dokumen ini membedah Roadmap Strategis Pengembangan Sistem 2026–2027 dengan fokus utama pada rilis Q4 2026 (FAP STAGE: Customer &amp; PIC hingga Stakeholders + Tab Dokumen). Dilengkapi rincian operasional langkah demi langkah (SOP 6 Tahap) penginputan data oleh tim Marketing, integrasi OCR NIB OSS RBA, Digital Twin Excel 118-baris, validasi saham 100%, serta gambaran umum fase lanjutan 2027.</w:t>
             </w:r>
           </w:p>
         </w:tc>
@@ -1080,7 +1080,7 @@
           <w:color w:val="002060"/>
           <w:sz w:val="30"/>
         </w:rPr>
-        <w:t>BAB 2: PROSES DETAIL FAP STAGE DARI SISI MARKETING (RILIS Q4 2026)</w:t>
+        <w:t>BAB 2: PANDUAN OPERASIONAL STEP-BY-STEP FAP STAGE (SOP 6 LANGKAH MARKETING)</w:t>
       </w:r>
     </w:p>
     <w:p>
@@ -1088,7 +1088,7 @@
         <w:spacing w:line="276" w:lineRule="auto" w:after="120"/>
       </w:pPr>
       <w:r>
-        <w:t>Pada rilis Q4 2026, fokus implementasi difokuskan penuh pada FAP STAGE. Di tahap ini, staf Marketing (MKT) di cabang bertindak sebagai garda terdepan penginputan data. Seluruh alur dirancang secara ergonomis ke dalam 4 Tab Berurutan (Customer &amp; PIC, Legal, Stakeholders, dan Documents) yang dilengkapi otomatisasi AI dan live visual mirror:</w:t>
+        <w:t>Pada kuartal Q4 2026, sistem diresmikan dengan fokus utama pada FAP STAGE. Berikut adalah Standard Operating Procedure (SOP) langkah demi langkah yang dijalankan oleh Marketing Officer (MKT) di seluruh kantor cabang LiuGong saat menginput permohonan pembiayaan baru:</w:t>
       </w:r>
     </w:p>
     <w:p>
@@ -1157,7 +1157,7 @@
           <w:color w:val="ED7D31"/>
           <w:sz w:val="24"/>
         </w:rPr>
-        <w:t>2.1. Tab 1: Customer &amp; PIC (5 Modul Accordion &amp; Digital Twin Excel 118-Baris)</w:t>
+        <w:t>Langkah 1: Inisiasi Permohonan Baru &amp; Pendaftaran Registrasi</w:t>
       </w:r>
     </w:p>
     <w:p>
@@ -1165,20 +1165,90 @@
         <w:spacing w:line="276" w:lineRule="auto" w:after="80"/>
       </w:pPr>
       <w:r>
-        <w:t>Untuk mencegah kelelahan pengguna (form fatigue) akibat lebih dari 35 field isian, formulir kiri dibagi ke dalam 5 modul kartu accordion bernomor:</w:t>
+        <w:t>1. Login Pengguna: Marketing masuk ke sistem menggunakan akun resmi cabang (misal: marketing@liugong.local).</w:t>
         <w:br/>
-        <w:t>1. Modul 01 - Identitas &amp; Klasifikasi Debitur: Marketing memilih Kategori Nasabah (Customer Baru / Existing), Tipe Debitur (Corporate / Commercial / Micro), Kantor Cabang LiuGong (JKT01, SBY01, BPN01, PLB01, MDN01), serta Tanggal Permohonan.</w:t>
+        <w:t>2. Buka Origination Workspace: Memilih menu 'Applications' pada sidebar kiri.</w:t>
         <w:br/>
-        <w:t>2. Modul 02 - Kantor Registrasi &amp; Domisili Perusahaan: Marketing memasukkan Nama Resmi Perusahaan, Alamat Kantor Pusat, Kota, Provinsi, Kode Pos, serta Nomor Telepon/Fax. Pada field NIB (Nomor Induk Berusaha), tersedia tombol 'Scan OCR NIB' yang otomatis mengekstrak dokumen OSS RBA BKPM.</w:t>
+        <w:t>3. Inisiasi Aplikasi: Klik tombol '+ New application' (atau membuka draft berjalan). Sistem secara otomatis mengalokasikan nomor register resmi sesuai format standar: [Nomor Urut]/AF/[Bulan Romawi]/[Tahun] (contoh: 003/AF/IX/2026) dan menetapkan tahap awal pada 'FAP Stage' berstatus 'Draft'.</w:t>
+      </w:r>
+    </w:p>
+    <w:p>
+      <w:pPr>
+        <w:spacing w:before="160" w:after="40"/>
+      </w:pPr>
+      <w:r>
+        <w:rPr>
+          <w:rFonts w:ascii="Calibri" w:hAnsi="Calibri"/>
+          <w:b/>
+          <w:color w:val="ED7D31"/>
+          <w:sz w:val="24"/>
+        </w:rPr>
+        <w:t>Langkah 2: Pengisian Tab 1 (Customer &amp; PIC) — 5 Modul Accordion &amp; Digital Twin Excel</w:t>
+      </w:r>
+    </w:p>
+    <w:p>
+      <w:pPr>
+        <w:spacing w:line="276" w:lineRule="auto" w:after="80"/>
+      </w:pPr>
+      <w:r>
+        <w:t>Marketing melengkapi data identitas calon debitur pada formulir sebelah kiri yang terbagi ke dalam 5 modul kartu accordion bernomor:</w:t>
         <w:br/>
-        <w:t>3. Modul 03 - Profil Usaha &amp; Legalitas Awal: Pengisian Bisnis Utama (KBLI Sektor Tambang/Konstruksi/Sawit), Pengalaman Usaha (Tahun &amp; Bulan), NPWP Badan Usaha (15/16 digit), serta No &amp; Tanggal Akta Pendirian.</w:t>
+        <w:t>• Modul 01 - Identitas &amp; Klasifikasi Debitur:</w:t>
         <w:br/>
-        <w:t>4. Modul 04 - Kontak Utama / Penanggung Jawab (PIC): Nama Lengkap PIC Pengadaan, Jabatan Formal (Direktur/Procurement), Alamat Domisili PIC, Nomor WhatsApp aktif, dan Email kantor resmi.</w:t>
+        <w:t xml:space="preserve">  - Memilih Kategori Pelanggan: 'Customer Baru' (New Customer) atau 'Customer Lama' (Existing Customer).</w:t>
         <w:br/>
-        <w:t>5. Modul 05 - Segmentasi Industri &amp; Proyek Berjalan: Pemilihan sektor industri alat berat serta deskripsi kontrak kerja yang sedang dikerjakan debitur (pemberi kerja/bouwheer, lokasi tambang/konstruksi, durasi kontrak).</w:t>
+        <w:t xml:space="preserve">  - Memilih Segmen Bisnis: 'Corporate', 'Commercial', atau 'Micro'.</w:t>
+        <w:br/>
+        <w:t xml:space="preserve">  - Menentukan Kantor Cabang LiuGong (misal: JKT01 Jakarta, SBY01 Surabaya, BPN01 Balikpapan, PLB01 Palembang, MDN01 Medan).</w:t>
+        <w:br/>
+        <w:t xml:space="preserve">  - Memverifikasi Tanggal Aplikasi Pembiayaan.</w:t>
         <w:br/>
         <w:br/>
-        <w:t>Fitur Digital Twin Live Excel: Pada kolom kanan, terpampang replika presisi formulir Excel resmi (FAP-Document_APPROVED_v01.2025.xlsx). Setiap karakter yang diketik oleh Marketing langsung terproyeksi ke lembar kanan secara real-time, lengkap dengan tombol navigasi Auto-Sync Focus (1. Identitas s/d 5. Proyek).</w:t>
+        <w:t>• Modul 02 - Kantor Registrasi &amp; Domisili (Otomasi Scan OCR NIB 13-Digit):</w:t>
+        <w:br/>
+        <w:t xml:space="preserve">  - Memasukkan Nama Legal Perusahaan (PT/CV).</w:t>
+        <w:br/>
+        <w:t xml:space="preserve">  - Pemanfaatan Fitur AI OCR NIB: Marketing menekan tombol pill '[ 📷 Scan OCR NIB ]' di header field NIB. Jendela pop-up modal terbuka; Marketing mengunggah berkas sertifikat standar NIB OSS RBA (format PDF atau gambar). AI OCR langsung membaca berkas dan mengekstrak secara otomatis 5 parameter kunci: 13-Digit Nomor NIB, Nama Perusahaan, Alamat Lengkap, Kode Pos, dan Tanggal Terbit OSS. Seluruh field langsung terisi otomatis tanpa risiko salah ketik.</w:t>
+        <w:br/>
+        <w:t xml:space="preserve">  - Melengkapi Kota, Provinsi, dan Nomor Telepon/Fax Kantor Pusat.</w:t>
+        <w:br/>
+        <w:br/>
+        <w:t>• Modul 03 - Profil Usaha &amp; Legalitas Awal:</w:t>
+        <w:br/>
+        <w:t xml:space="preserve">  - Memasukkan Bisnis Utama / KBLI (misal: Kontraktor Penambangan Nikel, Perkebunan Kelapa Sawit, Jasa Konstruksi Sipil).</w:t>
+        <w:br/>
+        <w:t xml:space="preserve">  - Mengisi Pengalaman Usaha (Tahun dan Bulan berjalan).</w:t>
+        <w:br/>
+        <w:t xml:space="preserve">  - Memasukkan Nomor NPWP Badan Usaha (15 atau 16 digit angka).</w:t>
+        <w:br/>
+        <w:t xml:space="preserve">  - Memasukkan Nomor Akta Pendirian dan Tanggal Akta Pendirian awal.</w:t>
+        <w:br/>
+        <w:br/>
+        <w:t>• Modul 04 - Kontak Utama / Penanggung Jawab (PIC):</w:t>
+        <w:br/>
+        <w:t xml:space="preserve">  - Mengisi Nama Lengkap PIC yang ditunjuk debitur untuk menangani pengadaan alat berat.</w:t>
+        <w:br/>
+        <w:t xml:space="preserve">  - Mengisi Jabatan Formal di Perusahaan (misal: Direktur Operasional, GM Procurement).</w:t>
+        <w:br/>
+        <w:t xml:space="preserve">  - Memasukkan Alamat Domisili Tempat Tinggal PIC, Kota, Provinsi, Kode Pos.</w:t>
+        <w:br/>
+        <w:t xml:space="preserve">  - Memasukkan Nomor Handphone / WhatsApp aktif dan Email kantor resmi PIC.</w:t>
+        <w:br/>
+        <w:br/>
+        <w:t>• Modul 05 - Segmentasi Industri &amp; Proyek Berjalan:</w:t>
+        <w:br/>
+        <w:t xml:space="preserve">  - Memilih Sektor Industri (Mining Nikel/Batubara, Construction, Forestry, Agriculture, Logistics).</w:t>
+        <w:br/>
+        <w:t xml:space="preserve">  - Mengisi Deskripsi Proyek / Kontrak Kerja yang sedang berjalan (nama bouwheer/pemberi kerja, lokasi tambang/konstruksi, durasi kontrak kerja).</w:t>
+        <w:br/>
+        <w:br/>
+        <w:t>• Verifikasi Visual Kolom Kanan (Live Excel Mirror 118-Baris):</w:t>
+        <w:br/>
+        <w:t xml:space="preserve">  - Selama Marketing mengetik pada modul kiri, lembar kerja resmi Excel (FAP-Document_APPROVED_v01.2025.xlsx) pada kolom kanan terisi secara real-time.</w:t>
+        <w:br/>
+        <w:t xml:space="preserve">  - Marketing dapat menggunakan tombol navigasi cepat (1. Identitas s/d 5. Proyek) di ribbon Excel untuk memverifikasi tata letak dokumen cetak A4.</w:t>
+        <w:br/>
+        <w:t xml:space="preserve">  - Marketing menekan tombol 'Simpan' untuk mengunci data FAP Stage ke basis data.</w:t>
       </w:r>
     </w:p>
     <w:p>
@@ -1302,7 +1372,7 @@
           <w:color w:val="ED7D31"/>
           <w:sz w:val="24"/>
         </w:rPr>
-        <w:t>2.2. Tab 2: Legal Deeds (Akta Pendirian, Akta Perubahan &amp; SK Kemenkumham)</w:t>
+        <w:t>Langkah 3: Pengisian Tab 2 (Legal Deeds) — Akta Notaris &amp; SK Kemenkumham</w:t>
       </w:r>
     </w:p>
     <w:p>
@@ -1310,17 +1380,29 @@
         <w:spacing w:line="276" w:lineRule="auto" w:after="80"/>
       </w:pPr>
       <w:r>
-        <w:t>Di tab Legal, Marketing mendokumentasikan riwayat legalitas yuridis perusahaan debitur:</w:t>
+        <w:t>Setelah data Customer &amp; PIC tersimpan, Marketing beralih ke Tab 2 'Legal':</w:t>
         <w:br/>
-        <w:t>• Akta Pendirian Utama: Nomor Akta Notaris, Tanggal Akta, Nama Notaris, serta Nomor &amp; Tanggal SK Menkumham Pendirian.</w:t>
+        <w:t>1. Perekaman Akta Pendirian:</w:t>
         <w:br/>
-        <w:t>• Akta Perubahan Terakhir: Nomor Akta, Tanggal Akta, serta Nomor &amp; Tanggal SK Menkumham Perubahan.</w:t>
+        <w:t xml:space="preserve">   - Klik tombol '+ Tambah akta', pilih tipe 'Akta Pendirian'.</w:t>
         <w:br/>
-        <w:t>• Kategori Remarks Perubahan: Memilih chip kategori klausul yang diubah (Susunan Pemegang Saham, Pengurus Direksi/Komisaris, Modal Dasar/Disetor, atau Maksud &amp; Tujuan Anggaran Dasar).</w:t>
+        <w:t xml:space="preserve">   - Memasukkan Nomor Akta Notaris, Tanggal Akta, Nama Notaris Pembuat Akta.</w:t>
         <w:br/>
-        <w:t>• Editor TinyMCE Catatan Akta: Dilengkapi teks editor kaya dengan penomoran otomatis berurutan (continuous numbered list) untuk mencatat ringkasan isi akta tanpa terputus.</w:t>
+        <w:t xml:space="preserve">   - Memasukkan Nomor SK Pengesahan Kemenkumham dan Tanggal SK.</w:t>
         <w:br/>
-        <w:t>• Segmentasi Tabel Cerdas: Sistem memisahkan antara 'Akta Aktif &amp; Rujukan Terkini' di tabel atas dan 'Riwayat Akta Lama (Historical)' di tabel bawah.</w:t>
+        <w:t>2. Perekaman Akta Perubahan Terakhir:</w:t>
+        <w:br/>
+        <w:t xml:space="preserve">   - Menambahkan baris akta perubahan, memilih tipe 'Akta Perubahan'.</w:t>
+        <w:br/>
+        <w:t xml:space="preserve">   - Memasukkan Nomor Akta Perubahan, Tanggal Akta, Nomor dan Tanggal SK Menkumham Perubahan.</w:t>
+        <w:br/>
+        <w:t xml:space="preserve">   - Memilih chip 'Kategori Remarks': Saham, Kepengurusan, Modal, atau Anggaran Dasar.</w:t>
+        <w:br/>
+        <w:t xml:space="preserve">   - Pencatatan Ringkasan Klausul: Menggunakan teks editor TinyMCE dengan penomoran berurutan otomatis (continuous ordered list) untuk mendokumentasikan pasal-pasal penting perubahan akta.</w:t>
+        <w:br/>
+        <w:t>3. Verifikasi Status Akta:</w:t>
+        <w:br/>
+        <w:t xml:space="preserve">   - Sistem secara otomatis menempatkan akta yang berlaku efektif pada tabel atas 'Akta Aktif &amp; Rujukan Terkini', sementara draf atau akta lampau diarsipkan ke tabel bawah 'Riwayat Akta Lama (Historical)'.</w:t>
       </w:r>
     </w:p>
     <w:p>
@@ -1389,7 +1471,7 @@
           <w:color w:val="ED7D31"/>
           <w:sz w:val="24"/>
         </w:rPr>
-        <w:t>2.3. Tab 3: Stakeholders (Susunan Pengurus, Pemegang Saham &amp; Validasi Modal 100%)</w:t>
+        <w:t>Langkah 4: Pengisian Tab 3 (Stakeholders) — Struktur Pengurus &amp; Validasi Saham Mutlak 100%</w:t>
       </w:r>
     </w:p>
     <w:p>
@@ -1397,15 +1479,25 @@
         <w:spacing w:line="276" w:lineRule="auto" w:after="80"/>
       </w:pPr>
       <w:r>
-        <w:t>Di tab Stakeholders, Marketing memasukkan susunan jajaran manajemen dan struktur kepemilikan modal perseroan:</w:t>
+        <w:t>Marketing beralih ke Tab 3 'Stakeholders' untuk mendata jajaran manajemen dan pemegang saham:</w:t>
         <w:br/>
-        <w:t>• Klasifikasi Pemilik: Perorangan WNI (NIK e-KTP 16 digit), Perorangan Asing / Expatriat (Paspor &amp; E-KITAS), atau Badan Usaha (NPWP Badan).</w:t>
+        <w:t>1. Input Pengurus Perseroan:</w:t>
         <w:br/>
-        <w:t>• Jabatan Formal: Direktur Utama, Direktur, Komisaris Utama, Komisaris, atau Pemegang Saham Murni.</w:t>
+        <w:t xml:space="preserve">   - Menambahkan Direktur Utama, Direktur, Komisaris Utama, dan Komisaris.</w:t>
         <w:br/>
-        <w:t>• Komposisi Saham: Jumlah lembar saham dan nilai nominal per lembar saham.</w:t>
+        <w:t xml:space="preserve">   - Menentukan kewarganegaraan: WNI (wajib memasukkan 16-digit NIK e-KTP) atau WNA (memasukkan Nomor Paspor &amp; izin tinggal E-KITAS untuk direksi ekspatriat mitra LiuGong).</w:t>
         <w:br/>
-        <w:t>• Validasi Keras Mutlak 100% (Hard Gate Invariant): Total persentase seluruh pemegang saham WAJIB tepat 100.00%. Apabila total persentase saham kurang (misal 99.8%) atau lebih (misal 101%), tombol pengajuan terkunci secara otomatis dan sistem memunculkan indikator peringatan merah. Hal ini menjamin integritas hukum kepemilikan modal sejak detik pertama.</w:t>
+        <w:t>2. Input Pemegang Saham &amp; Modal:</w:t>
+        <w:br/>
+        <w:t xml:space="preserve">   - Menambahkan pemilik saham perorangan maupun badan hukum (memasukkan NPWP Perusahaan Pemegang Saham).</w:t>
+        <w:br/>
+        <w:t xml:space="preserve">   - Memasukkan jumlah lembar saham dan nilai nominal per lembar saham.</w:t>
+        <w:br/>
+        <w:t>3. Validasi Keras Mutlak 100% (Hard Gate Invariant):</w:t>
+        <w:br/>
+        <w:t xml:space="preserve">   - Sistem menghitung persentase kepemilikan modal secara real-time.</w:t>
+        <w:br/>
+        <w:t xml:space="preserve">   - Total persentase seluruh pemegang saham WAJIB tepat 100.00%. Jika total saham kurang (misal 99.5%) atau lebih (misal 101.0%), sistem memunculkan indikator peringatan merah dan memblokir tombol pengajuan aplikasi. Hal ini mengunci kepatuhan hukum kepemilikan perseroan sebelum melangkah ke tahap berikutnya.</w:t>
       </w:r>
     </w:p>
     <w:p>
@@ -1474,7 +1566,7 @@
           <w:color w:val="ED7D31"/>
           <w:sz w:val="24"/>
         </w:rPr>
-        <w:t>2.4. Tab 4: Documents (Checklist 13 Berkas Wajib &amp; Repositori Digital)</w:t>
+        <w:t>Langkah 5: Pengisian Tab 4 (Documents) — Verifikasi 13 Berkas Wajib &amp; Unggah Digital</w:t>
       </w:r>
     </w:p>
     <w:p>
@@ -1482,37 +1574,39 @@
         <w:spacing w:line="276" w:lineRule="auto" w:after="80"/>
       </w:pPr>
       <w:r>
-        <w:t>Sesuai arahan Direksi, Tab Dokumen kini dihadirkan secara penuh pada FAP Stage untuk memastikan seluruh berkas persyaratan terhimpun rapi:</w:t>
+        <w:t>Sesuai instruksi Direksi, Tab Dokumen dihadirkan secara penuh pada FAP Stage untuk memastikan berkas fisik terdigitalisasi sejak awal:</w:t>
         <w:br/>
-        <w:t>• Checklist 13 Dokumen Wajib:</w:t>
+        <w:t>1. Checklist 13 Dokumen Persyaratan Wajib:</w:t>
         <w:br/>
-        <w:t xml:space="preserve">  1. KTP Pengurus (Direksi &amp; Komisaris)</w:t>
+        <w:t xml:space="preserve">   1. KTP Pengurus (Seluruh Direksi &amp; Komisaris)</w:t>
         <w:br/>
-        <w:t xml:space="preserve">  2. NPWP Perusahaan &amp; Pengurus</w:t>
+        <w:t xml:space="preserve">   2. NPWP Badan Usaha &amp; Pengurus</w:t>
         <w:br/>
-        <w:t xml:space="preserve">  3. NIB (Nomor Induk Berusaha) OSS BKPM</w:t>
+        <w:t xml:space="preserve">   3. NIB (Nomor Induk Berusaha) OSS BKPM</w:t>
         <w:br/>
-        <w:t xml:space="preserve">  4. Akta Pendirian Perusahaan + SK Kemenkumham</w:t>
+        <w:t xml:space="preserve">   4. Akta Pendirian Perusahaan + SK Pengesahan Kemenkumham</w:t>
         <w:br/>
-        <w:t xml:space="preserve">  5. Akta Perubahan Terakhir + SK Kemenkumham</w:t>
+        <w:t xml:space="preserve">   5. Akta Perubahan Terakhir + SK Penerimaan Pemberitahuan Kemenkumham</w:t>
         <w:br/>
-        <w:t xml:space="preserve">  6. Rekening Koran Operasional (3–6 Bulan Terakhir)</w:t>
+        <w:t xml:space="preserve">   6. Rekening Koran Operasional Perusahaan (3–6 Bulan Terakhir)</w:t>
         <w:br/>
-        <w:t xml:space="preserve">  7. Laporan Keuangan Neraca &amp; Laba Rugi</w:t>
+        <w:t xml:space="preserve">   7. Laporan Keuangan Neraca &amp; Laba Rugi (Audited / In-House)</w:t>
         <w:br/>
-        <w:t xml:space="preserve">  8. SPT Tahunan Pajak Badan</w:t>
+        <w:t xml:space="preserve">   8. SPT Tahunan Pajak Penghasilan Badan</w:t>
         <w:br/>
-        <w:t xml:space="preserve">  9. Profil Perusahaan (Company Profile)</w:t>
+        <w:t xml:space="preserve">   9. Profil Perusahaan (Company Profile &amp; Portofolio Pekerjaan)</w:t>
         <w:br/>
-        <w:t xml:space="preserve">  10. Kontrak Kerja / SPK Proyek Berjalan</w:t>
+        <w:t xml:space="preserve">   10. Salinan Kontrak Kerja / SPK Proyek Berjalan dengan Bouwheer</w:t>
         <w:br/>
-        <w:t xml:space="preserve">  11. Izin Usaha Sektoral (IUJP/IUP Khusus Tambang)</w:t>
+        <w:t xml:space="preserve">   11. Izin Usaha Sektoral (IUJP/IUP untuk Pertambangan, SBU Konstruksi)</w:t>
         <w:br/>
-        <w:t xml:space="preserve">  12. Formulir Aplikasi Pembiayaan (FAP) Bertandatangan Basah &amp; Cap</w:t>
+        <w:t xml:space="preserve">   12. Formulir Aplikasi Pembiayaan (FAP) Asli Bertandatangan Basah &amp; Cap Basah Perusahaan</w:t>
         <w:br/>
-        <w:t xml:space="preserve">  13. Surat Persetujuan Pengecekan Pefindo Biro Kredit</w:t>
+        <w:t xml:space="preserve">   13. Surat Kuasa Persetujuan Pengecekan Data Kredit Pefindo Biro Kredit</w:t>
         <w:br/>
-        <w:t>• Pengunggahan &amp; Verifikasi Berkas: Setiap item dilengkapi tombol upload berkas (PDF / JPG), indikator status (Verified / Pending), serta counter badge 'Documents (13)' di header tab.</w:t>
+        <w:t>2. Unggah Berkas Digital: Marketing menekan tombol 'Upload' pada masing-masing dokumen, memilih berkas scan (PDF/JPG) dari komputer.</w:t>
+        <w:br/>
+        <w:t>3. Pemantauan Kelengkapan: Status berkas berubah menjadi 'Uploaded/Verified' dan counter kelengkapan di header tab bertambah (misal: 'Documents 13/13').</w:t>
       </w:r>
     </w:p>
     <w:p>
@@ -1568,6 +1662,32 @@
           <w:sz w:val="19"/>
         </w:rPr>
         <w:t>Gambar: Pusat Verifikasi Berkas: Checklist 13 Dokumen Wajib dengan Fitur Unggah &amp; Status Kelengkapan (Live System)</w:t>
+      </w:r>
+    </w:p>
+    <w:p>
+      <w:pPr>
+        <w:spacing w:before="160" w:after="40"/>
+      </w:pPr>
+      <w:r>
+        <w:rPr>
+          <w:rFonts w:ascii="Calibri" w:hAnsi="Calibri"/>
+          <w:b/>
+          <w:color w:val="ED7D31"/>
+          <w:sz w:val="24"/>
+        </w:rPr>
+        <w:t>Langkah 6: Final Review &amp; Pengajuan FAP Stage ke Business Support (BS)</w:t>
+      </w:r>
+    </w:p>
+    <w:p>
+      <w:pPr>
+        <w:spacing w:line="276" w:lineRule="auto" w:after="80"/>
+      </w:pPr>
+      <w:r>
+        <w:t>1. Peninjauan Metrik Header: Marketing memeriksa ringkasan metrik di bagian atas workspace (Nilai Permohonan Pembiayaan, Tenor Angsuran, Kategori Nasabah, dan Status Verifikasi Dokumen 13/13).</w:t>
+        <w:br/>
+        <w:t>2. Eksekusi Pengajuan: Marketing menekan tombol 'Submit FAP Stage' (atau 'SUBMIT_TO_BS'). Sistem melakukan validasi menyeluruh (Nama perusahaan terisi, NIB 13 digit valid, NPWP valid, total saham 100.00%). Jika seluruh aturan terpenuhi, dialog konfirmasi pengajuan muncul.</w:t>
+        <w:br/>
+        <w:t>3. Transisi Tahap Otomatis: Status aplikasi secara resmi berpindah dari 'FAP Stage (Draft)' menjadi 'SUBMITTED_TO_BS'. Aplikasi diteruskan secara digital ke meja kerja Business Support (BS) untuk verifikasi awal, dan tahap 'Pre-analysis' diaktifkan. Seluruh riwayat aksi tercatat permanen pada tab Activity Log (Audit Trail abadi).</w:t>
       </w:r>
     </w:p>
     <w:p>

</xml_diff>

<commit_message>
docs(word): embed complete 10-step sequential screenshots from +New Application to FAP Stage completion
</commit_message>
<xml_diff>
--- a/LIUGONG_CRM_BUSINESS_SPECIFICATION_PRESDIR.docx
+++ b/LIUGONG_CRM_BUSINESS_SPECIFICATION_PRESDIR.docx
@@ -1108,7 +1108,7 @@
               <a:graphicData uri="http://schemas.openxmlformats.org/drawingml/2006/picture">
                 <pic:pic>
                   <pic:nvPicPr>
-                    <pic:cNvPr id="0" name="fap_stage_tabs_with_document.png"/>
+                    <pic:cNvPr id="0" name="05_step_tab1_form_auto_filled.png"/>
                     <pic:cNvPicPr/>
                   </pic:nvPicPr>
                   <pic:blipFill>
@@ -1268,7 +1268,7 @@
               <a:graphicData uri="http://schemas.openxmlformats.org/drawingml/2006/picture">
                 <pic:pic>
                   <pic:nvPicPr>
-                    <pic:cNvPr id="0" name="03_workspace_split_50_50.png"/>
+                    <pic:cNvPr id="0" name="02_step_click_new_application.png"/>
                     <pic:cNvPicPr/>
                   </pic:nvPicPr>
                   <pic:blipFill>
@@ -1323,7 +1323,7 @@
               <a:graphicData uri="http://schemas.openxmlformats.org/drawingml/2006/picture">
                 <pic:pic>
                   <pic:nvPicPr>
-                    <pic:cNvPr id="0" name="04_nib_ocr_modal.png"/>
+                    <pic:cNvPr id="0" name="03_step_nib_ocr_modal_opened.png"/>
                     <pic:cNvPicPr/>
                   </pic:nvPicPr>
                   <pic:blipFill>
@@ -1517,7 +1517,7 @@
               <a:graphicData uri="http://schemas.openxmlformats.org/drawingml/2006/picture">
                 <pic:pic>
                   <pic:nvPicPr>
-                    <pic:cNvPr id="0" name="tab_3_stakeholders.png"/>
+                    <pic:cNvPr id="0" name="07_step_tab3_stakeholders.png"/>
                     <pic:cNvPicPr/>
                   </pic:nvPicPr>
                   <pic:blipFill>
@@ -1626,7 +1626,7 @@
               <a:graphicData uri="http://schemas.openxmlformats.org/drawingml/2006/picture">
                 <pic:pic>
                   <pic:nvPicPr>
-                    <pic:cNvPr id="0" name="fap_stage_tab_document_view.png"/>
+                    <pic:cNvPr id="0" name="08_step_tab4_documents_checklist.png"/>
                     <pic:cNvPicPr/>
                   </pic:nvPicPr>
                   <pic:blipFill>

</xml_diff>

<commit_message>
docs(word): refine BAB 2 to highlight core FAP features, exact OCR placements, general overview, and end-to-end flow to Proposal while keeping BAB 3 intact
</commit_message>
<xml_diff>
--- a/LIUGONG_CRM_BUSINESS_SPECIFICATION_PRESDIR.docx
+++ b/LIUGONG_CRM_BUSINESS_SPECIFICATION_PRESDIR.docx
@@ -1080,7 +1080,21 @@
           <w:color w:val="002060"/>
           <w:sz w:val="30"/>
         </w:rPr>
-        <w:t>BAB 2: PANDUAN OPERASIONAL STEP-BY-STEP FAP STAGE (SOP 6 LANGKAH MARKETING)</w:t>
+        <w:t>BAB 2: ARSITEKTUR FAP STAGE, PEMETAAN FITUR &amp; AI OCR, SERTA ALUR HINGGA PROPOSAL</w:t>
+      </w:r>
+    </w:p>
+    <w:p>
+      <w:pPr>
+        <w:spacing w:before="120" w:after="40"/>
+      </w:pPr>
+      <w:r>
+        <w:rPr>
+          <w:rFonts w:ascii="Calibri" w:hAnsi="Calibri"/>
+          <w:b/>
+          <w:color w:val="ED7D31"/>
+          <w:sz w:val="24"/>
+        </w:rPr>
+        <w:t>2.1. Penjelasan Umum FAP Stage (General Overview &amp; Peran Marketing)</w:t>
       </w:r>
     </w:p>
     <w:p>
@@ -1088,7 +1102,20 @@
         <w:spacing w:line="276" w:lineRule="auto" w:after="120"/>
       </w:pPr>
       <w:r>
-        <w:t>Pada kuartal Q4 2026, sistem diresmikan dengan fokus utama pada FAP STAGE. Berikut adalah Standard Operating Procedure (SOP) langkah demi langkah yang dijalankan oleh Marketing Officer (MKT) di seluruh kantor cabang LiuGong saat menginput permohonan pembiayaan baru:</w:t>
+        <w:t>FAP STAGE (Financing Application Process) adalah gerbang intake operasional paling awal pada sistem LOS-CRM LiuGong Finance. Pada tahap ini, tim Marketing (MKT) di seluruh kantor cabang bertugas melakukan onboarding calon debitur secara komprehensif, menghimpun data legalitas korporasi, memetakan susunan pengurus serta pemegang saham, dan memverifikasi kelengkapan berkas fisik persyaratan pembiayaan sebelum permohonan diteruskan ke tahap analisis risiko.</w:t>
+        <w:br/>
+        <w:br/>
+        <w:t>Secara garis besar, aktivitas utama staf Marketing pada FAP Stage mencakup:</w:t>
+        <w:br/>
+        <w:t>1. Inisiasi Permohonan: Menentukan kategori debitur (Baru/Lama), segmentasi (Corporate/Commercial/Micro), dan cabang operasional LiuGong.</w:t>
+        <w:br/>
+        <w:t>2. Perekaman Identitas &amp; Domisili: Memasukkan nama resmi PT/CV, alamat kantor pusat, kontak penanggung jawab operasional (PIC), serta segmentasi proyek kontrak berjalan.</w:t>
+        <w:br/>
+        <w:t>3. Dokumentasi Yuridis Notaris: Merekam data akta pendirian dan akta perubahan terakhir lengkap dengan tanggal dan nomor SK Menkumham.</w:t>
+        <w:br/>
+        <w:t>4. Pemetaan Tata Kelola Kepemilikan: Mendaftarkan seluruh direksi, komisaris, dan pemegang saham dengan validasi keras komposisi modal 100.00%.</w:t>
+        <w:br/>
+        <w:t>5. Pengumpulan 13 Dokumen Persyaratan: Menghimpun pindaian berkas legalitas dan finansial ke dalam repositori digital terenkripsi.</w:t>
       </w:r>
     </w:p>
     <w:p>
@@ -1143,7 +1170,7 @@
           <w:color w:val="64748B"/>
           <w:sz w:val="19"/>
         </w:rPr>
-        <w:t>Gambar: Tampilan Workspace FAP Stage Aktif Menampilkan 4 Tab Terstruktur Lengkap dengan Tab Dokumen (Live System)</w:t>
+        <w:t>Gambar: Tampilan Workspace FAP Stage Split 50-50 Menampilkan 4 Tab Terstruktur dan Digital Twin Excel 118-Baris (Live System)</w:t>
       </w:r>
     </w:p>
     <w:p>
@@ -1157,20 +1184,330 @@
           <w:color w:val="ED7D31"/>
           <w:sz w:val="24"/>
         </w:rPr>
-        <w:t>Langkah 1: Inisiasi Permohonan Baru &amp; Pendaftaran Registrasi</w:t>
+        <w:t>2.2. Fitur-Fitur Utama pada FAP Stage (Core Capabilities)</w:t>
       </w:r>
     </w:p>
+    <w:tbl>
+      <w:tblPr>
+        <w:tblW w:type="auto" w:w="0"/>
+        <w:jc w:val="center"/>
+        <w:tblLayout w:type="fixed"/>
+        <w:tblLook w:firstColumn="1" w:firstRow="1" w:lastColumn="0" w:lastRow="0" w:noHBand="0" w:noVBand="1" w:val="04A0"/>
+        <w:tblBorders>
+          <w:top w:val="single" w:sz="4" w:space="0" w:color="D3D3D3"/>
+          <w:bottom w:val="single" w:sz="4" w:space="0" w:color="D3D3D3"/>
+          <w:insideH w:val="single" w:sz="4" w:space="0" w:color="D3D3D3"/>
+          <w:insideV w:val="none"/>
+          <w:left w:val="none"/>
+          <w:right w:val="none"/>
+        </w:tblBorders>
+      </w:tblPr>
+      <w:tblGrid>
+        <w:gridCol w:w="4896"/>
+        <w:gridCol w:w="4896"/>
+      </w:tblGrid>
+      <w:tr>
+        <w:tc>
+          <w:tcPr>
+            <w:tcW w:type="dxa" w:w="3168"/>
+            <w:shd w:fill="002060"/>
+            <w:tcMar>
+              <w:top w:w="60" w:type="dxa"/>
+              <w:bottom w:w="60" w:type="dxa"/>
+              <w:left w:w="80" w:type="dxa"/>
+              <w:right w:w="80" w:type="dxa"/>
+            </w:tcMar>
+          </w:tcPr>
+          <w:p>
+            <w:r>
+              <w:rPr>
+                <w:rFonts w:ascii="Calibri" w:hAnsi="Calibri"/>
+                <w:b/>
+                <w:color w:val="FFFFFF"/>
+                <w:sz w:val="19"/>
+              </w:rPr>
+              <w:t>Fitur Utama FAP Stage</w:t>
+            </w:r>
+          </w:p>
+        </w:tc>
+        <w:tc>
+          <w:tcPr>
+            <w:tcW w:type="dxa" w:w="6192"/>
+            <w:shd w:fill="002060"/>
+            <w:tcMar>
+              <w:top w:w="60" w:type="dxa"/>
+              <w:bottom w:w="60" w:type="dxa"/>
+              <w:left w:w="80" w:type="dxa"/>
+              <w:right w:w="80" w:type="dxa"/>
+            </w:tcMar>
+          </w:tcPr>
+          <w:p>
+            <w:r>
+              <w:rPr>
+                <w:rFonts w:ascii="Calibri" w:hAnsi="Calibri"/>
+                <w:b/>
+                <w:color w:val="FFFFFF"/>
+                <w:sz w:val="19"/>
+              </w:rPr>
+              <w:t>Deskripsi Fungsional &amp; Nilai Bisnis</w:t>
+            </w:r>
+          </w:p>
+        </w:tc>
+      </w:tr>
+      <w:tr>
+        <w:tc>
+          <w:tcPr>
+            <w:tcW w:type="dxa" w:w="3168"/>
+            <w:tcMar>
+              <w:top w:w="50" w:type="dxa"/>
+              <w:bottom w:w="50" w:type="dxa"/>
+              <w:left w:w="70" w:type="dxa"/>
+              <w:right w:w="70" w:type="dxa"/>
+            </w:tcMar>
+          </w:tcPr>
+          <w:p>
+            <w:pPr>
+              <w:spacing w:line="276" w:lineRule="auto"/>
+            </w:pPr>
+            <w:r>
+              <w:rPr>
+                <w:rFonts w:ascii="Calibri" w:hAnsi="Calibri"/>
+                <w:b/>
+                <w:sz w:val="18"/>
+              </w:rPr>
+              <w:t>Workspace Split 50-50 &amp; Live Excel Mirror</w:t>
+            </w:r>
+          </w:p>
+        </w:tc>
+        <w:tc>
+          <w:tcPr>
+            <w:tcW w:type="dxa" w:w="6192"/>
+            <w:tcMar>
+              <w:top w:w="50" w:type="dxa"/>
+              <w:bottom w:w="50" w:type="dxa"/>
+              <w:left w:w="70" w:type="dxa"/>
+              <w:right w:w="70" w:type="dxa"/>
+            </w:tcMar>
+          </w:tcPr>
+          <w:p>
+            <w:pPr>
+              <w:spacing w:line="276" w:lineRule="auto"/>
+            </w:pPr>
+            <w:r>
+              <w:rPr>
+                <w:rFonts w:ascii="Calibri" w:hAnsi="Calibri"/>
+                <w:sz w:val="18"/>
+              </w:rPr>
+              <w:t>Kolom kiri formulir input dan kolom kanan pratinjau lembar kerja resmi Excel 118-baris. Setiap ketikan di formulir kiri langsung terisi seketika di lembar Excel kanan secara real-time.</w:t>
+            </w:r>
+          </w:p>
+        </w:tc>
+      </w:tr>
+      <w:tr>
+        <w:tc>
+          <w:tcPr>
+            <w:tcW w:type="dxa" w:w="3168"/>
+            <w:tcMar>
+              <w:top w:w="50" w:type="dxa"/>
+              <w:bottom w:w="50" w:type="dxa"/>
+              <w:left w:w="70" w:type="dxa"/>
+              <w:right w:w="70" w:type="dxa"/>
+            </w:tcMar>
+            <w:shd w:fill="F9FAFB"/>
+          </w:tcPr>
+          <w:p>
+            <w:pPr>
+              <w:spacing w:line="276" w:lineRule="auto"/>
+            </w:pPr>
+            <w:r>
+              <w:rPr>
+                <w:rFonts w:ascii="Calibri" w:hAnsi="Calibri"/>
+                <w:b/>
+                <w:sz w:val="18"/>
+              </w:rPr>
+              <w:t>Formulir 5-Modul Kartu Accordion</w:t>
+            </w:r>
+          </w:p>
+        </w:tc>
+        <w:tc>
+          <w:tcPr>
+            <w:tcW w:type="dxa" w:w="6192"/>
+            <w:tcMar>
+              <w:top w:w="50" w:type="dxa"/>
+              <w:bottom w:w="50" w:type="dxa"/>
+              <w:left w:w="70" w:type="dxa"/>
+              <w:right w:w="70" w:type="dxa"/>
+            </w:tcMar>
+            <w:shd w:fill="F9FAFB"/>
+          </w:tcPr>
+          <w:p>
+            <w:pPr>
+              <w:spacing w:line="276" w:lineRule="auto"/>
+            </w:pPr>
+            <w:r>
+              <w:rPr>
+                <w:rFonts w:ascii="Calibri" w:hAnsi="Calibri"/>
+                <w:sz w:val="18"/>
+              </w:rPr>
+              <w:t>Membagi lebih dari 35 field input panjang menjadi 5 modul terstruktur (01 Identitas, 02 Domisili, 03 Profil Usaha, 04 PIC, 05 Proyek) lengkap dengan quick jump chips navigasi dua arah.</w:t>
+            </w:r>
+          </w:p>
+        </w:tc>
+      </w:tr>
+      <w:tr>
+        <w:tc>
+          <w:tcPr>
+            <w:tcW w:type="dxa" w:w="3168"/>
+            <w:tcMar>
+              <w:top w:w="50" w:type="dxa"/>
+              <w:bottom w:w="50" w:type="dxa"/>
+              <w:left w:w="70" w:type="dxa"/>
+              <w:right w:w="70" w:type="dxa"/>
+            </w:tcMar>
+          </w:tcPr>
+          <w:p>
+            <w:pPr>
+              <w:spacing w:line="276" w:lineRule="auto"/>
+            </w:pPr>
+            <w:r>
+              <w:rPr>
+                <w:rFonts w:ascii="Calibri" w:hAnsi="Calibri"/>
+                <w:b/>
+                <w:sz w:val="18"/>
+              </w:rPr>
+              <w:t>Dual Table Legal Notaris &amp; TinyMCE Editor</w:t>
+            </w:r>
+          </w:p>
+        </w:tc>
+        <w:tc>
+          <w:tcPr>
+            <w:tcW w:type="dxa" w:w="6192"/>
+            <w:tcMar>
+              <w:top w:w="50" w:type="dxa"/>
+              <w:bottom w:w="50" w:type="dxa"/>
+              <w:left w:w="70" w:type="dxa"/>
+              <w:right w:w="70" w:type="dxa"/>
+            </w:tcMar>
+          </w:tcPr>
+          <w:p>
+            <w:pPr>
+              <w:spacing w:line="276" w:lineRule="auto"/>
+            </w:pPr>
+            <w:r>
+              <w:rPr>
+                <w:rFonts w:ascii="Calibri" w:hAnsi="Calibri"/>
+                <w:sz w:val="18"/>
+              </w:rPr>
+              <w:t>Pemisahan akta aktif (rujukan yuridis saat ini) di tabel atas dan riwayat akta lama di tabel bawah, dilengkapi editor TinyMCE bernomor otomatis untuk mencatat klausul notaris.</w:t>
+            </w:r>
+          </w:p>
+        </w:tc>
+      </w:tr>
+      <w:tr>
+        <w:tc>
+          <w:tcPr>
+            <w:tcW w:type="dxa" w:w="3168"/>
+            <w:tcMar>
+              <w:top w:w="50" w:type="dxa"/>
+              <w:bottom w:w="50" w:type="dxa"/>
+              <w:left w:w="70" w:type="dxa"/>
+              <w:right w:w="70" w:type="dxa"/>
+            </w:tcMar>
+            <w:shd w:fill="F9FAFB"/>
+          </w:tcPr>
+          <w:p>
+            <w:pPr>
+              <w:spacing w:line="276" w:lineRule="auto"/>
+            </w:pPr>
+            <w:r>
+              <w:rPr>
+                <w:rFonts w:ascii="Calibri" w:hAnsi="Calibri"/>
+                <w:b/>
+                <w:sz w:val="18"/>
+              </w:rPr>
+              <w:t>Hard Gate Validasi Modal Saham 100.00%</w:t>
+            </w:r>
+          </w:p>
+        </w:tc>
+        <w:tc>
+          <w:tcPr>
+            <w:tcW w:type="dxa" w:w="6192"/>
+            <w:tcMar>
+              <w:top w:w="50" w:type="dxa"/>
+              <w:bottom w:w="50" w:type="dxa"/>
+              <w:left w:w="70" w:type="dxa"/>
+              <w:right w:w="70" w:type="dxa"/>
+            </w:tcMar>
+            <w:shd w:fill="F9FAFB"/>
+          </w:tcPr>
+          <w:p>
+            <w:pPr>
+              <w:spacing w:line="276" w:lineRule="auto"/>
+            </w:pPr>
+            <w:r>
+              <w:rPr>
+                <w:rFonts w:ascii="Calibri" w:hAnsi="Calibri"/>
+                <w:sz w:val="18"/>
+              </w:rPr>
+              <w:t>Sistem mengunci pengajuan jika total persentase saham seluruh pemegang saham tidak tepat 100.00% (mencegah kekeliruan perhitungan modal debitur).</w:t>
+            </w:r>
+          </w:p>
+        </w:tc>
+      </w:tr>
+      <w:tr>
+        <w:tc>
+          <w:tcPr>
+            <w:tcW w:type="dxa" w:w="3168"/>
+            <w:tcMar>
+              <w:top w:w="50" w:type="dxa"/>
+              <w:bottom w:w="50" w:type="dxa"/>
+              <w:left w:w="70" w:type="dxa"/>
+              <w:right w:w="70" w:type="dxa"/>
+            </w:tcMar>
+          </w:tcPr>
+          <w:p>
+            <w:pPr>
+              <w:spacing w:line="276" w:lineRule="auto"/>
+            </w:pPr>
+            <w:r>
+              <w:rPr>
+                <w:rFonts w:ascii="Calibri" w:hAnsi="Calibri"/>
+                <w:b/>
+                <w:sz w:val="18"/>
+              </w:rPr>
+              <w:t>Pusat Checklist &amp; Repositori 13 Berkas Dokumen</w:t>
+            </w:r>
+          </w:p>
+        </w:tc>
+        <w:tc>
+          <w:tcPr>
+            <w:tcW w:type="dxa" w:w="6192"/>
+            <w:tcMar>
+              <w:top w:w="50" w:type="dxa"/>
+              <w:bottom w:w="50" w:type="dxa"/>
+              <w:left w:w="70" w:type="dxa"/>
+              <w:right w:w="70" w:type="dxa"/>
+            </w:tcMar>
+          </w:tcPr>
+          <w:p>
+            <w:pPr>
+              <w:spacing w:line="276" w:lineRule="auto"/>
+            </w:pPr>
+            <w:r>
+              <w:rPr>
+                <w:rFonts w:ascii="Calibri" w:hAnsi="Calibri"/>
+                <w:sz w:val="18"/>
+              </w:rPr>
+              <w:t>Tab Dokumen menampilkan checklist 13 berkas wajib legalitas dan finansial, fitur unggah file digital (PDF/JPG), indikator status verifikasi, dan counter kelengkapan berkas.</w:t>
+            </w:r>
+          </w:p>
+        </w:tc>
+      </w:tr>
+    </w:tbl>
     <w:p>
       <w:pPr>
-        <w:spacing w:line="276" w:lineRule="auto" w:after="80"/>
+        <w:spacing w:after="80"/>
       </w:pPr>
-      <w:r>
-        <w:t>1. Login Pengguna: Marketing masuk ke sistem menggunakan akun resmi cabang (misal: marketing@liugong.local).</w:t>
-        <w:br/>
-        <w:t>2. Buka Origination Workspace: Memilih menu 'Applications' pada sidebar kiri.</w:t>
-        <w:br/>
-        <w:t>3. Inisiasi Aplikasi: Klik tombol '+ New application' (atau membuka draft berjalan). Sistem secara otomatis mengalokasikan nomor register resmi sesuai format standar: [Nomor Urut]/AF/[Bulan Romawi]/[Tahun] (contoh: 003/AF/IX/2026) dan menetapkan tahap awal pada 'FAP Stage' berstatus 'Draft'.</w:t>
-      </w:r>
     </w:p>
     <w:p>
       <w:pPr>
@@ -1183,74 +1520,435 @@
           <w:color w:val="ED7D31"/>
           <w:sz w:val="24"/>
         </w:rPr>
-        <w:t>Langkah 2: Pengisian Tab 1 (Customer &amp; PIC) — 5 Modul Accordion &amp; Digital Twin Excel</w:t>
+        <w:t>2.3. Pemetaan Titik-Titik Multi-Document AI OCR (Di Mana Saja OCR Bekerja)</w:t>
       </w:r>
     </w:p>
     <w:p>
       <w:pPr>
-        <w:spacing w:line="276" w:lineRule="auto" w:after="80"/>
+        <w:spacing w:line="276" w:lineRule="auto" w:after="120"/>
       </w:pPr>
       <w:r>
-        <w:t>Marketing melengkapi data identitas calon debitur pada formulir sebelah kiri yang terbagi ke dalam 5 modul kartu accordion bernomor:</w:t>
-        <w:br/>
-        <w:t>• Modul 01 - Identitas &amp; Klasifikasi Debitur:</w:t>
-        <w:br/>
-        <w:t xml:space="preserve">  - Memilih Kategori Pelanggan: 'Customer Baru' (New Customer) atau 'Customer Lama' (Existing Customer).</w:t>
-        <w:br/>
-        <w:t xml:space="preserve">  - Memilih Segmen Bisnis: 'Corporate', 'Commercial', atau 'Micro'.</w:t>
-        <w:br/>
-        <w:t xml:space="preserve">  - Menentukan Kantor Cabang LiuGong (misal: JKT01 Jakarta, SBY01 Surabaya, BPN01 Balikpapan, PLB01 Palembang, MDN01 Medan).</w:t>
-        <w:br/>
-        <w:t xml:space="preserve">  - Memverifikasi Tanggal Aplikasi Pembiayaan.</w:t>
-        <w:br/>
-        <w:br/>
-        <w:t>• Modul 02 - Kantor Registrasi &amp; Domisili (Otomasi Scan OCR NIB 13-Digit):</w:t>
-        <w:br/>
-        <w:t xml:space="preserve">  - Memasukkan Nama Legal Perusahaan (PT/CV).</w:t>
-        <w:br/>
-        <w:t xml:space="preserve">  - Pemanfaatan Fitur AI OCR NIB: Marketing menekan tombol pill '[ 📷 Scan OCR NIB ]' di header field NIB. Jendela pop-up modal terbuka; Marketing mengunggah berkas sertifikat standar NIB OSS RBA (format PDF atau gambar). AI OCR langsung membaca berkas dan mengekstrak secara otomatis 5 parameter kunci: 13-Digit Nomor NIB, Nama Perusahaan, Alamat Lengkap, Kode Pos, dan Tanggal Terbit OSS. Seluruh field langsung terisi otomatis tanpa risiko salah ketik.</w:t>
-        <w:br/>
-        <w:t xml:space="preserve">  - Melengkapi Kota, Provinsi, dan Nomor Telepon/Fax Kantor Pusat.</w:t>
-        <w:br/>
-        <w:br/>
-        <w:t>• Modul 03 - Profil Usaha &amp; Legalitas Awal:</w:t>
-        <w:br/>
-        <w:t xml:space="preserve">  - Memasukkan Bisnis Utama / KBLI (misal: Kontraktor Penambangan Nikel, Perkebunan Kelapa Sawit, Jasa Konstruksi Sipil).</w:t>
-        <w:br/>
-        <w:t xml:space="preserve">  - Mengisi Pengalaman Usaha (Tahun dan Bulan berjalan).</w:t>
-        <w:br/>
-        <w:t xml:space="preserve">  - Memasukkan Nomor NPWP Badan Usaha (15 atau 16 digit angka).</w:t>
-        <w:br/>
-        <w:t xml:space="preserve">  - Memasukkan Nomor Akta Pendirian dan Tanggal Akta Pendirian awal.</w:t>
-        <w:br/>
-        <w:br/>
-        <w:t>• Modul 04 - Kontak Utama / Penanggung Jawab (PIC):</w:t>
-        <w:br/>
-        <w:t xml:space="preserve">  - Mengisi Nama Lengkap PIC yang ditunjuk debitur untuk menangani pengadaan alat berat.</w:t>
-        <w:br/>
-        <w:t xml:space="preserve">  - Mengisi Jabatan Formal di Perusahaan (misal: Direktur Operasional, GM Procurement).</w:t>
-        <w:br/>
-        <w:t xml:space="preserve">  - Memasukkan Alamat Domisili Tempat Tinggal PIC, Kota, Provinsi, Kode Pos.</w:t>
-        <w:br/>
-        <w:t xml:space="preserve">  - Memasukkan Nomor Handphone / WhatsApp aktif dan Email kantor resmi PIC.</w:t>
-        <w:br/>
-        <w:br/>
-        <w:t>• Modul 05 - Segmentasi Industri &amp; Proyek Berjalan:</w:t>
-        <w:br/>
-        <w:t xml:space="preserve">  - Memilih Sektor Industri (Mining Nikel/Batubara, Construction, Forestry, Agriculture, Logistics).</w:t>
-        <w:br/>
-        <w:t xml:space="preserve">  - Mengisi Deskripsi Proyek / Kontrak Kerja yang sedang berjalan (nama bouwheer/pemberi kerja, lokasi tambang/konstruksi, durasi kontrak kerja).</w:t>
-        <w:br/>
-        <w:br/>
-        <w:t>• Verifikasi Visual Kolom Kanan (Live Excel Mirror 118-Baris):</w:t>
-        <w:br/>
-        <w:t xml:space="preserve">  - Selama Marketing mengetik pada modul kiri, lembar kerja resmi Excel (FAP-Document_APPROVED_v01.2025.xlsx) pada kolom kanan terisi secara real-time.</w:t>
-        <w:br/>
-        <w:t xml:space="preserve">  - Marketing dapat menggunakan tombol navigasi cepat (1. Identitas s/d 5. Proyek) di ribbon Excel untuk memverifikasi tata letak dokumen cetak A4.</w:t>
-        <w:br/>
-        <w:t xml:space="preserve">  - Marketing menekan tombol 'Simpan' untuk mengunci data FAP Stage ke basis data.</w:t>
+        <w:t>Untuk mempercepat proses onboarding dan meniadakan risiko kesalahan pengetikan nomor resmi (human-error typo), sistem menanamkan teknologi Optical Character Recognition (OCR) berbasis AI pada titik-titik krusial berikut:</w:t>
       </w:r>
     </w:p>
+    <w:tbl>
+      <w:tblPr>
+        <w:tblW w:type="auto" w:w="0"/>
+        <w:jc w:val="center"/>
+        <w:tblLayout w:type="fixed"/>
+        <w:tblLook w:firstColumn="1" w:firstRow="1" w:lastColumn="0" w:lastRow="0" w:noHBand="0" w:noVBand="1" w:val="04A0"/>
+        <w:tblBorders>
+          <w:top w:val="single" w:sz="4" w:space="0" w:color="D3D3D3"/>
+          <w:bottom w:val="single" w:sz="4" w:space="0" w:color="D3D3D3"/>
+          <w:insideH w:val="single" w:sz="4" w:space="0" w:color="D3D3D3"/>
+          <w:insideV w:val="none"/>
+          <w:left w:val="none"/>
+          <w:right w:val="none"/>
+        </w:tblBorders>
+      </w:tblPr>
+      <w:tblGrid>
+        <w:gridCol w:w="3264"/>
+        <w:gridCol w:w="3264"/>
+        <w:gridCol w:w="3264"/>
+      </w:tblGrid>
+      <w:tr>
+        <w:tc>
+          <w:tcPr>
+            <w:tcW w:type="dxa" w:w="2592"/>
+            <w:shd w:fill="002060"/>
+            <w:tcMar>
+              <w:top w:w="60" w:type="dxa"/>
+              <w:bottom w:w="60" w:type="dxa"/>
+              <w:left w:w="80" w:type="dxa"/>
+              <w:right w:w="80" w:type="dxa"/>
+            </w:tcMar>
+          </w:tcPr>
+          <w:p>
+            <w:r>
+              <w:rPr>
+                <w:rFonts w:ascii="Calibri" w:hAnsi="Calibri"/>
+                <w:b/>
+                <w:color w:val="FFFFFF"/>
+                <w:sz w:val="19"/>
+              </w:rPr>
+              <w:t>Teknologi OCR</w:t>
+            </w:r>
+          </w:p>
+        </w:tc>
+        <w:tc>
+          <w:tcPr>
+            <w:tcW w:type="dxa" w:w="3168"/>
+            <w:shd w:fill="002060"/>
+            <w:tcMar>
+              <w:top w:w="60" w:type="dxa"/>
+              <w:bottom w:w="60" w:type="dxa"/>
+              <w:left w:w="80" w:type="dxa"/>
+              <w:right w:w="80" w:type="dxa"/>
+            </w:tcMar>
+          </w:tcPr>
+          <w:p>
+            <w:r>
+              <w:rPr>
+                <w:rFonts w:ascii="Calibri" w:hAnsi="Calibri"/>
+                <w:b/>
+                <w:color w:val="FFFFFF"/>
+                <w:sz w:val="19"/>
+              </w:rPr>
+              <w:t>Titik Lokasi pada Sistem</w:t>
+            </w:r>
+          </w:p>
+        </w:tc>
+        <w:tc>
+          <w:tcPr>
+            <w:tcW w:type="dxa" w:w="3600"/>
+            <w:shd w:fill="002060"/>
+            <w:tcMar>
+              <w:top w:w="60" w:type="dxa"/>
+              <w:bottom w:w="60" w:type="dxa"/>
+              <w:left w:w="80" w:type="dxa"/>
+              <w:right w:w="80" w:type="dxa"/>
+            </w:tcMar>
+          </w:tcPr>
+          <w:p>
+            <w:r>
+              <w:rPr>
+                <w:rFonts w:ascii="Calibri" w:hAnsi="Calibri"/>
+                <w:b/>
+                <w:color w:val="FFFFFF"/>
+                <w:sz w:val="19"/>
+              </w:rPr>
+              <w:t>Parameter yang Diekstrak Otomatis</w:t>
+            </w:r>
+          </w:p>
+        </w:tc>
+      </w:tr>
+      <w:tr>
+        <w:tc>
+          <w:tcPr>
+            <w:tcW w:type="dxa" w:w="2592"/>
+            <w:tcMar>
+              <w:top w:w="50" w:type="dxa"/>
+              <w:bottom w:w="50" w:type="dxa"/>
+              <w:left w:w="70" w:type="dxa"/>
+              <w:right w:w="70" w:type="dxa"/>
+            </w:tcMar>
+          </w:tcPr>
+          <w:p>
+            <w:pPr>
+              <w:spacing w:line="276" w:lineRule="auto"/>
+            </w:pPr>
+            <w:r>
+              <w:rPr>
+                <w:rFonts w:ascii="Calibri" w:hAnsi="Calibri"/>
+                <w:b/>
+                <w:sz w:val="18"/>
+              </w:rPr>
+              <w:t>OCR NIB OSS (13-Digit)</w:t>
+            </w:r>
+          </w:p>
+        </w:tc>
+        <w:tc>
+          <w:tcPr>
+            <w:tcW w:type="dxa" w:w="3168"/>
+            <w:tcMar>
+              <w:top w:w="50" w:type="dxa"/>
+              <w:bottom w:w="50" w:type="dxa"/>
+              <w:left w:w="70" w:type="dxa"/>
+              <w:right w:w="70" w:type="dxa"/>
+            </w:tcMar>
+          </w:tcPr>
+          <w:p>
+            <w:pPr>
+              <w:spacing w:line="276" w:lineRule="auto"/>
+            </w:pPr>
+            <w:r>
+              <w:rPr>
+                <w:rFonts w:ascii="Calibri" w:hAnsi="Calibri"/>
+                <w:sz w:val="18"/>
+              </w:rPr>
+              <w:t>Tab 1 (Customer &amp; PIC)</w:t>
+              <w:br/>
+              <w:t>Modul 02: Kantor Registrasi &amp; Domisili (Tombol pill [Scan OCR NIB])</w:t>
+            </w:r>
+          </w:p>
+        </w:tc>
+        <w:tc>
+          <w:tcPr>
+            <w:tcW w:type="dxa" w:w="3600"/>
+            <w:tcMar>
+              <w:top w:w="50" w:type="dxa"/>
+              <w:bottom w:w="50" w:type="dxa"/>
+              <w:left w:w="70" w:type="dxa"/>
+              <w:right w:w="70" w:type="dxa"/>
+            </w:tcMar>
+          </w:tcPr>
+          <w:p>
+            <w:pPr>
+              <w:spacing w:line="276" w:lineRule="auto"/>
+            </w:pPr>
+            <w:r>
+              <w:rPr>
+                <w:rFonts w:ascii="Calibri" w:hAnsi="Calibri"/>
+                <w:sz w:val="18"/>
+              </w:rPr>
+              <w:t>• Nomor NIB (13 digit)</w:t>
+              <w:br/>
+              <w:t>• Nama Resmi Perusahaan</w:t>
+              <w:br/>
+              <w:t>• Alamat Domisili Kantor</w:t>
+              <w:br/>
+              <w:t>• Kode Pos</w:t>
+              <w:br/>
+              <w:t>• Tanggal Terbit OSS BKPM</w:t>
+            </w:r>
+          </w:p>
+        </w:tc>
+      </w:tr>
+      <w:tr>
+        <w:tc>
+          <w:tcPr>
+            <w:tcW w:type="dxa" w:w="2592"/>
+            <w:tcMar>
+              <w:top w:w="50" w:type="dxa"/>
+              <w:bottom w:w="50" w:type="dxa"/>
+              <w:left w:w="70" w:type="dxa"/>
+              <w:right w:w="70" w:type="dxa"/>
+            </w:tcMar>
+            <w:shd w:fill="F9FAFB"/>
+          </w:tcPr>
+          <w:p>
+            <w:pPr>
+              <w:spacing w:line="276" w:lineRule="auto"/>
+            </w:pPr>
+            <w:r>
+              <w:rPr>
+                <w:rFonts w:ascii="Calibri" w:hAnsi="Calibri"/>
+                <w:b/>
+                <w:sz w:val="18"/>
+              </w:rPr>
+              <w:t>OCR e-KTP WNI</w:t>
+            </w:r>
+          </w:p>
+        </w:tc>
+        <w:tc>
+          <w:tcPr>
+            <w:tcW w:type="dxa" w:w="3168"/>
+            <w:tcMar>
+              <w:top w:w="50" w:type="dxa"/>
+              <w:bottom w:w="50" w:type="dxa"/>
+              <w:left w:w="70" w:type="dxa"/>
+              <w:right w:w="70" w:type="dxa"/>
+            </w:tcMar>
+            <w:shd w:fill="F9FAFB"/>
+          </w:tcPr>
+          <w:p>
+            <w:pPr>
+              <w:spacing w:line="276" w:lineRule="auto"/>
+            </w:pPr>
+            <w:r>
+              <w:rPr>
+                <w:rFonts w:ascii="Calibri" w:hAnsi="Calibri"/>
+                <w:sz w:val="18"/>
+              </w:rPr>
+              <w:t>Tab 3 (Stakeholders)</w:t>
+              <w:br/>
+              <w:t>Form Input Pengurus Direksi &amp; Komisaris Berkewarganegaraan Indonesia</w:t>
+            </w:r>
+          </w:p>
+        </w:tc>
+        <w:tc>
+          <w:tcPr>
+            <w:tcW w:type="dxa" w:w="3600"/>
+            <w:tcMar>
+              <w:top w:w="50" w:type="dxa"/>
+              <w:bottom w:w="50" w:type="dxa"/>
+              <w:left w:w="70" w:type="dxa"/>
+              <w:right w:w="70" w:type="dxa"/>
+            </w:tcMar>
+            <w:shd w:fill="F9FAFB"/>
+          </w:tcPr>
+          <w:p>
+            <w:pPr>
+              <w:spacing w:line="276" w:lineRule="auto"/>
+            </w:pPr>
+            <w:r>
+              <w:rPr>
+                <w:rFonts w:ascii="Calibri" w:hAnsi="Calibri"/>
+                <w:sz w:val="18"/>
+              </w:rPr>
+              <w:t>• NIK KTP (16 digit)</w:t>
+              <w:br/>
+              <w:t>• Nama Lengkap Pengurus</w:t>
+              <w:br/>
+              <w:t>• Tempat &amp; Tanggal Lahir</w:t>
+              <w:br/>
+              <w:t>• Jenis Kelamin</w:t>
+              <w:br/>
+              <w:t>• Alamat KTP</w:t>
+            </w:r>
+          </w:p>
+        </w:tc>
+      </w:tr>
+      <w:tr>
+        <w:tc>
+          <w:tcPr>
+            <w:tcW w:type="dxa" w:w="2592"/>
+            <w:tcMar>
+              <w:top w:w="50" w:type="dxa"/>
+              <w:bottom w:w="50" w:type="dxa"/>
+              <w:left w:w="70" w:type="dxa"/>
+              <w:right w:w="70" w:type="dxa"/>
+            </w:tcMar>
+          </w:tcPr>
+          <w:p>
+            <w:pPr>
+              <w:spacing w:line="276" w:lineRule="auto"/>
+            </w:pPr>
+            <w:r>
+              <w:rPr>
+                <w:rFonts w:ascii="Calibri" w:hAnsi="Calibri"/>
+                <w:b/>
+                <w:sz w:val="18"/>
+              </w:rPr>
+              <w:t>OCR Paspor &amp; E-KITAS (Expatriate)</w:t>
+            </w:r>
+          </w:p>
+        </w:tc>
+        <w:tc>
+          <w:tcPr>
+            <w:tcW w:type="dxa" w:w="3168"/>
+            <w:tcMar>
+              <w:top w:w="50" w:type="dxa"/>
+              <w:bottom w:w="50" w:type="dxa"/>
+              <w:left w:w="70" w:type="dxa"/>
+              <w:right w:w="70" w:type="dxa"/>
+            </w:tcMar>
+          </w:tcPr>
+          <w:p>
+            <w:pPr>
+              <w:spacing w:line="276" w:lineRule="auto"/>
+            </w:pPr>
+            <w:r>
+              <w:rPr>
+                <w:rFonts w:ascii="Calibri" w:hAnsi="Calibri"/>
+                <w:sz w:val="18"/>
+              </w:rPr>
+              <w:t>Tab 3 (Stakeholders)</w:t>
+              <w:br/>
+              <w:t>Form Input Direksi, Komisaris, atau Pemegang Saham WNA (Ekspatriat)</w:t>
+            </w:r>
+          </w:p>
+        </w:tc>
+        <w:tc>
+          <w:tcPr>
+            <w:tcW w:type="dxa" w:w="3600"/>
+            <w:tcMar>
+              <w:top w:w="50" w:type="dxa"/>
+              <w:bottom w:w="50" w:type="dxa"/>
+              <w:left w:w="70" w:type="dxa"/>
+              <w:right w:w="70" w:type="dxa"/>
+            </w:tcMar>
+          </w:tcPr>
+          <w:p>
+            <w:pPr>
+              <w:spacing w:line="276" w:lineRule="auto"/>
+            </w:pPr>
+            <w:r>
+              <w:rPr>
+                <w:rFonts w:ascii="Calibri" w:hAnsi="Calibri"/>
+                <w:sz w:val="18"/>
+              </w:rPr>
+              <w:t>• Nomor Buku Paspor</w:t>
+              <w:br/>
+              <w:t>• Masa Berlaku Paspor</w:t>
+              <w:br/>
+              <w:t>• Nomor Izin Tinggal E-KITAS</w:t>
+              <w:br/>
+              <w:t>• Negara Asal / Kewarganegaraan</w:t>
+            </w:r>
+          </w:p>
+        </w:tc>
+      </w:tr>
+      <w:tr>
+        <w:tc>
+          <w:tcPr>
+            <w:tcW w:type="dxa" w:w="2592"/>
+            <w:tcMar>
+              <w:top w:w="50" w:type="dxa"/>
+              <w:bottom w:w="50" w:type="dxa"/>
+              <w:left w:w="70" w:type="dxa"/>
+              <w:right w:w="70" w:type="dxa"/>
+            </w:tcMar>
+            <w:shd w:fill="F9FAFB"/>
+          </w:tcPr>
+          <w:p>
+            <w:pPr>
+              <w:spacing w:line="276" w:lineRule="auto"/>
+            </w:pPr>
+            <w:r>
+              <w:rPr>
+                <w:rFonts w:ascii="Calibri" w:hAnsi="Calibri"/>
+                <w:b/>
+                <w:sz w:val="18"/>
+              </w:rPr>
+              <w:t>OCR NPWP (Badan &amp; Pribadi)</w:t>
+            </w:r>
+          </w:p>
+        </w:tc>
+        <w:tc>
+          <w:tcPr>
+            <w:tcW w:type="dxa" w:w="3168"/>
+            <w:tcMar>
+              <w:top w:w="50" w:type="dxa"/>
+              <w:bottom w:w="50" w:type="dxa"/>
+              <w:left w:w="70" w:type="dxa"/>
+              <w:right w:w="70" w:type="dxa"/>
+            </w:tcMar>
+            <w:shd w:fill="F9FAFB"/>
+          </w:tcPr>
+          <w:p>
+            <w:pPr>
+              <w:spacing w:line="276" w:lineRule="auto"/>
+            </w:pPr>
+            <w:r>
+              <w:rPr>
+                <w:rFonts w:ascii="Calibri" w:hAnsi="Calibri"/>
+                <w:sz w:val="18"/>
+              </w:rPr>
+              <w:t>Tab 1 (Modul 03 Profil Usaha) &amp; Tab 3 (Stakeholders)</w:t>
+            </w:r>
+          </w:p>
+        </w:tc>
+        <w:tc>
+          <w:tcPr>
+            <w:tcW w:type="dxa" w:w="3600"/>
+            <w:tcMar>
+              <w:top w:w="50" w:type="dxa"/>
+              <w:bottom w:w="50" w:type="dxa"/>
+              <w:left w:w="70" w:type="dxa"/>
+              <w:right w:w="70" w:type="dxa"/>
+            </w:tcMar>
+            <w:shd w:fill="F9FAFB"/>
+          </w:tcPr>
+          <w:p>
+            <w:pPr>
+              <w:spacing w:line="276" w:lineRule="auto"/>
+            </w:pPr>
+            <w:r>
+              <w:rPr>
+                <w:rFonts w:ascii="Calibri" w:hAnsi="Calibri"/>
+                <w:sz w:val="18"/>
+              </w:rPr>
+              <w:t>• Nomor Pokok Wajib Pajak (15 atau 16 digit valid DJP)</w:t>
+              <w:br/>
+              <w:t>• Nama Terdaftar Pajak</w:t>
+              <w:br/>
+              <w:t>• Alamat Terdaftar Pajak</w:t>
+            </w:r>
+          </w:p>
+        </w:tc>
+      </w:tr>
+    </w:tbl>
     <w:p>
       <w:pPr>
         <w:spacing w:before="160" w:after="60"/>
@@ -1268,7 +1966,7 @@
               <a:graphicData uri="http://schemas.openxmlformats.org/drawingml/2006/picture">
                 <pic:pic>
                   <pic:nvPicPr>
-                    <pic:cNvPr id="0" name="02_step_click_new_application.png"/>
+                    <pic:cNvPr id="0" name="03_step_nib_ocr_modal_opened.png"/>
                     <pic:cNvPicPr/>
                   </pic:nvPicPr>
                   <pic:blipFill>
@@ -1303,62 +2001,7 @@
           <w:color w:val="64748B"/>
           <w:sz w:val="19"/>
         </w:rPr>
-        <w:t>Gambar: Dual-Pane Split Workspace 50-50: Form Input Accordion Kiri dan Live Digital Twin Excel FAP Kanan (Live System)</w:t>
-      </w:r>
-    </w:p>
-    <w:p>
-      <w:pPr>
-        <w:spacing w:before="160" w:after="60"/>
-        <w:jc w:val="center"/>
-      </w:pPr>
-      <w:r>
-        <w:drawing>
-          <wp:inline xmlns:a="http://schemas.openxmlformats.org/drawingml/2006/main" xmlns:pic="http://schemas.openxmlformats.org/drawingml/2006/picture">
-            <wp:extent cx="5669280" cy="3543300"/>
-            <wp:docPr id="5" name="Picture 5"/>
-            <wp:cNvGraphicFramePr>
-              <a:graphicFrameLocks noChangeAspect="1"/>
-            </wp:cNvGraphicFramePr>
-            <a:graphic>
-              <a:graphicData uri="http://schemas.openxmlformats.org/drawingml/2006/picture">
-                <pic:pic>
-                  <pic:nvPicPr>
-                    <pic:cNvPr id="0" name="03_step_nib_ocr_modal_opened.png"/>
-                    <pic:cNvPicPr/>
-                  </pic:nvPicPr>
-                  <pic:blipFill>
-                    <a:blip r:embed="rId13"/>
-                    <a:stretch>
-                      <a:fillRect/>
-                    </a:stretch>
-                  </pic:blipFill>
-                  <pic:spPr>
-                    <a:xfrm>
-                      <a:off x="0" y="0"/>
-                      <a:ext cx="5669280" cy="3543300"/>
-                    </a:xfrm>
-                    <a:prstGeom prst="rect"/>
-                  </pic:spPr>
-                </pic:pic>
-              </a:graphicData>
-            </a:graphic>
-          </wp:inline>
-        </w:drawing>
-      </w:r>
-    </w:p>
-    <w:p>
-      <w:pPr>
-        <w:spacing w:after="160"/>
-        <w:jc w:val="center"/>
-      </w:pPr>
-      <w:r>
-        <w:rPr>
-          <w:rFonts w:ascii="Calibri" w:hAnsi="Calibri"/>
-          <w:i/>
-          <w:color w:val="64748B"/>
-          <w:sz w:val="19"/>
-        </w:rPr>
-        <w:t>Gambar: Fitur Modal Scan OCR Dokumen NIB OSS RBA dengan Ekstraksi 5 Parameter Kunci Otomatis (Live System)</w:t>
+        <w:t>Gambar: Modal Dialog Scan OCR NIB 13-Digit Terbuka Langsung dari Form Domisili Perusahaan</w:t>
       </w:r>
     </w:p>
     <w:p>
@@ -1372,322 +2015,40 @@
           <w:color w:val="ED7D31"/>
           <w:sz w:val="24"/>
         </w:rPr>
-        <w:t>Langkah 3: Pengisian Tab 2 (Legal Deeds) — Akta Notaris &amp; SK Kemenkumham</w:t>
+        <w:t>2.4. Alur Rantai Pembiayaan: Dari FAP Stage Hingga Proposal Final</w:t>
       </w:r>
     </w:p>
     <w:p>
       <w:pPr>
-        <w:spacing w:line="276" w:lineRule="auto" w:after="80"/>
+        <w:spacing w:line="276" w:lineRule="auto" w:after="120"/>
       </w:pPr>
       <w:r>
-        <w:t>Setelah data Customer &amp; PIC tersimpan, Marketing beralih ke Tab 2 'Legal':</w:t>
+        <w:t>FAP Stage tidak berdiri sendiri, melainkan menjadi fondasi data utama yang mengalir mulus ke seluruh tahapan berikutnya hingga penerbitan proposal komersial:</w:t>
         <w:br/>
-        <w:t>1. Perekaman Akta Pendirian:</w:t>
         <w:br/>
-        <w:t xml:space="preserve">   - Klik tombol '+ Tambah akta', pilih tipe 'Akta Pendirian'.</w:t>
+        <w:t>1. FAP STAGE (Customer Intake &amp; Profiling):</w:t>
         <w:br/>
-        <w:t xml:space="preserve">   - Memasukkan Nomor Akta Notaris, Tanggal Akta, Nama Notaris Pembuat Akta.</w:t>
+        <w:t xml:space="preserve">   Marketing menghimpun profil debitur, legalitas akta, susunan saham (100%), dan 13 berkas fisik. Data tervalidasi dan siap diproses lebih lanjut.</w:t>
         <w:br/>
-        <w:t xml:space="preserve">   - Memasukkan Nomor SK Pengesahan Kemenkumham dan Tanggal SK.</w:t>
         <w:br/>
-        <w:t>2. Perekaman Akta Perubahan Terakhir:</w:t>
+        <w:t>2. [THE INTELLIGENT BRIDGE: PEFINDO BIRO KREDIT GATEWAY]:</w:t>
         <w:br/>
-        <w:t xml:space="preserve">   - Menambahkan baris akta perubahan, memilih tipe 'Akta Perubahan'.</w:t>
+        <w:t xml:space="preserve">   Sebelum masuk ke analisis mendalam, sistem secara otomatis menembakkan data identitas (NIB/NPWP) ke Pefindo Biro Kredit. Penarikan Credit Score IdScore (skala 250–900) dan total eksposur kredit berjalan disajikan secara instan dalam hitungan detik.</w:t>
         <w:br/>
-        <w:t xml:space="preserve">   - Memasukkan Nomor Akta Perubahan, Tanggal Akta, Nomor dan Tanggal SK Menkumham Perubahan.</w:t>
         <w:br/>
-        <w:t xml:space="preserve">   - Memilih chip 'Kategori Remarks': Saham, Kepengurusan, Modal, atau Anggaran Dasar.</w:t>
+        <w:t>3. PRE-ANALYSIS (Risk Screening &amp; Gatekeeping):</w:t>
         <w:br/>
-        <w:t xml:space="preserve">   - Pencatatan Ringkasan Klausul: Menggunakan teks editor TinyMCE dengan penomoran berurutan otomatis (continuous ordered list) untuk mendokumentasikan pasal-pasal penting perubahan akta.</w:t>
+        <w:t xml:space="preserve">   Credit Analyst melakukan skrining kelayakan awal (Go / Review / No-Go). Pada roadmap Q1 2027, fitur OCR NPWP / SPT Tahunan akan membaca lampiran pajak dan otomatis mengisikan angka omzet, aset, dan modal ke tabel Financial Statements tanpa ketik manual.</w:t>
         <w:br/>
-        <w:t>3. Verifikasi Status Akta:</w:t>
         <w:br/>
-        <w:t xml:space="preserve">   - Sistem secara otomatis menempatkan akta yang berlaku efektif pada tabel atas 'Akta Aktif &amp; Rujukan Terkini', sementara draf atau akta lampau diarsipkan ke tabel bawah 'Riwayat Akta Lama (Historical)'.</w:t>
-      </w:r>
-    </w:p>
-    <w:p>
-      <w:pPr>
-        <w:spacing w:before="160" w:after="60"/>
-        <w:jc w:val="center"/>
-      </w:pPr>
-      <w:r>
-        <w:drawing>
-          <wp:inline xmlns:a="http://schemas.openxmlformats.org/drawingml/2006/main" xmlns:pic="http://schemas.openxmlformats.org/drawingml/2006/picture">
-            <wp:extent cx="5669280" cy="3543300"/>
-            <wp:docPr id="6" name="Picture 6"/>
-            <wp:cNvGraphicFramePr>
-              <a:graphicFrameLocks noChangeAspect="1"/>
-            </wp:cNvGraphicFramePr>
-            <a:graphic>
-              <a:graphicData uri="http://schemas.openxmlformats.org/drawingml/2006/picture">
-                <pic:pic>
-                  <pic:nvPicPr>
-                    <pic:cNvPr id="0" name="tab_2_legal.png"/>
-                    <pic:cNvPicPr/>
-                  </pic:nvPicPr>
-                  <pic:blipFill>
-                    <a:blip r:embed="rId14"/>
-                    <a:stretch>
-                      <a:fillRect/>
-                    </a:stretch>
-                  </pic:blipFill>
-                  <pic:spPr>
-                    <a:xfrm>
-                      <a:off x="0" y="0"/>
-                      <a:ext cx="5669280" cy="3543300"/>
-                    </a:xfrm>
-                    <a:prstGeom prst="rect"/>
-                  </pic:spPr>
-                </pic:pic>
-              </a:graphicData>
-            </a:graphic>
-          </wp:inline>
-        </w:drawing>
-      </w:r>
-    </w:p>
-    <w:p>
-      <w:pPr>
-        <w:spacing w:after="160"/>
-        <w:jc w:val="center"/>
-      </w:pPr>
-      <w:r>
-        <w:rPr>
-          <w:rFonts w:ascii="Calibri" w:hAnsi="Calibri"/>
-          <w:i/>
-          <w:color w:val="64748B"/>
-          <w:sz w:val="19"/>
-        </w:rPr>
-        <w:t>Gambar: Manajemen Akta Legalitas: Tabel Akta Aktif Rujukan Terkini dan Riwayat Akta Historis (Live System)</w:t>
-      </w:r>
-    </w:p>
-    <w:p>
-      <w:pPr>
-        <w:spacing w:before="160" w:after="40"/>
-      </w:pPr>
-      <w:r>
-        <w:rPr>
-          <w:rFonts w:ascii="Calibri" w:hAnsi="Calibri"/>
-          <w:b/>
-          <w:color w:val="ED7D31"/>
-          <w:sz w:val="24"/>
-        </w:rPr>
-        <w:t>Langkah 4: Pengisian Tab 3 (Stakeholders) — Struktur Pengurus &amp; Validasi Saham Mutlak 100%</w:t>
-      </w:r>
-    </w:p>
-    <w:p>
-      <w:pPr>
-        <w:spacing w:line="276" w:lineRule="auto" w:after="80"/>
-      </w:pPr>
-      <w:r>
-        <w:t>Marketing beralih ke Tab 3 'Stakeholders' untuk mendata jajaran manajemen dan pemegang saham:</w:t>
+        <w:t>4. ICLF (Initial Credit Limit Facility &amp; CDE):</w:t>
         <w:br/>
-        <w:t>1. Input Pengurus Perseroan:</w:t>
+        <w:t xml:space="preserve">   Penetapan pagu batas atas kredit debitur atau grup usaha sesuai ketentuan BMPP OJK, didukung Credit Decision Engine (CDE Financial di Q2 2027 dan CDE Bank Statement di Q3 2027).</w:t>
         <w:br/>
-        <w:t xml:space="preserve">   - Menambahkan Direktur Utama, Direktur, Komisaris Utama, dan Komisaris.</w:t>
         <w:br/>
-        <w:t xml:space="preserve">   - Menentukan kewarganegaraan: WNI (wajib memasukkan 16-digit NIK e-KTP) atau WNA (memasukkan Nomor Paspor &amp; izin tinggal E-KITAS untuk direksi ekspatriat mitra LiuGong).</w:t>
+        <w:t>5. PROPOSAL (Final Commercial Dossier &amp; Committee Approval):</w:t>
         <w:br/>
-        <w:t>2. Input Pemegang Saham &amp; Modal:</w:t>
-        <w:br/>
-        <w:t xml:space="preserve">   - Menambahkan pemilik saham perorangan maupun badan hukum (memasukkan NPWP Perusahaan Pemegang Saham).</w:t>
-        <w:br/>
-        <w:t xml:space="preserve">   - Memasukkan jumlah lembar saham dan nilai nominal per lembar saham.</w:t>
-        <w:br/>
-        <w:t>3. Validasi Keras Mutlak 100% (Hard Gate Invariant):</w:t>
-        <w:br/>
-        <w:t xml:space="preserve">   - Sistem menghitung persentase kepemilikan modal secara real-time.</w:t>
-        <w:br/>
-        <w:t xml:space="preserve">   - Total persentase seluruh pemegang saham WAJIB tepat 100.00%. Jika total saham kurang (misal 99.5%) atau lebih (misal 101.0%), sistem memunculkan indikator peringatan merah dan memblokir tombol pengajuan aplikasi. Hal ini mengunci kepatuhan hukum kepemilikan perseroan sebelum melangkah ke tahap berikutnya.</w:t>
-      </w:r>
-    </w:p>
-    <w:p>
-      <w:pPr>
-        <w:spacing w:before="160" w:after="60"/>
-        <w:jc w:val="center"/>
-      </w:pPr>
-      <w:r>
-        <w:drawing>
-          <wp:inline xmlns:a="http://schemas.openxmlformats.org/drawingml/2006/main" xmlns:pic="http://schemas.openxmlformats.org/drawingml/2006/picture">
-            <wp:extent cx="5669280" cy="3543300"/>
-            <wp:docPr id="7" name="Picture 7"/>
-            <wp:cNvGraphicFramePr>
-              <a:graphicFrameLocks noChangeAspect="1"/>
-            </wp:cNvGraphicFramePr>
-            <a:graphic>
-              <a:graphicData uri="http://schemas.openxmlformats.org/drawingml/2006/picture">
-                <pic:pic>
-                  <pic:nvPicPr>
-                    <pic:cNvPr id="0" name="07_step_tab3_stakeholders.png"/>
-                    <pic:cNvPicPr/>
-                  </pic:nvPicPr>
-                  <pic:blipFill>
-                    <a:blip r:embed="rId15"/>
-                    <a:stretch>
-                      <a:fillRect/>
-                    </a:stretch>
-                  </pic:blipFill>
-                  <pic:spPr>
-                    <a:xfrm>
-                      <a:off x="0" y="0"/>
-                      <a:ext cx="5669280" cy="3543300"/>
-                    </a:xfrm>
-                    <a:prstGeom prst="rect"/>
-                  </pic:spPr>
-                </pic:pic>
-              </a:graphicData>
-            </a:graphic>
-          </wp:inline>
-        </w:drawing>
-      </w:r>
-    </w:p>
-    <w:p>
-      <w:pPr>
-        <w:spacing w:after="160"/>
-        <w:jc w:val="center"/>
-      </w:pPr>
-      <w:r>
-        <w:rPr>
-          <w:rFonts w:ascii="Calibri" w:hAnsi="Calibri"/>
-          <w:i/>
-          <w:color w:val="64748B"/>
-          <w:sz w:val="19"/>
-        </w:rPr>
-        <w:t>Gambar: Struktur Pemegang Saham &amp; Jajaran Pengurus dengan Validasi Keras Kepemilikan Modal 100% (Live System)</w:t>
-      </w:r>
-    </w:p>
-    <w:p>
-      <w:pPr>
-        <w:spacing w:before="160" w:after="40"/>
-      </w:pPr>
-      <w:r>
-        <w:rPr>
-          <w:rFonts w:ascii="Calibri" w:hAnsi="Calibri"/>
-          <w:b/>
-          <w:color w:val="ED7D31"/>
-          <w:sz w:val="24"/>
-        </w:rPr>
-        <w:t>Langkah 5: Pengisian Tab 4 (Documents) — Verifikasi 13 Berkas Wajib &amp; Unggah Digital</w:t>
-      </w:r>
-    </w:p>
-    <w:p>
-      <w:pPr>
-        <w:spacing w:line="276" w:lineRule="auto" w:after="80"/>
-      </w:pPr>
-      <w:r>
-        <w:t>Sesuai instruksi Direksi, Tab Dokumen dihadirkan secara penuh pada FAP Stage untuk memastikan berkas fisik terdigitalisasi sejak awal:</w:t>
-        <w:br/>
-        <w:t>1. Checklist 13 Dokumen Persyaratan Wajib:</w:t>
-        <w:br/>
-        <w:t xml:space="preserve">   1. KTP Pengurus (Seluruh Direksi &amp; Komisaris)</w:t>
-        <w:br/>
-        <w:t xml:space="preserve">   2. NPWP Badan Usaha &amp; Pengurus</w:t>
-        <w:br/>
-        <w:t xml:space="preserve">   3. NIB (Nomor Induk Berusaha) OSS BKPM</w:t>
-        <w:br/>
-        <w:t xml:space="preserve">   4. Akta Pendirian Perusahaan + SK Pengesahan Kemenkumham</w:t>
-        <w:br/>
-        <w:t xml:space="preserve">   5. Akta Perubahan Terakhir + SK Penerimaan Pemberitahuan Kemenkumham</w:t>
-        <w:br/>
-        <w:t xml:space="preserve">   6. Rekening Koran Operasional Perusahaan (3–6 Bulan Terakhir)</w:t>
-        <w:br/>
-        <w:t xml:space="preserve">   7. Laporan Keuangan Neraca &amp; Laba Rugi (Audited / In-House)</w:t>
-        <w:br/>
-        <w:t xml:space="preserve">   8. SPT Tahunan Pajak Penghasilan Badan</w:t>
-        <w:br/>
-        <w:t xml:space="preserve">   9. Profil Perusahaan (Company Profile &amp; Portofolio Pekerjaan)</w:t>
-        <w:br/>
-        <w:t xml:space="preserve">   10. Salinan Kontrak Kerja / SPK Proyek Berjalan dengan Bouwheer</w:t>
-        <w:br/>
-        <w:t xml:space="preserve">   11. Izin Usaha Sektoral (IUJP/IUP untuk Pertambangan, SBU Konstruksi)</w:t>
-        <w:br/>
-        <w:t xml:space="preserve">   12. Formulir Aplikasi Pembiayaan (FAP) Asli Bertandatangan Basah &amp; Cap Basah Perusahaan</w:t>
-        <w:br/>
-        <w:t xml:space="preserve">   13. Surat Kuasa Persetujuan Pengecekan Data Kredit Pefindo Biro Kredit</w:t>
-        <w:br/>
-        <w:t>2. Unggah Berkas Digital: Marketing menekan tombol 'Upload' pada masing-masing dokumen, memilih berkas scan (PDF/JPG) dari komputer.</w:t>
-        <w:br/>
-        <w:t>3. Pemantauan Kelengkapan: Status berkas berubah menjadi 'Uploaded/Verified' dan counter kelengkapan di header tab bertambah (misal: 'Documents 13/13').</w:t>
-      </w:r>
-    </w:p>
-    <w:p>
-      <w:pPr>
-        <w:spacing w:before="160" w:after="60"/>
-        <w:jc w:val="center"/>
-      </w:pPr>
-      <w:r>
-        <w:drawing>
-          <wp:inline xmlns:a="http://schemas.openxmlformats.org/drawingml/2006/main" xmlns:pic="http://schemas.openxmlformats.org/drawingml/2006/picture">
-            <wp:extent cx="5669280" cy="3543300"/>
-            <wp:docPr id="8" name="Picture 8"/>
-            <wp:cNvGraphicFramePr>
-              <a:graphicFrameLocks noChangeAspect="1"/>
-            </wp:cNvGraphicFramePr>
-            <a:graphic>
-              <a:graphicData uri="http://schemas.openxmlformats.org/drawingml/2006/picture">
-                <pic:pic>
-                  <pic:nvPicPr>
-                    <pic:cNvPr id="0" name="08_step_tab4_documents_checklist.png"/>
-                    <pic:cNvPicPr/>
-                  </pic:nvPicPr>
-                  <pic:blipFill>
-                    <a:blip r:embed="rId16"/>
-                    <a:stretch>
-                      <a:fillRect/>
-                    </a:stretch>
-                  </pic:blipFill>
-                  <pic:spPr>
-                    <a:xfrm>
-                      <a:off x="0" y="0"/>
-                      <a:ext cx="5669280" cy="3543300"/>
-                    </a:xfrm>
-                    <a:prstGeom prst="rect"/>
-                  </pic:spPr>
-                </pic:pic>
-              </a:graphicData>
-            </a:graphic>
-          </wp:inline>
-        </w:drawing>
-      </w:r>
-    </w:p>
-    <w:p>
-      <w:pPr>
-        <w:spacing w:after="160"/>
-        <w:jc w:val="center"/>
-      </w:pPr>
-      <w:r>
-        <w:rPr>
-          <w:rFonts w:ascii="Calibri" w:hAnsi="Calibri"/>
-          <w:i/>
-          <w:color w:val="64748B"/>
-          <w:sz w:val="19"/>
-        </w:rPr>
-        <w:t>Gambar: Pusat Verifikasi Berkas: Checklist 13 Dokumen Wajib dengan Fitur Unggah &amp; Status Kelengkapan (Live System)</w:t>
-      </w:r>
-    </w:p>
-    <w:p>
-      <w:pPr>
-        <w:spacing w:before="160" w:after="40"/>
-      </w:pPr>
-      <w:r>
-        <w:rPr>
-          <w:rFonts w:ascii="Calibri" w:hAnsi="Calibri"/>
-          <w:b/>
-          <w:color w:val="ED7D31"/>
-          <w:sz w:val="24"/>
-        </w:rPr>
-        <w:t>Langkah 6: Final Review &amp; Pengajuan FAP Stage ke Business Support (BS)</w:t>
-      </w:r>
-    </w:p>
-    <w:p>
-      <w:pPr>
-        <w:spacing w:line="276" w:lineRule="auto" w:after="80"/>
-      </w:pPr>
-      <w:r>
-        <w:t>1. Peninjauan Metrik Header: Marketing memeriksa ringkasan metrik di bagian atas workspace (Nilai Permohonan Pembiayaan, Tenor Angsuran, Kategori Nasabah, dan Status Verifikasi Dokumen 13/13).</w:t>
-        <w:br/>
-        <w:t>2. Eksekusi Pengajuan: Marketing menekan tombol 'Submit FAP Stage' (atau 'SUBMIT_TO_BS'). Sistem melakukan validasi menyeluruh (Nama perusahaan terisi, NIB 13 digit valid, NPWP valid, total saham 100.00%). Jika seluruh aturan terpenuhi, dialog konfirmasi pengajuan muncul.</w:t>
-        <w:br/>
-        <w:t>3. Transisi Tahap Otomatis: Status aplikasi secara resmi berpindah dari 'FAP Stage (Draft)' menjadi 'SUBMITTED_TO_BS'. Aplikasi diteruskan secara digital ke meja kerja Business Support (BS) untuk verifikasi awal, dan tahap 'Pre-analysis' diaktifkan. Seluruh riwayat aksi tercatat permanen pada tab Activity Log (Audit Trail abadi).</w:t>
+        <w:t xml:space="preserve">   Penyusunan paket pembiayaan unit alat berat LiuGong, skema subsidi bunga dealer, uang muka (DP 20%–30%), kalkulator anuitas bunga efektif menurun (reducing balance), dan persetujuan bertingkat Komite Kredit berjejak audit abadi.</w:t>
       </w:r>
     </w:p>
     <w:p>

</xml_diff>

<commit_message>
docs(word): embed live screenshot of Stakeholder Side-by-side KTP and Passport AI OCR modal into BAB 2
</commit_message>
<xml_diff>
--- a/LIUGONG_CRM_BUSINESS_SPECIFICATION_PRESDIR.docx
+++ b/LIUGONG_CRM_BUSINESS_SPECIFICATION_PRESDIR.docx
@@ -2006,6 +2006,61 @@
     </w:p>
     <w:p>
       <w:pPr>
+        <w:spacing w:before="160" w:after="60"/>
+        <w:jc w:val="center"/>
+      </w:pPr>
+      <w:r>
+        <w:drawing>
+          <wp:inline xmlns:a="http://schemas.openxmlformats.org/drawingml/2006/main" xmlns:pic="http://schemas.openxmlformats.org/drawingml/2006/picture">
+            <wp:extent cx="5669280" cy="3543300"/>
+            <wp:docPr id="5" name="Picture 5"/>
+            <wp:cNvGraphicFramePr>
+              <a:graphicFrameLocks noChangeAspect="1"/>
+            </wp:cNvGraphicFramePr>
+            <a:graphic>
+              <a:graphicData uri="http://schemas.openxmlformats.org/drawingml/2006/picture">
+                <pic:pic>
+                  <pic:nvPicPr>
+                    <pic:cNvPr id="0" name="step_stakeholder_ktp_ocr_modal.png"/>
+                    <pic:cNvPicPr/>
+                  </pic:nvPicPr>
+                  <pic:blipFill>
+                    <a:blip r:embed="rId13"/>
+                    <a:stretch>
+                      <a:fillRect/>
+                    </a:stretch>
+                  </pic:blipFill>
+                  <pic:spPr>
+                    <a:xfrm>
+                      <a:off x="0" y="0"/>
+                      <a:ext cx="5669280" cy="3543300"/>
+                    </a:xfrm>
+                    <a:prstGeom prst="rect"/>
+                  </pic:spPr>
+                </pic:pic>
+              </a:graphicData>
+            </a:graphic>
+          </wp:inline>
+        </w:drawing>
+      </w:r>
+    </w:p>
+    <w:p>
+      <w:pPr>
+        <w:spacing w:after="160"/>
+        <w:jc w:val="center"/>
+      </w:pPr>
+      <w:r>
+        <w:rPr>
+          <w:rFonts w:ascii="Calibri" w:hAnsi="Calibri"/>
+          <w:i/>
+          <w:color w:val="64748B"/>
+          <w:sz w:val="19"/>
+        </w:rPr>
+        <w:t>Gambar: Modal Dialog Side-by-side OCR e-KTP &amp; Paspor pada Pengurus dan Pemegang Saham (Stakeholders)</w:t>
+      </w:r>
+    </w:p>
+    <w:p>
+      <w:pPr>
         <w:spacing w:before="160" w:after="40"/>
       </w:pPr>
       <w:r>

</xml_diff>

<commit_message>
refactor(diagram): rebuild architecture diagram strictly adhering to diagram-design skill standards with zero-error self_check
</commit_message>
<xml_diff>
--- a/LIUGONG_CRM_BUSINESS_SPECIFICATION_PRESDIR.docx
+++ b/LIUGONG_CRM_BUSINESS_SPECIFICATION_PRESDIR.docx
@@ -1017,7 +1017,7 @@
       <w:r>
         <w:drawing>
           <wp:inline xmlns:a="http://schemas.openxmlformats.org/drawingml/2006/main" xmlns:pic="http://schemas.openxmlformats.org/drawingml/2006/picture">
-            <wp:extent cx="5669280" cy="1852809"/>
+            <wp:extent cx="5669280" cy="2273468"/>
             <wp:docPr id="2" name="Picture 2"/>
             <wp:cNvGraphicFramePr>
               <a:graphicFrameLocks noChangeAspect="1"/>
@@ -1038,7 +1038,7 @@
                   <pic:spPr>
                     <a:xfrm>
                       <a:off x="0" y="0"/>
-                      <a:ext cx="5669280" cy="1852809"/>
+                      <a:ext cx="5669280" cy="2273468"/>
                     </a:xfrm>
                     <a:prstGeom prst="rect"/>
                   </pic:spPr>

</xml_diff>

<commit_message>
fix(business): purge false 'cabang' assumption; align model with centralized Head Office & authorized dealer network
</commit_message>
<xml_diff>
--- a/LIUGONG_CRM_BUSINESS_SPECIFICATION_PRESDIR.docx
+++ b/LIUGONG_CRM_BUSINESS_SPECIFICATION_PRESDIR.docx
@@ -1102,12 +1102,12 @@
         <w:spacing w:line="276" w:lineRule="auto" w:after="120"/>
       </w:pPr>
       <w:r>
-        <w:t>FAP STAGE (Financing Application Process) adalah gerbang intake operasional paling awal pada sistem LOS-CRM LiuGong Finance. Pada tahap ini, tim Marketing (MKT) di seluruh kantor cabang bertugas melakukan onboarding calon debitur secara komprehensif, menghimpun data legalitas korporasi, memetakan susunan pengurus serta pemegang saham, dan memverifikasi kelengkapan berkas fisik persyaratan pembiayaan sebelum permohonan diteruskan ke tahap analisis risiko.</w:t>
+        <w:t>FAP STAGE (Financing Application Process) adalah gerbang intake operasional paling awal pada sistem LOS-CRM LiuGong Finance Indonesia. Pada model bisnis LiuGong Finance, operasional berjalan terpusat di Kantor Pusat (Head Office) tanpa kantor cabang fisik di daerah, bekerja sama langsung dengan jaringan Dealer Resmi LiuGong (seperti PT Megatama Mandiri, dll.). Tim Marketing (MKT) bertugas melakukan onboarding calon debitur secara komprehensif, menghimpun data legalitas korporasi, memetakan susunan pengurus serta pemegang saham, dan memverifikasi kelengkapan berkas fisik persyaratan pembiayaan sebelum permohonan diteruskan ke tahap analisis risiko.</w:t>
         <w:br/>
         <w:br/>
         <w:t>Secara garis besar, aktivitas utama staf Marketing pada FAP Stage mencakup:</w:t>
         <w:br/>
-        <w:t>1. Inisiasi Permohonan: Menentukan kategori debitur (Baru/Lama), segmentasi (Corporate/Commercial/Micro), dan cabang operasional LiuGong.</w:t>
+        <w:t>1. Inisiasi Permohonan: Menentukan kategori debitur (Baru/Lama), segmentasi (Corporate/Commercial/Micro), dan penunjukan mitra dealer resmi LiuGong.</w:t>
         <w:br/>
         <w:t>2. Perekaman Identitas &amp; Domisili: Memasukkan nama resmi PT/CV, alamat kantor pusat, kontak penanggung jawab operasional (PIC), serta segmentasi proyek kontrak berjalan.</w:t>
         <w:br/>
@@ -2230,7 +2230,7 @@
         <w:br/>
         <w:t>• Mesin Aktuaria Bunga Efektif: Simulasi angsuran anuitas menurun resmi (reducing balance annuity) presisi tinggi.</w:t>
         <w:br/>
-        <w:t>• Persetujuan Komite Kredit Digital: Pelaksanaan sidang komite kredit digital berjenjang (Tier 1 Cabang s/d Tier 3 Direksi/Presdir) dengan hak Approve, Reject, atau Return, disertai pencatatan audit trail permanen.</w:t>
+        <w:t>• Persetujuan Komite Kredit Digital: Pelaksanaan sidang komite kredit digital berjenjang (Tier 1 s/d Tier 3 Direksi/Presdir) dengan hak Approve, Reject, atau Return, disertai pencatatan audit trail permanen.</w:t>
       </w:r>
     </w:p>
     <w:p>

</xml_diff>